<commit_message>
Figure 4: add platinum cohort 2 and both outputs (weeks 1-8)
Co-authored-by: Cursor <cursoragent@cursor.com>
</commit_message>
<xml_diff>
--- a/manuscript/build/flex_dbs.docx
+++ b/manuscript/build/flex_dbs.docx
@@ -5201,7 +5201,7 @@
       <w:r>
         <w:drawing>
           <wp:inline>
-            <wp:extent cx="5943600" cy="2547257"/>
+            <wp:extent cx="5943600" cy="2717074"/>
             <wp:effectExtent b="0" l="0" r="0" t="0"/>
             <wp:docPr descr="image" title="" id="55" name="Picture"/>
             <a:graphic>
@@ -5222,7 +5222,7 @@
                   <pic:spPr bwMode="auto">
                     <a:xfrm>
                       <a:off x="0" y="0"/>
-                      <a:ext cx="5943600" cy="2547257"/>
+                      <a:ext cx="5943600" cy="2717074"/>
                     </a:xfrm>
                     <a:prstGeom prst="rect">
                       <a:avLst/>

</xml_diff>

<commit_message>
Figure 4 rework (pooled impedance, compliance strip), updated impedance results; behavior key and movement analysis scripts
Co-authored-by: Cursor <cursoragent@cursor.com>
</commit_message>
<xml_diff>
--- a/manuscript/build/flex_dbs.docx
+++ b/manuscript/build/flex_dbs.docx
@@ -15,7 +15,7 @@
         <w:pStyle w:val="FirstParagraph"/>
       </w:pPr>
       <w:r>
-        <w:t xml:space="preserve">Matt Gaidica</w:t>
+        <w:t xml:space="preserve">Robert D. Graham</w:t>
       </w:r>
       <w:r>
         <w:rPr>
@@ -24,7 +24,16 @@
         <w:t xml:space="preserve">1,*</w:t>
       </w:r>
       <w:r>
-        <w:t xml:space="preserve">, Robert D. Graham</w:t>
+        <w:t xml:space="preserve">, Meaghan C. Creed</w:t>
+      </w:r>
+      <w:r>
+        <w:rPr>
+          <w:vertAlign w:val="superscript"/>
+        </w:rPr>
+        <w:t xml:space="preserve">1</w:t>
+      </w:r>
+      <w:r>
+        <w:t xml:space="preserve">, Matt Gaidica</w:t>
       </w:r>
       <w:r>
         <w:rPr>
@@ -32,42 +41,33 @@
         </w:rPr>
         <w:t xml:space="preserve">2</w:t>
       </w:r>
-      <w:r>
-        <w:t xml:space="preserve">, Meaghan C. Creed</w:t>
-      </w:r>
+    </w:p>
+    <w:p>
+      <w:pPr>
+        <w:pStyle w:val="BodyText"/>
+      </w:pPr>
+      <w:r>
+        <w:rPr>
+          <w:vertAlign w:val="superscript"/>
+        </w:rPr>
+        <w:t xml:space="preserve">1</w:t>
+      </w:r>
+      <w:r>
+        <w:t xml:space="preserve">Department of Anesthesiology, Washington University School of Medicine, St. Louis, MO, USA</w:t>
+      </w:r>
+    </w:p>
+    <w:p>
+      <w:pPr>
+        <w:pStyle w:val="BodyText"/>
+      </w:pPr>
       <w:r>
         <w:rPr>
           <w:vertAlign w:val="superscript"/>
         </w:rPr>
         <w:t xml:space="preserve">2</w:t>
       </w:r>
-    </w:p>
-    <w:p>
-      <w:pPr>
-        <w:pStyle w:val="BodyText"/>
-      </w:pPr>
-      <w:r>
-        <w:rPr>
-          <w:vertAlign w:val="superscript"/>
-        </w:rPr>
-        <w:t xml:space="preserve">1</w:t>
-      </w:r>
       <w:r>
         <w:t xml:space="preserve">Department of Neuroscience, Washington University School of Medicine, St. Louis, MO, USA</w:t>
-      </w:r>
-    </w:p>
-    <w:p>
-      <w:pPr>
-        <w:pStyle w:val="BodyText"/>
-      </w:pPr>
-      <w:r>
-        <w:rPr>
-          <w:vertAlign w:val="superscript"/>
-        </w:rPr>
-        <w:t xml:space="preserve">2</w:t>
-      </w:r>
-      <w:r>
-        <w:t xml:space="preserve">Department of Anesthesiology, Washington University School of Medicine, St. Louis, MO, USA</w:t>
       </w:r>
     </w:p>
     <w:p>
@@ -81,7 +81,7 @@
         <w:t xml:space="preserve">*</w:t>
       </w:r>
       <w:r>
-        <w:t xml:space="preserve">Corresponding author: Matt Gaidica, gaidica@wustl.edu</w:t>
+        <w:t xml:space="preserve">Corresponding author: Robert D. Graham, robertg@wustl.edu</w:t>
       </w:r>
     </w:p>
     <w:p>
@@ -162,7 +162,7 @@
         <w:t xml:space="preserve"> </w:t>
       </w:r>
       <w:r>
-        <w:t xml:space="preserve">Battery current was 1.47–1.89 mA in standby and 3.15–3.42 mA during stimulation at 60–400 µA, giving about three days of continuous stimulation per pair of cells. Implanted platinum electrodes presented 37–80 kΩ over five weeks in two mice, placing the maximum regulated current at roughly 60–120 µA. Analysis of the current-pump network bounds load-dependent current error at 4–8 % for these loads.</w:t>
+        <w:t xml:space="preserve">Battery current was 1.47–1.89 mA in standby and 3.15–3.42 mA during stimulation at 60–400 µA, giving about three days of continuous stimulation per pair of cells. Five implanted platinum electrodes in three mice presented weekly mean impedances of 43–54 kΩ over eight weeks (32–80 kΩ across individual sessions), placing the maximum regulated current near 100 µA (86–107 µA at the weekly means). Analysis of the current-pump network bounds load-dependent current error at 3–8 % for these loads.</w:t>
       </w:r>
     </w:p>
     <w:p>
@@ -1796,7 +1796,7 @@
         <w:t xml:space="preserve"> </w:t>
       </w:r>
       <w:r>
-        <w:t xml:space="preserve">plus headroom for the sense resistor, the output filter and the amplifier’s swing limit. With ±5 V rails, a 2 kΩ sense resistor and 660 Ω of series filter resistance per channel, the voltage available at the electrode is approximately ±4.6 V at 100 µA and ±3.9 V at 400 µA (derived from the schematic). Section 3 shows that the implanted electrodes used here present 37–80 kΩ in vivo, so compliance rather than the programmable range sets the largest current that can be delivered. A battery-direct design with</w:t>
+        <w:t xml:space="preserve">plus headroom for the sense resistor, the output filter and the amplifier’s swing limit. With ±5 V rails, a 2 kΩ sense resistor and 660 Ω of series filter resistance per channel, the voltage available at the electrode is approximately ±4.6 V at 100 µA and ±3.9 V at 400 µA (derived from the schematic). Section 3 shows that the implanted electrodes used here present 32–80 kΩ in vivo, so compliance rather than the programmable range sets the largest current that can be delivered. A battery-direct design with</w:t>
       </w:r>
       <w:r>
         <w:t xml:space="preserve"> </w:t>
@@ -1957,7 +1957,7 @@
         <w:pStyle w:val="FirstParagraph"/>
       </w:pPr>
       <w:r>
-        <w:t xml:space="preserve">Platinum electrodes were implanted bilaterally in two mice (mouse 1 and mouse 2), and impedance was measured weekly from 1 to 5 weeks after implantation. At each session a StimJim stimulator</w:t>
+        <w:t xml:space="preserve">Platinum electrodes were implanted bilaterally in four mice across two surgical cohorts (eight electrodes), and impedance was measured weekly from 1 to 8 weeks after implantation. At each session a StimJim stimulator</w:t>
       </w:r>
       <w:r>
         <w:t xml:space="preserve"> </w:t>
@@ -1986,7 +1986,7 @@
         <w:pStyle w:val="BodyText"/>
       </w:pPr>
       <w:r>
-        <w:t xml:space="preserve">We report one electrode per animal (output 1). The other electrode of mouse 1 read near 0 V at every session, consistent with a short to the return, so output 0 was not analyzed.</w:t>
+        <w:t xml:space="preserve">Three electrodes were excluded. One read near 0 V at every session, consistent with a short to the return. Both electrodes of one mouse gave unstable readings, varying by up to 4.7-fold between sessions and drifting within a session; whether this reflected the electrodes, the implant strategy or the recording setup could not be determined. The analyzed data set therefore comprises five electrodes from three mice, measured at eight weekly sessions (40 electrode-sessions).</w:t>
       </w:r>
     </w:p>
     <w:p>
@@ -2012,7 +2012,7 @@
         <w:pStyle w:val="FirstParagraph"/>
       </w:pPr>
       <w:r>
-        <w:t xml:space="preserve">Measured impedances ranged from 37 to 80 kΩ over the five weeks (Figure 4A). The electrode in mouse 1 was stable at 37–49 kΩ (mean 43.9 ± 4.7 kΩ, mean ± SD across weeks), and the electrode in mouse 2 ranged from 54 to 80 kΩ (66.0 ± 11.0 kΩ), peaking at 3 weeks and falling to 60 kΩ by 5 weeks. Impedance therefore differed by about 1.5-fold between animals and varied by up to 1.5-fold within one animal over time.</w:t>
+        <w:t xml:space="preserve">Across the five electrodes, impedance ranged from 32 to 80 kΩ (49.1 ± 9.9 kΩ, mean ± SD over all electrode-sessions). The weekly mean was 43.0 ± 7.4 kΩ at 1 week, peaked at 54.2 ± 14.8 kΩ at 3 weeks and returned to 44.6 ± 7.5 kΩ by 8 weeks, remaining within 43–54 kΩ throughout (Figure 4A). Mean impedance of individual electrodes ranged from 42.7 to 64.2 kΩ, so differences between electrodes (about 1.5-fold) were larger than the change in the group mean over time.</w:t>
       </w:r>
     </w:p>
     <w:p>
@@ -2133,7 +2133,7 @@
         <w:t xml:space="preserve"> </w:t>
       </w:r>
       <w:r>
-        <w:t xml:space="preserve">(Figure 4B). For the measured electrodes this corresponds to 95–123 µA in mouse 1 and 59–86 µA in mouse 2, compared with the 600 µA nominal range of the application. The 100 µA reference protocol was therefore within compliance for mouse 1 in three of five weeks and was not for mouse 2 at any time point. A battery-direct design with</w:t>
+        <w:t xml:space="preserve">(Figure 4B). The weekly mean impedances correspond to 86–107 µA, and individual electrode-sessions to 59–140 µA, compared with the 600 µA nominal range of the application. The 100 µA reference protocol was within compliance in 15 of 40 electrode-sessions, and in 0 to 5 of the 8 sessions for individual electrodes. A battery-direct design with</w:t>
       </w:r>
       <w:r>
         <w:t xml:space="preserve"> </w:t>
@@ -2161,7 +2161,7 @@
         </m:r>
       </m:oMath>
       <w:r>
-        <w:t xml:space="preserve">38–81 µA into the same loads. The usable amplitude is set by electrode impedance and compliance together, not by the programmable range, and it changes as the electrode–tissue interface matures.</w:t>
+        <w:t xml:space="preserve">38–93 µA into the same loads. The usable amplitude is set by electrode impedance and compliance together, not by the programmable range, and it differs between electrodes more than it changes over time after implantation.</w:t>
       </w:r>
     </w:p>
     <w:bookmarkEnd w:id="29"/>
@@ -4412,7 +4412,7 @@
         <w:t xml:space="preserve"> </w:t>
       </w:r>
       <w:r>
-        <w:t xml:space="preserve">note that their 2.1 V of output headroom delivers the full 149 µA only into loads below about 20 kΩ, well below the 37–80 kΩ measured in vivo in Section 3. Second, the systems that offer real-time wireless control are rat-scale or externally powered and regulate voltage rather than current:</w:t>
+        <w:t xml:space="preserve">note that their 2.1 V of output headroom delivers the full 149 µA only into loads below about 20 kΩ, well below the 32–80 kΩ measured in vivo in Section 3. Second, the systems that offer real-time wireless control are rat-scale or externally powered and regulate voltage rather than current:</w:t>
       </w:r>
       <w:r>
         <w:t xml:space="preserve"> </w:t>
@@ -4582,7 +4582,7 @@
         <w:pStyle w:val="BodyText"/>
       </w:pPr>
       <w:r>
-        <w:t xml:space="preserve">The in-vivo impedance measurements reinforce that DBS delivery is a systems problem. Electrode impedance and stimulator compliance jointly determine whether the commanded constant current is actually delivered, and impedance differs between electrodes and changes after implantation (Section 3). A stimulator specified only by its programmable current range has not been fully specified. For the implanted platinum electrodes used here, 37–80 kΩ in vivo, the ±5 V rails of FLEX-DBS support roughly 60–120 µA, well below the 600 µA programmable range and on the order of the 100 µA protocols used in prior work. We therefore recommend reporting the compliance limit alongside the measured impedance distribution (Figure 4B) for any rodent stimulator. Two practical consequences follow. First, electrode impedance is the most direct lever on usable amplitude, and future protocols will establish a method for fabricating lower-impedance electrodes. Second, in our work stimulation parameters were guided by the behavioral effects they produced in prior studies rather than by theory alone; a configurable stimulator lets the experimenter confirm that a chosen amplitude is both deliverable into the implanted load and behaviorally effective, and adjust it if either condition fails.</w:t>
+        <w:t xml:space="preserve">The in-vivo impedance measurements reinforce that DBS delivery is a systems problem. Electrode impedance and stimulator compliance jointly determine whether the commanded constant current is actually delivered, and impedance differs between electrodes and varies over the weeks after implantation (Section 3). A stimulator specified only by its programmable current range has not been fully specified. For the implanted platinum electrodes used here, 32–80 kΩ in vivo with weekly means of 43–54 kΩ, the ±5 V rails of FLEX-DBS support roughly 60–140 µA, well below the 600 µA programmable range and centered on the 100 µA protocols used in prior work. We therefore recommend reporting the compliance limit alongside the measured impedance distribution (Figure 4B) for any rodent stimulator. Two practical consequences follow. First, electrode impedance is the most direct lever on usable amplitude, and future protocols will establish a method for fabricating lower-impedance electrodes. Second, in our work stimulation parameters were guided by the behavioral effects they produced in prior studies rather than by theory alone; a configurable stimulator lets the experimenter confirm that a chosen amplitude is both deliverable into the implanted load and behaviorally effective, and adjust it if either condition fails.</w:t>
       </w:r>
     </w:p>
     <w:p>
@@ -4668,7 +4668,7 @@
         <w:t xml:space="preserve">(Creed et al., 2015, 2011)</w:t>
       </w:r>
       <w:r>
-        <w:t xml:space="preserve">. The recovery-phase ratio is fixed at 1:5. The Howland pumps are not perfectly load-independent: with 0.1 % resistors, the worst-case resistor mismatch gives an output impedance of about 0.9 MΩ, so delivered current can fall by up to 4–8 % into the 37–80 kΩ loads measured here relative to a low-impedance load. Amplitude should therefore be interpreted against the measured load and the calibration in Section 4.1 rather than as an absolute. Finally, the impedance data come from two animals and a stimulator whose voltage read-back underestimates high loads (Section 3.2).</w:t>
+        <w:t xml:space="preserve">. The recovery-phase ratio is fixed at 1:5. The Howland pumps are not perfectly load-independent: with 0.1 % resistors, the worst-case resistor mismatch gives an output impedance of about 0.9 MΩ, so delivered current can fall by up to 3–8 % into the 32–80 kΩ loads measured here relative to a low-impedance load. Amplitude should therefore be interpreted against the measured load and the calibration in Section 4.1 rather than as an absolute. Finally, the impedance data come from five electrodes in three mice, with three of eight implanted electrodes excluded, and from a stimulator whose voltage read-back underestimates high loads (Section 3.2).</w:t>
       </w:r>
     </w:p>
     <w:p>
@@ -4704,7 +4704,7 @@
         <w:pStyle w:val="FirstParagraph"/>
       </w:pPr>
       <w:r>
-        <w:t xml:space="preserve">FLEX-DBS is a head-mounted, bilateral, constant-current stimulator with real-time smartphone control that supports about three days of continuous stimulation per pair of cells. Its ±5 V compliance rails deliver roughly 60–120 µA into implanted platinum electrodes of 37–80 kΩ, which shows that electrode impedance, not the programmable range, sets usable amplitude in vivo. The platform trades runtime for flexibility and is intended for experiments in which parameters must be set, changed and verified at the cage.</w:t>
+        <w:t xml:space="preserve">FLEX-DBS is a head-mounted, bilateral, constant-current stimulator with real-time smartphone control that supports about three days of continuous stimulation per pair of cells. Its ±5 V compliance rails deliver roughly 60–140 µA into implanted platinum electrodes of 32–80 kΩ, which shows that electrode impedance, not the programmable range, sets usable amplitude in vivo. The platform trades runtime for flexibility and is intended for experiments in which parameters must be set, changed and verified at the cage.</w:t>
       </w:r>
     </w:p>
     <w:bookmarkEnd w:id="41"/>
@@ -5048,7 +5048,7 @@
         <w:t xml:space="preserve"> </w:t>
       </w:r>
       <w:r>
-        <w:t xml:space="preserve">Impedance of one implanted platinum electrode per mouse from 1 to 5 weeks after implantation, measured with 10 µA, 450 µs pulses (mean of five readings per session; Section 3.2).</w:t>
+        <w:t xml:space="preserve">Impedance of implanted platinum electrodes from 1 to 8 weeks after implantation, measured with 10 µA, 450 µs pulses (five readings averaged per electrode and session; Section 3.2). Points show the mean ± SD across five electrodes from three mice; three of eight implanted electrodes were excluded (Section 3.2).</w:t>
       </w:r>
       <w:r>
         <w:t xml:space="preserve"> </w:t>
@@ -5064,7 +5064,7 @@
         <w:t xml:space="preserve"> </w:t>
       </w:r>
       <w:r>
-        <w:t xml:space="preserve">Largest regulated current as a function of load impedance for FLEX-DBS,</w:t>
+        <w:t xml:space="preserve">Top: largest regulated current of FLEX-DBS as a function of load impedance,</w:t>
       </w:r>
       <w:r>
         <w:t xml:space="preserve"> </w:t>
@@ -5174,24 +5174,7 @@
         </m:r>
       </m:oMath>
       <w:r>
-        <w:t xml:space="preserve"> </w:t>
-      </w:r>
-      <w:r>
-        <w:t xml:space="preserve">(solid), and for an illustrative battery-direct stimulator with</w:t>
-      </w:r>
-      <w:r>
-        <w:t xml:space="preserve"> </w:t>
-      </w:r>
-      <m:oMath>
-        <m:r>
-          <m:rPr>
-            <m:sty m:val="p"/>
-          </m:rPr>
-          <m:t>∼</m:t>
-        </m:r>
-      </m:oMath>
-      <w:r>
-        <w:t xml:space="preserve">3 V of compliance (dashed). Points mark the measured impedances from (A) on the FLEX-DBS curve; the dotted line marks the 100 µA reference protocol.</w:t>
+        <w:t xml:space="preserve">. The gray band spans the range of weekly mean impedances in (A), 43–54 kΩ, and the dashed lines project it to the corresponding current range, 86–107 µA; the dotted line marks the 100 µA reference protocol. Bottom: weekly mean ± SD impedance on the same impedance axis, colored from week 1 (bottom) to week 8 (top).</w:t>
       </w:r>
     </w:p>
     <w:p>
@@ -5201,7 +5184,7 @@
       <w:r>
         <w:drawing>
           <wp:inline>
-            <wp:extent cx="5943600" cy="2717074"/>
+            <wp:extent cx="5943600" cy="3056708"/>
             <wp:effectExtent b="0" l="0" r="0" t="0"/>
             <wp:docPr descr="image" title="" id="55" name="Picture"/>
             <a:graphic>
@@ -5222,7 +5205,7 @@
                   <pic:spPr bwMode="auto">
                     <a:xfrm>
                       <a:off x="0" y="0"/>
-                      <a:ext cx="5943600" cy="2717074"/>
+                      <a:ext cx="5943600" cy="3056708"/>
                     </a:xfrm>
                     <a:prstGeom prst="rect">
                       <a:avLst/>
@@ -5941,7 +5924,18 @@
         </w:numPr>
       </w:pPr>
       <w:r>
-        <w:t xml:space="preserve">Only the platinum cohort 1 sheet, output 1, is reported. Output 0 of mouse 1 read near 0 V throughout and was excluded; output 0 of mouse 2 (47–53 kΩ) is not reported, to keep one electrode per animal. Confirm this choice.</w:t>
+        <w:t xml:space="preserve">Data come from the platinum cohort 1 (M1, M2) and platinum cohort 2 (F1, F2) sheets. Excluded: M1 output 0 (near 0 V throughout, likely a short) and both electrodes of F1 (unstable; 47–118 kΩ and 23–106 kΩ between sessions, with within-session drift at 7 weeks). Analyzed: five electrodes from M1, M2 and F2. Confirm the wording of the exclusion criteria, and consider stating a quantitative criterion.</w:t>
+      </w:r>
+    </w:p>
+    <w:p>
+      <w:pPr>
+        <w:numPr>
+          <w:ilvl w:val="0"/>
+          <w:numId w:val="1004"/>
+        </w:numPr>
+      </w:pPr>
+      <w:r>
+        <w:t xml:space="preserve">The cohort 2 week-4 session was recorded at 4 weeks + 1 day and is plotted and analyzed as week 4.</w:t>
       </w:r>
     </w:p>
     <w:p>

</xml_diff>

<commit_message>
Bench recordings into 1 kOhm and Figure 5; Section 4.1 from bench data; separate settings from delivered values in text; device mass and electrode holder
Co-authored-by: Cursor <cursoragent@cursor.com>
</commit_message>
<xml_diff>
--- a/manuscript/build/flex_dbs.docx
+++ b/manuscript/build/flex_dbs.docx
@@ -144,7 +144,7 @@
         <w:t xml:space="preserve"> </w:t>
       </w:r>
       <w:r>
-        <w:t xml:space="preserve">FLEX-DBS (Flexible Deep Brain Stimulation) is a head-mounted, battery-powered stimulator that delivers bilateral constant-current stimulation from improved Howland current pumps on ±5 V rails. Amplitude, pulse width and frequency are programmable in continuous and burst modes from an iOS application over Bluetooth Low Energy, and stimulation continues autonomously after the phone disconnects. The device measures 19.5 × 22.5 × 8.72 mm and runs on two size-13 zinc-air cells, which can be exchanged without handling the implant.</w:t>
+        <w:t xml:space="preserve">FLEX-DBS (Flexible Deep Brain Stimulation) is a head-mounted, battery-powered stimulator that delivers bilateral constant-current stimulation from improved Howland current pumps on ±5 V rails. Amplitude, pulse width and frequency are programmable in continuous and burst modes from an iOS application over Bluetooth Low Energy, and stimulation continues autonomously after the phone disconnects. The device measures 19.5 × 22.5 × 8.72 mm, weighs 4.27 g in operation and runs on two size-13 zinc-air cells, which can be exchanged without handling the implant.</w:t>
       </w:r>
     </w:p>
     <w:p>
@@ -162,7 +162,7 @@
         <w:t xml:space="preserve"> </w:t>
       </w:r>
       <w:r>
-        <w:t xml:space="preserve">Battery current was 1.47–1.89 mA in standby and 3.15–3.42 mA during stimulation at 60–400 µA, giving about three days of continuous stimulation per pair of cells. Five implanted platinum electrodes in three mice presented weekly mean impedances of 43–54 kΩ over eight weeks (32–80 kΩ across individual sessions), placing the maximum regulated current near 100 µA (86–107 µA at the weekly means). Analysis of the current-pump network bounds load-dependent current error at 3–8 % for these loads.</w:t>
+        <w:t xml:space="preserve">Into a 1 kΩ bench load, delivered current increased approximately linearly with the amplitude setting and was repeatable from pulse to pulse, with an asymmetric biphasic waveform whose recovery phase ran at about one fifth of the stimulating amplitude. Battery current was 1.47–1.89 mA in standby and 3.15–3.42 mA during stimulation at amplitude settings of 60–400 µA, giving about three days of continuous stimulation per pair of cells. Five implanted platinum electrodes in three mice presented weekly mean impedances of 43–54 kΩ over eight weeks (32–80 kΩ across individual sessions), placing the maximum regulated current near 100 µA (86–107 µA at the weekly means). Analysis of the current-pump network bounds load-dependent current error at 3–8 % for these loads.</w:t>
       </w:r>
     </w:p>
     <w:p>
@@ -913,7 +913,7 @@
         </m:r>
       </m:oMath>
       <w:r>
-        <w:t xml:space="preserve">6 µA per percent (300 µA at 50 % and 600 µA at 100 %). Calibration of the delivered current is described in Section 4.1.</w:t>
+        <w:t xml:space="preserve">6 µA per percent (300 µA at 50 % and 600 µA at 100 %). The current measured against these labels is reported in Section 4.1.</w:t>
       </w:r>
     </w:p>
     <w:p>
@@ -1001,7 +1001,7 @@
         <w:t xml:space="preserve">P</w:t>
       </w:r>
       <w:r>
-        <w:t xml:space="preserve">; the DAC returns to the reference; the switches disconnect the electrodes; and the op amp is shut down. Switches change state only at zero commanded current, so the load is never connected to a saturated open-circuit current source and never disconnected mid-pulse, and pulse edges are produced by DAC steps into an already-connected load. The reversed phase carries the same charge as the stimulating phase, so each pulse is charge-balanced by construction. Because the op amp is enabled only around each pulse, its on-time is roughly 210 µs + 6·</w:t>
+        <w:t xml:space="preserve">; the DAC returns to the reference; the switches disconnect the electrodes; and the op amp is shut down. Switches change state only at zero commanded current, so the load is never connected to a saturated open-circuit current source and never disconnected mid-pulse, and pulse edges are produced by DAC steps into an already-connected load. The recovery phase is designed to carry the same charge as the stimulating phase; with firmware v0.5 the measured phases leave a net residual in the stimulating direction (Section 4.1). Because the op amp is enabled only around each pulse, its on-time is roughly 210 µs + 6·</w:t>
       </w:r>
       <w:r>
         <w:rPr>
@@ -1019,7 +1019,7 @@
         <w:pStyle w:val="BodyText"/>
       </w:pPr>
       <w:r>
-        <w:t xml:space="preserve">Pulse and inter-pulse timing derive from the 32.768 kHz low-frequency timer, so every duration is quantized to one 30.5 µs tick. Interrupt latency, tick quantization and the DAC write add a fixed</w:t>
+        <w:t xml:space="preserve">Pulse and inter-pulse timing derive from the 32.768 kHz low-frequency timer, so every duration is quantized to one 30.5 µs tick. To compensate for interrupt latency, tick quantization and the DAC write, the firmware subtracts a fixed overhead estimate from each phase (117 µs from the stimulating phase and 116 µs from the recovery phase). The compensation is not exact: at the 180 µs setting the stimulating phase measured</w:t>
       </w:r>
       <w:r>
         <w:t xml:space="preserve"> </w:t>
@@ -1033,7 +1033,7 @@
         </m:r>
       </m:oMath>
       <w:r>
-        <w:t xml:space="preserve">117 µs to each stimulating phase, which the firmware subtracts from the programmed pulse width; settings of 117 µs or less therefore produce a stimulating phase of</w:t>
+        <w:t xml:space="preserve">240 µs and the recovery phase</w:t>
       </w:r>
       <w:r>
         <w:t xml:space="preserve"> </w:t>
@@ -1047,7 +1047,35 @@
         </m:r>
       </m:oMath>
       <w:r>
-        <w:t xml:space="preserve">117 µs rather than the programmed value. The stimulation period is set by a periodic timer whose period is computed in whole milliseconds, rounded down, so the delivered frequency takes one of seven values between 83.3 and 166.7 Hz (Table 2). The 130 Hz setting used throughout this work delivers 142.9 Hz; 100 and 125 Hz are delivered exactly. In burst mode a second periodic timer starts a train of pulses at the intra-burst frequency every burst period and stops scheduling new pulses at the end of the burst duration. The first pulse of each burst occurs one intra-burst period after burst onset, and a pulse already in progress when the burst ends completes its full charge-balanced chain rather than being truncated.</w:t>
+        <w:t xml:space="preserve">860 µs rather than 900 µs (Section 4.1). The stimulation period is set by a periodic timer whose period is computed in whole milliseconds, rounded down, so the delivered frequency takes one of seven values between</w:t>
+      </w:r>
+      <w:r>
+        <w:t xml:space="preserve"> </w:t>
+      </w:r>
+      <m:oMath>
+        <m:r>
+          <m:rPr>
+            <m:sty m:val="p"/>
+          </m:rPr>
+          <m:t>∼</m:t>
+        </m:r>
+      </m:oMath>
+      <w:r>
+        <w:t xml:space="preserve">83 and</w:t>
+      </w:r>
+      <w:r>
+        <w:t xml:space="preserve"> </w:t>
+      </w:r>
+      <m:oMath>
+        <m:r>
+          <m:rPr>
+            <m:sty m:val="p"/>
+          </m:rPr>
+          <m:t>∼</m:t>
+        </m:r>
+      </m:oMath>
+      <w:r>
+        <w:t xml:space="preserve">167 Hz (Table 2). The 130 Hz setting used throughout this work delivers 142.5 Hz; the 100 and 125 Hz settings correspond to whole-millisecond periods and are not rounded. In burst mode a second periodic timer starts a train of pulses at the intra-burst frequency every burst period and stops scheduling new pulses at the end of the burst duration. The first pulse of each burst occurs one intra-burst period after burst onset, and a pulse already in progress when the burst ends completes its full stimulating and recovery chain rather than being truncated.</w:t>
       </w:r>
     </w:p>
     <w:p>
@@ -1185,65 +1213,11 @@
               <w:jc w:val="left"/>
             </w:pPr>
             <w:r>
-              <w:t xml:space="preserve">16-bit DAC; ideal transconductance 6.25 µA per percent (0–625 µA), limited by compliance at high load (Section 3.3)</w:t>
-            </w:r>
-          </w:p>
-        </w:tc>
-        <w:tc>
-          <w:tcPr/>
-          <w:p>
-            <w:pPr>
-              <w:pStyle w:val="Compact"/>
-              <w:jc w:val="left"/>
-            </w:pPr>
-            <w:r>
-              <w:t xml:space="preserve">Shared by both channels</w:t>
-            </w:r>
-          </w:p>
-        </w:tc>
-      </w:tr>
-      <w:tr>
-        <w:tc>
-          <w:tcPr/>
-          <w:p>
-            <w:pPr>
-              <w:pStyle w:val="Compact"/>
-              <w:jc w:val="left"/>
-            </w:pPr>
-            <w:r>
-              <w:t xml:space="preserve">Pulse width</w:t>
+              <w:t xml:space="preserve">16-bit DAC; ideal transconductance 6.25 µA per percent (0–625 µA); into 1 kΩ,</w:t>
             </w:r>
             <w:r>
               <w:t xml:space="preserve"> </w:t>
             </w:r>
-            <w:r>
-              <w:rPr>
-                <w:i/>
-                <w:iCs/>
-              </w:rPr>
-              <w:t xml:space="preserve">P</w:t>
-            </w:r>
-          </w:p>
-        </w:tc>
-        <w:tc>
-          <w:tcPr/>
-          <w:p>
-            <w:pPr>
-              <w:pStyle w:val="Compact"/>
-              <w:jc w:val="left"/>
-            </w:pPr>
-            <w:r>
-              <w:t xml:space="preserve">90–600 µs in 30 µs steps</w:t>
-            </w:r>
-          </w:p>
-        </w:tc>
-        <w:tc>
-          <w:tcPr/>
-          <w:p>
-            <w:pPr>
-              <w:pStyle w:val="Compact"/>
-              <w:jc w:val="left"/>
-            </w:pPr>
             <m:oMath>
               <m:r>
                 <m:rPr>
@@ -1253,7 +1227,143 @@
               </m:r>
             </m:oMath>
             <w:r>
-              <w:t xml:space="preserve">120–600 µs, quantized to 30.5 µs; settings of 117 µs or less deliver</w:t>
+              <w:t xml:space="preserve">4.7 µA per percent + 47 µA measured (Section 4.1); limited by compliance at high load (Section 3.3)</w:t>
+            </w:r>
+          </w:p>
+        </w:tc>
+        <w:tc>
+          <w:tcPr/>
+          <w:p>
+            <w:pPr>
+              <w:pStyle w:val="Compact"/>
+              <w:jc w:val="left"/>
+            </w:pPr>
+            <w:r>
+              <w:t xml:space="preserve">Shared by both channels</w:t>
+            </w:r>
+          </w:p>
+        </w:tc>
+      </w:tr>
+      <w:tr>
+        <w:tc>
+          <w:tcPr/>
+          <w:p>
+            <w:pPr>
+              <w:pStyle w:val="Compact"/>
+              <w:jc w:val="left"/>
+            </w:pPr>
+            <w:r>
+              <w:t xml:space="preserve">Pulse width</w:t>
+            </w:r>
+            <w:r>
+              <w:t xml:space="preserve"> </w:t>
+            </w:r>
+            <w:r>
+              <w:rPr>
+                <w:i/>
+                <w:iCs/>
+              </w:rPr>
+              <w:t xml:space="preserve">P</w:t>
+            </w:r>
+          </w:p>
+        </w:tc>
+        <w:tc>
+          <w:tcPr/>
+          <w:p>
+            <w:pPr>
+              <w:pStyle w:val="Compact"/>
+              <w:jc w:val="left"/>
+            </w:pPr>
+            <w:r>
+              <w:t xml:space="preserve">90–600 µs in 30 µs steps</w:t>
+            </w:r>
+          </w:p>
+        </w:tc>
+        <w:tc>
+          <w:tcPr/>
+          <w:p>
+            <w:pPr>
+              <w:pStyle w:val="Compact"/>
+              <w:jc w:val="left"/>
+            </w:pPr>
+            <w:r>
+              <w:t xml:space="preserve">Quantized to 30.5 µs; 238–254 µs measured at the 180 µs setting (Section 4.1)</w:t>
+            </w:r>
+          </w:p>
+        </w:tc>
+        <w:tc>
+          <w:tcPr/>
+          <w:p>
+            <w:pPr>
+              <w:pStyle w:val="Compact"/>
+              <w:jc w:val="left"/>
+            </w:pPr>
+            <w:r>
+              <w:t xml:space="preserve">Recovery phase set to 5·</w:t>
+            </w:r>
+            <w:r>
+              <w:rPr>
+                <w:i/>
+                <w:iCs/>
+              </w:rPr>
+              <w:t xml:space="preserve">P</w:t>
+            </w:r>
+            <w:r>
+              <w:t xml:space="preserve"> </w:t>
+            </w:r>
+            <w:r>
+              <w:t xml:space="preserve">at</w:t>
+            </w:r>
+            <w:r>
+              <w:t xml:space="preserve"> </w:t>
+            </w:r>
+            <w:r>
+              <w:rPr>
+                <w:i/>
+                <w:iCs/>
+              </w:rPr>
+              <w:t xml:space="preserve">I</w:t>
+            </w:r>
+            <w:r>
+              <w:t xml:space="preserve">/5</w:t>
+            </w:r>
+          </w:p>
+        </w:tc>
+      </w:tr>
+      <w:tr>
+        <w:tc>
+          <w:tcPr/>
+          <w:p>
+            <w:pPr>
+              <w:pStyle w:val="Compact"/>
+              <w:jc w:val="left"/>
+            </w:pPr>
+            <w:r>
+              <w:t xml:space="preserve">Frequency (continuous mode)</w:t>
+            </w:r>
+          </w:p>
+        </w:tc>
+        <w:tc>
+          <w:tcPr/>
+          <w:p>
+            <w:pPr>
+              <w:pStyle w:val="Compact"/>
+              <w:jc w:val="left"/>
+            </w:pPr>
+            <w:r>
+              <w:t xml:space="preserve">80–160 Hz in 5 Hz steps</w:t>
+            </w:r>
+          </w:p>
+        </w:tc>
+        <w:tc>
+          <w:tcPr/>
+          <w:p>
+            <w:pPr>
+              <w:pStyle w:val="Compact"/>
+              <w:jc w:val="left"/>
+            </w:pPr>
+            <w:r>
+              <w:t xml:space="preserve">Period in whole milliseconds, rounded down:</w:t>
             </w:r>
             <w:r>
               <w:t xml:space="preserve"> </w:t>
@@ -1267,95 +1377,19 @@
               </m:r>
             </m:oMath>
             <w:r>
-              <w:t xml:space="preserve">117 µs</w:t>
-            </w:r>
-          </w:p>
-        </w:tc>
-        <w:tc>
-          <w:tcPr/>
-          <w:p>
-            <w:pPr>
-              <w:pStyle w:val="Compact"/>
-              <w:jc w:val="left"/>
-            </w:pPr>
-            <w:r>
-              <w:t xml:space="preserve">Recovery phase is 5·</w:t>
-            </w:r>
-            <w:r>
-              <w:rPr>
-                <w:i/>
-                <w:iCs/>
-              </w:rPr>
-              <w:t xml:space="preserve">P</w:t>
-            </w:r>
-            <w:r>
-              <w:t xml:space="preserve"> </w:t>
-            </w:r>
-            <w:r>
-              <w:t xml:space="preserve">at</w:t>
-            </w:r>
-            <w:r>
-              <w:t xml:space="preserve"> </w:t>
-            </w:r>
-            <w:r>
-              <w:rPr>
-                <w:i/>
-                <w:iCs/>
-              </w:rPr>
-              <w:t xml:space="preserve">I</w:t>
-            </w:r>
-            <w:r>
-              <w:t xml:space="preserve">/5</w:t>
-            </w:r>
-          </w:p>
-        </w:tc>
-      </w:tr>
-      <w:tr>
-        <w:tc>
-          <w:tcPr/>
-          <w:p>
-            <w:pPr>
-              <w:pStyle w:val="Compact"/>
-              <w:jc w:val="left"/>
-            </w:pPr>
-            <w:r>
-              <w:t xml:space="preserve">Frequency (continuous mode)</w:t>
-            </w:r>
-          </w:p>
-        </w:tc>
-        <w:tc>
-          <w:tcPr/>
-          <w:p>
-            <w:pPr>
-              <w:pStyle w:val="Compact"/>
-              <w:jc w:val="left"/>
-            </w:pPr>
-            <w:r>
-              <w:t xml:space="preserve">80–160 Hz in 5 Hz steps</w:t>
-            </w:r>
-          </w:p>
-        </w:tc>
-        <w:tc>
-          <w:tcPr/>
-          <w:p>
-            <w:pPr>
-              <w:pStyle w:val="Compact"/>
-              <w:jc w:val="left"/>
-            </w:pPr>
-            <w:r>
-              <w:t xml:space="preserve">Period in whole milliseconds, rounded down: 83.3, 90.9, 100, 111.1, 125, 142.9 or 166.7 Hz</w:t>
-            </w:r>
-          </w:p>
-        </w:tc>
-        <w:tc>
-          <w:tcPr/>
-          <w:p>
-            <w:pPr>
-              <w:pStyle w:val="Compact"/>
-              <w:jc w:val="left"/>
-            </w:pPr>
-            <w:r>
-              <w:t xml:space="preserve">130 Hz setting delivers 142.9 Hz</w:t>
+              <w:t xml:space="preserve">83, 91, 100, 111, 125, 143 or 167 Hz</w:t>
+            </w:r>
+          </w:p>
+        </w:tc>
+        <w:tc>
+          <w:tcPr/>
+          <w:p>
+            <w:pPr>
+              <w:pStyle w:val="Compact"/>
+              <w:jc w:val="left"/>
+            </w:pPr>
+            <w:r>
+              <w:t xml:space="preserve">130 Hz setting delivers 142.5 Hz (measured)</w:t>
             </w:r>
           </w:p>
         </w:tc>
@@ -1649,7 +1683,7 @@
         </w:r>
       </w:hyperlink>
       <w:r>
-        <w:t xml:space="preserve">) and printed in PLA on a Bambu Lab X1 Carbon printer.</w:t>
+        <w:t xml:space="preserve">) and printed in PLA on a Bambu Lab X1 Carbon printer. The device with its electrode connector and programming tab weighs 2.17 g, the shroud 0.48 g and each zinc-air cell 0.81 g, for 4.27 g in operation with two cells and the shroud (3.79 g without the shroud).</w:t>
       </w:r>
     </w:p>
     <w:bookmarkEnd w:id="24"/>
@@ -1729,7 +1763,7 @@
         <w:t xml:space="preserve">(Aleksandrova et al., 2013; Creed et al., 2013)</w:t>
       </w:r>
       <w:r>
-        <w:t xml:space="preserve">. Firmware v0.5 does not yet deliver the reference protocol exactly: the 90 µs setting produces a</w:t>
+        <w:t xml:space="preserve">. Firmware v0.5 does not yet reproduce the programmed timing exactly: the 130 Hz setting delivers 142.5 Hz, and at the 180 µs setting the stimulating phase measured</w:t>
       </w:r>
       <w:r>
         <w:t xml:space="preserve"> </w:t>
@@ -1743,7 +1777,7 @@
         </m:r>
       </m:oMath>
       <w:r>
-        <w:t xml:space="preserve">117 µs stimulating phase and the 130 Hz setting produces 142.9 Hz (Table 2). Both are firmware limitations with straightforward fixes (Section 7).</w:t>
+        <w:t xml:space="preserve">60 µs longer than set (Section 4.1). Both are firmware timing limitations with straightforward fixes (Section 7). The amplitude setting is likewise a reproducible command rather than a calibrated delivered current. In practice we titrate amplitude in each animal against its behavioral effect, because electrode impedance and implant location vary between animals; on-board current or impedance sensing would make that titration more direct (Section 7).</w:t>
       </w:r>
     </w:p>
     <w:p>
@@ -1908,7 +1942,7 @@
     </w:p>
     <w:bookmarkEnd w:id="25"/>
     <w:bookmarkEnd w:id="26"/>
-    <w:bookmarkStart w:id="30" w:name="X57bda648fac4c74240b4e4e5b4df06dc7553e60"/>
+    <w:bookmarkStart w:id="31" w:name="X57bda648fac4c74240b4e4e5b4df06dc7553e60"/>
     <w:p>
       <w:pPr>
         <w:pStyle w:val="Heading2"/>
@@ -1925,7 +1959,7 @@
         <w:t xml:space="preserve">Electrode characterization is part of the methods contribution because a constant-current stimulator cannot be evaluated independently of the load it drives.</w:t>
       </w:r>
     </w:p>
-    <w:bookmarkStart w:id="27" w:name="electrode-construction"/>
+    <w:bookmarkStart w:id="28" w:name="electrode-construction"/>
     <w:p>
       <w:pPr>
         <w:pStyle w:val="Heading3"/>
@@ -1939,11 +1973,33 @@
         <w:pStyle w:val="FirstParagraph"/>
       </w:pPr>
       <w:r>
-        <w:t xml:space="preserve">[Pending; see Working notes.]</w:t>
-      </w:r>
-    </w:p>
-    <w:bookmarkEnd w:id="27"/>
-    <w:bookmarkStart w:id="28" w:name="in-vivo-impedance-measurement"/>
+        <w:t xml:space="preserve">Electrodes were implanted using a custom 3D-printed electrode holder designed in Fusion 360 (Autodesk; design available at</w:t>
+      </w:r>
+      <w:r>
+        <w:t xml:space="preserve"> </w:t>
+      </w:r>
+      <w:hyperlink r:id="rId27">
+        <w:r>
+          <w:rPr>
+            <w:rStyle w:val="Hyperlink"/>
+          </w:rPr>
+          <w:t xml:space="preserve">https://a360.co/4rEBmq2</w:t>
+        </w:r>
+      </w:hyperlink>
+      <w:r>
+        <w:t xml:space="preserve">) and printed in clear biocompatible resin.</w:t>
+      </w:r>
+    </w:p>
+    <w:p>
+      <w:pPr>
+        <w:pStyle w:val="BodyText"/>
+      </w:pPr>
+      <w:r>
+        <w:t xml:space="preserve">[Remaining construction details pending; see Working notes.]</w:t>
+      </w:r>
+    </w:p>
+    <w:bookmarkEnd w:id="28"/>
+    <w:bookmarkStart w:id="29" w:name="in-vivo-impedance-measurement"/>
     <w:p>
       <w:pPr>
         <w:pStyle w:val="Heading3"/>
@@ -1997,8 +2053,8 @@
         <w:t xml:space="preserve">Two properties of the measurement bound its interpretation. First, in a bench check against resistive loads, the voltage reported by the StimJim fell 6–73 % below the oscilloscope-measured voltage for loads of 2–68 kΩ, with the largest errors above 10 kΩ; the in-vivo values may therefore underestimate the true load. Second, the 450 µs measurement pulse is longer than typical DBS pulses, so the polarization it includes overstates the voltage needed for shorter pulses. The values below are best treated as an estimate of the load range rather than a calibrated impedance.</w:t>
       </w:r>
     </w:p>
-    <w:bookmarkEnd w:id="28"/>
-    <w:bookmarkStart w:id="29" w:name="Xff818d12ac2e9badea00b0c3b03353ab1a2f357"/>
+    <w:bookmarkEnd w:id="29"/>
+    <w:bookmarkStart w:id="30" w:name="Xff818d12ac2e9badea00b0c3b03353ab1a2f357"/>
     <w:p>
       <w:pPr>
         <w:pStyle w:val="Heading3"/>
@@ -2164,9 +2220,9 @@
         <w:t xml:space="preserve">38–93 µA into the same loads. The usable amplitude is set by electrode impedance and compliance together, not by the programmable range, and it differs between electrodes more than it changes over time after implantation.</w:t>
       </w:r>
     </w:p>
-    <w:bookmarkEnd w:id="29"/>
     <w:bookmarkEnd w:id="30"/>
-    <w:bookmarkStart w:id="34" w:name="X9416b741bc14303dc05a5c9bb70798e5bb11912"/>
+    <w:bookmarkEnd w:id="31"/>
+    <w:bookmarkStart w:id="35" w:name="X9416b741bc14303dc05a5c9bb70798e5bb11912"/>
     <w:p>
       <w:pPr>
         <w:pStyle w:val="Heading2"/>
@@ -2175,7 +2231,7 @@
         <w:t xml:space="preserve">4. Electrical validation of the wireless stimulator</w:t>
       </w:r>
     </w:p>
-    <w:bookmarkStart w:id="31" w:name="current-accuracy-and-pulse-fidelity"/>
+    <w:bookmarkStart w:id="32" w:name="current-accuracy-and-pulse-fidelity"/>
     <w:p>
       <w:pPr>
         <w:pStyle w:val="Heading3"/>
@@ -2189,61 +2245,10 @@
         <w:pStyle w:val="FirstParagraph"/>
       </w:pPr>
       <w:r>
-        <w:t xml:space="preserve">[Pending; see Working notes.]</w:t>
-      </w:r>
-    </w:p>
-    <w:bookmarkEnd w:id="31"/>
-    <w:bookmarkStart w:id="32" w:name="load-tolerance-and-compliance"/>
-    <w:p>
-      <w:pPr>
-        <w:pStyle w:val="Heading3"/>
-      </w:pPr>
-      <w:r>
-        <w:t xml:space="preserve">4.2 Load tolerance and compliance</w:t>
-      </w:r>
-    </w:p>
-    <w:p>
-      <w:pPr>
-        <w:pStyle w:val="FirstParagraph"/>
-      </w:pPr>
-      <w:r>
-        <w:t xml:space="preserve">[Pending; see Working notes.]</w:t>
-      </w:r>
-    </w:p>
-    <w:bookmarkEnd w:id="32"/>
-    <w:bookmarkStart w:id="33" w:name="battery-and-operating-duration"/>
-    <w:p>
-      <w:pPr>
-        <w:pStyle w:val="Heading3"/>
-      </w:pPr>
-      <w:r>
-        <w:t xml:space="preserve">4.3 Battery and operating duration</w:t>
-      </w:r>
-    </w:p>
-    <w:p>
-      <w:pPr>
-        <w:pStyle w:val="FirstParagraph"/>
-      </w:pPr>
-      <w:r>
-        <w:t xml:space="preserve">Battery current was measured at the cell terminals in each operating state with the LED heartbeat active (Table 3). The device draws 1.47 mA when idle and not advertising, 1.62 mA while advertising, 1.89 mA while connected to the application, and 3.15–3.42 mA while stimulating with 60 and 400 µA commanded, respectively, at the 130 Hz frequency setting (142.9 Hz delivered; Table 2).</w:t>
-      </w:r>
-    </w:p>
-    <w:p>
-      <w:pPr>
-        <w:pStyle w:val="BodyText"/>
-      </w:pPr>
-      <w:r>
-        <w:rPr>
-          <w:b/>
-          <w:bCs/>
-        </w:rPr>
-        <w:t xml:space="preserve">Table 3.</w:t>
-      </w:r>
-      <w:r>
-        <w:t xml:space="preserve"> </w:t>
-      </w:r>
-      <w:r>
-        <w:t xml:space="preserve">Measured battery current and projected runtime on two size-13 zinc-air cells in series (</w:t>
+        <w:t xml:space="preserve">Both outputs of a device running firmware v0.5 were loaded with 1 kΩ resistors, and one output was recorded with a Joulescope JS220 at 500 kHz for</w:t>
+      </w:r>
+      <w:r>
+        <w:t xml:space="preserve"> </w:t>
       </w:r>
       <m:oMath>
         <m:r>
@@ -2254,7 +2259,88 @@
         </m:r>
       </m:oMath>
       <w:r>
-        <w:t xml:space="preserve">280 mAh; 90 % of nameplate capacity assumed usable). Stimulation rows use the 130 Hz setting, which delivers 142.9 Hz.</w:t>
+        <w:t xml:space="preserve">11 s at amplitude settings of 10, 50 and 100 % (180 µs, 130 Hz; Figure 5). Delivered current was taken as the voltage across the load divided by 1 kΩ. The meter’s own current channel showed 4–18 µs spikes after each edge from automatic range switching, so both channels were passed through a 38 µs median filter, which removes impulses while preserving steps; charge computed from the voltage changed by less than 0.5 nC with filtering.</w:t>
+      </w:r>
+    </w:p>
+    <w:p>
+      <w:pPr>
+        <w:pStyle w:val="BodyText"/>
+      </w:pPr>
+      <w:r>
+        <w:t xml:space="preserve">Delivered amplitude increased with the setting and was highly repeatable from pulse to pulse. The stimulating phase measured 106, 264 and 530 µA at 10, 50 and 100 %, with a pulse-to-pulse SD below 0.5 µA at every setting. A line through the three settings has a slope of 4.7 µA per percent and an intercept of +47 µA, against the 6 µA per percent shown in the application (Figure 5B). The application value is therefore a reproducible setting rather than a calibrated current: the device delivers more than the nominal value at low settings and less at high settings. The recovery phase scaled with the stimulating phase at 1:4.7–4.9 (22, 56 and 113 µA).</w:t>
+      </w:r>
+    </w:p>
+    <w:p>
+      <w:pPr>
+        <w:pStyle w:val="BodyText"/>
+      </w:pPr>
+      <w:r>
+        <w:t xml:space="preserve">Pulse timing differed from the set values by a nearly constant amount. At the 180 µs setting the stimulating phase lasted 238–254 µs and the recovery phase 854–878 µs, against 900 µs set, so the two phases did not carry equal charge: the median pulse delivered 27, 63 and 125 nC in the stimulating phase and 19, 48 and 96 nC in the recovery phase, leaving a net 9.5, 17.3 and 33.0 nC per period in the stimulating direction (26–35 % of the stimulating-phase charge; Figure 5C). The 130 Hz setting delivered 142.5 Hz at every amplitude, a 7.02 ms period, because firmware v0.5 sets the period in whole milliseconds (Table 2), and the period varied with an SD of 29–38 µs, about one 30.5 µs timer tick. Other pulse widths, additional amplitude points and the behavior into electrode-like loads remain to be measured (Section 4.2).</w:t>
+      </w:r>
+    </w:p>
+    <w:bookmarkEnd w:id="32"/>
+    <w:bookmarkStart w:id="33" w:name="load-tolerance-and-compliance"/>
+    <w:p>
+      <w:pPr>
+        <w:pStyle w:val="Heading3"/>
+      </w:pPr>
+      <w:r>
+        <w:t xml:space="preserve">4.2 Load tolerance and compliance</w:t>
+      </w:r>
+    </w:p>
+    <w:p>
+      <w:pPr>
+        <w:pStyle w:val="FirstParagraph"/>
+      </w:pPr>
+      <w:r>
+        <w:t xml:space="preserve">[Pending; see Working notes.]</w:t>
+      </w:r>
+    </w:p>
+    <w:bookmarkEnd w:id="33"/>
+    <w:bookmarkStart w:id="34" w:name="battery-and-operating-duration"/>
+    <w:p>
+      <w:pPr>
+        <w:pStyle w:val="Heading3"/>
+      </w:pPr>
+      <w:r>
+        <w:t xml:space="preserve">4.3 Battery and operating duration</w:t>
+      </w:r>
+    </w:p>
+    <w:p>
+      <w:pPr>
+        <w:pStyle w:val="FirstParagraph"/>
+      </w:pPr>
+      <w:r>
+        <w:t xml:space="preserve">Battery current was measured at the cell terminals in each operating state with the LED heartbeat active (Table 3). The device draws 1.47 mA when idle and not advertising, 1.62 mA while advertising, 1.89 mA while connected to the application, and 3.15–3.42 mA while stimulating at amplitude settings labeled 60 and 400 µA, respectively, at the 130 Hz frequency setting (142.5 Hz delivered; Section 4.1).</w:t>
+      </w:r>
+    </w:p>
+    <w:p>
+      <w:pPr>
+        <w:pStyle w:val="BodyText"/>
+      </w:pPr>
+      <w:r>
+        <w:rPr>
+          <w:b/>
+          <w:bCs/>
+        </w:rPr>
+        <w:t xml:space="preserve">Table 3.</w:t>
+      </w:r>
+      <w:r>
+        <w:t xml:space="preserve"> </w:t>
+      </w:r>
+      <w:r>
+        <w:t xml:space="preserve">Measured battery current and projected runtime on two size-13 zinc-air cells in series (</w:t>
+      </w:r>
+      <m:oMath>
+        <m:r>
+          <m:rPr>
+            <m:sty m:val="p"/>
+          </m:rPr>
+          <m:t>∼</m:t>
+        </m:r>
+      </m:oMath>
+      <w:r>
+        <w:t xml:space="preserve">280 mAh; 90 % of nameplate capacity assumed usable). Stimulation rows use the 130 Hz setting, which delivers 142.5 Hz, and give the amplitude as labeled in the application.</w:t>
       </w:r>
     </w:p>
     <w:tbl>
@@ -2546,7 +2632,7 @@
         <w:pStyle w:val="BodyText"/>
       </w:pPr>
       <w:r>
-        <w:t xml:space="preserve">Two features of these numbers define the usable experimental window. First, raising the commanded current from 60 to 400 µA adds only 0.27 mA at the battery: stimulation itself is a minor term, and the platform current (boost converter chain, negative rail, DAC and reference, and a microcontroller that remains awake to sequence pulses) sets the runtime. Second, even at the highest measured current a fresh pair of cells supports about three days of continuous stimulation, and more than five days of standby with the phone connected. Hours-long, overnight and multiday experiments can therefore run without disturbing the animal, and longer studies remain feasible through a brief, noninvasive battery exchange that avoids the restraint and handling a tether requires. Zinc-air cells are inexpensive and widely available, which suits a device whose cells are replaced frequently.</w:t>
+        <w:t xml:space="preserve">Two features of these numbers define the usable experimental window. First, raising the amplitude setting from 60 to 400 µA adds only 0.27 mA at the battery: stimulation itself is a minor term, and the platform current (boost converter chain, negative rail, DAC and reference, and a microcontroller that remains awake to sequence pulses) sets the runtime. Second, even at the highest measured current a fresh pair of cells supports about three days of continuous stimulation, and more than five days of standby with the phone connected. Hours-long, overnight and multiday experiments can therefore run without disturbing the animal, and longer studies remain feasible through a brief, noninvasive battery exchange that avoids the restraint and handling a tether requires. Zinc-air cells are inexpensive and widely available, which suits a device whose cells are replaced frequently.</w:t>
       </w:r>
     </w:p>
     <w:p>
@@ -2557,9 +2643,9 @@
         <w:t xml:space="preserve">Runtime should therefore be interpreted against the experimental protocol rather than as a binary acute-versus-chronic designation. The device can be used for chronic studies with scheduled battery exchange; it is not intended as a fully implanted, maintenance-free system operating for weeks or months. Section 7 describes why that use case requires a different architecture rather than a firmware change.</w:t>
       </w:r>
     </w:p>
-    <w:bookmarkEnd w:id="33"/>
     <w:bookmarkEnd w:id="34"/>
-    <w:bookmarkStart w:id="35" w:name="comparison-with-existing-methods"/>
+    <w:bookmarkEnd w:id="35"/>
+    <w:bookmarkStart w:id="36" w:name="comparison-with-existing-methods"/>
     <w:p>
       <w:pPr>
         <w:pStyle w:val="Heading2"/>
@@ -2894,7 +2980,11 @@
           <w:p>
             <w:pPr>
               <w:pStyle w:val="Compact"/>
-            </w:pPr>
+              <w:jc w:val="left"/>
+            </w:pPr>
+            <w:r>
+              <w:t xml:space="preserve">4.27 g with shroud (two zinc-air cells)</w:t>
+            </w:r>
           </w:p>
         </w:tc>
         <w:tc>
@@ -2955,7 +3045,7 @@
               <w:jc w:val="left"/>
             </w:pPr>
             <w:r>
-              <w:t xml:space="preserve">0–625 µA ideal (compliance-limited in vivo);</w:t>
+              <w:t xml:space="preserve">0–625 µA ideal (compliance-limited in vivo); 90–600 µs set;</w:t>
             </w:r>
             <w:r>
               <w:t xml:space="preserve"> </w:t>
@@ -2969,7 +3059,7 @@
               </m:r>
             </m:oMath>
             <w:r>
-              <w:t xml:space="preserve">117–600 µs; 83.3–166.7 Hz delivered; charge-balanced biphasic, 1:5 recovery; continuous or burst</w:t>
+              <w:t xml:space="preserve">83–167 Hz delivered; asymmetric biphasic, 1:5 recovery; continuous or burst</w:t>
             </w:r>
           </w:p>
         </w:tc>
@@ -4480,11 +4570,11 @@
         <w:t xml:space="preserve"> </w:t>
       </w:r>
       <w:r>
-        <w:t xml:space="preserve">is suitable. FLEX-DBS is designed for experiments in which the investigator must set, change and verify parameters at the cage, deliver known current into an uncertain load, and stimulate continuously from hours through multiple days. Section 6 tests whether it behaves like the tethered reference method it replaces.</w:t>
-      </w:r>
-    </w:p>
-    <w:bookmarkEnd w:id="35"/>
-    <w:bookmarkStart w:id="39" w:name="in-vivo-functional-validation"/>
+        <w:t xml:space="preserve">is suitable. FLEX-DBS is designed for experiments in which the investigator must set, change and verify parameters at the cage, deliver regulated current into an uncertain load, and stimulate continuously from hours through multiple days. Section 6 tests whether it behaves like the tethered reference method it replaces.</w:t>
+      </w:r>
+    </w:p>
+    <w:bookmarkEnd w:id="36"/>
+    <w:bookmarkStart w:id="40" w:name="in-vivo-functional-validation"/>
     <w:p>
       <w:pPr>
         <w:pStyle w:val="Heading2"/>
@@ -4493,7 +4583,7 @@
         <w:t xml:space="preserve">6. In-vivo functional validation</w:t>
       </w:r>
     </w:p>
-    <w:bookmarkStart w:id="36" w:name="experimental-paradigm"/>
+    <w:bookmarkStart w:id="37" w:name="experimental-paradigm"/>
     <w:p>
       <w:pPr>
         <w:pStyle w:val="Heading3"/>
@@ -4510,8 +4600,8 @@
         <w:t xml:space="preserve">[Pending; see Working notes.]</w:t>
       </w:r>
     </w:p>
-    <w:bookmarkEnd w:id="36"/>
-    <w:bookmarkStart w:id="37" w:name="video-based-behavioral-analysis"/>
+    <w:bookmarkEnd w:id="37"/>
+    <w:bookmarkStart w:id="38" w:name="video-based-behavioral-analysis"/>
     <w:p>
       <w:pPr>
         <w:pStyle w:val="Heading3"/>
@@ -4528,8 +4618,8 @@
         <w:t xml:space="preserve">[Pending; see Working notes.]</w:t>
       </w:r>
     </w:p>
-    <w:bookmarkEnd w:id="37"/>
-    <w:bookmarkStart w:id="38" w:name="functional-equivalence"/>
+    <w:bookmarkEnd w:id="38"/>
+    <w:bookmarkStart w:id="39" w:name="functional-equivalence"/>
     <w:p>
       <w:pPr>
         <w:pStyle w:val="Heading3"/>
@@ -4546,9 +4636,9 @@
         <w:t xml:space="preserve">[Pending; see Working notes.]</w:t>
       </w:r>
     </w:p>
-    <w:bookmarkEnd w:id="38"/>
     <w:bookmarkEnd w:id="39"/>
-    <w:bookmarkStart w:id="40" w:name="discussion"/>
+    <w:bookmarkEnd w:id="40"/>
+    <w:bookmarkStart w:id="41" w:name="discussion"/>
     <w:p>
       <w:pPr>
         <w:pStyle w:val="Heading2"/>
@@ -4582,7 +4672,7 @@
         <w:pStyle w:val="BodyText"/>
       </w:pPr>
       <w:r>
-        <w:t xml:space="preserve">The in-vivo impedance measurements reinforce that DBS delivery is a systems problem. Electrode impedance and stimulator compliance jointly determine whether the commanded constant current is actually delivered, and impedance differs between electrodes and varies over the weeks after implantation (Section 3). A stimulator specified only by its programmable current range has not been fully specified. For the implanted platinum electrodes used here, 32–80 kΩ in vivo with weekly means of 43–54 kΩ, the ±5 V rails of FLEX-DBS support roughly 60–140 µA, well below the 600 µA programmable range and centered on the 100 µA protocols used in prior work. We therefore recommend reporting the compliance limit alongside the measured impedance distribution (Figure 4B) for any rodent stimulator. Two practical consequences follow. First, electrode impedance is the most direct lever on usable amplitude, and future protocols will establish a method for fabricating lower-impedance electrodes. Second, in our work stimulation parameters were guided by the behavioral effects they produced in prior studies rather than by theory alone; a configurable stimulator lets the experimenter confirm that a chosen amplitude is both deliverable into the implanted load and behaviorally effective, and adjust it if either condition fails.</w:t>
+        <w:t xml:space="preserve">The in-vivo impedance measurements reinforce that DBS delivery is a systems problem. Electrode impedance and stimulator compliance jointly determine whether the commanded constant current is actually delivered, and impedance differs between electrodes and varies over the weeks after implantation (Section 3). A stimulator specified only by its programmable current range has not been fully specified. For the implanted platinum electrodes used here, 32–80 kΩ in vivo with weekly means of 43–54 kΩ, the ±5 V rails of FLEX-DBS support roughly 60–140 µA, well below the 600 µA programmable range and centered on the 100 µA protocols used in prior work. We therefore recommend reporting the compliance limit alongside the measured impedance distribution (Figure 4B) for any rodent stimulator. Two practical consequences follow. First, electrode impedance is the most direct lever on usable amplitude, and future protocols will establish a method for fabricating lower-impedance electrodes. Second, in our work stimulation parameters were guided by the behavioral effects they produced in prior studies rather than by theory alone, and amplitude is titrated in each animal against its behavioral effect rather than taken from the application’s nominal value, because electrode impedance and implant location vary between animals. A configurable stimulator lets the experimenter confirm that a chosen amplitude is both deliverable into the implanted load and behaviorally effective, and adjust it if either condition fails.</w:t>
       </w:r>
     </w:p>
     <w:p>
@@ -4590,7 +4680,7 @@
         <w:pStyle w:val="BodyText"/>
       </w:pPr>
       <w:r>
-        <w:t xml:space="preserve">Flexible multiday systems and fully implanted long-duration systems occupy different optimization spaces, and the current budget in Section 4.3 shows why. Only 0.27 mA of the 3.42 mA drawn during 400 µA stimulation is attributable to stimulation itself; the remainder is the platform. Each source of overhead enables a capability of FLEX-DBS: a boost converter and inverter provide ±5 V compliance; a continuously powered precision DAC and reference set the current accurately; an awake microcontroller sequences each pulse; and the radio stack permits configuration and verification at the cage. Power was reduced within these constraints, most visibly by shutting the output amplifier down between pulses, but maintenance-free operation for weeks or months was not the primary objective. A fully implanted derivative would invert the priorities: battery-direct operation at</w:t>
+        <w:t xml:space="preserve">Flexible multiday systems and fully implanted long-duration systems occupy different optimization spaces, and the current budget in Section 4.3 shows why. Only 0.27 mA of the 3.42 mA drawn at the 400 µA setting is attributable to stimulation itself; the remainder is the platform. Each source of overhead enables a capability of FLEX-DBS: a boost converter and inverter provide ±5 V compliance; a continuously powered precision DAC and reference set the current reproducibly; an awake microcontroller sequences each pulse; and the radio stack permits configuration and verification at the cage. Power was reduced within these constraints, most visibly by shutting the output amplifier down between pulses, but maintenance-free operation for weeks or months was not the primary objective. A fully implanted derivative would invert the priorities: battery-direct operation at</w:t>
       </w:r>
       <w:r>
         <w:t xml:space="preserve"> </w:t>
@@ -4631,7 +4721,7 @@
         <w:t xml:space="preserve"> </w:t>
       </w:r>
       <w:r>
-        <w:t xml:space="preserve">The device’s size and mass suit a head-mounted, accessible system but exclude fully implanted use, and runtime beyond about three days of continuous stimulation requires a battery exchange. The two channels share amplitude and, in the current firmware, timing, so protocols that require different bilateral amplitudes or deliberately offset pulses are not supported without hardware or firmware changes. Firmware v0.5 quantizes the stimulation period to whole milliseconds and cannot deliver stimulating phases shorter than</w:t>
+        <w:t xml:space="preserve">The device’s size and mass suit a head-mounted, accessible system but exclude fully implanted use, and runtime beyond about three days of continuous stimulation requires a battery exchange. The two channels share amplitude and, in the current firmware, timing, so protocols that require different bilateral amplitudes or deliberately offset pulses are not supported without hardware or firmware changes. Firmware v0.5 quantizes the stimulation period to whole milliseconds, so the common 130 Hz setting delivers 142.5 Hz, and its fixed timing compensation leaves the stimulating phase</w:t>
       </w:r>
       <w:r>
         <w:t xml:space="preserve"> </w:t>
@@ -4645,21 +4735,7 @@
         </m:r>
       </m:oMath>
       <w:r>
-        <w:t xml:space="preserve">117 µs, so the common 130 Hz, 90 µs protocol is delivered as 142.9 Hz with a</w:t>
-      </w:r>
-      <w:r>
-        <w:t xml:space="preserve"> </w:t>
-      </w:r>
-      <m:oMath>
-        <m:r>
-          <m:rPr>
-            <m:sty m:val="p"/>
-          </m:rPr>
-          <m:t>∼</m:t>
-        </m:r>
-      </m:oMath>
-      <w:r>
-        <w:t xml:space="preserve">117 µs phase (Table 2). The 80 Hz frequency floor is also set in software and excludes the low-frequency protocols of comparative and therapeutic interest</w:t>
+        <w:t xml:space="preserve">60 µs longer and the recovery phase 22–46 µs shorter than set at 180 µs (Section 4.1). Together with a recovery amplitude slightly below one fifth, this leaves a net charge of 26–35 % of the stimulating-phase charge per pulse into 1 kΩ, which should be corrected before long-duration use; delivered amplitude also departs from the application’s nominal value by an offset and a lower slope (Section 4.1). The 80 Hz frequency floor is also set in software and excludes the low-frequency protocols of comparative and therapeutic interest</w:t>
       </w:r>
       <w:r>
         <w:t xml:space="preserve"> </w:t>
@@ -4668,7 +4744,7 @@
         <w:t xml:space="preserve">(Creed et al., 2015, 2011)</w:t>
       </w:r>
       <w:r>
-        <w:t xml:space="preserve">. The recovery-phase ratio is fixed at 1:5. The Howland pumps are not perfectly load-independent: with 0.1 % resistors, the worst-case resistor mismatch gives an output impedance of about 0.9 MΩ, so delivered current can fall by up to 3–8 % into the 32–80 kΩ loads measured here relative to a low-impedance load. Amplitude should therefore be interpreted against the measured load and the calibration in Section 4.1 rather than as an absolute. Finally, the impedance data come from five electrodes in three mice, with three of eight implanted electrodes excluded, and from a stimulator whose voltage read-back underestimates high loads (Section 3.2).</w:t>
+        <w:t xml:space="preserve">. The recovery-phase ratio is fixed at 1:5. The Howland pumps are not perfectly load-independent: with 0.1 % resistors, the worst-case resistor mismatch gives an output impedance of about 0.9 MΩ, so delivered current can fall by up to 3–8 % into the 32–80 kΩ loads measured here relative to a low-impedance load. Amplitude settings should therefore be interpreted against the measured load and the bench measurements in Section 4.1 rather than as absolute currents. Finally, the impedance data come from five electrodes in three mice, with three of eight implanted electrodes excluded, and from a stimulator whose voltage read-back underestimates high loads (Section 3.2).</w:t>
       </w:r>
     </w:p>
     <w:p>
@@ -4686,11 +4762,11 @@
         <w:t xml:space="preserve"> </w:t>
       </w:r>
       <w:r>
-        <w:t xml:space="preserve">The schematic, firmware, application and protocol are released so that others can reproduce or adapt the platform (Supplementary material). Several extensions are firmware-level within the present hardware: computing the stimulation period in timer ticks rather than whole milliseconds, which would deliver 130 Hz and other frequencies exactly; raising the minimum pulse-width setting to match what is delivered, or restructuring pulse timing to reach shorter phases; independent per-channel timing; a wider frequency range; a selectable recovery ratio; and over-the-air firmware update. Lower-power, fully implanted derivatives would extend the platform’s reach without changing the role of FLEX-DBS as a configurable system for hours-long through multiday experiments.</w:t>
-      </w:r>
-    </w:p>
-    <w:bookmarkEnd w:id="40"/>
-    <w:bookmarkStart w:id="41" w:name="conclusions"/>
+        <w:t xml:space="preserve">The schematic, firmware, application and protocol are released so that others can reproduce or adapt the platform (Supplementary material). Several extensions are firmware-level within the present hardware: computing the stimulation period in timer ticks rather than whole milliseconds, which would deliver 130 Hz and other frequencies exactly; calibrating the phase-timing compensation and recovery amplitude against bench measurements so that the two phases carry equal charge; independent per-channel timing; a wider frequency range; a selectable recovery ratio; and over-the-air firmware update. At the hardware level, on-board sensing of delivered current or electrode voltage would report the stimulation actually delivered and track electrode impedance over the course of an experiment, supporting amplitude titration in each animal. Lower-power, fully implanted derivatives would extend the platform’s reach without changing the role of FLEX-DBS as a configurable system for hours-long through multiday experiments.</w:t>
+      </w:r>
+    </w:p>
+    <w:bookmarkEnd w:id="41"/>
+    <w:bookmarkStart w:id="42" w:name="conclusions"/>
     <w:p>
       <w:pPr>
         <w:pStyle w:val="Heading2"/>
@@ -4707,8 +4783,8 @@
         <w:t xml:space="preserve">FLEX-DBS is a head-mounted, bilateral, constant-current stimulator with real-time smartphone control that supports about three days of continuous stimulation per pair of cells. Its ±5 V compliance rails deliver roughly 60–140 µA into implanted platinum electrodes of 32–80 kΩ, which shows that electrode impedance, not the programmable range, sets usable amplitude in vivo. The platform trades runtime for flexibility and is intended for experiments in which parameters must be set, changed and verified at the cage.</w:t>
       </w:r>
     </w:p>
-    <w:bookmarkEnd w:id="41"/>
-    <w:bookmarkStart w:id="57" w:name="figures"/>
+    <w:bookmarkEnd w:id="42"/>
+    <w:bookmarkStart w:id="61" w:name="figures"/>
     <w:p>
       <w:pPr>
         <w:pStyle w:val="Heading2"/>
@@ -4744,18 +4820,18 @@
           <wp:inline>
             <wp:extent cx="4114800" cy="5778564"/>
             <wp:effectExtent b="0" l="0" r="0" t="0"/>
-            <wp:docPr descr="image" title="" id="43" name="Picture"/>
+            <wp:docPr descr="image" title="" id="44" name="Picture"/>
             <a:graphic>
               <a:graphicData uri="http://schemas.openxmlformats.org/drawingml/2006/picture">
                 <pic:pic>
                   <pic:nvPicPr>
-                    <pic:cNvPr descr="figures/fig1_architecture.png" id="44" name="Picture"/>
+                    <pic:cNvPr descr="figures/fig1_architecture.png" id="45" name="Picture"/>
                     <pic:cNvPicPr>
                       <a:picLocks noChangeArrowheads="1" noChangeAspect="1"/>
                     </pic:cNvPicPr>
                   </pic:nvPicPr>
                   <pic:blipFill>
-                    <a:blip r:embed="rId42"/>
+                    <a:blip r:embed="rId43"/>
                     <a:stretch>
                       <a:fillRect/>
                     </a:stretch>
@@ -4835,18 +4911,18 @@
           <wp:inline>
             <wp:extent cx="2651760" cy="2377440"/>
             <wp:effectExtent b="0" l="0" r="0" t="0"/>
-            <wp:docPr descr="image" title="" id="46" name="Picture"/>
+            <wp:docPr descr="image" title="" id="47" name="Picture"/>
             <a:graphic>
               <a:graphicData uri="http://schemas.openxmlformats.org/drawingml/2006/picture">
                 <pic:pic>
                   <pic:nvPicPr>
-                    <pic:cNvPr descr="figures/FLEX-DBS_deviceScale.jpg" id="47" name="Picture"/>
+                    <pic:cNvPr descr="figures/FLEX-DBS_deviceScale.jpg" id="48" name="Picture"/>
                     <pic:cNvPicPr>
                       <a:picLocks noChangeArrowheads="1" noChangeAspect="1"/>
                     </pic:cNvPicPr>
                   </pic:nvPicPr>
                   <pic:blipFill>
-                    <a:blip r:embed="rId45"/>
+                    <a:blip r:embed="rId46"/>
                     <a:stretch>
                       <a:fillRect/>
                     </a:stretch>
@@ -4880,18 +4956,18 @@
           <wp:inline>
             <wp:extent cx="2651760" cy="2377440"/>
             <wp:effectExtent b="0" l="0" r="0" t="0"/>
-            <wp:docPr descr="image" title="" id="49" name="Picture"/>
+            <wp:docPr descr="image" title="" id="50" name="Picture"/>
             <a:graphic>
               <a:graphicData uri="http://schemas.openxmlformats.org/drawingml/2006/picture">
                 <pic:pic>
                   <pic:nvPicPr>
-                    <pic:cNvPr descr="figures/FLEX-DBS_3D_render.png" id="50" name="Picture"/>
+                    <pic:cNvPr descr="figures/FLEX-DBS_3D_render.png" id="51" name="Picture"/>
                     <pic:cNvPicPr>
                       <a:picLocks noChangeArrowheads="1" noChangeAspect="1"/>
                     </pic:cNvPicPr>
                   </pic:nvPicPr>
                   <pic:blipFill>
-                    <a:blip r:embed="rId48"/>
+                    <a:blip r:embed="rId49"/>
                     <a:stretch>
                       <a:fillRect/>
                     </a:stretch>
@@ -4959,21 +5035,7 @@
         <w:t xml:space="preserve"> </w:t>
       </w:r>
       <w:r>
-        <w:t xml:space="preserve">Burst mode: burst period, intra-burst frequency and burst duration with unit selection. Representative settings are shown (50 %, 90 µs, 130 Hz; 30 s burst period, 10 s burst duration). With firmware v0.5, the 90 µs and 130 Hz settings deliver a</w:t>
-      </w:r>
-      <w:r>
-        <w:t xml:space="preserve"> </w:t>
-      </w:r>
-      <m:oMath>
-        <m:r>
-          <m:rPr>
-            <m:sty m:val="p"/>
-          </m:rPr>
-          <m:t>∼</m:t>
-        </m:r>
-      </m:oMath>
-      <w:r>
-        <w:t xml:space="preserve">117 µs stimulating phase at 142.9 Hz (Table 2).</w:t>
+        <w:t xml:space="preserve">Burst mode: burst period, intra-burst frequency and burst duration with unit selection. Representative settings are shown (50 %, 90 µs, 130 Hz; 30 s burst period, 10 s burst duration). Displayed values are settings; delivered values are given in Table 2.</w:t>
       </w:r>
     </w:p>
     <w:p>
@@ -4985,18 +5047,18 @@
           <wp:inline>
             <wp:extent cx="5029200" cy="4258161"/>
             <wp:effectExtent b="0" l="0" r="0" t="0"/>
-            <wp:docPr descr="image" title="" id="52" name="Picture"/>
+            <wp:docPr descr="image" title="" id="53" name="Picture"/>
             <a:graphic>
               <a:graphicData uri="http://schemas.openxmlformats.org/drawingml/2006/picture">
                 <pic:pic>
                   <pic:nvPicPr>
-                    <pic:cNvPr descr="figures/FLEX-DBS_iPhoneRenders.png" id="53" name="Picture"/>
+                    <pic:cNvPr descr="figures/FLEX-DBS_iPhoneRenders.png" id="54" name="Picture"/>
                     <pic:cNvPicPr>
                       <a:picLocks noChangeArrowheads="1" noChangeAspect="1"/>
                     </pic:cNvPicPr>
                   </pic:nvPicPr>
                   <pic:blipFill>
-                    <a:blip r:embed="rId51"/>
+                    <a:blip r:embed="rId52"/>
                     <a:stretch>
                       <a:fillRect/>
                     </a:stretch>
@@ -5186,18 +5248,18 @@
           <wp:inline>
             <wp:extent cx="5943600" cy="3056708"/>
             <wp:effectExtent b="0" l="0" r="0" t="0"/>
-            <wp:docPr descr="image" title="" id="55" name="Picture"/>
+            <wp:docPr descr="image" title="" id="56" name="Picture"/>
             <a:graphic>
               <a:graphicData uri="http://schemas.openxmlformats.org/drawingml/2006/picture">
                 <pic:pic>
                   <pic:nvPicPr>
-                    <pic:cNvPr descr="figures/fig4_impedance.png" id="56" name="Picture"/>
+                    <pic:cNvPr descr="figures/fig4_impedance.png" id="57" name="Picture"/>
                     <pic:cNvPicPr>
                       <a:picLocks noChangeArrowheads="1" noChangeAspect="1"/>
                     </pic:cNvPicPr>
                   </pic:nvPicPr>
                   <pic:blipFill>
-                    <a:blip r:embed="rId54"/>
+                    <a:blip r:embed="rId55"/>
                     <a:stretch>
                       <a:fillRect/>
                     </a:stretch>
@@ -5224,8 +5286,135 @@
         </w:drawing>
       </w:r>
     </w:p>
-    <w:bookmarkEnd w:id="57"/>
-    <w:bookmarkStart w:id="60" w:name="supplementary-material"/>
+    <w:p>
+      <w:pPr>
+        <w:pStyle w:val="BodyText"/>
+      </w:pPr>
+      <w:r>
+        <w:rPr>
+          <w:b/>
+          <w:bCs/>
+        </w:rPr>
+        <w:t xml:space="preserve">Figure 5. Bench output into a 1 kΩ load.</w:t>
+      </w:r>
+      <w:r>
+        <w:t xml:space="preserve"> </w:t>
+      </w:r>
+      <w:r>
+        <w:t xml:space="preserve">One output of a FLEX-DBS device (firmware v0.5) was loaded with 1 kΩ and recorded at 500 kHz for</w:t>
+      </w:r>
+      <w:r>
+        <w:t xml:space="preserve"> </w:t>
+      </w:r>
+      <m:oMath>
+        <m:r>
+          <m:rPr>
+            <m:sty m:val="p"/>
+          </m:rPr>
+          <m:t>∼</m:t>
+        </m:r>
+      </m:oMath>
+      <w:r>
+        <w:t xml:space="preserve">11 s at each of three amplitude settings (10, 50 and 100 %; 180 µs, 130 Hz). Current is the voltage across the load divided by 1 kΩ, after a 38 µs median filter that removes range-switching artifacts of the meter (Section 4.1).</w:t>
+      </w:r>
+      <w:r>
+        <w:t xml:space="preserve"> </w:t>
+      </w:r>
+      <w:r>
+        <w:rPr>
+          <w:i/>
+          <w:iCs/>
+        </w:rPr>
+        <w:t xml:space="preserve">(A)</w:t>
+      </w:r>
+      <w:r>
+        <w:t xml:space="preserve"> </w:t>
+      </w:r>
+      <w:r>
+        <w:t xml:space="preserve">Median pulse at each setting (1545–1602 pulses); the 5th–95th percentile band lies within the line width. Shading marks the set stimulating (180 µs) and recovery (900 µs) phases.</w:t>
+      </w:r>
+      <w:r>
+        <w:t xml:space="preserve"> </w:t>
+      </w:r>
+      <w:r>
+        <w:rPr>
+          <w:i/>
+          <w:iCs/>
+        </w:rPr>
+        <w:t xml:space="preserve">(B)</w:t>
+      </w:r>
+      <w:r>
+        <w:t xml:space="preserve"> </w:t>
+      </w:r>
+      <w:r>
+        <w:t xml:space="preserve">Mean plateau current of the stimulating (phase 1) and recovery (phase 2) phases against the amplitude setting, with the nominal currents shown in the application (6 µA per percent; recovery, one fifth), the ideal DAC transconductance (6.25 µA per percent) and least-squares lines through the three settings.</w:t>
+      </w:r>
+      <w:r>
+        <w:t xml:space="preserve"> </w:t>
+      </w:r>
+      <w:r>
+        <w:rPr>
+          <w:i/>
+          <w:iCs/>
+        </w:rPr>
+        <w:t xml:space="preserve">(C)</w:t>
+      </w:r>
+      <w:r>
+        <w:t xml:space="preserve"> </w:t>
+      </w:r>
+      <w:r>
+        <w:t xml:space="preserve">Charge in each phase of the median pulse and the mean net charge over a full period. At every setting the delivered frequency was 142.5 Hz, the stimulating phase lasted 238–254 µs and the recovery phase 854–878 µs.</w:t>
+      </w:r>
+    </w:p>
+    <w:p>
+      <w:pPr>
+        <w:pStyle w:val="BodyText"/>
+      </w:pPr>
+      <w:r>
+        <w:drawing>
+          <wp:inline>
+            <wp:extent cx="5943600" cy="4754880"/>
+            <wp:effectExtent b="0" l="0" r="0" t="0"/>
+            <wp:docPr descr="image" title="" id="59" name="Picture"/>
+            <a:graphic>
+              <a:graphicData uri="http://schemas.openxmlformats.org/drawingml/2006/picture">
+                <pic:pic>
+                  <pic:nvPicPr>
+                    <pic:cNvPr descr="figures/fig5_bench.png" id="60" name="Picture"/>
+                    <pic:cNvPicPr>
+                      <a:picLocks noChangeArrowheads="1" noChangeAspect="1"/>
+                    </pic:cNvPicPr>
+                  </pic:nvPicPr>
+                  <pic:blipFill>
+                    <a:blip r:embed="rId58"/>
+                    <a:stretch>
+                      <a:fillRect/>
+                    </a:stretch>
+                  </pic:blipFill>
+                  <pic:spPr bwMode="auto">
+                    <a:xfrm>
+                      <a:off x="0" y="0"/>
+                      <a:ext cx="5943600" cy="4754880"/>
+                    </a:xfrm>
+                    <a:prstGeom prst="rect">
+                      <a:avLst/>
+                    </a:prstGeom>
+                    <a:noFill/>
+                    <a:ln w="9525">
+                      <a:noFill/>
+                      <a:headEnd/>
+                      <a:tailEnd/>
+                    </a:ln>
+                  </pic:spPr>
+                </pic:pic>
+              </a:graphicData>
+            </a:graphic>
+          </wp:inline>
+        </w:drawing>
+      </w:r>
+    </w:p>
+    <w:bookmarkEnd w:id="61"/>
+    <w:bookmarkStart w:id="64" w:name="supplementary-material"/>
     <w:p>
       <w:pPr>
         <w:pStyle w:val="Heading2"/>
@@ -5278,7 +5467,7 @@
       <w:r>
         <w:t xml:space="preserve"> </w:t>
       </w:r>
-      <w:hyperlink r:id="rId58">
+      <w:hyperlink r:id="rId62">
         <w:r>
           <w:rPr>
             <w:rStyle w:val="Hyperlink"/>
@@ -5310,7 +5499,7 @@
       <w:r>
         <w:t xml:space="preserve"> </w:t>
       </w:r>
-      <w:hyperlink r:id="rId59">
+      <w:hyperlink r:id="rId63">
         <w:r>
           <w:rPr>
             <w:rStyle w:val="Hyperlink"/>
@@ -5384,8 +5573,40 @@
         </w:r>
       </w:hyperlink>
     </w:p>
-    <w:bookmarkEnd w:id="60"/>
-    <w:bookmarkStart w:id="61" w:name="author-contributions"/>
+    <w:p>
+      <w:pPr>
+        <w:numPr>
+          <w:ilvl w:val="0"/>
+          <w:numId w:val="1002"/>
+        </w:numPr>
+      </w:pPr>
+      <w:r>
+        <w:rPr>
+          <w:b/>
+          <w:bCs/>
+        </w:rPr>
+        <w:t xml:space="preserve">S6.</w:t>
+      </w:r>
+      <w:r>
+        <w:t xml:space="preserve"> </w:t>
+      </w:r>
+      <w:r>
+        <w:t xml:space="preserve">Electrode holder design (Fusion 360):</w:t>
+      </w:r>
+      <w:r>
+        <w:t xml:space="preserve"> </w:t>
+      </w:r>
+      <w:hyperlink r:id="rId27">
+        <w:r>
+          <w:rPr>
+            <w:rStyle w:val="Hyperlink"/>
+          </w:rPr>
+          <w:t xml:space="preserve">https://a360.co/4rEBmq2</w:t>
+        </w:r>
+      </w:hyperlink>
+    </w:p>
+    <w:bookmarkEnd w:id="64"/>
+    <w:bookmarkStart w:id="65" w:name="author-contributions"/>
     <w:p>
       <w:pPr>
         <w:pStyle w:val="Heading2"/>
@@ -5402,8 +5623,8 @@
         <w:t xml:space="preserve">[Pending; see Working notes.]</w:t>
       </w:r>
     </w:p>
-    <w:bookmarkEnd w:id="61"/>
-    <w:bookmarkStart w:id="62" w:name="competing-interests"/>
+    <w:bookmarkEnd w:id="65"/>
+    <w:bookmarkStart w:id="66" w:name="competing-interests"/>
     <w:p>
       <w:pPr>
         <w:pStyle w:val="Heading2"/>
@@ -5420,8 +5641,8 @@
         <w:t xml:space="preserve">[Pending; see Working notes.]</w:t>
       </w:r>
     </w:p>
-    <w:bookmarkEnd w:id="62"/>
-    <w:bookmarkStart w:id="63" w:name="funding"/>
+    <w:bookmarkEnd w:id="66"/>
+    <w:bookmarkStart w:id="67" w:name="funding"/>
     <w:p>
       <w:pPr>
         <w:pStyle w:val="Heading2"/>
@@ -5438,8 +5659,8 @@
         <w:t xml:space="preserve">[Pending; see Working notes.]</w:t>
       </w:r>
     </w:p>
-    <w:bookmarkEnd w:id="63"/>
-    <w:bookmarkStart w:id="64" w:name="data-and-code-availability"/>
+    <w:bookmarkEnd w:id="67"/>
+    <w:bookmarkStart w:id="68" w:name="data-and-code-availability"/>
     <w:p>
       <w:pPr>
         <w:pStyle w:val="Heading2"/>
@@ -5470,8 +5691,8 @@
         <w:t xml:space="preserve">. The impedance data underlying Figure 4 are available from the corresponding author on request.</w:t>
       </w:r>
     </w:p>
-    <w:bookmarkEnd w:id="64"/>
-    <w:bookmarkStart w:id="65" w:name="acknowledgments"/>
+    <w:bookmarkEnd w:id="68"/>
+    <w:bookmarkStart w:id="69" w:name="acknowledgments"/>
     <w:p>
       <w:pPr>
         <w:pStyle w:val="Heading2"/>
@@ -5488,8 +5709,8 @@
         <w:t xml:space="preserve">[Pending; see Working notes.]</w:t>
       </w:r>
     </w:p>
-    <w:bookmarkEnd w:id="65"/>
-    <w:bookmarkStart w:id="123" w:name="working-notes"/>
+    <w:bookmarkEnd w:id="69"/>
+    <w:bookmarkStart w:id="128" w:name="working-notes"/>
     <w:p>
       <w:pPr>
         <w:pStyle w:val="Heading2"/>
@@ -5506,7 +5727,7 @@
         <w:t xml:space="preserve">Open items for the authors. Remove this section before posting.</w:t>
       </w:r>
     </w:p>
-    <w:bookmarkStart w:id="66" w:name="notes-data"/>
+    <w:bookmarkStart w:id="70" w:name="notes-data"/>
     <w:p>
       <w:pPr>
         <w:pStyle w:val="Heading3"/>
@@ -5533,19 +5754,7 @@
         <w:t xml:space="preserve"> </w:t>
       </w:r>
       <w:r>
-        <w:t xml:space="preserve">Table 4 leaves the FLEX-DBS mass blank. R. Graham (comment, 2026-09-18):</w:t>
-      </w:r>
-      <w:r>
-        <w:t xml:space="preserve"> </w:t>
-      </w:r>
-      <w:r>
-        <w:t xml:space="preserve">“If i remember right, we were around 4.4 grams the last time i weighed a device w/ batteries.”</w:t>
-      </w:r>
-      <w:r>
-        <w:t xml:space="preserve"> </w:t>
-      </w:r>
-      <w:r>
-        <w:t xml:space="preserve">Weigh the device with cells, with and without the shroud and with the programming tab removed, and add the value to Section 2.2 and Table 4.</w:t>
+        <w:t xml:space="preserve">Added to Section 2.2 and Table 4 (2.17 g device with connector and tab, 0.48 g shroud, 0.81 g per cell; 4.27 g total). Optional: weigh with the programming tab removed, since that is how the device is worn.</w:t>
       </w:r>
     </w:p>
     <w:p>
@@ -5620,7 +5829,7 @@
         <w:t xml:space="preserve"> </w:t>
       </w:r>
       <w:r>
-        <w:t xml:space="preserve">Commanded versus measured current into 1 kΩ (resolves the 6.25 µA/% ideal transconductance versus the application’s 6 µA/% label); programmed versus measured stimulating- and recovery-phase widths (confirms the</w:t>
+        <w:t xml:space="preserve">Figure 5 and Section 4.1 now report three amplitude settings at 180 µs, 130 Hz into 1 kΩ; open items are listed under Bench QC below. Still needed for Section 4.2: delivered current versus load at 100 and 400 µA to measure the compliance limit (confirms the</w:t>
       </w:r>
       <w:r>
         <w:t xml:space="preserve"> </w:t>
@@ -5634,7 +5843,216 @@
         </m:r>
       </m:oMath>
       <w:r>
-        <w:t xml:space="preserve">117 µs floor and the 1:5 recovery ratio); delivered current versus load at 100 and 400 µA to measure the compliance limit (confirms the</w:t>
+        <w:t xml:space="preserve">4.9 V swing used in Section 3.3 and Figure 4B) and the Howland load dependence bounded analytically in Section 7, as a new Figure 5 panel with the compliance limit marked; a representative pulse at the reference protocol (90 µs); op-amp on-time per pulse (210 µs + 6·</w:t>
+      </w:r>
+      <w:r>
+        <w:rPr>
+          <w:i/>
+          <w:iCs/>
+        </w:rPr>
+        <w:t xml:space="preserve">P</w:t>
+      </w:r>
+      <w:r>
+        <w:t xml:space="preserve">, currently from firmware constants).</w:t>
+      </w:r>
+    </w:p>
+    <w:p>
+      <w:pPr>
+        <w:numPr>
+          <w:ilvl w:val="0"/>
+          <w:numId w:val="1003"/>
+        </w:numPr>
+      </w:pPr>
+      <w:r>
+        <w:rPr>
+          <w:b/>
+          <w:bCs/>
+        </w:rPr>
+        <w:t xml:space="preserve">Battery measurements (Section 4.3, Table 3).</w:t>
+      </w:r>
+      <w:r>
+        <w:t xml:space="preserve"> </w:t>
+      </w:r>
+      <w:r>
+        <w:t xml:space="preserve">Record the conditions of the current measurements (pulse width, load, LED state, instrument) from the bench notes, and replace the runtime projections with a measured discharge to cutoff.</w:t>
+      </w:r>
+    </w:p>
+    <w:p>
+      <w:pPr>
+        <w:numPr>
+          <w:ilvl w:val="0"/>
+          <w:numId w:val="1003"/>
+        </w:numPr>
+      </w:pPr>
+      <w:r>
+        <w:rPr>
+          <w:b/>
+          <w:bCs/>
+        </w:rPr>
+        <w:t xml:space="preserve">In-vivo validation (Sections 6.1–6.3).</w:t>
+      </w:r>
+      <w:r>
+        <w:t xml:space="preserve"> </w:t>
+      </w:r>
+      <w:r>
+        <w:t xml:space="preserve">Setup, wireless-versus-tethered comparison and behavioral outcome. Planned Figure 6 legend:</w:t>
+      </w:r>
+      <w:r>
+        <w:t xml:space="preserve"> </w:t>
+      </w:r>
+      <w:r>
+        <w:rPr>
+          <w:i/>
+          <w:iCs/>
+        </w:rPr>
+        <w:t xml:space="preserve">(A)</w:t>
+      </w:r>
+      <w:r>
+        <w:t xml:space="preserve"> </w:t>
+      </w:r>
+      <w:r>
+        <w:t xml:space="preserve">head-mounted device on the animal and arena;</w:t>
+      </w:r>
+      <w:r>
+        <w:t xml:space="preserve"> </w:t>
+      </w:r>
+      <w:r>
+        <w:rPr>
+          <w:i/>
+          <w:iCs/>
+        </w:rPr>
+        <w:t xml:space="preserve">(B)</w:t>
+      </w:r>
+      <w:r>
+        <w:t xml:space="preserve"> </w:t>
+      </w:r>
+      <w:r>
+        <w:t xml:space="preserve">example tracking;</w:t>
+      </w:r>
+      <w:r>
+        <w:t xml:space="preserve"> </w:t>
+      </w:r>
+      <w:r>
+        <w:rPr>
+          <w:i/>
+          <w:iCs/>
+        </w:rPr>
+        <w:t xml:space="preserve">(C)</w:t>
+      </w:r>
+      <w:r>
+        <w:t xml:space="preserve"> </w:t>
+      </w:r>
+      <w:r>
+        <w:t xml:space="preserve">behavioral metric for baseline, tethered DBS and FLEX-DBS wireless DBS, per animal and group.</w:t>
+      </w:r>
+    </w:p>
+    <w:p>
+      <w:pPr>
+        <w:numPr>
+          <w:ilvl w:val="0"/>
+          <w:numId w:val="1003"/>
+        </w:numPr>
+      </w:pPr>
+      <w:r>
+        <w:rPr>
+          <w:b/>
+          <w:bCs/>
+        </w:rPr>
+        <w:t xml:space="preserve">Abstract and Conclusions.</w:t>
+      </w:r>
+      <w:r>
+        <w:t xml:space="preserve"> </w:t>
+      </w:r>
+      <w:r>
+        <w:t xml:space="preserve">Update the Results and Conclusions once the load sweep and in-vivo data exist; both currently describe design, 1 kΩ bench, impedance and battery results only.</w:t>
+      </w:r>
+    </w:p>
+    <w:p>
+      <w:pPr>
+        <w:numPr>
+          <w:ilvl w:val="0"/>
+          <w:numId w:val="1003"/>
+        </w:numPr>
+      </w:pPr>
+      <w:r>
+        <w:rPr>
+          <w:b/>
+          <w:bCs/>
+        </w:rPr>
+        <w:t xml:space="preserve">Timing diagram.</w:t>
+      </w:r>
+      <w:r>
+        <w:t xml:space="preserve"> </w:t>
+      </w:r>
+      <w:r>
+        <w:t xml:space="preserve">The per-pulse sequence in Section 2.2 (amplifier enable and 150 µs settle; switches close and 30 µs settle; DAC step to</w:t>
+      </w:r>
+      <w:r>
+        <w:t xml:space="preserve"> </w:t>
+      </w:r>
+      <w:r>
+        <w:rPr>
+          <w:i/>
+          <w:iCs/>
+        </w:rPr>
+        <w:t xml:space="preserve">I</w:t>
+      </w:r>
+      <w:r>
+        <w:t xml:space="preserve"> </w:t>
+      </w:r>
+      <w:r>
+        <w:t xml:space="preserve">for</w:t>
+      </w:r>
+      <w:r>
+        <w:t xml:space="preserve"> </w:t>
+      </w:r>
+      <w:r>
+        <w:rPr>
+          <w:i/>
+          <w:iCs/>
+        </w:rPr>
+        <w:t xml:space="preserve">P</w:t>
+      </w:r>
+      <w:r>
+        <w:t xml:space="preserve">; step to −</w:t>
+      </w:r>
+      <w:r>
+        <w:rPr>
+          <w:i/>
+          <w:iCs/>
+        </w:rPr>
+        <w:t xml:space="preserve">I</w:t>
+      </w:r>
+      <w:r>
+        <w:t xml:space="preserve">/5 for 5·</w:t>
+      </w:r>
+      <w:r>
+        <w:rPr>
+          <w:i/>
+          <w:iCs/>
+        </w:rPr>
+        <w:t xml:space="preserve">P</w:t>
+      </w:r>
+      <w:r>
+        <w:t xml:space="preserve">; return to reference; switches open; amplifier shutdown) could become a Figure 1 inset or a panel of Figure 5, preferably from a scope capture.</w:t>
+      </w:r>
+    </w:p>
+    <w:bookmarkEnd w:id="70"/>
+    <w:bookmarkStart w:id="71" w:name="notes-bench-qc"/>
+    <w:p>
+      <w:pPr>
+        <w:pStyle w:val="Heading3"/>
+      </w:pPr>
+      <w:r>
+        <w:t xml:space="preserve">Bench QC, 1 kΩ load (2026-10-01)</w:t>
+      </w:r>
+    </w:p>
+    <w:p>
+      <w:pPr>
+        <w:pStyle w:val="FirstParagraph"/>
+      </w:pPr>
+      <w:r>
+        <w:t xml:space="preserve">Three Joulescope JS220 recordings (500 kHz,</w:t>
       </w:r>
       <w:r>
         <w:t xml:space="preserve"> </w:t>
@@ -5648,88 +6066,44 @@
         </m:r>
       </m:oMath>
       <w:r>
-        <w:t xml:space="preserve">4.9 V swing used in Section 3.3 and Figure 4B) and the Howland load dependence bounded analytically in Section 7; a representative pulse at the reference protocol; op-amp on-time per pulse (210 µs + 6·</w:t>
+        <w:t xml:space="preserve">11 s each) at 10, 50 and 100 % amplitude, 180 µs, 130 Hz set, 1 kΩ on both outputs, one output recorded (</w:t>
       </w:r>
       <w:r>
         <w:rPr>
-          <w:i/>
-          <w:iCs/>
+          <w:rStyle w:val="VerbatimChar"/>
         </w:rPr>
-        <w:t xml:space="preserve">P</w:t>
-      </w:r>
-      <w:r>
-        <w:t xml:space="preserve">, currently from firmware constants). Planned Figure 5 legend:</w:t>
+        <w:t xml:space="preserve">data/bench/</w:t>
+      </w:r>
+      <w:r>
+        <w:t xml:space="preserve">, analyzed with</w:t>
       </w:r>
       <w:r>
         <w:t xml:space="preserve"> </w:t>
       </w:r>
       <w:r>
         <w:rPr>
-          <w:i/>
-          <w:iCs/>
+          <w:rStyle w:val="VerbatimChar"/>
         </w:rPr>
-        <w:t xml:space="preserve">(A)</w:t>
-      </w:r>
-      <w:r>
-        <w:t xml:space="preserve"> </w:t>
-      </w:r>
-      <w:r>
-        <w:t xml:space="preserve">commanded versus measured current into 1 kΩ;</w:t>
-      </w:r>
-      <w:r>
-        <w:t xml:space="preserve"> </w:t>
+        <w:t xml:space="preserve">data/bench/bench_qc.py</w:t>
+      </w:r>
+      <w:r>
+        <w:t xml:space="preserve">). Results are in Section 4.1 and Figure 5 (</w:t>
       </w:r>
       <w:r>
         <w:rPr>
-          <w:i/>
-          <w:iCs/>
+          <w:rStyle w:val="VerbatimChar"/>
         </w:rPr>
-        <w:t xml:space="preserve">(B)</w:t>
-      </w:r>
-      <w:r>
-        <w:t xml:space="preserve"> </w:t>
-      </w:r>
-      <w:r>
-        <w:t xml:space="preserve">programmed versus measured stimulating- and recovery-phase widths;</w:t>
-      </w:r>
-      <w:r>
-        <w:t xml:space="preserve"> </w:t>
-      </w:r>
-      <w:r>
-        <w:rPr>
-          <w:i/>
-          <w:iCs/>
-        </w:rPr>
-        <w:t xml:space="preserve">(C)</w:t>
-      </w:r>
-      <w:r>
-        <w:t xml:space="preserve"> </w:t>
-      </w:r>
-      <w:r>
-        <w:t xml:space="preserve">representative pulse at the reference protocol showing the asymmetric recovery phase;</w:t>
-      </w:r>
-      <w:r>
-        <w:t xml:space="preserve"> </w:t>
-      </w:r>
-      <w:r>
-        <w:rPr>
-          <w:i/>
-          <w:iCs/>
-        </w:rPr>
-        <w:t xml:space="preserve">(D)</w:t>
-      </w:r>
-      <w:r>
-        <w:t xml:space="preserve"> </w:t>
-      </w:r>
-      <w:r>
-        <w:t xml:space="preserve">delivered current versus load at 100 and 400 µA with the compliance limit marked.</w:t>
+        <w:t xml:space="preserve">figures/scripts/fig_bench.py</w:t>
+      </w:r>
+      <w:r>
+        <w:t xml:space="preserve">). Firmware is not being changed now. Open items:</w:t>
       </w:r>
     </w:p>
     <w:p>
       <w:pPr>
         <w:numPr>
           <w:ilvl w:val="0"/>
-          <w:numId w:val="1003"/>
+          <w:numId w:val="1004"/>
         </w:numPr>
       </w:pPr>
       <w:r>
@@ -5737,20 +6111,34 @@
           <w:b/>
           <w:bCs/>
         </w:rPr>
-        <w:t xml:space="preserve">Battery measurements (Section 4.3, Table 3).</w:t>
-      </w:r>
-      <w:r>
-        <w:t xml:space="preserve"> </w:t>
-      </w:r>
-      <w:r>
-        <w:t xml:space="preserve">Record the conditions of the current measurements (pulse width, load, LED state, instrument) from the bench notes, and replace the runtime projections with a measured discharge to cutoff.</w:t>
+        <w:t xml:space="preserve">More amplitude points.</w:t>
+      </w:r>
+      <w:r>
+        <w:t xml:space="preserve"> </w:t>
+      </w:r>
+      <w:r>
+        <w:t xml:space="preserve">Measure 0 % and several intermediate settings. The three points give 4.7 µA/% with a +47 µA intercept but deviate from that line by up to</w:t>
+      </w:r>
+      <w:r>
+        <w:t xml:space="preserve"> </w:t>
+      </w:r>
+      <m:oMath>
+        <m:r>
+          <m:rPr>
+            <m:sty m:val="p"/>
+          </m:rPr>
+          <m:t>∼</m:t>
+        </m:r>
+      </m:oMath>
+      <w:r>
+        <w:t xml:space="preserve">20 µA, and phase 2 does not shift by the same offset, so the cause (Howland mismatch, DAC code mapping or something else) is not yet identified.</w:t>
       </w:r>
     </w:p>
     <w:p>
       <w:pPr>
         <w:numPr>
           <w:ilvl w:val="0"/>
-          <w:numId w:val="1003"/>
+          <w:numId w:val="1004"/>
         </w:numPr>
       </w:pPr>
       <w:r>
@@ -5758,68 +6146,20 @@
           <w:b/>
           <w:bCs/>
         </w:rPr>
-        <w:t xml:space="preserve">In-vivo validation (Sections 6.1–6.3).</w:t>
-      </w:r>
-      <w:r>
-        <w:t xml:space="preserve"> </w:t>
-      </w:r>
-      <w:r>
-        <w:t xml:space="preserve">Setup, wireless-versus-tethered comparison and behavioral outcome. Planned Figure 6 legend:</w:t>
-      </w:r>
-      <w:r>
-        <w:t xml:space="preserve"> </w:t>
-      </w:r>
-      <w:r>
-        <w:rPr>
-          <w:i/>
-          <w:iCs/>
-        </w:rPr>
-        <w:t xml:space="preserve">(A)</w:t>
-      </w:r>
-      <w:r>
-        <w:t xml:space="preserve"> </w:t>
-      </w:r>
-      <w:r>
-        <w:t xml:space="preserve">head-mounted device on the animal and arena;</w:t>
-      </w:r>
-      <w:r>
-        <w:t xml:space="preserve"> </w:t>
-      </w:r>
-      <w:r>
-        <w:rPr>
-          <w:i/>
-          <w:iCs/>
-        </w:rPr>
-        <w:t xml:space="preserve">(B)</w:t>
-      </w:r>
-      <w:r>
-        <w:t xml:space="preserve"> </w:t>
-      </w:r>
-      <w:r>
-        <w:t xml:space="preserve">example tracking;</w:t>
-      </w:r>
-      <w:r>
-        <w:t xml:space="preserve"> </w:t>
-      </w:r>
-      <w:r>
-        <w:rPr>
-          <w:i/>
-          <w:iCs/>
-        </w:rPr>
-        <w:t xml:space="preserve">(C)</w:t>
-      </w:r>
-      <w:r>
-        <w:t xml:space="preserve"> </w:t>
-      </w:r>
-      <w:r>
-        <w:t xml:space="preserve">behavioral metric for baseline, tethered DBS and FLEX-DBS wireless DBS, per animal and group.</w:t>
+        <w:t xml:space="preserve">Other pulse widths.</w:t>
+      </w:r>
+      <w:r>
+        <w:t xml:space="preserve"> </w:t>
+      </w:r>
+      <w:r>
+        <w:t xml:space="preserve">Measure several settings, including 90 µs, to separate a fixed timing offset from a proportional error and to find what the 90 µs reference setting actually delivers.</w:t>
       </w:r>
     </w:p>
     <w:p>
       <w:pPr>
         <w:numPr>
           <w:ilvl w:val="0"/>
-          <w:numId w:val="1003"/>
+          <w:numId w:val="1004"/>
         </w:numPr>
       </w:pPr>
       <w:r>
@@ -5827,20 +6167,54 @@
           <w:b/>
           <w:bCs/>
         </w:rPr>
-        <w:t xml:space="preserve">Abstract and Conclusions.</w:t>
-      </w:r>
-      <w:r>
-        <w:t xml:space="preserve"> </w:t>
-      </w:r>
-      <w:r>
-        <w:t xml:space="preserve">Update the Results and Conclusions once bench and in-vivo data exist; both currently describe design, impedance and battery results only.</w:t>
+        <w:t xml:space="preserve">Interpulse transient.</w:t>
+      </w:r>
+      <w:r>
+        <w:t xml:space="preserve"> </w:t>
+      </w:r>
+      <w:r>
+        <w:t xml:space="preserve">A brief transient about 2 ms after each pulse ends (largest on the current channel,</w:t>
+      </w:r>
+      <w:r>
+        <w:t xml:space="preserve"> </w:t>
+      </w:r>
+      <m:oMath>
+        <m:r>
+          <m:rPr>
+            <m:sty m:val="p"/>
+          </m:rPr>
+          <m:t>∼</m:t>
+        </m:r>
+      </m:oMath>
+      <m:oMath>
+        <m:r>
+          <m:rPr>
+            <m:sty m:val="p"/>
+          </m:rPr>
+          <m:t>−</m:t>
+        </m:r>
+      </m:oMath>
+      <w:r>
+        <w:t xml:space="preserve">8 mV on the voltage channel) matches the</w:t>
+      </w:r>
+      <w:r>
+        <w:t xml:space="preserve"> </w:t>
+      </w:r>
+      <w:r>
+        <w:t xml:space="preserve">“artifact at SHDN+2 ms”</w:t>
+      </w:r>
+      <w:r>
+        <w:t xml:space="preserve"> </w:t>
+      </w:r>
+      <w:r>
+        <w:t xml:space="preserve">described in the firmware comments (LT6020 shutdown coupling through the open switch). The median filter suppresses it, so its absence in filtered plots should not be read as absence in the device; raw traces are shown in grey in the QC figures.</w:t>
       </w:r>
     </w:p>
     <w:p>
       <w:pPr>
         <w:numPr>
           <w:ilvl w:val="0"/>
-          <w:numId w:val="1003"/>
+          <w:numId w:val="1004"/>
         </w:numPr>
       </w:pPr>
       <w:r>
@@ -5848,72 +6222,27 @@
           <w:b/>
           <w:bCs/>
         </w:rPr>
-        <w:t xml:space="preserve">Timing diagram.</w:t>
-      </w:r>
-      <w:r>
-        <w:t xml:space="preserve"> </w:t>
-      </w:r>
-      <w:r>
-        <w:t xml:space="preserve">The per-pulse sequence in Section 2.2 (amplifier enable and 150 µs settle; switches close and 30 µs settle; DAC step to</w:t>
-      </w:r>
-      <w:r>
-        <w:t xml:space="preserve"> </w:t>
-      </w:r>
-      <w:r>
-        <w:rPr>
-          <w:i/>
-          <w:iCs/>
-        </w:rPr>
-        <w:t xml:space="preserve">I</w:t>
-      </w:r>
-      <w:r>
-        <w:t xml:space="preserve"> </w:t>
-      </w:r>
-      <w:r>
-        <w:t xml:space="preserve">for</w:t>
-      </w:r>
-      <w:r>
-        <w:t xml:space="preserve"> </w:t>
-      </w:r>
-      <w:r>
-        <w:rPr>
-          <w:i/>
-          <w:iCs/>
-        </w:rPr>
-        <w:t xml:space="preserve">P</w:t>
-      </w:r>
-      <w:r>
-        <w:t xml:space="preserve">; step to −</w:t>
-      </w:r>
-      <w:r>
-        <w:rPr>
-          <w:i/>
-          <w:iCs/>
-        </w:rPr>
-        <w:t xml:space="preserve">I</w:t>
-      </w:r>
-      <w:r>
-        <w:t xml:space="preserve">/5 for 5·</w:t>
-      </w:r>
-      <w:r>
-        <w:rPr>
-          <w:i/>
-          <w:iCs/>
-        </w:rPr>
-        <w:t xml:space="preserve">P</w:t>
-      </w:r>
-      <w:r>
-        <w:t xml:space="preserve">; return to reference; switches open; amplifier shutdown) could become a Figure 1 inset or a panel of Figure 5, preferably from a scope capture.</w:t>
-      </w:r>
-    </w:p>
-    <w:bookmarkEnd w:id="66"/>
-    <w:bookmarkStart w:id="67" w:name="notes-impedance"/>
-    <w:p>
-      <w:pPr>
-        <w:pStyle w:val="Heading3"/>
-      </w:pPr>
-      <w:r>
-        <w:t xml:space="preserve">Impedance measurement</w:t>
+        <w:t xml:space="preserve">Phase 1 step.</w:t>
+      </w:r>
+      <w:r>
+        <w:t xml:space="preserve"> </w:t>
+      </w:r>
+      <w:r>
+        <w:t xml:space="preserve">At 10 % the phase 1 plateau steps up by</w:t>
+      </w:r>
+      <w:r>
+        <w:t xml:space="preserve"> </w:t>
+      </w:r>
+      <m:oMath>
+        <m:r>
+          <m:rPr>
+            <m:sty m:val="p"/>
+          </m:rPr>
+          <m:t>∼</m:t>
+        </m:r>
+      </m:oMath>
+      <w:r>
+        <w:t xml:space="preserve">10 µA partway through (visible in Figure 5A). Not investigated.</w:t>
       </w:r>
     </w:p>
     <w:p>
@@ -5924,81 +6253,27 @@
         </w:numPr>
       </w:pPr>
       <w:r>
-        <w:t xml:space="preserve">Data come from the platinum cohort 1 (M1, M2) and platinum cohort 2 (F1, F2) sheets. Excluded: M1 output 0 (near 0 V throughout, likely a short) and both electrodes of F1 (unstable; 47–118 kΩ and 23–106 kΩ between sessions, with within-session drift at 7 weeks). Analyzed: five electrodes from M1, M2 and F2. Confirm the wording of the exclusion criteria, and consider stating a quantitative criterion.</w:t>
-      </w:r>
-    </w:p>
-    <w:p>
-      <w:pPr>
-        <w:numPr>
-          <w:ilvl w:val="0"/>
-          <w:numId w:val="1004"/>
-        </w:numPr>
-      </w:pPr>
-      <w:r>
-        <w:t xml:space="preserve">The cohort 2 week-4 session was recorded at 4 weeks + 1 day and is plotted and analyzed as week 4.</w:t>
-      </w:r>
-    </w:p>
-    <w:p>
-      <w:pPr>
-        <w:numPr>
-          <w:ilvl w:val="0"/>
-          <w:numId w:val="1004"/>
-        </w:numPr>
-      </w:pPr>
-      <w:r>
-        <w:t xml:space="preserve">The StimJim bench check (2/10/20/68 kΩ) showed its voltage read-back 6–73 % below the oscilloscope, so the in-vivo values may be underestimates. Consider remeasuring with an impedance meter (for example, a NanoZ at 1 kHz) or with an oscilloscope on the StimJim output, and report both.</w:t>
-      </w:r>
-    </w:p>
-    <w:p>
-      <w:pPr>
-        <w:numPr>
-          <w:ilvl w:val="0"/>
-          <w:numId w:val="1004"/>
-        </w:numPr>
-      </w:pPr>
-      <w:r>
-        <w:t xml:space="preserve">The 450 µs measurement pulse is longer than the DBS pulses; a measurement at the stimulation pulse width would better match the compliance calculation.</w:t>
-      </w:r>
-    </w:p>
-    <w:p>
-      <w:pPr>
-        <w:numPr>
-          <w:ilvl w:val="0"/>
-          <w:numId w:val="1004"/>
-        </w:numPr>
-      </w:pPr>
-      <w:r>
-        <w:t xml:space="preserve">The two-electrode configuration is justified with</w:t>
-      </w:r>
-      <w:r>
-        <w:t xml:space="preserve"> </w:t>
-      </w:r>
-      <w:r>
-        <w:t xml:space="preserve">Koo and Weiland (2018)</w:t>
-      </w:r>
-      <w:r>
-        <w:t xml:space="preserve">; confirm that this is the framing the authors want.</w:t>
-      </w:r>
-    </w:p>
-    <w:p>
-      <w:pPr>
-        <w:numPr>
-          <w:ilvl w:val="0"/>
-          <w:numId w:val="1004"/>
-        </w:numPr>
-      </w:pPr>
-      <w:r>
-        <w:t xml:space="preserve">The other workbook sheets (gold-plated platinum, in vivo two months post, in vivo, bench testing) are not used.</w:t>
-      </w:r>
-    </w:p>
-    <w:bookmarkEnd w:id="67"/>
-    <w:bookmarkStart w:id="68" w:name="notes-citations"/>
+        <w:rPr>
+          <w:b/>
+          <w:bCs/>
+        </w:rPr>
+        <w:t xml:space="preserve">Load sweep.</w:t>
+      </w:r>
+      <w:r>
+        <w:t xml:space="preserve"> </w:t>
+      </w:r>
+      <w:r>
+        <w:t xml:space="preserve">Delivered current versus load for Section 4.2 (see Bench electrical characterization above).</w:t>
+      </w:r>
+    </w:p>
+    <w:bookmarkEnd w:id="71"/>
+    <w:bookmarkStart w:id="72" w:name="notes-impedance"/>
     <w:p>
       <w:pPr>
         <w:pStyle w:val="Heading3"/>
       </w:pPr>
       <w:r>
-        <w:t xml:space="preserve">Citations to add or verify</w:t>
+        <w:t xml:space="preserve">Impedance measurement</w:t>
       </w:r>
     </w:p>
     <w:p>
@@ -6009,7 +6284,7 @@
         </w:numPr>
       </w:pPr>
       <w:r>
-        <w:t xml:space="preserve">Introduction: the claims that tethers constrain behavior or add stress, and that some therapeutic effects of DBS develop over days to weeks, have no citation and were softened. Add references or keep the softened wording.</w:t>
+        <w:t xml:space="preserve">Data come from the platinum cohort 1 (M1, M2) and platinum cohort 2 (F1, F2) sheets. Excluded: M1 output 0 (near 0 V throughout, likely a short) and both electrodes of F1 (unstable; 47–118 kΩ and 23–106 kΩ between sessions, with within-session drift at 7 weeks). Analyzed: five electrodes from M1, M2 and F2. Confirm the wording of the exclusion criteria, and consider stating a quantitative criterion.</w:t>
       </w:r>
     </w:p>
     <w:p>
@@ -6020,19 +6295,7 @@
         </w:numPr>
       </w:pPr>
       <w:r>
-        <w:t xml:space="preserve">Introduction:</w:t>
-      </w:r>
-      <w:r>
-        <w:t xml:space="preserve"> </w:t>
-      </w:r>
-      <w:r>
-        <w:t xml:space="preserve">Creed (2018)</w:t>
-      </w:r>
-      <w:r>
-        <w:t xml:space="preserve"> </w:t>
-      </w:r>
-      <w:r>
-        <w:t xml:space="preserve">reviews neuromodulation for addiction; confirm that it supports the sentence on subthalamic stimulation parameters, or substitute a subthalamic reference.</w:t>
+        <w:t xml:space="preserve">The cohort 2 week-4 session was recorded at 4 weeks + 1 day and is plotted and analyzed as week 4.</w:t>
       </w:r>
     </w:p>
     <w:p>
@@ -6043,43 +6306,7 @@
         </w:numPr>
       </w:pPr>
       <w:r>
-        <w:t xml:space="preserve">Section 2.3: confirm that</w:t>
-      </w:r>
-      <w:r>
-        <w:t xml:space="preserve"> </w:t>
-      </w:r>
-      <w:r>
-        <w:t xml:space="preserve">Aleksandrova et al. (2013)</w:t>
-      </w:r>
-      <w:r>
-        <w:t xml:space="preserve"> </w:t>
-      </w:r>
-      <w:r>
-        <w:t xml:space="preserve">and</w:t>
-      </w:r>
-      <w:r>
-        <w:t xml:space="preserve"> </w:t>
-      </w:r>
-      <w:r>
-        <w:t xml:space="preserve">Creed et al. (2013)</w:t>
-      </w:r>
-      <w:r>
-        <w:t xml:space="preserve"> </w:t>
-      </w:r>
-      <w:r>
-        <w:t xml:space="preserve">used amplitudes in the several-hundred-microampere range, and that</w:t>
-      </w:r>
-      <w:r>
-        <w:t xml:space="preserve"> </w:t>
-      </w:r>
-      <w:r>
-        <w:t xml:space="preserve">Creed et al. (2012)</w:t>
-      </w:r>
-      <w:r>
-        <w:t xml:space="preserve"> </w:t>
-      </w:r>
-      <w:r>
-        <w:t xml:space="preserve">is the right citation for the 100 µA, 90 µs, 130 Hz reference protocol.</w:t>
+        <w:t xml:space="preserve">The StimJim bench check (2/10/20/68 kΩ) showed its voltage read-back 6–73 % below the oscilloscope, so the in-vivo values may be underestimates. Consider remeasuring with an impedance meter (for example, a NanoZ at 1 kHz) or with an oscilloscope on the StimJim output, and report both.</w:t>
       </w:r>
     </w:p>
     <w:p>
@@ -6090,16 +6317,7 @@
         </w:numPr>
       </w:pPr>
       <w:r>
-        <w:t xml:space="preserve">The Howland balance and load-dependence analysis cites the TI application note</w:t>
-      </w:r>
-      <w:r>
-        <w:t xml:space="preserve"> </w:t>
-      </w:r>
-      <w:r>
-        <w:t xml:space="preserve">(Texas Instruments, 2008)</w:t>
-      </w:r>
-      <w:r>
-        <w:t xml:space="preserve">; a peer-reviewed source could be added.</w:t>
+        <w:t xml:space="preserve">The 450 µs measurement pulse is longer than the DBS pulses; a measurement at the stimulation pulse width would better match the compliance calculation.</w:t>
       </w:r>
     </w:p>
     <w:p>
@@ -6110,23 +6328,37 @@
         </w:numPr>
       </w:pPr>
       <w:r>
-        <w:t xml:space="preserve">Paulat et al. (2026)</w:t>
-      </w:r>
-      <w:r>
-        <w:t xml:space="preserve"> </w:t>
-      </w:r>
-      <w:r>
-        <w:t xml:space="preserve">is a Research Square preprint; update if it is published.</w:t>
-      </w:r>
-    </w:p>
-    <w:bookmarkEnd w:id="68"/>
-    <w:bookmarkStart w:id="69" w:name="notes-table4"/>
+        <w:t xml:space="preserve">The two-electrode configuration is justified with</w:t>
+      </w:r>
+      <w:r>
+        <w:t xml:space="preserve"> </w:t>
+      </w:r>
+      <w:r>
+        <w:t xml:space="preserve">Koo and Weiland (2018)</w:t>
+      </w:r>
+      <w:r>
+        <w:t xml:space="preserve">; confirm that this is the framing the authors want.</w:t>
+      </w:r>
+    </w:p>
+    <w:p>
+      <w:pPr>
+        <w:numPr>
+          <w:ilvl w:val="0"/>
+          <w:numId w:val="1005"/>
+        </w:numPr>
+      </w:pPr>
+      <w:r>
+        <w:t xml:space="preserve">The other workbook sheets (gold-plated platinum, in vivo two months post, in vivo, bench testing) are not used.</w:t>
+      </w:r>
+    </w:p>
+    <w:bookmarkEnd w:id="72"/>
+    <w:bookmarkStart w:id="73" w:name="notes-citations"/>
     <w:p>
       <w:pPr>
         <w:pStyle w:val="Heading3"/>
       </w:pPr>
       <w:r>
-        <w:t xml:space="preserve">Table 4</w:t>
+        <w:t xml:space="preserve">Citations to add or verify</w:t>
       </w:r>
     </w:p>
     <w:p>
@@ -6137,25 +6369,7 @@
         </w:numPr>
       </w:pPr>
       <w:r>
-        <w:t xml:space="preserve">Haas et al. (2012)</w:t>
-      </w:r>
-      <w:r>
-        <w:t xml:space="preserve"> </w:t>
-      </w:r>
-      <w:r>
-        <w:t xml:space="preserve">is paywalled and only its abstract was checked, so most of its row is blank. Secondary sources</w:t>
-      </w:r>
-      <w:r>
-        <w:t xml:space="preserve"> </w:t>
-      </w:r>
-      <w:r>
-        <w:t xml:space="preserve">(Kouzani et al., 2013)</w:t>
-      </w:r>
-      <w:r>
-        <w:t xml:space="preserve"> </w:t>
-      </w:r>
-      <w:r>
-        <w:t xml:space="preserve">describe it as a 2.1 g, 8 × 30 mm cylinder with a 4.65 V battery, magnet on/off, parameters set with a programming fixture and fixed resistors, and a 10 h runtime; the parameter cell in that source is garbled (probably 20–100 µA, 60 µs, 131 Hz). Verify against the original and fill in.</w:t>
+        <w:t xml:space="preserve">Introduction: the claims that tethers constrain behavior or add stress, and that some therapeutic effects of DBS develop over days to weeks, have no citation and were softened. Add references or keep the softened wording.</w:t>
       </w:r>
     </w:p>
     <w:p>
@@ -6166,37 +6380,19 @@
         </w:numPr>
       </w:pPr>
       <w:r>
-        <w:t xml:space="preserve">Supplementary files were not read for</w:t>
-      </w:r>
-      <w:r>
-        <w:t xml:space="preserve"> </w:t>
-      </w:r>
-      <w:r>
-        <w:t xml:space="preserve">Burton et al. (2021)</w:t>
-      </w:r>
-      <w:r>
-        <w:t xml:space="preserve"> </w:t>
-      </w:r>
-      <w:r>
-        <w:t xml:space="preserve">or</w:t>
-      </w:r>
-      <w:r>
-        <w:t xml:space="preserve"> </w:t>
-      </w:r>
-      <w:r>
-        <w:t xml:space="preserve">Shen et al. (2026)</w:t>
-      </w:r>
-      <w:r>
-        <w:t xml:space="preserve">, and</w:t>
-      </w:r>
-      <w:r>
-        <w:t xml:space="preserve"> </w:t>
-      </w:r>
-      <w:r>
-        <w:t xml:space="preserve">Paulat et al. (2026)</w:t>
-      </w:r>
-      <w:r>
-        <w:t xml:space="preserve">’s programmable ranges and battery models come from its supplement. The Pinnell firmware release was not checked in the Figshare repository.</w:t>
+        <w:t xml:space="preserve">Introduction:</w:t>
+      </w:r>
+      <w:r>
+        <w:t xml:space="preserve"> </w:t>
+      </w:r>
+      <w:r>
+        <w:t xml:space="preserve">Creed (2018)</w:t>
+      </w:r>
+      <w:r>
+        <w:t xml:space="preserve"> </w:t>
+      </w:r>
+      <w:r>
+        <w:t xml:space="preserve">reviews neuromodulation for addiction; confirm that it supports the sentence on subthalamic stimulation parameters, or substitute a subthalamic reference.</w:t>
       </w:r>
     </w:p>
     <w:p>
@@ -6204,6 +6400,170 @@
         <w:numPr>
           <w:ilvl w:val="0"/>
           <w:numId w:val="1006"/>
+        </w:numPr>
+      </w:pPr>
+      <w:r>
+        <w:t xml:space="preserve">Section 2.3: confirm that</w:t>
+      </w:r>
+      <w:r>
+        <w:t xml:space="preserve"> </w:t>
+      </w:r>
+      <w:r>
+        <w:t xml:space="preserve">Aleksandrova et al. (2013)</w:t>
+      </w:r>
+      <w:r>
+        <w:t xml:space="preserve"> </w:t>
+      </w:r>
+      <w:r>
+        <w:t xml:space="preserve">and</w:t>
+      </w:r>
+      <w:r>
+        <w:t xml:space="preserve"> </w:t>
+      </w:r>
+      <w:r>
+        <w:t xml:space="preserve">Creed et al. (2013)</w:t>
+      </w:r>
+      <w:r>
+        <w:t xml:space="preserve"> </w:t>
+      </w:r>
+      <w:r>
+        <w:t xml:space="preserve">used amplitudes in the several-hundred-microampere range, and that</w:t>
+      </w:r>
+      <w:r>
+        <w:t xml:space="preserve"> </w:t>
+      </w:r>
+      <w:r>
+        <w:t xml:space="preserve">Creed et al. (2012)</w:t>
+      </w:r>
+      <w:r>
+        <w:t xml:space="preserve"> </w:t>
+      </w:r>
+      <w:r>
+        <w:t xml:space="preserve">is the right citation for the 100 µA, 90 µs, 130 Hz reference protocol.</w:t>
+      </w:r>
+    </w:p>
+    <w:p>
+      <w:pPr>
+        <w:numPr>
+          <w:ilvl w:val="0"/>
+          <w:numId w:val="1006"/>
+        </w:numPr>
+      </w:pPr>
+      <w:r>
+        <w:t xml:space="preserve">The Howland balance and load-dependence analysis cites the TI application note</w:t>
+      </w:r>
+      <w:r>
+        <w:t xml:space="preserve"> </w:t>
+      </w:r>
+      <w:r>
+        <w:t xml:space="preserve">(Texas Instruments, 2008)</w:t>
+      </w:r>
+      <w:r>
+        <w:t xml:space="preserve">; a peer-reviewed source could be added.</w:t>
+      </w:r>
+    </w:p>
+    <w:p>
+      <w:pPr>
+        <w:numPr>
+          <w:ilvl w:val="0"/>
+          <w:numId w:val="1006"/>
+        </w:numPr>
+      </w:pPr>
+      <w:r>
+        <w:t xml:space="preserve">Paulat et al. (2026)</w:t>
+      </w:r>
+      <w:r>
+        <w:t xml:space="preserve"> </w:t>
+      </w:r>
+      <w:r>
+        <w:t xml:space="preserve">is a Research Square preprint; update if it is published.</w:t>
+      </w:r>
+    </w:p>
+    <w:bookmarkEnd w:id="73"/>
+    <w:bookmarkStart w:id="74" w:name="notes-table4"/>
+    <w:p>
+      <w:pPr>
+        <w:pStyle w:val="Heading3"/>
+      </w:pPr>
+      <w:r>
+        <w:t xml:space="preserve">Table 4</w:t>
+      </w:r>
+    </w:p>
+    <w:p>
+      <w:pPr>
+        <w:numPr>
+          <w:ilvl w:val="0"/>
+          <w:numId w:val="1007"/>
+        </w:numPr>
+      </w:pPr>
+      <w:r>
+        <w:t xml:space="preserve">Haas et al. (2012)</w:t>
+      </w:r>
+      <w:r>
+        <w:t xml:space="preserve"> </w:t>
+      </w:r>
+      <w:r>
+        <w:t xml:space="preserve">is paywalled and only its abstract was checked, so most of its row is blank. Secondary sources</w:t>
+      </w:r>
+      <w:r>
+        <w:t xml:space="preserve"> </w:t>
+      </w:r>
+      <w:r>
+        <w:t xml:space="preserve">(Kouzani et al., 2013)</w:t>
+      </w:r>
+      <w:r>
+        <w:t xml:space="preserve"> </w:t>
+      </w:r>
+      <w:r>
+        <w:t xml:space="preserve">describe it as a 2.1 g, 8 × 30 mm cylinder with a 4.65 V battery, magnet on/off, parameters set with a programming fixture and fixed resistors, and a 10 h runtime; the parameter cell in that source is garbled (probably 20–100 µA, 60 µs, 131 Hz). Verify against the original and fill in.</w:t>
+      </w:r>
+    </w:p>
+    <w:p>
+      <w:pPr>
+        <w:numPr>
+          <w:ilvl w:val="0"/>
+          <w:numId w:val="1007"/>
+        </w:numPr>
+      </w:pPr>
+      <w:r>
+        <w:t xml:space="preserve">Supplementary files were not read for</w:t>
+      </w:r>
+      <w:r>
+        <w:t xml:space="preserve"> </w:t>
+      </w:r>
+      <w:r>
+        <w:t xml:space="preserve">Burton et al. (2021)</w:t>
+      </w:r>
+      <w:r>
+        <w:t xml:space="preserve"> </w:t>
+      </w:r>
+      <w:r>
+        <w:t xml:space="preserve">or</w:t>
+      </w:r>
+      <w:r>
+        <w:t xml:space="preserve"> </w:t>
+      </w:r>
+      <w:r>
+        <w:t xml:space="preserve">Shen et al. (2026)</w:t>
+      </w:r>
+      <w:r>
+        <w:t xml:space="preserve">, and</w:t>
+      </w:r>
+      <w:r>
+        <w:t xml:space="preserve"> </w:t>
+      </w:r>
+      <w:r>
+        <w:t xml:space="preserve">Paulat et al. (2026)</w:t>
+      </w:r>
+      <w:r>
+        <w:t xml:space="preserve">’s programmable ranges and battery models come from its supplement. The Pinnell firmware release was not checked in the Figshare repository.</w:t>
+      </w:r>
+    </w:p>
+    <w:p>
+      <w:pPr>
+        <w:numPr>
+          <w:ilvl w:val="0"/>
+          <w:numId w:val="1007"/>
         </w:numPr>
       </w:pPr>
       <w:r>
@@ -6288,7 +6648,7 @@
       <w:pPr>
         <w:numPr>
           <w:ilvl w:val="0"/>
-          <w:numId w:val="1006"/>
+          <w:numId w:val="1007"/>
         </w:numPr>
       </w:pPr>
       <w:r>
@@ -6320,27 +6680,6 @@
       </w:r>
       <w:r>
         <w:t xml:space="preserve">means untethered, with no radio; its pulse width is read from its Figure 1d.</w:t>
-      </w:r>
-    </w:p>
-    <w:p>
-      <w:pPr>
-        <w:numPr>
-          <w:ilvl w:val="0"/>
-          <w:numId w:val="1006"/>
-        </w:numPr>
-      </w:pPr>
-      <w:r>
-        <w:t xml:space="preserve">Consider adding dimensions as a column once the FLEX-DBS mass is known.</w:t>
-      </w:r>
-    </w:p>
-    <w:bookmarkEnd w:id="69"/>
-    <w:bookmarkStart w:id="70" w:name="notes-firmware"/>
-    <w:p>
-      <w:pPr>
-        <w:pStyle w:val="Heading3"/>
-      </w:pPr>
-      <w:r>
-        <w:t xml:space="preserve">Firmware and design</w:t>
       </w:r>
     </w:p>
     <w:p>
@@ -6351,7 +6690,28 @@
         </w:numPr>
       </w:pPr>
       <w:r>
-        <w:t xml:space="preserve">Firmware v0.5 delivers 130 Hz as 142.9 Hz and settings of 117 µs or less as</w:t>
+        <w:t xml:space="preserve">Consider adding dimensions as a column now that the FLEX-DBS mass is known.</w:t>
+      </w:r>
+    </w:p>
+    <w:bookmarkEnd w:id="74"/>
+    <w:bookmarkStart w:id="75" w:name="notes-firmware"/>
+    <w:p>
+      <w:pPr>
+        <w:pStyle w:val="Heading3"/>
+      </w:pPr>
+      <w:r>
+        <w:t xml:space="preserve">Firmware and design</w:t>
+      </w:r>
+    </w:p>
+    <w:p>
+      <w:pPr>
+        <w:numPr>
+          <w:ilvl w:val="0"/>
+          <w:numId w:val="1008"/>
+        </w:numPr>
+      </w:pPr>
+      <w:r>
+        <w:t xml:space="preserve">Firmware v0.5 delivers the 130 Hz setting as 142.5 Hz, and at 180 µs the stimulating phase measures</w:t>
       </w:r>
       <w:r>
         <w:t xml:space="preserve"> </w:t>
@@ -6365,14 +6725,14 @@
         </m:r>
       </m:oMath>
       <w:r>
-        <w:t xml:space="preserve">117 µs (Table 2). If the fixes listed in Section 7 are made before posting, update Table 2, Figure 3’s legend and the Limitations.</w:t>
+        <w:t xml:space="preserve">60 µs long and the recovery phase 22–46 µs short, leaving a 26–35 % net charge per pulse (Section 4.1). If the fixes listed in Section 7 are made before posting, remeasure and update Section 4.1, Figure 5, Table 2 and the Limitations.</w:t>
       </w:r>
     </w:p>
     <w:p>
       <w:pPr>
         <w:numPr>
           <w:ilvl w:val="0"/>
-          <w:numId w:val="1007"/>
+          <w:numId w:val="1008"/>
         </w:numPr>
       </w:pPr>
       <w:r>
@@ -6395,7 +6755,7 @@
       <w:pPr>
         <w:numPr>
           <w:ilvl w:val="0"/>
-          <w:numId w:val="1007"/>
+          <w:numId w:val="1008"/>
         </w:numPr>
       </w:pPr>
       <w:r>
@@ -6411,8 +6771,8 @@
         <w:t xml:space="preserve">) alongside the schematic.</w:t>
       </w:r>
     </w:p>
-    <w:bookmarkEnd w:id="70"/>
-    <w:bookmarkStart w:id="122" w:name="notes-end-matter"/>
+    <w:bookmarkEnd w:id="75"/>
+    <w:bookmarkStart w:id="127" w:name="notes-end-matter"/>
     <w:p>
       <w:pPr>
         <w:pStyle w:val="Heading3"/>
@@ -6425,7 +6785,7 @@
       <w:pPr>
         <w:numPr>
           <w:ilvl w:val="0"/>
-          <w:numId w:val="1008"/>
+          <w:numId w:val="1009"/>
         </w:numPr>
       </w:pPr>
       <w:r>
@@ -6436,7 +6796,7 @@
       <w:pPr>
         <w:numPr>
           <w:ilvl w:val="0"/>
-          <w:numId w:val="1008"/>
+          <w:numId w:val="1009"/>
         </w:numPr>
       </w:pPr>
       <w:r>
@@ -6447,7 +6807,7 @@
       <w:pPr>
         <w:numPr>
           <w:ilvl w:val="0"/>
-          <w:numId w:val="1008"/>
+          <w:numId w:val="1009"/>
         </w:numPr>
       </w:pPr>
       <w:r>
@@ -6467,15 +6827,15 @@
       <w:pPr>
         <w:numPr>
           <w:ilvl w:val="0"/>
-          <w:numId w:val="1008"/>
+          <w:numId w:val="1009"/>
         </w:numPr>
       </w:pPr>
       <w:r>
         <w:t xml:space="preserve">Before journal submission (not needed for bioRxiv): Highlights, graphical abstract, CRediT statement, generative-AI declaration, line numbers and double spacing per the Journal of Neuroscience Methods guide.</w:t>
       </w:r>
     </w:p>
-    <w:bookmarkStart w:id="121" w:name="refs"/>
-    <w:bookmarkStart w:id="72" w:name="ref-aleksandrova2013"/>
+    <w:bookmarkStart w:id="126" w:name="refs"/>
+    <w:bookmarkStart w:id="77" w:name="ref-aleksandrova2013"/>
     <w:p>
       <w:pPr>
         <w:pStyle w:val="Bibliography"/>
@@ -6486,7 +6846,7 @@
       <w:r>
         <w:t xml:space="preserve"> </w:t>
       </w:r>
-      <w:hyperlink r:id="rId71">
+      <w:hyperlink r:id="rId76">
         <w:r>
           <w:rPr>
             <w:rStyle w:val="Hyperlink"/>
@@ -6495,8 +6855,8 @@
         </w:r>
       </w:hyperlink>
     </w:p>
-    <w:bookmarkEnd w:id="72"/>
-    <w:bookmarkStart w:id="74" w:name="ref-alpaugh2019"/>
+    <w:bookmarkEnd w:id="77"/>
+    <w:bookmarkStart w:id="79" w:name="ref-alpaugh2019"/>
     <w:p>
       <w:pPr>
         <w:pStyle w:val="Bibliography"/>
@@ -6507,7 +6867,7 @@
       <w:r>
         <w:t xml:space="preserve"> </w:t>
       </w:r>
-      <w:hyperlink r:id="rId73">
+      <w:hyperlink r:id="rId78">
         <w:r>
           <w:rPr>
             <w:rStyle w:val="Hyperlink"/>
@@ -6516,8 +6876,8 @@
         </w:r>
       </w:hyperlink>
     </w:p>
-    <w:bookmarkEnd w:id="74"/>
-    <w:bookmarkStart w:id="76" w:name="ref-burton2021"/>
+    <w:bookmarkEnd w:id="79"/>
+    <w:bookmarkStart w:id="81" w:name="ref-burton2021"/>
     <w:p>
       <w:pPr>
         <w:pStyle w:val="Bibliography"/>
@@ -6528,7 +6888,7 @@
       <w:r>
         <w:t xml:space="preserve"> </w:t>
       </w:r>
-      <w:hyperlink r:id="rId75">
+      <w:hyperlink r:id="rId80">
         <w:r>
           <w:rPr>
             <w:rStyle w:val="Hyperlink"/>
@@ -6537,8 +6897,8 @@
         </w:r>
       </w:hyperlink>
     </w:p>
-    <w:bookmarkEnd w:id="76"/>
-    <w:bookmarkStart w:id="78" w:name="ref-cermak2019"/>
+    <w:bookmarkEnd w:id="81"/>
+    <w:bookmarkStart w:id="83" w:name="ref-cermak2019"/>
     <w:p>
       <w:pPr>
         <w:pStyle w:val="Bibliography"/>
@@ -6549,7 +6909,7 @@
       <w:r>
         <w:t xml:space="preserve"> </w:t>
       </w:r>
-      <w:hyperlink r:id="rId77">
+      <w:hyperlink r:id="rId82">
         <w:r>
           <w:rPr>
             <w:rStyle w:val="Hyperlink"/>
@@ -6558,8 +6918,8 @@
         </w:r>
       </w:hyperlink>
     </w:p>
-    <w:bookmarkEnd w:id="78"/>
-    <w:bookmarkStart w:id="80" w:name="ref-creed2018"/>
+    <w:bookmarkEnd w:id="83"/>
+    <w:bookmarkStart w:id="85" w:name="ref-creed2018"/>
     <w:p>
       <w:pPr>
         <w:pStyle w:val="Bibliography"/>
@@ -6570,7 +6930,7 @@
       <w:r>
         <w:t xml:space="preserve"> </w:t>
       </w:r>
-      <w:hyperlink r:id="rId79">
+      <w:hyperlink r:id="rId84">
         <w:r>
           <w:rPr>
             <w:rStyle w:val="Hyperlink"/>
@@ -6579,8 +6939,8 @@
         </w:r>
       </w:hyperlink>
     </w:p>
-    <w:bookmarkEnd w:id="80"/>
-    <w:bookmarkStart w:id="82" w:name="ref-creed2013"/>
+    <w:bookmarkEnd w:id="85"/>
+    <w:bookmarkStart w:id="87" w:name="ref-creed2013"/>
     <w:p>
       <w:pPr>
         <w:pStyle w:val="Bibliography"/>
@@ -6591,7 +6951,7 @@
       <w:r>
         <w:t xml:space="preserve"> </w:t>
       </w:r>
-      <w:hyperlink r:id="rId81">
+      <w:hyperlink r:id="rId86">
         <w:r>
           <w:rPr>
             <w:rStyle w:val="Hyperlink"/>
@@ -6600,8 +6960,8 @@
         </w:r>
       </w:hyperlink>
     </w:p>
-    <w:bookmarkEnd w:id="82"/>
-    <w:bookmarkStart w:id="84" w:name="ref-creed2012egr"/>
+    <w:bookmarkEnd w:id="87"/>
+    <w:bookmarkStart w:id="89" w:name="ref-creed2012egr"/>
     <w:p>
       <w:pPr>
         <w:pStyle w:val="Bibliography"/>
@@ -6612,7 +6972,7 @@
       <w:r>
         <w:t xml:space="preserve"> </w:t>
       </w:r>
-      <w:hyperlink r:id="rId83">
+      <w:hyperlink r:id="rId88">
         <w:r>
           <w:rPr>
             <w:rStyle w:val="Hyperlink"/>
@@ -6621,8 +6981,8 @@
         </w:r>
       </w:hyperlink>
     </w:p>
-    <w:bookmarkEnd w:id="84"/>
-    <w:bookmarkStart w:id="86" w:name="ref-creed2011"/>
+    <w:bookmarkEnd w:id="89"/>
+    <w:bookmarkStart w:id="91" w:name="ref-creed2011"/>
     <w:p>
       <w:pPr>
         <w:pStyle w:val="Bibliography"/>
@@ -6633,7 +6993,7 @@
       <w:r>
         <w:t xml:space="preserve"> </w:t>
       </w:r>
-      <w:hyperlink r:id="rId85">
+      <w:hyperlink r:id="rId90">
         <w:r>
           <w:rPr>
             <w:rStyle w:val="Hyperlink"/>
@@ -6642,8 +7002,8 @@
         </w:r>
       </w:hyperlink>
     </w:p>
-    <w:bookmarkEnd w:id="86"/>
-    <w:bookmarkStart w:id="88" w:name="ref-creed2015"/>
+    <w:bookmarkEnd w:id="91"/>
+    <w:bookmarkStart w:id="93" w:name="ref-creed2015"/>
     <w:p>
       <w:pPr>
         <w:pStyle w:val="Bibliography"/>
@@ -6654,7 +7014,7 @@
       <w:r>
         <w:t xml:space="preserve"> </w:t>
       </w:r>
-      <w:hyperlink r:id="rId87">
+      <w:hyperlink r:id="rId92">
         <w:r>
           <w:rPr>
             <w:rStyle w:val="Hyperlink"/>
@@ -6663,8 +7023,8 @@
         </w:r>
       </w:hyperlink>
     </w:p>
-    <w:bookmarkEnd w:id="88"/>
-    <w:bookmarkStart w:id="90" w:name="ref-fasano2019"/>
+    <w:bookmarkEnd w:id="93"/>
+    <w:bookmarkStart w:id="95" w:name="ref-fasano2019"/>
     <w:p>
       <w:pPr>
         <w:pStyle w:val="Bibliography"/>
@@ -6675,7 +7035,7 @@
       <w:r>
         <w:t xml:space="preserve"> </w:t>
       </w:r>
-      <w:hyperlink r:id="rId89">
+      <w:hyperlink r:id="rId94">
         <w:r>
           <w:rPr>
             <w:rStyle w:val="Hyperlink"/>
@@ -6684,8 +7044,8 @@
         </w:r>
       </w:hyperlink>
     </w:p>
-    <w:bookmarkEnd w:id="90"/>
-    <w:bookmarkStart w:id="92" w:name="ref-fleischer2020"/>
+    <w:bookmarkEnd w:id="95"/>
+    <w:bookmarkStart w:id="97" w:name="ref-fleischer2020"/>
     <w:p>
       <w:pPr>
         <w:pStyle w:val="Bibliography"/>
@@ -6696,7 +7056,7 @@
       <w:r>
         <w:t xml:space="preserve"> </w:t>
       </w:r>
-      <w:hyperlink r:id="rId91">
+      <w:hyperlink r:id="rId96">
         <w:r>
           <w:rPr>
             <w:rStyle w:val="Hyperlink"/>
@@ -6705,8 +7065,8 @@
         </w:r>
       </w:hyperlink>
     </w:p>
-    <w:bookmarkEnd w:id="92"/>
-    <w:bookmarkStart w:id="94" w:name="ref-grotemeyer2024"/>
+    <w:bookmarkEnd w:id="97"/>
+    <w:bookmarkStart w:id="99" w:name="ref-grotemeyer2024"/>
     <w:p>
       <w:pPr>
         <w:pStyle w:val="Bibliography"/>
@@ -6717,7 +7077,7 @@
       <w:r>
         <w:t xml:space="preserve"> </w:t>
       </w:r>
-      <w:hyperlink r:id="rId93">
+      <w:hyperlink r:id="rId98">
         <w:r>
           <w:rPr>
             <w:rStyle w:val="Hyperlink"/>
@@ -6726,8 +7086,8 @@
         </w:r>
       </w:hyperlink>
     </w:p>
-    <w:bookmarkEnd w:id="94"/>
-    <w:bookmarkStart w:id="96" w:name="ref-dehaas2012"/>
+    <w:bookmarkEnd w:id="99"/>
+    <w:bookmarkStart w:id="101" w:name="ref-dehaas2012"/>
     <w:p>
       <w:pPr>
         <w:pStyle w:val="Bibliography"/>
@@ -6738,7 +7098,7 @@
       <w:r>
         <w:t xml:space="preserve"> </w:t>
       </w:r>
-      <w:hyperlink r:id="rId95">
+      <w:hyperlink r:id="rId100">
         <w:r>
           <w:rPr>
             <w:rStyle w:val="Hyperlink"/>
@@ -6747,8 +7107,8 @@
         </w:r>
       </w:hyperlink>
     </w:p>
-    <w:bookmarkEnd w:id="96"/>
-    <w:bookmarkStart w:id="98" w:name="ref-knotkova2021"/>
+    <w:bookmarkEnd w:id="101"/>
+    <w:bookmarkStart w:id="103" w:name="ref-knotkova2021"/>
     <w:p>
       <w:pPr>
         <w:pStyle w:val="Bibliography"/>
@@ -6759,7 +7119,7 @@
       <w:r>
         <w:t xml:space="preserve"> </w:t>
       </w:r>
-      <w:hyperlink r:id="rId97">
+      <w:hyperlink r:id="rId102">
         <w:r>
           <w:rPr>
             <w:rStyle w:val="Hyperlink"/>
@@ -6768,8 +7128,8 @@
         </w:r>
       </w:hyperlink>
     </w:p>
-    <w:bookmarkEnd w:id="98"/>
-    <w:bookmarkStart w:id="100" w:name="ref-koo2018"/>
+    <w:bookmarkEnd w:id="103"/>
+    <w:bookmarkStart w:id="105" w:name="ref-koo2018"/>
     <w:p>
       <w:pPr>
         <w:pStyle w:val="Bibliography"/>
@@ -6780,7 +7140,7 @@
       <w:r>
         <w:t xml:space="preserve"> </w:t>
       </w:r>
-      <w:hyperlink r:id="rId99">
+      <w:hyperlink r:id="rId104">
         <w:r>
           <w:rPr>
             <w:rStyle w:val="Hyperlink"/>
@@ -6789,8 +7149,8 @@
         </w:r>
       </w:hyperlink>
     </w:p>
-    <w:bookmarkEnd w:id="100"/>
-    <w:bookmarkStart w:id="102" w:name="ref-kouzani2013"/>
+    <w:bookmarkEnd w:id="105"/>
+    <w:bookmarkStart w:id="107" w:name="ref-kouzani2013"/>
     <w:p>
       <w:pPr>
         <w:pStyle w:val="Bibliography"/>
@@ -6801,7 +7161,7 @@
       <w:r>
         <w:t xml:space="preserve"> </w:t>
       </w:r>
-      <w:hyperlink r:id="rId101">
+      <w:hyperlink r:id="rId106">
         <w:r>
           <w:rPr>
             <w:rStyle w:val="Hyperlink"/>
@@ -6810,8 +7170,8 @@
         </w:r>
       </w:hyperlink>
     </w:p>
-    <w:bookmarkEnd w:id="102"/>
-    <w:bookmarkStart w:id="104" w:name="ref-krauss2021"/>
+    <w:bookmarkEnd w:id="107"/>
+    <w:bookmarkStart w:id="109" w:name="ref-krauss2021"/>
     <w:p>
       <w:pPr>
         <w:pStyle w:val="Bibliography"/>
@@ -6822,7 +7182,7 @@
       <w:r>
         <w:t xml:space="preserve"> </w:t>
       </w:r>
-      <w:hyperlink r:id="rId103">
+      <w:hyperlink r:id="rId108">
         <w:r>
           <w:rPr>
             <w:rStyle w:val="Hyperlink"/>
@@ -6831,8 +7191,8 @@
         </w:r>
       </w:hyperlink>
     </w:p>
-    <w:bookmarkEnd w:id="104"/>
-    <w:bookmarkStart w:id="106" w:name="ref-lozano2019"/>
+    <w:bookmarkEnd w:id="109"/>
+    <w:bookmarkStart w:id="111" w:name="ref-lozano2019"/>
     <w:p>
       <w:pPr>
         <w:pStyle w:val="Bibliography"/>
@@ -6843,7 +7203,7 @@
       <w:r>
         <w:t xml:space="preserve"> </w:t>
       </w:r>
-      <w:hyperlink r:id="rId105">
+      <w:hyperlink r:id="rId110">
         <w:r>
           <w:rPr>
             <w:rStyle w:val="Hyperlink"/>
@@ -6852,8 +7212,8 @@
         </w:r>
       </w:hyperlink>
     </w:p>
-    <w:bookmarkEnd w:id="106"/>
-    <w:bookmarkStart w:id="108" w:name="ref-merrill2005"/>
+    <w:bookmarkEnd w:id="111"/>
+    <w:bookmarkStart w:id="113" w:name="ref-merrill2005"/>
     <w:p>
       <w:pPr>
         <w:pStyle w:val="Bibliography"/>
@@ -6864,7 +7224,7 @@
       <w:r>
         <w:t xml:space="preserve"> </w:t>
       </w:r>
-      <w:hyperlink r:id="rId107">
+      <w:hyperlink r:id="rId112">
         <w:r>
           <w:rPr>
             <w:rStyle w:val="Hyperlink"/>
@@ -6873,8 +7233,8 @@
         </w:r>
       </w:hyperlink>
     </w:p>
-    <w:bookmarkEnd w:id="108"/>
-    <w:bookmarkStart w:id="110" w:name="ref-murphy2021"/>
+    <w:bookmarkEnd w:id="113"/>
+    <w:bookmarkStart w:id="115" w:name="ref-murphy2021"/>
     <w:p>
       <w:pPr>
         <w:pStyle w:val="Bibliography"/>
@@ -6885,7 +7245,7 @@
       <w:r>
         <w:t xml:space="preserve"> </w:t>
       </w:r>
-      <w:hyperlink r:id="rId109">
+      <w:hyperlink r:id="rId114">
         <w:r>
           <w:rPr>
             <w:rStyle w:val="Hyperlink"/>
@@ -6894,8 +7254,8 @@
         </w:r>
       </w:hyperlink>
     </w:p>
-    <w:bookmarkEnd w:id="110"/>
-    <w:bookmarkStart w:id="112" w:name="ref-paulat2026"/>
+    <w:bookmarkEnd w:id="115"/>
+    <w:bookmarkStart w:id="117" w:name="ref-paulat2026"/>
     <w:p>
       <w:pPr>
         <w:pStyle w:val="Bibliography"/>
@@ -6906,7 +7266,7 @@
       <w:r>
         <w:t xml:space="preserve"> </w:t>
       </w:r>
-      <w:hyperlink r:id="rId111">
+      <w:hyperlink r:id="rId116">
         <w:r>
           <w:rPr>
             <w:rStyle w:val="Hyperlink"/>
@@ -6915,8 +7275,8 @@
         </w:r>
       </w:hyperlink>
     </w:p>
-    <w:bookmarkEnd w:id="112"/>
-    <w:bookmarkStart w:id="114" w:name="ref-pinnell2018"/>
+    <w:bookmarkEnd w:id="117"/>
+    <w:bookmarkStart w:id="119" w:name="ref-pinnell2018"/>
     <w:p>
       <w:pPr>
         <w:pStyle w:val="Bibliography"/>
@@ -6927,7 +7287,7 @@
       <w:r>
         <w:t xml:space="preserve"> </w:t>
       </w:r>
-      <w:hyperlink r:id="rId113">
+      <w:hyperlink r:id="rId118">
         <w:r>
           <w:rPr>
             <w:rStyle w:val="Hyperlink"/>
@@ -6936,8 +7296,8 @@
         </w:r>
       </w:hyperlink>
     </w:p>
-    <w:bookmarkEnd w:id="114"/>
-    <w:bookmarkStart w:id="116" w:name="ref-plocksties2021"/>
+    <w:bookmarkEnd w:id="119"/>
+    <w:bookmarkStart w:id="121" w:name="ref-plocksties2021"/>
     <w:p>
       <w:pPr>
         <w:pStyle w:val="Bibliography"/>
@@ -6954,7 +7314,7 @@
       <w:r>
         <w:t xml:space="preserve"> </w:t>
       </w:r>
-      <w:hyperlink r:id="rId115">
+      <w:hyperlink r:id="rId120">
         <w:r>
           <w:rPr>
             <w:rStyle w:val="Hyperlink"/>
@@ -6963,8 +7323,8 @@
         </w:r>
       </w:hyperlink>
     </w:p>
-    <w:bookmarkEnd w:id="116"/>
-    <w:bookmarkStart w:id="118" w:name="ref-shen2026"/>
+    <w:bookmarkEnd w:id="121"/>
+    <w:bookmarkStart w:id="123" w:name="ref-shen2026"/>
     <w:p>
       <w:pPr>
         <w:pStyle w:val="Bibliography"/>
@@ -6975,7 +7335,7 @@
       <w:r>
         <w:t xml:space="preserve"> </w:t>
       </w:r>
-      <w:hyperlink r:id="rId117">
+      <w:hyperlink r:id="rId122">
         <w:r>
           <w:rPr>
             <w:rStyle w:val="Hyperlink"/>
@@ -6984,8 +7344,8 @@
         </w:r>
       </w:hyperlink>
     </w:p>
-    <w:bookmarkEnd w:id="118"/>
-    <w:bookmarkStart w:id="120" w:name="ref-ti2008howland"/>
+    <w:bookmarkEnd w:id="123"/>
+    <w:bookmarkStart w:id="125" w:name="ref-ti2008howland"/>
     <w:p>
       <w:pPr>
         <w:pStyle w:val="Bibliography"/>
@@ -6996,7 +7356,7 @@
       <w:r>
         <w:t xml:space="preserve"> </w:t>
       </w:r>
-      <w:hyperlink r:id="rId119">
+      <w:hyperlink r:id="rId124">
         <w:r>
           <w:rPr>
             <w:rStyle w:val="Hyperlink"/>
@@ -7047,10 +7407,10 @@
         <w:t xml:space="preserve">(Application Report No. SNOA474A). Texas Instruments.</w:t>
       </w:r>
     </w:p>
-    <w:bookmarkEnd w:id="120"/>
-    <w:bookmarkEnd w:id="121"/>
-    <w:bookmarkEnd w:id="122"/>
-    <w:bookmarkEnd w:id="123"/>
+    <w:bookmarkEnd w:id="125"/>
+    <w:bookmarkEnd w:id="126"/>
+    <w:bookmarkEnd w:id="127"/>
+    <w:bookmarkEnd w:id="128"/>
     <w:sectPr>
       <w:footnotePr>
         <w:numRestart w:val="eachSect"/>
@@ -7973,6 +8333,9 @@
     <w:abstractNumId w:val="991"/>
   </w:num>
   <w:num w:numId="1008">
+    <w:abstractNumId w:val="991"/>
+  </w:num>
+  <w:num w:numId="1009">
     <w:abstractNumId w:val="991"/>
   </w:num>
 </w:numbering>

</xml_diff>

<commit_message>
Table 4 completed from sources; working notes split into own PDF; citations resolved
- Table 4: de Haas row from full paper, sizes in mass column, Burton 25 kHz, t-IPG 5.3 mm,
  Shen channels, Pinnell Figshare wording; tethered row removed; paradigm-enabling
  FLEX-DBS features marked with a dagger
- Working notes built separately (notes.tex, make notes) and limited to preprint items;
  deferred items moved to future_revisions.md
- Citations added and verified (tucker2013, jiang2017, aulehner2022, kupsch2006, vachez2020)
- Device mass 1.61 g without tab; battery measurement conditions (JS220, 1 kOhm, 180 us);
  LED behavior; Section 3 intro; abstract comparison rewritten
- Figure 1 now a static image; Mermaid source kept for reference only

Co-authored-by: Cursor <cursoragent@cursor.com>
</commit_message>
<xml_diff>
--- a/manuscript/build/flex_dbs.docx
+++ b/manuscript/build/flex_dbs.docx
@@ -144,7 +144,7 @@
         <w:t xml:space="preserve"> </w:t>
       </w:r>
       <w:r>
-        <w:t xml:space="preserve">FLEX-DBS (Flexible Deep Brain Stimulation) is a head-mounted, battery-powered stimulator that delivers bilateral constant-current stimulation from improved Howland current pumps on ±5 V rails. Amplitude, pulse width and frequency are programmable in continuous and burst modes from an iOS application over Bluetooth Low Energy, and stimulation continues autonomously after the phone disconnects. The device measures 19.5 × 22.5 × 8.72 mm, weighs 4.27 g in operation and runs on two size-13 zinc-air cells, which can be exchanged without handling the implant.</w:t>
+        <w:t xml:space="preserve">FLEX-DBS (Flexible Deep Brain Stimulation) is a head-mounted, battery-powered stimulator that delivers bilateral constant-current stimulation from improved Howland current pumps on ±5 V rails. Amplitude, pulse width and frequency are programmable in continuous and burst modes from an iOS application over Bluetooth Low Energy, and stimulation continues autonomously after the phone disconnects. The device measures 19.5 × 22.5 × 8.72 mm, weighs 3.71 g in operation and runs on two size-13 zinc-air cells, which can be exchanged without handling the implant.</w:t>
       </w:r>
     </w:p>
     <w:p>
@@ -180,7 +180,7 @@
         <w:t xml:space="preserve"> </w:t>
       </w:r>
       <w:r>
-        <w:t xml:space="preserve">Mouse-scale wireless systems with runtimes of weeks draw roughly 8–22 µA from supplies of about 3 V and are configured before implantation or through a near-field or cable programmer, with a magnet to switch stimulation or presets. FLEX-DBS instead offers real-time phone control, bilateral constant-current output, burst mode and higher compliance, at the cost of runtime measured in days.</w:t>
+        <w:t xml:space="preserve">Published wireless rodent stimulators each offer some of these capabilities, but none combines bilateral constant-current output, real-time wireless control that continues as autonomous stimulation after disconnect, and both continuous and burst modes. Together these allow stimulation to be configured and titrated at the home cage during an experiment, at the cost of runtime measured in days rather than weeks.</w:t>
       </w:r>
     </w:p>
     <w:p>
@@ -278,7 +278,25 @@
         <w:pStyle w:val="BodyText"/>
       </w:pPr>
       <w:r>
-        <w:t xml:space="preserve">Most systems for delivering preclinical DBS require the rodent to be physically tethered to an external pulse generator, which constrains experimental design in several ways. Tethering can be stressful, typically requires habituation before behavior normalizes, and restricts the animal’s movement. These consequences complicate or prevent behavioral assays that depend on unconstrained motor behavior, such as spontaneous pain behaviors, movement-disorder phenotypes and social interaction, and so limit the translational relevance of behavioral observations. Tethering is also difficult to implement in the home cage, so stimulation is usually delivered in dedicated apparatus such as open-field chambers, which can itself alter naturalistic behavior. Together with the cost of conventional stimulators, these constraints limit the throughput and statistical power of preclinical DBS studies.</w:t>
+        <w:t xml:space="preserve">Most systems for delivering preclinical DBS require the rodent to be physically tethered to an external pulse generator, which constrains experimental design in several ways. A tether restricts the animal’s movement and the environments in which it can be tested</w:t>
+      </w:r>
+      <w:r>
+        <w:t xml:space="preserve"> </w:t>
+      </w:r>
+      <w:r>
+        <w:t xml:space="preserve">(Jiang et al., 2017)</w:t>
+      </w:r>
+      <w:r>
+        <w:t xml:space="preserve">; its measurable effects on stress markers and sleep can be small</w:t>
+      </w:r>
+      <w:r>
+        <w:t xml:space="preserve"> </w:t>
+      </w:r>
+      <w:r>
+        <w:t xml:space="preserve">(Aulehner et al., 2022)</w:t>
+      </w:r>
+      <w:r>
+        <w:t xml:space="preserve">, but the restriction itself remains. These consequences complicate or prevent behavioral assays that depend on unconstrained motor behavior, such as spontaneous pain behaviors, movement-disorder phenotypes and social interaction, and so limit the translational relevance of behavioral observations. Tethering is also difficult to implement in the home cage, so stimulation is usually delivered in dedicated apparatus such as open-field chambers, which can itself alter naturalistic behavior. Together with the cost of conventional stimulators, these constraints limit the throughput and statistical power of preclinical DBS studies.</w:t>
       </w:r>
     </w:p>
     <w:p>
@@ -295,7 +313,25 @@
         <w:t xml:space="preserve">(Fasano and Helmich, 2019)</w:t>
       </w:r>
       <w:r>
-        <w:t xml:space="preserve">. For several emerging indications, therapeutic effects develop over longer periods than the acute motor effects that dominate preclinical work. A wireless, battery-powered system for delivering sustained DBS in rodents would support mechanistic studies of why efficacy is lost with long-term stimulation and of indications in which therapeutic effects emerge slowly.</w:t>
+        <w:t xml:space="preserve">. Some effects of DBS also develop over longer periods than the acute motor effects that dominate preclinical work: pallidal DBS for dystonia produces a delayed, progressive improvement over months</w:t>
+      </w:r>
+      <w:r>
+        <w:t xml:space="preserve"> </w:t>
+      </w:r>
+      <w:r>
+        <w:t xml:space="preserve">(Kupsch et al., 2006)</w:t>
+      </w:r>
+      <w:r>
+        <w:t xml:space="preserve">, and in rats the behavioral effect of repeated subthalamic stimulation took several sessions to emerge</w:t>
+      </w:r>
+      <w:r>
+        <w:t xml:space="preserve"> </w:t>
+      </w:r>
+      <w:r>
+        <w:t xml:space="preserve">(Aleksandrova et al., 2013)</w:t>
+      </w:r>
+      <w:r>
+        <w:t xml:space="preserve">. A wireless, battery-powered system for delivering sustained DBS in rodents would support mechanistic studies of why efficacy is lost with long-term stimulation and of indications in which therapeutic effects emerge slowly.</w:t>
       </w:r>
     </w:p>
     <w:p>
@@ -321,13 +357,13 @@
         <w:t xml:space="preserve">(Creed et al., 2015)</w:t>
       </w:r>
       <w:r>
-        <w:t xml:space="preserve">, and the therapeutic and side-effect profiles of subthalamic stimulation depend on parameters that are still being optimized preclinically</w:t>
-      </w:r>
-      <w:r>
-        <w:t xml:space="preserve"> </w:t>
-      </w:r>
-      <w:r>
-        <w:t xml:space="preserve">(Creed, 2018)</w:t>
+        <w:t xml:space="preserve">, and the effects of subthalamic stimulation on reward-related behavior, relevant to its motivational side effects, depend on stimulation parameters and task design</w:t>
+      </w:r>
+      <w:r>
+        <w:t xml:space="preserve"> </w:t>
+      </w:r>
+      <w:r>
+        <w:t xml:space="preserve">(Vachez and Creed, 2020)</w:t>
       </w:r>
       <w:r>
         <w:t xml:space="preserve">. Existing mouse-scale wireless systems also run from supplies of about 3 V, and several are single-channel (Section 5).</w:t>
@@ -338,7 +374,7 @@
         <w:pStyle w:val="BodyText"/>
       </w:pPr>
       <w:r>
-        <w:t xml:space="preserve">An ideal preclinical DBS device would let the experimenter set and change parameters in a freely moving mouse in its home cage, deliver true constant current into electrodes whose impedance is uncertain and changes after implantation, stimulate bilaterally, and support multiday, uninterrupted experiments with noninvasive battery exchange. Here we describe FLEX-DBS (Flexible Deep Brain Stimulation), a flexible wireless platform for bilateral constant-current deep brain stimulation in freely moving rodents. FLEX-DBS is a battery-powered, head-mounted device with ±5 V compliance rails; programmable amplitude, pulse width and frequency; continuous and burst stimulation modes; and a Bluetooth Low Energy (BLE) interface to an iOS application. We present the design as one point in a general DBS architecture, characterize the electrode load it must drive in vivo, describe its electrical validation, and compare it with tethered and published wireless systems. For this operating regime, generous compliance voltage, a precision current source, live wireless control and a phone-based interface take priority over the minimal quiescent current needed for maintenance-free implantation over weeks or months. Longer protocols remain possible through brief battery exchange, without reintroducing a tether or interrupting the animal overnight. By combining multiday untethered operation with parameter flexibility and verified current delivery, FLEX-DBS enables home-cage, social and extended-duration DBS experiments that are impractical with tethered stimulators or fixed-parameter implants, and supports systematic preclinical testing of stimulation paradigms for new clinical indications.</w:t>
+        <w:t xml:space="preserve">An ideal preclinical DBS device would let the experimenter set and change parameters in a freely moving mouse in its home cage, deliver true constant current into electrodes whose impedance is uncertain and changes after implantation, stimulate bilaterally, and support multiday, uninterrupted experiments with noninvasive battery exchange. Here we describe FLEX-DBS (Flexible Deep Brain Stimulation), a flexible wireless platform for bilateral constant-current deep brain stimulation in freely moving rodents. FLEX-DBS is a battery-powered, head-mounted device with ±5 V compliance rails; programmable amplitude, pulse width and frequency; continuous and burst stimulation modes; and a Bluetooth Low Energy (BLE) interface to an iOS application. We present the design as one point in a general DBS architecture, characterize the electrode load it must drive in vivo, describe its electrical validation, and compare it with tethered and published wireless systems. For this operating regime, generous compliance voltage, a precision current source, live wireless control and a phone-based interface take priority over the minimal quiescent current needed for maintenance-free implantation over weeks or months. Longer protocols remain possible through brief battery exchange, without reintroducing a tether or interrupting the animal overnight. By combining multiday untethered operation with parameter flexibility and regulated current delivery, FLEX-DBS enables home-cage, social and extended-duration DBS experiments that are impractical with tethered stimulators or fixed-parameter implants, and supports systematic preclinical testing of stimulation paradigms for new clinical indications.</w:t>
       </w:r>
     </w:p>
     <w:bookmarkEnd w:id="21"/>
@@ -1633,7 +1669,7 @@
         <w:pStyle w:val="BodyText"/>
       </w:pPr>
       <w:r>
-        <w:t xml:space="preserve">The intended workflow is configure-then-run: the experimenter connects, sets parameters, arms activation and disconnects; the device begins stimulating and stops advertising. Stimulation continues autonomously with no radio link. Passing a magnet over the device’s Hall-effect sensor re-enables advertising so the phone can reconnect to inspect battery voltage, change parameters or stop stimulation without handling the animal. A status LED indicates device state.</w:t>
+        <w:t xml:space="preserve">The intended workflow is configure-then-run: the experimenter connects, sets parameters, arms activation and disconnects; the device begins stimulating and stops advertising. Stimulation continues autonomously with no radio link. Passing a magnet over the device’s Hall-effect sensor re-enables advertising so the phone can reconnect to inspect battery voltage, change parameters or stop stimulation without handling the animal. A status LED indicates when the device is advertising or connected and turns off during stimulation.</w:t>
       </w:r>
     </w:p>
     <w:p>
@@ -1683,7 +1719,7 @@
         </w:r>
       </w:hyperlink>
       <w:r>
-        <w:t xml:space="preserve">) and printed in PLA on a Bambu Lab X1 Carbon printer. The device with its electrode connector and programming tab weighs 2.17 g, the shroud 0.48 g and each zinc-air cell 0.81 g, for 4.27 g in operation with two cells and the shroud (3.79 g without the shroud).</w:t>
+        <w:t xml:space="preserve">) and printed in PLA on a Bambu Lab X1 Carbon printer. The device with its electrode connector weighs 1.61 g with the programming tab removed (2.17 g with the tab), the shroud 0.48 g and each zinc-air cell 0.81 g, for 3.71 g in operation with two cells and the shroud (3.23 g without the shroud).</w:t>
       </w:r>
     </w:p>
     <w:bookmarkEnd w:id="24"/>
@@ -1725,7 +1761,7 @@
         <w:t xml:space="preserve"> </w:t>
       </w:r>
       <w:r>
-        <w:t xml:space="preserve">(Creed et al., 2012)</w:t>
+        <w:t xml:space="preserve">(Creed et al., 2013, 2012)</w:t>
       </w:r>
       <w:r>
         <w:t xml:space="preserve"> </w:t>
@@ -1754,16 +1790,28 @@
         </m:r>
       </m:oMath>
       <w:r>
-        <w:t xml:space="preserve">6 µA steps to 600 µA nominal, which covers the 100 µA protocols above and the several-hundred-microampere range used in behavioral studies</w:t>
-      </w:r>
-      <w:r>
-        <w:t xml:space="preserve"> </w:t>
-      </w:r>
-      <w:r>
-        <w:t xml:space="preserve">(Aleksandrova et al., 2013; Creed et al., 2013)</w:t>
-      </w:r>
-      <w:r>
-        <w:t xml:space="preserve">. Firmware v0.5 does not yet reproduce the programmed timing exactly: the 130 Hz setting delivers 142.5 Hz, and at the 180 µs setting the stimulating phase measured</w:t>
+        <w:t xml:space="preserve">6 µA steps to 600 µA nominal. Our prior protocols used 100 µA</w:t>
+      </w:r>
+      <w:r>
+        <w:t xml:space="preserve"> </w:t>
+      </w:r>
+      <w:r>
+        <w:t xml:space="preserve">(Creed et al., 2013, 2012)</w:t>
+      </w:r>
+      <w:r>
+        <w:t xml:space="preserve"> </w:t>
+      </w:r>
+      <w:r>
+        <w:t xml:space="preserve">and, in one behavioral study, 12.5 µA</w:t>
+      </w:r>
+      <w:r>
+        <w:t xml:space="preserve"> </w:t>
+      </w:r>
+      <w:r>
+        <w:t xml:space="preserve">(Aleksandrova et al., 2013)</w:t>
+      </w:r>
+      <w:r>
+        <w:t xml:space="preserve">; the range above 100 µA provides headroom for titration and for lower-impedance electrodes. Firmware v0.5 does not yet reproduce the programmed timing exactly: the 130 Hz setting delivers 142.5 Hz, and at the 180 µs setting the stimulating phase measured</w:t>
       </w:r>
       <w:r>
         <w:t xml:space="preserve"> </w:t>
@@ -1937,7 +1985,7 @@
         <w:t xml:space="preserve"> </w:t>
       </w:r>
       <w:r>
-        <w:t xml:space="preserve">The measured platform current (Section 4.3) is dominated by the boost converter chain, the negative rail and the awake microcontroller rather than by stimulation itself. The design accepts this overhead to provide compliance, precision and reconfigurability. A fully implanted, long-duration derivative would instead treat quiescent current, rail generation, charge-recovery method and radio duty cycle as the primary constraints, and would point toward a battery-direct, hardware-timed design with an average current roughly two orders of magnitude lower (Section 7).</w:t>
+        <w:t xml:space="preserve">The measured platform current (Section 4.2) is dominated by the boost converter chain, the negative rail and the awake microcontroller rather than by stimulation itself. The design accepts this overhead to provide compliance, precision and reconfigurability. A fully implanted, long-duration derivative would instead treat quiescent current, rail generation, charge-recovery method and radio duty cycle as the primary constraints, and would point toward a battery-direct, hardware-timed design with an average current roughly two orders of magnitude lower (Section 7).</w:t>
       </w:r>
     </w:p>
     <w:bookmarkEnd w:id="25"/>
@@ -1956,7 +2004,7 @@
         <w:pStyle w:val="FirstParagraph"/>
       </w:pPr>
       <w:r>
-        <w:t xml:space="preserve">Electrode characterization is part of the methods contribution because a constant-current stimulator cannot be evaluated independently of the load it drives.</w:t>
+        <w:t xml:space="preserve">A constant-current stimulator regulates current only while the voltage the electrode requires stays within its compliance, so the electrode load determines how much of the programmable range is usable. This section describes the electrodes (Section 3.1), how their impedance was measured in vivo over eight weeks after implantation (Section 3.2), and what those impedances imply for the current FLEX-DBS can deliver (Section 3.3).</w:t>
       </w:r>
     </w:p>
     <w:bookmarkStart w:id="28" w:name="electrode-construction"/>
@@ -1995,7 +2043,7 @@
         <w:pStyle w:val="BodyText"/>
       </w:pPr>
       <w:r>
-        <w:t xml:space="preserve">[Remaining construction details pending; see Working notes.]</w:t>
+        <w:t xml:space="preserve">[Remaining construction details pending.]</w:t>
       </w:r>
     </w:p>
     <w:bookmarkEnd w:id="28"/>
@@ -2222,7 +2270,7 @@
     </w:p>
     <w:bookmarkEnd w:id="30"/>
     <w:bookmarkEnd w:id="31"/>
-    <w:bookmarkStart w:id="35" w:name="X9416b741bc14303dc05a5c9bb70798e5bb11912"/>
+    <w:bookmarkStart w:id="34" w:name="X9416b741bc14303dc05a5c9bb70798e5bb11912"/>
     <w:p>
       <w:pPr>
         <w:pStyle w:val="Heading2"/>
@@ -2245,7 +2293,7 @@
         <w:pStyle w:val="FirstParagraph"/>
       </w:pPr>
       <w:r>
-        <w:t xml:space="preserve">Both outputs of a device running firmware v0.5 were loaded with 1 kΩ resistors, and one output was recorded with a Joulescope JS220 at 500 kHz for</w:t>
+        <w:t xml:space="preserve">Both outputs of a device running firmware v0.5 were loaded with 1 kΩ resistors, and one output was recorded with a Joulescope JS220 Precision Energy Analyzer at 500 kHz for</w:t>
       </w:r>
       <w:r>
         <w:t xml:space="preserve"> </w:t>
@@ -2275,17 +2323,17 @@
         <w:pStyle w:val="BodyText"/>
       </w:pPr>
       <w:r>
-        <w:t xml:space="preserve">Pulse timing differed from the set values by a nearly constant amount. At the 180 µs setting the stimulating phase lasted 238–254 µs and the recovery phase 854–878 µs, against 900 µs set, so the two phases did not carry equal charge: the median pulse delivered 27, 63 and 125 nC in the stimulating phase and 19, 48 and 96 nC in the recovery phase, leaving a net 9.5, 17.3 and 33.0 nC per period in the stimulating direction (26–35 % of the stimulating-phase charge; Figure 5C). The 130 Hz setting delivered 142.5 Hz at every amplitude, a 7.02 ms period, because firmware v0.5 sets the period in whole milliseconds (Table 2), and the period varied with an SD of 29–38 µs, about one 30.5 µs timer tick. Other pulse widths, additional amplitude points and the behavior into electrode-like loads remain to be measured (Section 4.2).</w:t>
+        <w:t xml:space="preserve">Pulse timing differed from the set values by a similar amount at every amplitude. At the 180 µs setting the stimulating phase lasted 238–254 µs and the recovery phase 854–878 µs, against 900 µs set, so the two phases did not carry equal charge: the median pulse delivered 27, 63 and 125 nC in the stimulating phase and 19, 48 and 96 nC in the recovery phase, leaving a net 9.5, 17.3 and 33.0 nC per period in the stimulating direction (26–35 % of the stimulating-phase charge; Figure 5C). The 130 Hz setting delivered 142.5 Hz at every amplitude, a 7.02 ms period, because firmware v0.5 sets the period in whole milliseconds (Table 2), and the period varied with an SD of 29–38 µs, about one 30.5 µs timer tick. Other pulse widths, additional amplitude points and higher-impedance loads were not characterized on the bench; the compliance limit in Section 3.3 is derived from the schematic.</w:t>
       </w:r>
     </w:p>
     <w:bookmarkEnd w:id="32"/>
-    <w:bookmarkStart w:id="33" w:name="load-tolerance-and-compliance"/>
+    <w:bookmarkStart w:id="33" w:name="battery-and-operating-duration"/>
     <w:p>
       <w:pPr>
         <w:pStyle w:val="Heading3"/>
       </w:pPr>
       <w:r>
-        <w:t xml:space="preserve">4.2 Load tolerance and compliance</w:t>
+        <w:t xml:space="preserve">4.2 Battery and operating duration</w:t>
       </w:r>
     </w:p>
     <w:p>
@@ -2293,25 +2341,7 @@
         <w:pStyle w:val="FirstParagraph"/>
       </w:pPr>
       <w:r>
-        <w:t xml:space="preserve">[Pending; see Working notes.]</w:t>
-      </w:r>
-    </w:p>
-    <w:bookmarkEnd w:id="33"/>
-    <w:bookmarkStart w:id="34" w:name="battery-and-operating-duration"/>
-    <w:p>
-      <w:pPr>
-        <w:pStyle w:val="Heading3"/>
-      </w:pPr>
-      <w:r>
-        <w:t xml:space="preserve">4.3 Battery and operating duration</w:t>
-      </w:r>
-    </w:p>
-    <w:p>
-      <w:pPr>
-        <w:pStyle w:val="FirstParagraph"/>
-      </w:pPr>
-      <w:r>
-        <w:t xml:space="preserve">Battery current was measured at the cell terminals in each operating state with the LED heartbeat active (Table 3). The device draws 1.47 mA when idle and not advertising, 1.62 mA while advertising, 1.89 mA while connected to the application, and 3.15–3.42 mA while stimulating at amplitude settings labeled 60 and 400 µA, respectively, at the 130 Hz frequency setting (142.5 Hz delivered; Section 4.1).</w:t>
+        <w:t xml:space="preserve">Battery current was measured at the cell terminals in each operating state with the same Joulescope JS220 (Table 3). The device draws 1.47 mA when idle and not advertising, 1.62 mA while advertising, 1.89 mA while connected to the application, and 3.15–3.42 mA while stimulating at amplitude settings labeled 60 and 400 µA, respectively, into 1 kΩ with a 180 µs pulse width at the 130 Hz frequency setting (142.5 Hz delivered; Section 4.1).</w:t>
       </w:r>
     </w:p>
     <w:p>
@@ -2340,7 +2370,7 @@
         </m:r>
       </m:oMath>
       <w:r>
-        <w:t xml:space="preserve">280 mAh; 90 % of nameplate capacity assumed usable). Stimulation rows use the 130 Hz setting, which delivers 142.5 Hz, and give the amplitude as labeled in the application.</w:t>
+        <w:t xml:space="preserve">280 mAh; 90 % of nameplate capacity assumed usable). Stimulation rows use a 1 kΩ load, a 180 µs pulse width and the 130 Hz setting, which delivers 142.5 Hz, and give the amplitude as labeled in the application.</w:t>
       </w:r>
     </w:p>
     <w:tbl>
@@ -2643,9 +2673,9 @@
         <w:t xml:space="preserve">Runtime should therefore be interpreted against the experimental protocol rather than as a binary acute-versus-chronic designation. The device can be used for chronic studies with scheduled battery exchange; it is not intended as a fully implanted, maintenance-free system operating for weeks or months. Section 7 describes why that use case requires a different architecture rather than a firmware change.</w:t>
       </w:r>
     </w:p>
+    <w:bookmarkEnd w:id="33"/>
     <w:bookmarkEnd w:id="34"/>
-    <w:bookmarkEnd w:id="35"/>
-    <w:bookmarkStart w:id="36" w:name="comparison-with-existing-methods"/>
+    <w:bookmarkStart w:id="35" w:name="comparison-with-existing-methods"/>
     <w:p>
       <w:pPr>
         <w:pStyle w:val="Heading2"/>
@@ -2659,7 +2689,7 @@
         <w:pStyle w:val="FirstParagraph"/>
       </w:pPr>
       <w:r>
-        <w:t xml:space="preserve">Table 4 places FLEX-DBS alongside conventional tethered stimulation and published wireless rodent stimulators that are small enough for mice or are architecturally instructive. The columns are the properties that determine whether a system can run a given experiment: species and mass, channels, output type, supply or compliance, parameter range, how parameters are set, power and operating duration, and whether the hardware and software are released.</w:t>
+        <w:t xml:space="preserve">Table 4 places FLEX-DBS alongside published wireless rodent stimulators that are small enough for mice or are architecturally instructive. The columns are the properties that determine whether a system can run a given experiment: species and mass, channels, output type, supply or compliance, parameter range, how parameters are set, power and operating duration, and whether the hardware and software are released.</w:t>
       </w:r>
     </w:p>
     <w:p>
@@ -2677,7 +2707,7 @@
         <w:t xml:space="preserve"> </w:t>
       </w:r>
       <w:r>
-        <w:t xml:space="preserve">FLEX-DBS in the context of tethered stimulation and published wireless rodent stimulators. Values for published systems are as reported by the authors; blank cells are not reported in the source. CC, constant current; CV, constant voltage.</w:t>
+        <w:t xml:space="preserve">FLEX-DBS in the context of published wireless rodent stimulators. Values for published systems are as reported by the authors; blank cells, and sizes omitted from the mass column, are not reported in the source. Where a source gives two values, the second is shown in parentheses with its location. CC, constant current; CV, constant voltage.</w:t>
       </w:r>
     </w:p>
     <w:tbl>
@@ -2735,7 +2765,7 @@
               <w:jc w:val="left"/>
             </w:pPr>
             <w:r>
-              <w:t xml:space="preserve">Mass with battery</w:t>
+              <w:t xml:space="preserve">Mass with battery; size</w:t>
             </w:r>
           </w:p>
         </w:tc>
@@ -2820,128 +2850,6 @@
             </w:pPr>
             <w:r>
               <w:t xml:space="preserve">Open release</w:t>
-            </w:r>
-          </w:p>
-        </w:tc>
-      </w:tr>
-      <w:tr>
-        <w:tc>
-          <w:tcPr/>
-          <w:p>
-            <w:pPr>
-              <w:pStyle w:val="Compact"/>
-              <w:jc w:val="left"/>
-            </w:pPr>
-            <w:r>
-              <w:t xml:space="preserve">Tethered stimulator (reference method)</w:t>
-            </w:r>
-          </w:p>
-        </w:tc>
-        <w:tc>
-          <w:tcPr/>
-          <w:p>
-            <w:pPr>
-              <w:pStyle w:val="Compact"/>
-              <w:jc w:val="left"/>
-            </w:pPr>
-            <w:r>
-              <w:t xml:space="preserve">Any</w:t>
-            </w:r>
-          </w:p>
-        </w:tc>
-        <w:tc>
-          <w:tcPr/>
-          <w:p>
-            <w:pPr>
-              <w:pStyle w:val="Compact"/>
-              <w:jc w:val="left"/>
-            </w:pPr>
-            <w:r>
-              <w:t xml:space="preserve">n/a (tether)</w:t>
-            </w:r>
-          </w:p>
-        </w:tc>
-        <w:tc>
-          <w:tcPr/>
-          <w:p>
-            <w:pPr>
-              <w:pStyle w:val="Compact"/>
-              <w:jc w:val="left"/>
-            </w:pPr>
-            <w:r>
-              <w:t xml:space="preserve">Instrument-dependent</w:t>
-            </w:r>
-          </w:p>
-        </w:tc>
-        <w:tc>
-          <w:tcPr/>
-          <w:p>
-            <w:pPr>
-              <w:pStyle w:val="Compact"/>
-              <w:jc w:val="left"/>
-            </w:pPr>
-            <w:r>
-              <w:t xml:space="preserve">CC or CV</w:t>
-            </w:r>
-          </w:p>
-        </w:tc>
-        <w:tc>
-          <w:tcPr/>
-          <w:p>
-            <w:pPr>
-              <w:pStyle w:val="Compact"/>
-              <w:jc w:val="left"/>
-            </w:pPr>
-            <w:r>
-              <w:t xml:space="preserve">Instrument-dependent</w:t>
-            </w:r>
-          </w:p>
-        </w:tc>
-        <w:tc>
-          <w:tcPr/>
-          <w:p>
-            <w:pPr>
-              <w:pStyle w:val="Compact"/>
-              <w:jc w:val="left"/>
-            </w:pPr>
-            <w:r>
-              <w:t xml:space="preserve">Instrument-dependent</w:t>
-            </w:r>
-          </w:p>
-        </w:tc>
-        <w:tc>
-          <w:tcPr/>
-          <w:p>
-            <w:pPr>
-              <w:pStyle w:val="Compact"/>
-              <w:jc w:val="left"/>
-            </w:pPr>
-            <w:r>
-              <w:t xml:space="preserve">Wired, real time</w:t>
-            </w:r>
-          </w:p>
-        </w:tc>
-        <w:tc>
-          <w:tcPr/>
-          <w:p>
-            <w:pPr>
-              <w:pStyle w:val="Compact"/>
-              <w:jc w:val="left"/>
-            </w:pPr>
-            <w:r>
-              <w:t xml:space="preserve">Mains powered; limited by the tether</w:t>
-            </w:r>
-          </w:p>
-        </w:tc>
-        <w:tc>
-          <w:tcPr/>
-          <w:p>
-            <w:pPr>
-              <w:pStyle w:val="Compact"/>
-              <w:jc w:val="left"/>
-            </w:pPr>
-            <w:r>
-              <w:t xml:space="preserve">n/a</w:t>
             </w:r>
           </w:p>
         </w:tc>
@@ -2983,20 +2891,41 @@
               <w:jc w:val="left"/>
             </w:pPr>
             <w:r>
-              <w:t xml:space="preserve">4.27 g with shroud (two zinc-air cells)</w:t>
-            </w:r>
-          </w:p>
-        </w:tc>
-        <w:tc>
-          <w:tcPr/>
-          <w:p>
-            <w:pPr>
-              <w:pStyle w:val="Compact"/>
-              <w:jc w:val="left"/>
-            </w:pPr>
-            <w:r>
+              <w:t xml:space="preserve">3.71 g with shroud (two zinc-air cells); 19.5 × 22.5 × 8.72 mm</w:t>
+            </w:r>
+          </w:p>
+        </w:tc>
+        <w:tc>
+          <w:tcPr/>
+          <w:p>
+            <w:pPr>
+              <w:pStyle w:val="Compact"/>
+              <w:jc w:val="left"/>
+            </w:pPr>
+            <w:r>
+              <w:rPr>
+                <w:b/>
+                <w:bCs/>
+              </w:rPr>
               <w:t xml:space="preserve">2; shared amplitude and timing</w:t>
             </w:r>
+            <m:oMath>
+              <m:sSup>
+                <m:e>
+                  <m:r>
+                    <m:t>​</m:t>
+                  </m:r>
+                </m:e>
+                <m:sup>
+                  <m:r>
+                    <m:rPr>
+                      <m:sty m:val="p"/>
+                    </m:rPr>
+                    <m:t>†</m:t>
+                  </m:r>
+                </m:sup>
+              </m:sSup>
+            </m:oMath>
           </w:p>
         </w:tc>
         <w:tc>
@@ -3059,20 +2988,68 @@
               </m:r>
             </m:oMath>
             <w:r>
-              <w:t xml:space="preserve">83–167 Hz delivered; asymmetric biphasic, 1:5 recovery; continuous or burst</w:t>
-            </w:r>
-          </w:p>
-        </w:tc>
-        <w:tc>
-          <w:tcPr/>
-          <w:p>
-            <w:pPr>
-              <w:pStyle w:val="Compact"/>
-              <w:jc w:val="left"/>
-            </w:pPr>
-            <w:r>
+              <w:t xml:space="preserve">83–167 Hz delivered; asymmetric biphasic, 1:5 recovery;</w:t>
+            </w:r>
+            <w:r>
+              <w:t xml:space="preserve"> </w:t>
+            </w:r>
+            <w:r>
+              <w:rPr>
+                <w:b/>
+                <w:bCs/>
+              </w:rPr>
+              <w:t xml:space="preserve">continuous or burst</w:t>
+            </w:r>
+            <m:oMath>
+              <m:sSup>
+                <m:e>
+                  <m:r>
+                    <m:t>​</m:t>
+                  </m:r>
+                </m:e>
+                <m:sup>
+                  <m:r>
+                    <m:rPr>
+                      <m:sty m:val="p"/>
+                    </m:rPr>
+                    <m:t>†</m:t>
+                  </m:r>
+                </m:sup>
+              </m:sSup>
+            </m:oMath>
+          </w:p>
+        </w:tc>
+        <w:tc>
+          <w:tcPr/>
+          <w:p>
+            <w:pPr>
+              <w:pStyle w:val="Compact"/>
+              <w:jc w:val="left"/>
+            </w:pPr>
+            <w:r>
+              <w:rPr>
+                <w:b/>
+                <w:bCs/>
+              </w:rPr>
               <w:t xml:space="preserve">Real-time BLE from an iOS app; autonomous after disconnect</w:t>
             </w:r>
+            <m:oMath>
+              <m:sSup>
+                <m:e>
+                  <m:r>
+                    <m:t>​</m:t>
+                  </m:r>
+                </m:e>
+                <m:sup>
+                  <m:r>
+                    <m:rPr>
+                      <m:sty m:val="p"/>
+                    </m:rPr>
+                    <m:t>†</m:t>
+                  </m:r>
+                </m:sup>
+              </m:sSup>
+            </m:oMath>
           </w:p>
         </w:tc>
         <w:tc>
@@ -3153,7 +3130,7 @@
               <w:jc w:val="left"/>
             </w:pPr>
             <w:r>
-              <w:t xml:space="preserve">0.9 g (s-IPG 1.6 g)</w:t>
+              <w:t xml:space="preserve">0.9 g (s-IPG 1.6 g); 5.3 mm thick</w:t>
             </w:r>
           </w:p>
         </w:tc>
@@ -3295,7 +3272,7 @@
               <w:jc w:val="left"/>
             </w:pPr>
             <w:r>
-              <w:t xml:space="preserve">4.0 g encapsulated (CR1225); 2.6 g (CR1216)</w:t>
+              <w:t xml:space="preserve">4.0 g encapsulated (CR1225), Ø17.0 × 9.0 mm; 2.6 g (CR1216), Ø15.5 × 7.5 mm</w:t>
             </w:r>
           </w:p>
         </w:tc>
@@ -3431,7 +3408,7 @@
               <w:jc w:val="left"/>
             </w:pPr>
             <w:r>
-              <w:t xml:space="preserve">2 g</w:t>
+              <w:t xml:space="preserve">2 g; 18 × 16 × 5 mm with housing</w:t>
             </w:r>
           </w:p>
         </w:tc>
@@ -3561,7 +3538,7 @@
               <w:jc w:val="left"/>
             </w:pPr>
             <w:r>
-              <w:t xml:space="preserve">2.8 g</w:t>
+              <w:t xml:space="preserve">2.8 g; board 9 × 9 × 1 mm (abstract: 10 × 10 mm)</w:t>
             </w:r>
           </w:p>
         </w:tc>
@@ -3698,63 +3675,83 @@
           <w:p>
             <w:pPr>
               <w:pStyle w:val="Compact"/>
-            </w:pPr>
-          </w:p>
-        </w:tc>
-        <w:tc>
-          <w:tcPr/>
-          <w:p>
-            <w:pPr>
-              <w:pStyle w:val="Compact"/>
-              <w:jc w:val="left"/>
-            </w:pPr>
-            <w:r>
-              <w:t xml:space="preserve">2 (bilateral)</w:t>
-            </w:r>
-          </w:p>
-        </w:tc>
-        <w:tc>
-          <w:tcPr/>
-          <w:p>
-            <w:pPr>
-              <w:pStyle w:val="Compact"/>
-            </w:pPr>
-          </w:p>
-        </w:tc>
-        <w:tc>
-          <w:tcPr/>
-          <w:p>
-            <w:pPr>
-              <w:pStyle w:val="Compact"/>
-            </w:pPr>
-          </w:p>
-        </w:tc>
-        <w:tc>
-          <w:tcPr/>
-          <w:p>
-            <w:pPr>
-              <w:pStyle w:val="Compact"/>
-              <w:jc w:val="left"/>
-            </w:pPr>
-            <w:r>
-              <w:t xml:space="preserve">Biphasic</w:t>
-            </w:r>
-          </w:p>
-        </w:tc>
-        <w:tc>
-          <w:tcPr/>
-          <w:p>
-            <w:pPr>
-              <w:pStyle w:val="Compact"/>
-            </w:pPr>
-          </w:p>
-        </w:tc>
-        <w:tc>
-          <w:tcPr/>
-          <w:p>
-            <w:pPr>
-              <w:pStyle w:val="Compact"/>
-            </w:pPr>
+              <w:jc w:val="left"/>
+            </w:pPr>
+            <w:r>
+              <w:t xml:space="preserve">2.1 g with batteries and lead; Ø8 × 30 mm</w:t>
+            </w:r>
+          </w:p>
+        </w:tc>
+        <w:tc>
+          <w:tcPr/>
+          <w:p>
+            <w:pPr>
+              <w:pStyle w:val="Compact"/>
+              <w:jc w:val="left"/>
+            </w:pPr>
+            <w:r>
+              <w:t xml:space="preserve">2 (bilateral), pulses alternate between channels</w:t>
+            </w:r>
+          </w:p>
+        </w:tc>
+        <w:tc>
+          <w:tcPr/>
+          <w:p>
+            <w:pPr>
+              <w:pStyle w:val="Compact"/>
+              <w:jc w:val="left"/>
+            </w:pPr>
+            <w:r>
+              <w:t xml:space="preserve">CC (adaptive series resistance)</w:t>
+            </w:r>
+          </w:p>
+        </w:tc>
+        <w:tc>
+          <w:tcPr/>
+          <w:p>
+            <w:pPr>
+              <w:pStyle w:val="Compact"/>
+              <w:jc w:val="left"/>
+            </w:pPr>
+            <w:r>
+              <w:t xml:space="preserve">4.65 V (three 337 silver-oxide cells); regulates into 15–45 kΩ</w:t>
+            </w:r>
+          </w:p>
+        </w:tc>
+        <w:tc>
+          <w:tcPr/>
+          <w:p>
+            <w:pPr>
+              <w:pStyle w:val="Compact"/>
+              <w:jc w:val="left"/>
+            </w:pPr>
+            <w:r>
+              <w:t xml:space="preserve">20–100 µA, 60 µs, 131 Hz fixed; symmetric biphasic</w:t>
+            </w:r>
+          </w:p>
+        </w:tc>
+        <w:tc>
+          <w:tcPr/>
+          <w:p>
+            <w:pPr>
+              <w:pStyle w:val="Compact"/>
+              <w:jc w:val="left"/>
+            </w:pPr>
+            <w:r>
+              <w:t xml:space="preserve">Amplitude set by reprogramming in a fixture (code table and resistor changes); magnet on/off; IR LED status</w:t>
+            </w:r>
+          </w:p>
+        </w:tc>
+        <w:tc>
+          <w:tcPr/>
+          <w:p>
+            <w:pPr>
+              <w:pStyle w:val="Compact"/>
+              <w:jc w:val="left"/>
+            </w:pPr>
+            <w:r>
+              <w:t xml:space="preserve">15 d standby, 10 h stimulating</w:t>
+            </w:r>
           </w:p>
         </w:tc>
         <w:tc>
@@ -4101,7 +4098,7 @@
               <w:jc w:val="left"/>
             </w:pPr>
             <w:r>
-              <w:t xml:space="preserve">2.8 g with battery and head cap</w:t>
+              <w:t xml:space="preserve">2.8 g with battery and head cap (text: 2.7 g); device Ø12.5 × 5 mm</w:t>
             </w:r>
           </w:p>
         </w:tc>
@@ -4199,7 +4196,7 @@
               <w:jc w:val="left"/>
             </w:pPr>
             <w:r>
-              <w:t xml:space="preserve">Yes (Figshare)</w:t>
+              <w:t xml:space="preserve">Design files and assembly instructions (Figshare)</w:t>
             </w:r>
           </w:p>
         </w:tc>
@@ -4299,7 +4296,7 @@
               </m:r>
             </m:oMath>
             <w:r>
-              <w:t xml:space="preserve">20 µs pulses; biphasic</w:t>
+              <w:t xml:space="preserve">20 µs pulses, up to 25 kHz; biphasic</w:t>
             </w:r>
           </w:p>
         </w:tc>
@@ -4383,16 +4380,20 @@
               <w:jc w:val="left"/>
             </w:pPr>
             <w:r>
-              <w:t xml:space="preserve">12.5 g (7.5 g battery)</w:t>
-            </w:r>
-          </w:p>
-        </w:tc>
-        <w:tc>
-          <w:tcPr/>
-          <w:p>
-            <w:pPr>
-              <w:pStyle w:val="Compact"/>
-            </w:pPr>
+              <w:t xml:space="preserve">12.5 g (7.5 g battery); 34 × 42 × 15 mm with housing</w:t>
+            </w:r>
+          </w:p>
+        </w:tc>
+        <w:tc>
+          <w:tcPr/>
+          <w:p>
+            <w:pPr>
+              <w:pStyle w:val="Compact"/>
+              <w:jc w:val="left"/>
+            </w:pPr>
+            <w:r>
+              <w:t xml:space="preserve">Not stated; used unilaterally</w:t>
+            </w:r>
           </w:p>
         </w:tc>
         <w:tc>
@@ -4477,6 +4478,31 @@
       <w:pPr>
         <w:pStyle w:val="BodyText"/>
       </w:pPr>
+      <m:oMath>
+        <m:sSup>
+          <m:e>
+            <m:r>
+              <m:t>​</m:t>
+            </m:r>
+          </m:e>
+          <m:sup>
+            <m:r>
+              <m:rPr>
+                <m:sty m:val="p"/>
+              </m:rPr>
+              <m:t>†</m:t>
+            </m:r>
+          </m:sup>
+        </m:sSup>
+      </m:oMath>
+      <w:r>
+        <w:t xml:space="preserve">New paradigm enabling.</w:t>
+      </w:r>
+    </w:p>
+    <w:p>
+      <w:pPr>
+        <w:pStyle w:val="BodyText"/>
+      </w:pPr>
       <w:r>
         <w:t xml:space="preserve">Three patterns emerge. First, the mouse-scale systems with runtimes of weeks</w:t>
       </w:r>
@@ -4573,23 +4599,78 @@
         <w:t xml:space="preserve">is suitable. FLEX-DBS is designed for experiments in which the investigator must set, change and verify parameters at the cage, deliver regulated current into an uncertain load, and stimulate continuously from hours through multiple days. Section 6 tests whether it behaves like the tethered reference method it replaces.</w:t>
       </w:r>
     </w:p>
+    <w:bookmarkEnd w:id="35"/>
+    <w:bookmarkStart w:id="39" w:name="in-vivo-functional-validation"/>
+    <w:p>
+      <w:pPr>
+        <w:pStyle w:val="Heading2"/>
+      </w:pPr>
+      <w:r>
+        <w:t xml:space="preserve">6. In-vivo functional validation</w:t>
+      </w:r>
+    </w:p>
+    <w:bookmarkStart w:id="36" w:name="experimental-paradigm"/>
+    <w:p>
+      <w:pPr>
+        <w:pStyle w:val="Heading3"/>
+      </w:pPr>
+      <w:r>
+        <w:t xml:space="preserve">6.1 Experimental paradigm</w:t>
+      </w:r>
+    </w:p>
+    <w:p>
+      <w:pPr>
+        <w:pStyle w:val="FirstParagraph"/>
+      </w:pPr>
+      <w:r>
+        <w:t xml:space="preserve">[Pending.]</w:t>
+      </w:r>
+    </w:p>
     <w:bookmarkEnd w:id="36"/>
-    <w:bookmarkStart w:id="40" w:name="in-vivo-functional-validation"/>
+    <w:bookmarkStart w:id="37" w:name="video-based-behavioral-analysis"/>
+    <w:p>
+      <w:pPr>
+        <w:pStyle w:val="Heading3"/>
+      </w:pPr>
+      <w:r>
+        <w:t xml:space="preserve">6.2 Video-based behavioral analysis</w:t>
+      </w:r>
+    </w:p>
+    <w:p>
+      <w:pPr>
+        <w:pStyle w:val="FirstParagraph"/>
+      </w:pPr>
+      <w:r>
+        <w:t xml:space="preserve">[Pending.]</w:t>
+      </w:r>
+    </w:p>
+    <w:bookmarkEnd w:id="37"/>
+    <w:bookmarkStart w:id="38" w:name="functional-equivalence"/>
+    <w:p>
+      <w:pPr>
+        <w:pStyle w:val="Heading3"/>
+      </w:pPr>
+      <w:r>
+        <w:t xml:space="preserve">6.3 Functional equivalence</w:t>
+      </w:r>
+    </w:p>
+    <w:p>
+      <w:pPr>
+        <w:pStyle w:val="FirstParagraph"/>
+      </w:pPr>
+      <w:r>
+        <w:t xml:space="preserve">[Pending.]</w:t>
+      </w:r>
+    </w:p>
+    <w:bookmarkEnd w:id="38"/>
+    <w:bookmarkEnd w:id="39"/>
+    <w:bookmarkStart w:id="40" w:name="discussion"/>
     <w:p>
       <w:pPr>
         <w:pStyle w:val="Heading2"/>
       </w:pPr>
       <w:r>
-        <w:t xml:space="preserve">6. In-vivo functional validation</w:t>
-      </w:r>
-    </w:p>
-    <w:bookmarkStart w:id="37" w:name="experimental-paradigm"/>
-    <w:p>
-      <w:pPr>
-        <w:pStyle w:val="Heading3"/>
-      </w:pPr>
-      <w:r>
-        <w:t xml:space="preserve">6.1 Experimental paradigm</w:t>
+        <w:t xml:space="preserve">7. Discussion</w:t>
       </w:r>
     </w:p>
     <w:p>
@@ -4597,61 +4678,6 @@
         <w:pStyle w:val="FirstParagraph"/>
       </w:pPr>
       <w:r>
-        <w:t xml:space="preserve">[Pending; see Working notes.]</w:t>
-      </w:r>
-    </w:p>
-    <w:bookmarkEnd w:id="37"/>
-    <w:bookmarkStart w:id="38" w:name="video-based-behavioral-analysis"/>
-    <w:p>
-      <w:pPr>
-        <w:pStyle w:val="Heading3"/>
-      </w:pPr>
-      <w:r>
-        <w:t xml:space="preserve">6.2 Video-based behavioral analysis</w:t>
-      </w:r>
-    </w:p>
-    <w:p>
-      <w:pPr>
-        <w:pStyle w:val="FirstParagraph"/>
-      </w:pPr>
-      <w:r>
-        <w:t xml:space="preserve">[Pending; see Working notes.]</w:t>
-      </w:r>
-    </w:p>
-    <w:bookmarkEnd w:id="38"/>
-    <w:bookmarkStart w:id="39" w:name="functional-equivalence"/>
-    <w:p>
-      <w:pPr>
-        <w:pStyle w:val="Heading3"/>
-      </w:pPr>
-      <w:r>
-        <w:t xml:space="preserve">6.3 Functional equivalence</w:t>
-      </w:r>
-    </w:p>
-    <w:p>
-      <w:pPr>
-        <w:pStyle w:val="FirstParagraph"/>
-      </w:pPr>
-      <w:r>
-        <w:t xml:space="preserve">[Pending; see Working notes.]</w:t>
-      </w:r>
-    </w:p>
-    <w:bookmarkEnd w:id="39"/>
-    <w:bookmarkEnd w:id="40"/>
-    <w:bookmarkStart w:id="41" w:name="discussion"/>
-    <w:p>
-      <w:pPr>
-        <w:pStyle w:val="Heading2"/>
-      </w:pPr>
-      <w:r>
-        <w:t xml:space="preserve">7. Discussion</w:t>
-      </w:r>
-    </w:p>
-    <w:p>
-      <w:pPr>
-        <w:pStyle w:val="FirstParagraph"/>
-      </w:pPr>
-      <w:r>
         <w:t xml:space="preserve">FLEX-DBS provides flexible, bilateral, constant-current DBS with live wireless control for experiments in freely moving rodents. A single pair of cells supports approximately three days of continuous stimulation, including undisturbed overnight and multiday protocols, and longer studies are possible with a brief battery exchange. The design prioritizes stimulation flexibility, electrical headroom, bilateral operation and a phone interface over maintenance-free operation for weeks or months, and the measurements reported here quantify what that priority costs and what it enables. Removing the tether while retaining the ability to set, change and verify parameters at the cage allows paradigms our laboratory has used with tethered hardware</w:t>
       </w:r>
       <w:r>
@@ -4680,7 +4706,7 @@
         <w:pStyle w:val="BodyText"/>
       </w:pPr>
       <w:r>
-        <w:t xml:space="preserve">Flexible multiday systems and fully implanted long-duration systems occupy different optimization spaces, and the current budget in Section 4.3 shows why. Only 0.27 mA of the 3.42 mA drawn at the 400 µA setting is attributable to stimulation itself; the remainder is the platform. Each source of overhead enables a capability of FLEX-DBS: a boost converter and inverter provide ±5 V compliance; a continuously powered precision DAC and reference set the current reproducibly; an awake microcontroller sequences each pulse; and the radio stack permits configuration and verification at the cage. Power was reduced within these constraints, most visibly by shutting the output amplifier down between pulses, but maintenance-free operation for weeks or months was not the primary objective. A fully implanted derivative would invert the priorities: battery-direct operation at</w:t>
+        <w:t xml:space="preserve">Flexible multiday systems and fully implanted long-duration systems occupy different optimization spaces, and the current budget in Section 4.2 shows why. Only 0.27 mA of the 3.42 mA drawn at the 400 µA setting is attributable to stimulation itself; the remainder is the platform. Each source of overhead enables a capability of FLEX-DBS: a boost converter and inverter provide ±5 V compliance; a continuously powered precision DAC and reference set the current reproducibly; an awake microcontroller sequences each pulse; and the radio stack permits configuration and verification at the cage. Power was reduced within these constraints, most visibly by shutting the output amplifier down between pulses, but maintenance-free operation for weeks or months was not the primary objective. A fully implanted derivative would invert the priorities: battery-direct operation at</w:t>
       </w:r>
       <w:r>
         <w:t xml:space="preserve"> </w:t>
@@ -4744,7 +4770,16 @@
         <w:t xml:space="preserve">(Creed et al., 2015, 2011)</w:t>
       </w:r>
       <w:r>
-        <w:t xml:space="preserve">. The recovery-phase ratio is fixed at 1:5. The Howland pumps are not perfectly load-independent: with 0.1 % resistors, the worst-case resistor mismatch gives an output impedance of about 0.9 MΩ, so delivered current can fall by up to 3–8 % into the 32–80 kΩ loads measured here relative to a low-impedance load. Amplitude settings should therefore be interpreted against the measured load and the bench measurements in Section 4.1 rather than as absolute currents. Finally, the impedance data come from five electrodes in three mice, with three of eight implanted electrodes excluded, and from a stimulator whose voltage read-back underestimates high loads (Section 3.2).</w:t>
+        <w:t xml:space="preserve">. The recovery-phase ratio is fixed at 1:5. The Howland pumps are not perfectly load-independent, because their finite output impedance limits current precision as the load changes</w:t>
+      </w:r>
+      <w:r>
+        <w:t xml:space="preserve"> </w:t>
+      </w:r>
+      <w:r>
+        <w:t xml:space="preserve">(Tucker et al., 2013)</w:t>
+      </w:r>
+      <w:r>
+        <w:t xml:space="preserve">: with 0.1 % resistors, the worst-case resistor mismatch gives an output impedance of about 0.9 MΩ, so delivered current can fall by up to 3–8 % into the 32–80 kΩ loads measured here relative to a low-impedance load. Amplitude settings should therefore be interpreted against the measured load and the bench measurements in Section 4.1 rather than as absolute currents. Those measurements cover a single pulse width into a 1 kΩ load; the compliance limit and the load dependence of the current are derived from the schematic rather than measured. Finally, the impedance data come from five electrodes in three mice, with three of eight implanted electrodes excluded, and from a stimulator whose voltage read-back underestimates high loads (Section 3.2).</w:t>
       </w:r>
     </w:p>
     <w:p>
@@ -4765,26 +4800,26 @@
         <w:t xml:space="preserve">The schematic, firmware, application and protocol are released so that others can reproduce or adapt the platform (Supplementary material). Several extensions are firmware-level within the present hardware: computing the stimulation period in timer ticks rather than whole milliseconds, which would deliver 130 Hz and other frequencies exactly; calibrating the phase-timing compensation and recovery amplitude against bench measurements so that the two phases carry equal charge; independent per-channel timing; a wider frequency range; a selectable recovery ratio; and over-the-air firmware update. At the hardware level, on-board sensing of delivered current or electrode voltage would report the stimulation actually delivered and track electrode impedance over the course of an experiment, supporting amplitude titration in each animal. Lower-power, fully implanted derivatives would extend the platform’s reach without changing the role of FLEX-DBS as a configurable system for hours-long through multiday experiments.</w:t>
       </w:r>
     </w:p>
+    <w:bookmarkEnd w:id="40"/>
+    <w:bookmarkStart w:id="41" w:name="conclusions"/>
+    <w:p>
+      <w:pPr>
+        <w:pStyle w:val="Heading2"/>
+      </w:pPr>
+      <w:r>
+        <w:t xml:space="preserve">8. Conclusions</w:t>
+      </w:r>
+    </w:p>
+    <w:p>
+      <w:pPr>
+        <w:pStyle w:val="FirstParagraph"/>
+      </w:pPr>
+      <w:r>
+        <w:t xml:space="preserve">FLEX-DBS is a head-mounted, bilateral, constant-current stimulator with real-time smartphone control that supports about three days of continuous stimulation per pair of cells. Its ±5 V compliance rails deliver roughly 60–140 µA into implanted platinum electrodes of 32–80 kΩ, which shows that electrode impedance, not the programmable range, sets usable amplitude in vivo. The platform trades runtime for flexibility and is intended for experiments in which parameters must be set, changed and verified at the cage.</w:t>
+      </w:r>
+    </w:p>
     <w:bookmarkEnd w:id="41"/>
-    <w:bookmarkStart w:id="42" w:name="conclusions"/>
-    <w:p>
-      <w:pPr>
-        <w:pStyle w:val="Heading2"/>
-      </w:pPr>
-      <w:r>
-        <w:t xml:space="preserve">8. Conclusions</w:t>
-      </w:r>
-    </w:p>
-    <w:p>
-      <w:pPr>
-        <w:pStyle w:val="FirstParagraph"/>
-      </w:pPr>
-      <w:r>
-        <w:t xml:space="preserve">FLEX-DBS is a head-mounted, bilateral, constant-current stimulator with real-time smartphone control that supports about three days of continuous stimulation per pair of cells. Its ±5 V compliance rails deliver roughly 60–140 µA into implanted platinum electrodes of 32–80 kΩ, which shows that electrode impedance, not the programmable range, sets usable amplitude in vivo. The platform trades runtime for flexibility and is intended for experiments in which parameters must be set, changed and verified at the cage.</w:t>
-      </w:r>
-    </w:p>
-    <w:bookmarkEnd w:id="42"/>
-    <w:bookmarkStart w:id="61" w:name="figures"/>
+    <w:bookmarkStart w:id="60" w:name="figures"/>
     <w:p>
       <w:pPr>
         <w:pStyle w:val="Heading2"/>
@@ -4818,20 +4853,20 @@
       <w:r>
         <w:drawing>
           <wp:inline>
-            <wp:extent cx="4114800" cy="5778564"/>
+            <wp:extent cx="4114800" cy="3086100"/>
             <wp:effectExtent b="0" l="0" r="0" t="0"/>
-            <wp:docPr descr="image" title="" id="44" name="Picture"/>
+            <wp:docPr descr="image" title="" id="43" name="Picture"/>
             <a:graphic>
               <a:graphicData uri="http://schemas.openxmlformats.org/drawingml/2006/picture">
                 <pic:pic>
                   <pic:nvPicPr>
-                    <pic:cNvPr descr="figures/fig1_architecture.png" id="45" name="Picture"/>
+                    <pic:cNvPr descr="figures/fig1_architecture.png" id="44" name="Picture"/>
                     <pic:cNvPicPr>
                       <a:picLocks noChangeArrowheads="1" noChangeAspect="1"/>
                     </pic:cNvPicPr>
                   </pic:nvPicPr>
                   <pic:blipFill>
-                    <a:blip r:embed="rId43"/>
+                    <a:blip r:embed="rId42"/>
                     <a:stretch>
                       <a:fillRect/>
                     </a:stretch>
@@ -4839,7 +4874,7 @@
                   <pic:spPr bwMode="auto">
                     <a:xfrm>
                       <a:off x="0" y="0"/>
-                      <a:ext cx="4114800" cy="5778564"/>
+                      <a:ext cx="4114800" cy="3086100"/>
                     </a:xfrm>
                     <a:prstGeom prst="rect">
                       <a:avLst/>
@@ -4911,18 +4946,18 @@
           <wp:inline>
             <wp:extent cx="2651760" cy="2377440"/>
             <wp:effectExtent b="0" l="0" r="0" t="0"/>
-            <wp:docPr descr="image" title="" id="47" name="Picture"/>
+            <wp:docPr descr="image" title="" id="46" name="Picture"/>
             <a:graphic>
               <a:graphicData uri="http://schemas.openxmlformats.org/drawingml/2006/picture">
                 <pic:pic>
                   <pic:nvPicPr>
-                    <pic:cNvPr descr="figures/FLEX-DBS_deviceScale.jpg" id="48" name="Picture"/>
+                    <pic:cNvPr descr="figures/FLEX-DBS_deviceScale.jpg" id="47" name="Picture"/>
                     <pic:cNvPicPr>
                       <a:picLocks noChangeArrowheads="1" noChangeAspect="1"/>
                     </pic:cNvPicPr>
                   </pic:nvPicPr>
                   <pic:blipFill>
-                    <a:blip r:embed="rId46"/>
+                    <a:blip r:embed="rId45"/>
                     <a:stretch>
                       <a:fillRect/>
                     </a:stretch>
@@ -4956,18 +4991,18 @@
           <wp:inline>
             <wp:extent cx="2651760" cy="2377440"/>
             <wp:effectExtent b="0" l="0" r="0" t="0"/>
-            <wp:docPr descr="image" title="" id="50" name="Picture"/>
+            <wp:docPr descr="image" title="" id="49" name="Picture"/>
             <a:graphic>
               <a:graphicData uri="http://schemas.openxmlformats.org/drawingml/2006/picture">
                 <pic:pic>
                   <pic:nvPicPr>
-                    <pic:cNvPr descr="figures/FLEX-DBS_3D_render.png" id="51" name="Picture"/>
+                    <pic:cNvPr descr="figures/FLEX-DBS_3D_render.png" id="50" name="Picture"/>
                     <pic:cNvPicPr>
                       <a:picLocks noChangeArrowheads="1" noChangeAspect="1"/>
                     </pic:cNvPicPr>
                   </pic:nvPicPr>
                   <pic:blipFill>
-                    <a:blip r:embed="rId49"/>
+                    <a:blip r:embed="rId48"/>
                     <a:stretch>
                       <a:fillRect/>
                     </a:stretch>
@@ -5047,18 +5082,18 @@
           <wp:inline>
             <wp:extent cx="5029200" cy="4258161"/>
             <wp:effectExtent b="0" l="0" r="0" t="0"/>
-            <wp:docPr descr="image" title="" id="53" name="Picture"/>
+            <wp:docPr descr="image" title="" id="52" name="Picture"/>
             <a:graphic>
               <a:graphicData uri="http://schemas.openxmlformats.org/drawingml/2006/picture">
                 <pic:pic>
                   <pic:nvPicPr>
-                    <pic:cNvPr descr="figures/FLEX-DBS_iPhoneRenders.png" id="54" name="Picture"/>
+                    <pic:cNvPr descr="figures/FLEX-DBS_iPhoneRenders.png" id="53" name="Picture"/>
                     <pic:cNvPicPr>
                       <a:picLocks noChangeArrowheads="1" noChangeAspect="1"/>
                     </pic:cNvPicPr>
                   </pic:nvPicPr>
                   <pic:blipFill>
-                    <a:blip r:embed="rId52"/>
+                    <a:blip r:embed="rId51"/>
                     <a:stretch>
                       <a:fillRect/>
                     </a:stretch>
@@ -5248,18 +5283,18 @@
           <wp:inline>
             <wp:extent cx="5943600" cy="3056708"/>
             <wp:effectExtent b="0" l="0" r="0" t="0"/>
-            <wp:docPr descr="image" title="" id="56" name="Picture"/>
+            <wp:docPr descr="image" title="" id="55" name="Picture"/>
             <a:graphic>
               <a:graphicData uri="http://schemas.openxmlformats.org/drawingml/2006/picture">
                 <pic:pic>
                   <pic:nvPicPr>
-                    <pic:cNvPr descr="figures/fig4_impedance.png" id="57" name="Picture"/>
+                    <pic:cNvPr descr="figures/fig4_impedance.png" id="56" name="Picture"/>
                     <pic:cNvPicPr>
                       <a:picLocks noChangeArrowheads="1" noChangeAspect="1"/>
                     </pic:cNvPicPr>
                   </pic:nvPicPr>
                   <pic:blipFill>
-                    <a:blip r:embed="rId55"/>
+                    <a:blip r:embed="rId54"/>
                     <a:stretch>
                       <a:fillRect/>
                     </a:stretch>
@@ -5375,18 +5410,18 @@
           <wp:inline>
             <wp:extent cx="5943600" cy="4754880"/>
             <wp:effectExtent b="0" l="0" r="0" t="0"/>
-            <wp:docPr descr="image" title="" id="59" name="Picture"/>
+            <wp:docPr descr="image" title="" id="58" name="Picture"/>
             <a:graphic>
               <a:graphicData uri="http://schemas.openxmlformats.org/drawingml/2006/picture">
                 <pic:pic>
                   <pic:nvPicPr>
-                    <pic:cNvPr descr="figures/fig5_bench.png" id="60" name="Picture"/>
+                    <pic:cNvPr descr="figures/fig5_bench.png" id="59" name="Picture"/>
                     <pic:cNvPicPr>
                       <a:picLocks noChangeArrowheads="1" noChangeAspect="1"/>
                     </pic:cNvPicPr>
                   </pic:nvPicPr>
                   <pic:blipFill>
-                    <a:blip r:embed="rId58"/>
+                    <a:blip r:embed="rId57"/>
                     <a:stretch>
                       <a:fillRect/>
                     </a:stretch>
@@ -5413,8 +5448,8 @@
         </w:drawing>
       </w:r>
     </w:p>
-    <w:bookmarkEnd w:id="61"/>
-    <w:bookmarkStart w:id="64" w:name="supplementary-material"/>
+    <w:bookmarkEnd w:id="60"/>
+    <w:bookmarkStart w:id="63" w:name="supplementary-material"/>
     <w:p>
       <w:pPr>
         <w:pStyle w:val="Heading2"/>
@@ -5467,7 +5502,7 @@
       <w:r>
         <w:t xml:space="preserve"> </w:t>
       </w:r>
-      <w:hyperlink r:id="rId62">
+      <w:hyperlink r:id="rId61">
         <w:r>
           <w:rPr>
             <w:rStyle w:val="Hyperlink"/>
@@ -5499,7 +5534,7 @@
       <w:r>
         <w:t xml:space="preserve"> </w:t>
       </w:r>
-      <w:hyperlink r:id="rId63">
+      <w:hyperlink r:id="rId62">
         <w:r>
           <w:rPr>
             <w:rStyle w:val="Hyperlink"/>
@@ -5605,14 +5640,32 @@
         </w:r>
       </w:hyperlink>
     </w:p>
+    <w:bookmarkEnd w:id="63"/>
+    <w:bookmarkStart w:id="64" w:name="author-contributions"/>
+    <w:p>
+      <w:pPr>
+        <w:pStyle w:val="Heading2"/>
+      </w:pPr>
+      <w:r>
+        <w:t xml:space="preserve">Author contributions</w:t>
+      </w:r>
+    </w:p>
+    <w:p>
+      <w:pPr>
+        <w:pStyle w:val="FirstParagraph"/>
+      </w:pPr>
+      <w:r>
+        <w:t xml:space="preserve">[Pending.]</w:t>
+      </w:r>
+    </w:p>
     <w:bookmarkEnd w:id="64"/>
-    <w:bookmarkStart w:id="65" w:name="author-contributions"/>
+    <w:bookmarkStart w:id="65" w:name="competing-interests"/>
     <w:p>
       <w:pPr>
         <w:pStyle w:val="Heading2"/>
       </w:pPr>
       <w:r>
-        <w:t xml:space="preserve">Author contributions</w:t>
+        <w:t xml:space="preserve">Competing interests</w:t>
       </w:r>
     </w:p>
     <w:p>
@@ -5620,17 +5673,17 @@
         <w:pStyle w:val="FirstParagraph"/>
       </w:pPr>
       <w:r>
-        <w:t xml:space="preserve">[Pending; see Working notes.]</w:t>
+        <w:t xml:space="preserve">[Pending.]</w:t>
       </w:r>
     </w:p>
     <w:bookmarkEnd w:id="65"/>
-    <w:bookmarkStart w:id="66" w:name="competing-interests"/>
+    <w:bookmarkStart w:id="66" w:name="funding"/>
     <w:p>
       <w:pPr>
         <w:pStyle w:val="Heading2"/>
       </w:pPr>
       <w:r>
-        <w:t xml:space="preserve">Competing interests</w:t>
+        <w:t xml:space="preserve">Funding</w:t>
       </w:r>
     </w:p>
     <w:p>
@@ -5638,29 +5691,11 @@
         <w:pStyle w:val="FirstParagraph"/>
       </w:pPr>
       <w:r>
-        <w:t xml:space="preserve">[Pending; see Working notes.]</w:t>
+        <w:t xml:space="preserve">[Pending.]</w:t>
       </w:r>
     </w:p>
     <w:bookmarkEnd w:id="66"/>
-    <w:bookmarkStart w:id="67" w:name="funding"/>
-    <w:p>
-      <w:pPr>
-        <w:pStyle w:val="Heading2"/>
-      </w:pPr>
-      <w:r>
-        <w:t xml:space="preserve">Funding</w:t>
-      </w:r>
-    </w:p>
-    <w:p>
-      <w:pPr>
-        <w:pStyle w:val="FirstParagraph"/>
-      </w:pPr>
-      <w:r>
-        <w:t xml:space="preserve">[Pending; see Working notes.]</w:t>
-      </w:r>
-    </w:p>
-    <w:bookmarkEnd w:id="67"/>
-    <w:bookmarkStart w:id="68" w:name="data-and-code-availability"/>
+    <w:bookmarkStart w:id="67" w:name="data-and-code-availability"/>
     <w:p>
       <w:pPr>
         <w:pStyle w:val="Heading2"/>
@@ -5691,8 +5726,8 @@
         <w:t xml:space="preserve">. The impedance data underlying Figure 4 are available from the corresponding author on request.</w:t>
       </w:r>
     </w:p>
-    <w:bookmarkEnd w:id="68"/>
-    <w:bookmarkStart w:id="69" w:name="acknowledgments"/>
+    <w:bookmarkEnd w:id="67"/>
+    <w:bookmarkStart w:id="129" w:name="acknowledgments"/>
     <w:p>
       <w:pPr>
         <w:pStyle w:val="Heading2"/>
@@ -5706,1136 +5741,11 @@
         <w:pStyle w:val="FirstParagraph"/>
       </w:pPr>
       <w:r>
-        <w:t xml:space="preserve">[Pending; see Working notes.]</w:t>
-      </w:r>
-    </w:p>
-    <w:bookmarkEnd w:id="69"/>
-    <w:bookmarkStart w:id="128" w:name="working-notes"/>
-    <w:p>
-      <w:pPr>
-        <w:pStyle w:val="Heading2"/>
-      </w:pPr>
-      <w:r>
-        <w:t xml:space="preserve">Working notes</w:t>
-      </w:r>
-    </w:p>
-    <w:p>
-      <w:pPr>
-        <w:pStyle w:val="FirstParagraph"/>
-      </w:pPr>
-      <w:r>
-        <w:t xml:space="preserve">Open items for the authors. Remove this section before posting.</w:t>
-      </w:r>
-    </w:p>
-    <w:bookmarkStart w:id="70" w:name="notes-data"/>
-    <w:p>
-      <w:pPr>
-        <w:pStyle w:val="Heading3"/>
-      </w:pPr>
-      <w:r>
-        <w:t xml:space="preserve">Data still needed</w:t>
-      </w:r>
-    </w:p>
-    <w:p>
-      <w:pPr>
-        <w:numPr>
-          <w:ilvl w:val="0"/>
-          <w:numId w:val="1003"/>
-        </w:numPr>
-      </w:pPr>
-      <w:r>
-        <w:rPr>
-          <w:b/>
-          <w:bCs/>
-        </w:rPr>
-        <w:t xml:space="preserve">Device mass.</w:t>
-      </w:r>
-      <w:r>
-        <w:t xml:space="preserve"> </w:t>
-      </w:r>
-      <w:r>
-        <w:t xml:space="preserve">Added to Section 2.2 and Table 4 (2.17 g device with connector and tab, 0.48 g shroud, 0.81 g per cell; 4.27 g total). Optional: weigh with the programming tab removed, since that is how the device is worn.</w:t>
-      </w:r>
-    </w:p>
-    <w:p>
-      <w:pPr>
-        <w:numPr>
-          <w:ilvl w:val="0"/>
-          <w:numId w:val="1003"/>
-        </w:numPr>
-      </w:pPr>
-      <w:r>
-        <w:rPr>
-          <w:b/>
-          <w:bCs/>
-        </w:rPr>
-        <w:t xml:space="preserve">Electrode construction (Section 3.1).</w:t>
-      </w:r>
-      <w:r>
-        <w:t xml:space="preserve"> </w:t>
-      </w:r>
-      <w:r>
-        <w:t xml:space="preserve">Materials, wire diameter, insulation, exposed length or tip geometry, bilateral spacing, return electrode, connector and fabrication steps. Planned figure: electrode photograph and schematic.</w:t>
-      </w:r>
-    </w:p>
-    <w:p>
-      <w:pPr>
-        <w:numPr>
-          <w:ilvl w:val="0"/>
-          <w:numId w:val="1003"/>
-        </w:numPr>
-      </w:pPr>
-      <w:r>
-        <w:rPr>
-          <w:b/>
-          <w:bCs/>
-        </w:rPr>
-        <w:t xml:space="preserve">Surgery and animals.</w:t>
-      </w:r>
-      <w:r>
-        <w:t xml:space="preserve"> </w:t>
-      </w:r>
-      <w:r>
-        <w:t xml:space="preserve">Strain, sex, age, housing, stereotaxic target and coordinates, anesthesia, IACUC protocol number, and the implantation date that anchors</w:t>
-      </w:r>
-      <w:r>
-        <w:t xml:space="preserve"> </w:t>
-      </w:r>
-      <w:r>
-        <w:t xml:space="preserve">“weeks after implantation”</w:t>
-      </w:r>
-      <w:r>
-        <w:t xml:space="preserve"> </w:t>
-      </w:r>
-      <w:r>
-        <w:t xml:space="preserve">in Section 3.</w:t>
-      </w:r>
-    </w:p>
-    <w:p>
-      <w:pPr>
-        <w:numPr>
-          <w:ilvl w:val="0"/>
-          <w:numId w:val="1003"/>
-        </w:numPr>
-      </w:pPr>
-      <w:r>
-        <w:rPr>
-          <w:b/>
-          <w:bCs/>
-        </w:rPr>
-        <w:t xml:space="preserve">Bench electrical characterization (Sections 4.1, 4.2).</w:t>
-      </w:r>
-      <w:r>
-        <w:t xml:space="preserve"> </w:t>
-      </w:r>
-      <w:r>
-        <w:t xml:space="preserve">Figure 5 and Section 4.1 now report three amplitude settings at 180 µs, 130 Hz into 1 kΩ; open items are listed under Bench QC below. Still needed for Section 4.2: delivered current versus load at 100 and 400 µA to measure the compliance limit (confirms the</w:t>
-      </w:r>
-      <w:r>
-        <w:t xml:space="preserve"> </w:t>
-      </w:r>
-      <m:oMath>
-        <m:r>
-          <m:rPr>
-            <m:sty m:val="p"/>
-          </m:rPr>
-          <m:t>∼</m:t>
-        </m:r>
-      </m:oMath>
-      <w:r>
-        <w:t xml:space="preserve">4.9 V swing used in Section 3.3 and Figure 4B) and the Howland load dependence bounded analytically in Section 7, as a new Figure 5 panel with the compliance limit marked; a representative pulse at the reference protocol (90 µs); op-amp on-time per pulse (210 µs + 6·</w:t>
-      </w:r>
-      <w:r>
-        <w:rPr>
-          <w:i/>
-          <w:iCs/>
-        </w:rPr>
-        <w:t xml:space="preserve">P</w:t>
-      </w:r>
-      <w:r>
-        <w:t xml:space="preserve">, currently from firmware constants).</w:t>
-      </w:r>
-    </w:p>
-    <w:p>
-      <w:pPr>
-        <w:numPr>
-          <w:ilvl w:val="0"/>
-          <w:numId w:val="1003"/>
-        </w:numPr>
-      </w:pPr>
-      <w:r>
-        <w:rPr>
-          <w:b/>
-          <w:bCs/>
-        </w:rPr>
-        <w:t xml:space="preserve">Battery measurements (Section 4.3, Table 3).</w:t>
-      </w:r>
-      <w:r>
-        <w:t xml:space="preserve"> </w:t>
-      </w:r>
-      <w:r>
-        <w:t xml:space="preserve">Record the conditions of the current measurements (pulse width, load, LED state, instrument) from the bench notes, and replace the runtime projections with a measured discharge to cutoff.</w:t>
-      </w:r>
-    </w:p>
-    <w:p>
-      <w:pPr>
-        <w:numPr>
-          <w:ilvl w:val="0"/>
-          <w:numId w:val="1003"/>
-        </w:numPr>
-      </w:pPr>
-      <w:r>
-        <w:rPr>
-          <w:b/>
-          <w:bCs/>
-        </w:rPr>
-        <w:t xml:space="preserve">In-vivo validation (Sections 6.1–6.3).</w:t>
-      </w:r>
-      <w:r>
-        <w:t xml:space="preserve"> </w:t>
-      </w:r>
-      <w:r>
-        <w:t xml:space="preserve">Setup, wireless-versus-tethered comparison and behavioral outcome. Planned Figure 6 legend:</w:t>
-      </w:r>
-      <w:r>
-        <w:t xml:space="preserve"> </w:t>
-      </w:r>
-      <w:r>
-        <w:rPr>
-          <w:i/>
-          <w:iCs/>
-        </w:rPr>
-        <w:t xml:space="preserve">(A)</w:t>
-      </w:r>
-      <w:r>
-        <w:t xml:space="preserve"> </w:t>
-      </w:r>
-      <w:r>
-        <w:t xml:space="preserve">head-mounted device on the animal and arena;</w:t>
-      </w:r>
-      <w:r>
-        <w:t xml:space="preserve"> </w:t>
-      </w:r>
-      <w:r>
-        <w:rPr>
-          <w:i/>
-          <w:iCs/>
-        </w:rPr>
-        <w:t xml:space="preserve">(B)</w:t>
-      </w:r>
-      <w:r>
-        <w:t xml:space="preserve"> </w:t>
-      </w:r>
-      <w:r>
-        <w:t xml:space="preserve">example tracking;</w:t>
-      </w:r>
-      <w:r>
-        <w:t xml:space="preserve"> </w:t>
-      </w:r>
-      <w:r>
-        <w:rPr>
-          <w:i/>
-          <w:iCs/>
-        </w:rPr>
-        <w:t xml:space="preserve">(C)</w:t>
-      </w:r>
-      <w:r>
-        <w:t xml:space="preserve"> </w:t>
-      </w:r>
-      <w:r>
-        <w:t xml:space="preserve">behavioral metric for baseline, tethered DBS and FLEX-DBS wireless DBS, per animal and group.</w:t>
-      </w:r>
-    </w:p>
-    <w:p>
-      <w:pPr>
-        <w:numPr>
-          <w:ilvl w:val="0"/>
-          <w:numId w:val="1003"/>
-        </w:numPr>
-      </w:pPr>
-      <w:r>
-        <w:rPr>
-          <w:b/>
-          <w:bCs/>
-        </w:rPr>
-        <w:t xml:space="preserve">Abstract and Conclusions.</w:t>
-      </w:r>
-      <w:r>
-        <w:t xml:space="preserve"> </w:t>
-      </w:r>
-      <w:r>
-        <w:t xml:space="preserve">Update the Results and Conclusions once the load sweep and in-vivo data exist; both currently describe design, 1 kΩ bench, impedance and battery results only.</w:t>
-      </w:r>
-    </w:p>
-    <w:p>
-      <w:pPr>
-        <w:numPr>
-          <w:ilvl w:val="0"/>
-          <w:numId w:val="1003"/>
-        </w:numPr>
-      </w:pPr>
-      <w:r>
-        <w:rPr>
-          <w:b/>
-          <w:bCs/>
-        </w:rPr>
-        <w:t xml:space="preserve">Timing diagram.</w:t>
-      </w:r>
-      <w:r>
-        <w:t xml:space="preserve"> </w:t>
-      </w:r>
-      <w:r>
-        <w:t xml:space="preserve">The per-pulse sequence in Section 2.2 (amplifier enable and 150 µs settle; switches close and 30 µs settle; DAC step to</w:t>
-      </w:r>
-      <w:r>
-        <w:t xml:space="preserve"> </w:t>
-      </w:r>
-      <w:r>
-        <w:rPr>
-          <w:i/>
-          <w:iCs/>
-        </w:rPr>
-        <w:t xml:space="preserve">I</w:t>
-      </w:r>
-      <w:r>
-        <w:t xml:space="preserve"> </w:t>
-      </w:r>
-      <w:r>
-        <w:t xml:space="preserve">for</w:t>
-      </w:r>
-      <w:r>
-        <w:t xml:space="preserve"> </w:t>
-      </w:r>
-      <w:r>
-        <w:rPr>
-          <w:i/>
-          <w:iCs/>
-        </w:rPr>
-        <w:t xml:space="preserve">P</w:t>
-      </w:r>
-      <w:r>
-        <w:t xml:space="preserve">; step to −</w:t>
-      </w:r>
-      <w:r>
-        <w:rPr>
-          <w:i/>
-          <w:iCs/>
-        </w:rPr>
-        <w:t xml:space="preserve">I</w:t>
-      </w:r>
-      <w:r>
-        <w:t xml:space="preserve">/5 for 5·</w:t>
-      </w:r>
-      <w:r>
-        <w:rPr>
-          <w:i/>
-          <w:iCs/>
-        </w:rPr>
-        <w:t xml:space="preserve">P</w:t>
-      </w:r>
-      <w:r>
-        <w:t xml:space="preserve">; return to reference; switches open; amplifier shutdown) could become a Figure 1 inset or a panel of Figure 5, preferably from a scope capture.</w:t>
-      </w:r>
-    </w:p>
-    <w:bookmarkEnd w:id="70"/>
-    <w:bookmarkStart w:id="71" w:name="notes-bench-qc"/>
-    <w:p>
-      <w:pPr>
-        <w:pStyle w:val="Heading3"/>
-      </w:pPr>
-      <w:r>
-        <w:t xml:space="preserve">Bench QC, 1 kΩ load (2026-10-01)</w:t>
-      </w:r>
-    </w:p>
-    <w:p>
-      <w:pPr>
-        <w:pStyle w:val="FirstParagraph"/>
-      </w:pPr>
-      <w:r>
-        <w:t xml:space="preserve">Three Joulescope JS220 recordings (500 kHz,</w:t>
-      </w:r>
-      <w:r>
-        <w:t xml:space="preserve"> </w:t>
-      </w:r>
-      <m:oMath>
-        <m:r>
-          <m:rPr>
-            <m:sty m:val="p"/>
-          </m:rPr>
-          <m:t>∼</m:t>
-        </m:r>
-      </m:oMath>
-      <w:r>
-        <w:t xml:space="preserve">11 s each) at 10, 50 and 100 % amplitude, 180 µs, 130 Hz set, 1 kΩ on both outputs, one output recorded (</w:t>
-      </w:r>
-      <w:r>
-        <w:rPr>
-          <w:rStyle w:val="VerbatimChar"/>
-        </w:rPr>
-        <w:t xml:space="preserve">data/bench/</w:t>
-      </w:r>
-      <w:r>
-        <w:t xml:space="preserve">, analyzed with</w:t>
-      </w:r>
-      <w:r>
-        <w:t xml:space="preserve"> </w:t>
-      </w:r>
-      <w:r>
-        <w:rPr>
-          <w:rStyle w:val="VerbatimChar"/>
-        </w:rPr>
-        <w:t xml:space="preserve">data/bench/bench_qc.py</w:t>
-      </w:r>
-      <w:r>
-        <w:t xml:space="preserve">). Results are in Section 4.1 and Figure 5 (</w:t>
-      </w:r>
-      <w:r>
-        <w:rPr>
-          <w:rStyle w:val="VerbatimChar"/>
-        </w:rPr>
-        <w:t xml:space="preserve">figures/scripts/fig_bench.py</w:t>
-      </w:r>
-      <w:r>
-        <w:t xml:space="preserve">). Firmware is not being changed now. Open items:</w:t>
-      </w:r>
-    </w:p>
-    <w:p>
-      <w:pPr>
-        <w:numPr>
-          <w:ilvl w:val="0"/>
-          <w:numId w:val="1004"/>
-        </w:numPr>
-      </w:pPr>
-      <w:r>
-        <w:rPr>
-          <w:b/>
-          <w:bCs/>
-        </w:rPr>
-        <w:t xml:space="preserve">More amplitude points.</w:t>
-      </w:r>
-      <w:r>
-        <w:t xml:space="preserve"> </w:t>
-      </w:r>
-      <w:r>
-        <w:t xml:space="preserve">Measure 0 % and several intermediate settings. The three points give 4.7 µA/% with a +47 µA intercept but deviate from that line by up to</w:t>
-      </w:r>
-      <w:r>
-        <w:t xml:space="preserve"> </w:t>
-      </w:r>
-      <m:oMath>
-        <m:r>
-          <m:rPr>
-            <m:sty m:val="p"/>
-          </m:rPr>
-          <m:t>∼</m:t>
-        </m:r>
-      </m:oMath>
-      <w:r>
-        <w:t xml:space="preserve">20 µA, and phase 2 does not shift by the same offset, so the cause (Howland mismatch, DAC code mapping or something else) is not yet identified.</w:t>
-      </w:r>
-    </w:p>
-    <w:p>
-      <w:pPr>
-        <w:numPr>
-          <w:ilvl w:val="0"/>
-          <w:numId w:val="1004"/>
-        </w:numPr>
-      </w:pPr>
-      <w:r>
-        <w:rPr>
-          <w:b/>
-          <w:bCs/>
-        </w:rPr>
-        <w:t xml:space="preserve">Other pulse widths.</w:t>
-      </w:r>
-      <w:r>
-        <w:t xml:space="preserve"> </w:t>
-      </w:r>
-      <w:r>
-        <w:t xml:space="preserve">Measure several settings, including 90 µs, to separate a fixed timing offset from a proportional error and to find what the 90 µs reference setting actually delivers.</w:t>
-      </w:r>
-    </w:p>
-    <w:p>
-      <w:pPr>
-        <w:numPr>
-          <w:ilvl w:val="0"/>
-          <w:numId w:val="1004"/>
-        </w:numPr>
-      </w:pPr>
-      <w:r>
-        <w:rPr>
-          <w:b/>
-          <w:bCs/>
-        </w:rPr>
-        <w:t xml:space="preserve">Interpulse transient.</w:t>
-      </w:r>
-      <w:r>
-        <w:t xml:space="preserve"> </w:t>
-      </w:r>
-      <w:r>
-        <w:t xml:space="preserve">A brief transient about 2 ms after each pulse ends (largest on the current channel,</w:t>
-      </w:r>
-      <w:r>
-        <w:t xml:space="preserve"> </w:t>
-      </w:r>
-      <m:oMath>
-        <m:r>
-          <m:rPr>
-            <m:sty m:val="p"/>
-          </m:rPr>
-          <m:t>∼</m:t>
-        </m:r>
-      </m:oMath>
-      <m:oMath>
-        <m:r>
-          <m:rPr>
-            <m:sty m:val="p"/>
-          </m:rPr>
-          <m:t>−</m:t>
-        </m:r>
-      </m:oMath>
-      <w:r>
-        <w:t xml:space="preserve">8 mV on the voltage channel) matches the</w:t>
-      </w:r>
-      <w:r>
-        <w:t xml:space="preserve"> </w:t>
-      </w:r>
-      <w:r>
-        <w:t xml:space="preserve">“artifact at SHDN+2 ms”</w:t>
-      </w:r>
-      <w:r>
-        <w:t xml:space="preserve"> </w:t>
-      </w:r>
-      <w:r>
-        <w:t xml:space="preserve">described in the firmware comments (LT6020 shutdown coupling through the open switch). The median filter suppresses it, so its absence in filtered plots should not be read as absence in the device; raw traces are shown in grey in the QC figures.</w:t>
-      </w:r>
-    </w:p>
-    <w:p>
-      <w:pPr>
-        <w:numPr>
-          <w:ilvl w:val="0"/>
-          <w:numId w:val="1004"/>
-        </w:numPr>
-      </w:pPr>
-      <w:r>
-        <w:rPr>
-          <w:b/>
-          <w:bCs/>
-        </w:rPr>
-        <w:t xml:space="preserve">Phase 1 step.</w:t>
-      </w:r>
-      <w:r>
-        <w:t xml:space="preserve"> </w:t>
-      </w:r>
-      <w:r>
-        <w:t xml:space="preserve">At 10 % the phase 1 plateau steps up by</w:t>
-      </w:r>
-      <w:r>
-        <w:t xml:space="preserve"> </w:t>
-      </w:r>
-      <m:oMath>
-        <m:r>
-          <m:rPr>
-            <m:sty m:val="p"/>
-          </m:rPr>
-          <m:t>∼</m:t>
-        </m:r>
-      </m:oMath>
-      <w:r>
-        <w:t xml:space="preserve">10 µA partway through (visible in Figure 5A). Not investigated.</w:t>
-      </w:r>
-    </w:p>
-    <w:p>
-      <w:pPr>
-        <w:numPr>
-          <w:ilvl w:val="0"/>
-          <w:numId w:val="1004"/>
-        </w:numPr>
-      </w:pPr>
-      <w:r>
-        <w:rPr>
-          <w:b/>
-          <w:bCs/>
-        </w:rPr>
-        <w:t xml:space="preserve">Load sweep.</w:t>
-      </w:r>
-      <w:r>
-        <w:t xml:space="preserve"> </w:t>
-      </w:r>
-      <w:r>
-        <w:t xml:space="preserve">Delivered current versus load for Section 4.2 (see Bench electrical characterization above).</w:t>
-      </w:r>
-    </w:p>
-    <w:bookmarkEnd w:id="71"/>
-    <w:bookmarkStart w:id="72" w:name="notes-impedance"/>
-    <w:p>
-      <w:pPr>
-        <w:pStyle w:val="Heading3"/>
-      </w:pPr>
-      <w:r>
-        <w:t xml:space="preserve">Impedance measurement</w:t>
-      </w:r>
-    </w:p>
-    <w:p>
-      <w:pPr>
-        <w:numPr>
-          <w:ilvl w:val="0"/>
-          <w:numId w:val="1005"/>
-        </w:numPr>
-      </w:pPr>
-      <w:r>
-        <w:t xml:space="preserve">Data come from the platinum cohort 1 (M1, M2) and platinum cohort 2 (F1, F2) sheets. Excluded: M1 output 0 (near 0 V throughout, likely a short) and both electrodes of F1 (unstable; 47–118 kΩ and 23–106 kΩ between sessions, with within-session drift at 7 weeks). Analyzed: five electrodes from M1, M2 and F2. Confirm the wording of the exclusion criteria, and consider stating a quantitative criterion.</w:t>
-      </w:r>
-    </w:p>
-    <w:p>
-      <w:pPr>
-        <w:numPr>
-          <w:ilvl w:val="0"/>
-          <w:numId w:val="1005"/>
-        </w:numPr>
-      </w:pPr>
-      <w:r>
-        <w:t xml:space="preserve">The cohort 2 week-4 session was recorded at 4 weeks + 1 day and is plotted and analyzed as week 4.</w:t>
-      </w:r>
-    </w:p>
-    <w:p>
-      <w:pPr>
-        <w:numPr>
-          <w:ilvl w:val="0"/>
-          <w:numId w:val="1005"/>
-        </w:numPr>
-      </w:pPr>
-      <w:r>
-        <w:t xml:space="preserve">The StimJim bench check (2/10/20/68 kΩ) showed its voltage read-back 6–73 % below the oscilloscope, so the in-vivo values may be underestimates. Consider remeasuring with an impedance meter (for example, a NanoZ at 1 kHz) or with an oscilloscope on the StimJim output, and report both.</w:t>
-      </w:r>
-    </w:p>
-    <w:p>
-      <w:pPr>
-        <w:numPr>
-          <w:ilvl w:val="0"/>
-          <w:numId w:val="1005"/>
-        </w:numPr>
-      </w:pPr>
-      <w:r>
-        <w:t xml:space="preserve">The 450 µs measurement pulse is longer than the DBS pulses; a measurement at the stimulation pulse width would better match the compliance calculation.</w:t>
-      </w:r>
-    </w:p>
-    <w:p>
-      <w:pPr>
-        <w:numPr>
-          <w:ilvl w:val="0"/>
-          <w:numId w:val="1005"/>
-        </w:numPr>
-      </w:pPr>
-      <w:r>
-        <w:t xml:space="preserve">The two-electrode configuration is justified with</w:t>
-      </w:r>
-      <w:r>
-        <w:t xml:space="preserve"> </w:t>
-      </w:r>
-      <w:r>
-        <w:t xml:space="preserve">Koo and Weiland (2018)</w:t>
-      </w:r>
-      <w:r>
-        <w:t xml:space="preserve">; confirm that this is the framing the authors want.</w:t>
-      </w:r>
-    </w:p>
-    <w:p>
-      <w:pPr>
-        <w:numPr>
-          <w:ilvl w:val="0"/>
-          <w:numId w:val="1005"/>
-        </w:numPr>
-      </w:pPr>
-      <w:r>
-        <w:t xml:space="preserve">The other workbook sheets (gold-plated platinum, in vivo two months post, in vivo, bench testing) are not used.</w:t>
-      </w:r>
-    </w:p>
-    <w:bookmarkEnd w:id="72"/>
-    <w:bookmarkStart w:id="73" w:name="notes-citations"/>
-    <w:p>
-      <w:pPr>
-        <w:pStyle w:val="Heading3"/>
-      </w:pPr>
-      <w:r>
-        <w:t xml:space="preserve">Citations to add or verify</w:t>
-      </w:r>
-    </w:p>
-    <w:p>
-      <w:pPr>
-        <w:numPr>
-          <w:ilvl w:val="0"/>
-          <w:numId w:val="1006"/>
-        </w:numPr>
-      </w:pPr>
-      <w:r>
-        <w:t xml:space="preserve">Introduction: the claims that tethers constrain behavior or add stress, and that some therapeutic effects of DBS develop over days to weeks, have no citation and were softened. Add references or keep the softened wording.</w:t>
-      </w:r>
-    </w:p>
-    <w:p>
-      <w:pPr>
-        <w:numPr>
-          <w:ilvl w:val="0"/>
-          <w:numId w:val="1006"/>
-        </w:numPr>
-      </w:pPr>
-      <w:r>
-        <w:t xml:space="preserve">Introduction:</w:t>
-      </w:r>
-      <w:r>
-        <w:t xml:space="preserve"> </w:t>
-      </w:r>
-      <w:r>
-        <w:t xml:space="preserve">Creed (2018)</w:t>
-      </w:r>
-      <w:r>
-        <w:t xml:space="preserve"> </w:t>
-      </w:r>
-      <w:r>
-        <w:t xml:space="preserve">reviews neuromodulation for addiction; confirm that it supports the sentence on subthalamic stimulation parameters, or substitute a subthalamic reference.</w:t>
-      </w:r>
-    </w:p>
-    <w:p>
-      <w:pPr>
-        <w:numPr>
-          <w:ilvl w:val="0"/>
-          <w:numId w:val="1006"/>
-        </w:numPr>
-      </w:pPr>
-      <w:r>
-        <w:t xml:space="preserve">Section 2.3: confirm that</w:t>
-      </w:r>
-      <w:r>
-        <w:t xml:space="preserve"> </w:t>
-      </w:r>
-      <w:r>
-        <w:t xml:space="preserve">Aleksandrova et al. (2013)</w:t>
-      </w:r>
-      <w:r>
-        <w:t xml:space="preserve"> </w:t>
-      </w:r>
-      <w:r>
-        <w:t xml:space="preserve">and</w:t>
-      </w:r>
-      <w:r>
-        <w:t xml:space="preserve"> </w:t>
-      </w:r>
-      <w:r>
-        <w:t xml:space="preserve">Creed et al. (2013)</w:t>
-      </w:r>
-      <w:r>
-        <w:t xml:space="preserve"> </w:t>
-      </w:r>
-      <w:r>
-        <w:t xml:space="preserve">used amplitudes in the several-hundred-microampere range, and that</w:t>
-      </w:r>
-      <w:r>
-        <w:t xml:space="preserve"> </w:t>
-      </w:r>
-      <w:r>
-        <w:t xml:space="preserve">Creed et al. (2012)</w:t>
-      </w:r>
-      <w:r>
-        <w:t xml:space="preserve"> </w:t>
-      </w:r>
-      <w:r>
-        <w:t xml:space="preserve">is the right citation for the 100 µA, 90 µs, 130 Hz reference protocol.</w:t>
-      </w:r>
-    </w:p>
-    <w:p>
-      <w:pPr>
-        <w:numPr>
-          <w:ilvl w:val="0"/>
-          <w:numId w:val="1006"/>
-        </w:numPr>
-      </w:pPr>
-      <w:r>
-        <w:t xml:space="preserve">The Howland balance and load-dependence analysis cites the TI application note</w:t>
-      </w:r>
-      <w:r>
-        <w:t xml:space="preserve"> </w:t>
-      </w:r>
-      <w:r>
-        <w:t xml:space="preserve">(Texas Instruments, 2008)</w:t>
-      </w:r>
-      <w:r>
-        <w:t xml:space="preserve">; a peer-reviewed source could be added.</w:t>
-      </w:r>
-    </w:p>
-    <w:p>
-      <w:pPr>
-        <w:numPr>
-          <w:ilvl w:val="0"/>
-          <w:numId w:val="1006"/>
-        </w:numPr>
-      </w:pPr>
-      <w:r>
-        <w:t xml:space="preserve">Paulat et al. (2026)</w:t>
-      </w:r>
-      <w:r>
-        <w:t xml:space="preserve"> </w:t>
-      </w:r>
-      <w:r>
-        <w:t xml:space="preserve">is a Research Square preprint; update if it is published.</w:t>
-      </w:r>
-    </w:p>
-    <w:bookmarkEnd w:id="73"/>
-    <w:bookmarkStart w:id="74" w:name="notes-table4"/>
-    <w:p>
-      <w:pPr>
-        <w:pStyle w:val="Heading3"/>
-      </w:pPr>
-      <w:r>
-        <w:t xml:space="preserve">Table 4</w:t>
-      </w:r>
-    </w:p>
-    <w:p>
-      <w:pPr>
-        <w:numPr>
-          <w:ilvl w:val="0"/>
-          <w:numId w:val="1007"/>
-        </w:numPr>
-      </w:pPr>
-      <w:r>
-        <w:t xml:space="preserve">Haas et al. (2012)</w:t>
-      </w:r>
-      <w:r>
-        <w:t xml:space="preserve"> </w:t>
-      </w:r>
-      <w:r>
-        <w:t xml:space="preserve">is paywalled and only its abstract was checked, so most of its row is blank. Secondary sources</w:t>
-      </w:r>
-      <w:r>
-        <w:t xml:space="preserve"> </w:t>
-      </w:r>
-      <w:r>
-        <w:t xml:space="preserve">(Kouzani et al., 2013)</w:t>
-      </w:r>
-      <w:r>
-        <w:t xml:space="preserve"> </w:t>
-      </w:r>
-      <w:r>
-        <w:t xml:space="preserve">describe it as a 2.1 g, 8 × 30 mm cylinder with a 4.65 V battery, magnet on/off, parameters set with a programming fixture and fixed resistors, and a 10 h runtime; the parameter cell in that source is garbled (probably 20–100 µA, 60 µs, 131 Hz). Verify against the original and fill in.</w:t>
-      </w:r>
-    </w:p>
-    <w:p>
-      <w:pPr>
-        <w:numPr>
-          <w:ilvl w:val="0"/>
-          <w:numId w:val="1007"/>
-        </w:numPr>
-      </w:pPr>
-      <w:r>
-        <w:t xml:space="preserve">Supplementary files were not read for</w:t>
-      </w:r>
-      <w:r>
-        <w:t xml:space="preserve"> </w:t>
-      </w:r>
-      <w:r>
-        <w:t xml:space="preserve">Burton et al. (2021)</w:t>
-      </w:r>
-      <w:r>
-        <w:t xml:space="preserve"> </w:t>
-      </w:r>
-      <w:r>
-        <w:t xml:space="preserve">or</w:t>
-      </w:r>
-      <w:r>
-        <w:t xml:space="preserve"> </w:t>
-      </w:r>
-      <w:r>
-        <w:t xml:space="preserve">Shen et al. (2026)</w:t>
-      </w:r>
-      <w:r>
-        <w:t xml:space="preserve">, and</w:t>
-      </w:r>
-      <w:r>
-        <w:t xml:space="preserve"> </w:t>
-      </w:r>
-      <w:r>
-        <w:t xml:space="preserve">Paulat et al. (2026)</w:t>
-      </w:r>
-      <w:r>
-        <w:t xml:space="preserve">’s programmable ranges and battery models come from its supplement. The Pinnell firmware release was not checked in the Figshare repository.</w:t>
-      </w:r>
-    </w:p>
-    <w:p>
-      <w:pPr>
-        <w:numPr>
-          <w:ilvl w:val="0"/>
-          <w:numId w:val="1007"/>
-        </w:numPr>
-      </w:pPr>
-      <w:r>
-        <w:t xml:space="preserve">Inconsistencies within sources:</w:t>
-      </w:r>
-      <w:r>
-        <w:t xml:space="preserve"> </w:t>
-      </w:r>
-      <w:r>
-        <w:t xml:space="preserve">Fleischer et al. (2020)</w:t>
-      </w:r>
-      <w:r>
-        <w:t xml:space="preserve"> </w:t>
-      </w:r>
-      <w:r>
-        <w:t xml:space="preserve">gives amplitude and frequency ranges that differ between text and table (both shown), and a 9 × 9 mm versus 10 × 10 mm board;</w:t>
-      </w:r>
-      <w:r>
-        <w:t xml:space="preserve"> </w:t>
-      </w:r>
-      <w:r>
-        <w:t xml:space="preserve">Pinnell et al. (2018)</w:t>
-      </w:r>
-      <w:r>
-        <w:t xml:space="preserve"> </w:t>
-      </w:r>
-      <w:r>
-        <w:t xml:space="preserve">gives 2.8 g in its table and 2.7 g in its introduction;</w:t>
-      </w:r>
-      <w:r>
-        <w:t xml:space="preserve"> </w:t>
-      </w:r>
-      <w:r>
-        <w:t xml:space="preserve">Shen et al. (2026)</w:t>
-      </w:r>
-      <w:r>
-        <w:t xml:space="preserve"> </w:t>
-      </w:r>
-      <w:r>
-        <w:t xml:space="preserve">gives</w:t>
-      </w:r>
-      <w:r>
-        <w:t xml:space="preserve"> </w:t>
-      </w:r>
-      <m:oMath>
-        <m:r>
-          <m:rPr>
-            <m:sty m:val="p"/>
-          </m:rPr>
-          <m:t>≥</m:t>
-        </m:r>
-      </m:oMath>
-      <w:r>
-        <w:t xml:space="preserve">300 h in its table but more than 30 days in its discussion, and demonstrates settings outside its stated ranges;</w:t>
-      </w:r>
-      <w:r>
-        <w:t xml:space="preserve"> </w:t>
-      </w:r>
-      <w:r>
-        <w:t xml:space="preserve">Burton et al. (2021)</w:t>
-      </w:r>
-      <w:r>
-        <w:t xml:space="preserve"> </w:t>
-      </w:r>
-      <w:r>
-        <w:t xml:space="preserve">gives a 50 kHz and a 25 kHz maximum frequency; the t-IPG thickness is 5.3 mm in the text of</w:t>
-      </w:r>
-      <w:r>
-        <w:t xml:space="preserve"> </w:t>
-      </w:r>
-      <w:r>
-        <w:t xml:space="preserve">Paulat et al. (2026)</w:t>
-      </w:r>
-      <w:r>
-        <w:t xml:space="preserve"> </w:t>
-      </w:r>
-      <w:r>
-        <w:t xml:space="preserve">and 2.6 mm in its supplementary table.</w:t>
-      </w:r>
-    </w:p>
-    <w:p>
-      <w:pPr>
-        <w:numPr>
-          <w:ilvl w:val="0"/>
-          <w:numId w:val="1007"/>
-        </w:numPr>
-      </w:pPr>
-      <w:r>
-        <w:t xml:space="preserve">Kouzani et al. (2013)</w:t>
-      </w:r>
-      <w:r>
-        <w:t xml:space="preserve"> </w:t>
-      </w:r>
-      <w:r>
-        <w:t xml:space="preserve">was designed for mice but tested in rats;</w:t>
-      </w:r>
-      <w:r>
-        <w:t xml:space="preserve"> </w:t>
-      </w:r>
-      <w:r>
-        <w:t xml:space="preserve">Alpaugh et al. (2019)</w:t>
-      </w:r>
-      <w:r>
-        <w:t xml:space="preserve">’s</w:t>
-      </w:r>
-      <w:r>
-        <w:t xml:space="preserve"> </w:t>
-      </w:r>
-      <w:r>
-        <w:t xml:space="preserve">“wireless”</w:t>
-      </w:r>
-      <w:r>
-        <w:t xml:space="preserve"> </w:t>
-      </w:r>
-      <w:r>
-        <w:t xml:space="preserve">means untethered, with no radio; its pulse width is read from its Figure 1d.</w:t>
-      </w:r>
-    </w:p>
-    <w:p>
-      <w:pPr>
-        <w:numPr>
-          <w:ilvl w:val="0"/>
-          <w:numId w:val="1007"/>
-        </w:numPr>
-      </w:pPr>
-      <w:r>
-        <w:t xml:space="preserve">Consider adding dimensions as a column now that the FLEX-DBS mass is known.</w:t>
-      </w:r>
-    </w:p>
-    <w:bookmarkEnd w:id="74"/>
-    <w:bookmarkStart w:id="75" w:name="notes-firmware"/>
-    <w:p>
-      <w:pPr>
-        <w:pStyle w:val="Heading3"/>
-      </w:pPr>
-      <w:r>
-        <w:t xml:space="preserve">Firmware and design</w:t>
-      </w:r>
-    </w:p>
-    <w:p>
-      <w:pPr>
-        <w:numPr>
-          <w:ilvl w:val="0"/>
-          <w:numId w:val="1008"/>
-        </w:numPr>
-      </w:pPr>
-      <w:r>
-        <w:t xml:space="preserve">Firmware v0.5 delivers the 130 Hz setting as 142.5 Hz, and at 180 µs the stimulating phase measures</w:t>
-      </w:r>
-      <w:r>
-        <w:t xml:space="preserve"> </w:t>
-      </w:r>
-      <m:oMath>
-        <m:r>
-          <m:rPr>
-            <m:sty m:val="p"/>
-          </m:rPr>
-          <m:t>∼</m:t>
-        </m:r>
-      </m:oMath>
-      <w:r>
-        <w:t xml:space="preserve">60 µs long and the recovery phase 22–46 µs short, leaving a 26–35 % net charge per pulse (Section 4.1). If the fixes listed in Section 7 are made before posting, remeasure and update Section 4.1, Figure 5, Table 2 and the Limitations.</w:t>
-      </w:r>
-    </w:p>
-    <w:p>
-      <w:pPr>
-        <w:numPr>
-          <w:ilvl w:val="0"/>
-          <w:numId w:val="1008"/>
-        </w:numPr>
-      </w:pPr>
-      <w:r>
-        <w:t xml:space="preserve">The photograph in Figure 2A shows the</w:t>
-      </w:r>
-      <w:r>
-        <w:t xml:space="preserve"> </w:t>
-      </w:r>
-      <w:r>
-        <w:t xml:space="preserve">“v8.1”</w:t>
-      </w:r>
-      <w:r>
-        <w:t xml:space="preserve"> </w:t>
-      </w:r>
-      <w:r>
-        <w:t xml:space="preserve">board silkscreen; decide whether to mention the hardware revision in the text.</w:t>
-      </w:r>
-    </w:p>
-    <w:p>
-      <w:pPr>
-        <w:numPr>
-          <w:ilvl w:val="0"/>
-          <w:numId w:val="1008"/>
-        </w:numPr>
-      </w:pPr>
-      <w:r>
-        <w:t xml:space="preserve">Supplementary S1: consider adding the BOM (</w:t>
-      </w:r>
-      <w:r>
-        <w:rPr>
-          <w:rStyle w:val="VerbatimChar"/>
-        </w:rPr>
-        <w:t xml:space="preserve">v8.1/BOM.csv</w:t>
-      </w:r>
-      <w:r>
-        <w:t xml:space="preserve">) alongside the schematic.</w:t>
-      </w:r>
-    </w:p>
-    <w:bookmarkEnd w:id="75"/>
-    <w:bookmarkStart w:id="127" w:name="notes-end-matter"/>
-    <w:p>
-      <w:pPr>
-        <w:pStyle w:val="Heading3"/>
-      </w:pPr>
-      <w:r>
-        <w:t xml:space="preserve">End matter</w:t>
-      </w:r>
-    </w:p>
-    <w:p>
-      <w:pPr>
-        <w:numPr>
-          <w:ilvl w:val="0"/>
-          <w:numId w:val="1009"/>
-        </w:numPr>
-      </w:pPr>
-      <w:r>
-        <w:t xml:space="preserve">Confirm author order, middle initials and affiliations.</w:t>
-      </w:r>
-    </w:p>
-    <w:p>
-      <w:pPr>
-        <w:numPr>
-          <w:ilvl w:val="0"/>
-          <w:numId w:val="1009"/>
-        </w:numPr>
-      </w:pPr>
-      <w:r>
-        <w:t xml:space="preserve">Author contributions, competing interests, funding and acknowledgments are pending.</w:t>
-      </w:r>
-    </w:p>
-    <w:p>
-      <w:pPr>
-        <w:numPr>
-          <w:ilvl w:val="0"/>
-          <w:numId w:val="1009"/>
-        </w:numPr>
-      </w:pPr>
-      <w:r>
-        <w:t xml:space="preserve">Data availability: decide whether to deposit the impedance data and figure scripts in a public repository instead of</w:t>
-      </w:r>
-      <w:r>
-        <w:t xml:space="preserve"> </w:t>
-      </w:r>
-      <w:r>
-        <w:t xml:space="preserve">“available on request”</w:t>
-      </w:r>
-      <w:r>
-        <w:t xml:space="preserve">.</w:t>
-      </w:r>
-    </w:p>
-    <w:p>
-      <w:pPr>
-        <w:numPr>
-          <w:ilvl w:val="0"/>
-          <w:numId w:val="1009"/>
-        </w:numPr>
-      </w:pPr>
-      <w:r>
-        <w:t xml:space="preserve">Before journal submission (not needed for bioRxiv): Highlights, graphical abstract, CRediT statement, generative-AI declaration, line numbers and double spacing per the Journal of Neuroscience Methods guide.</w:t>
-      </w:r>
-    </w:p>
-    <w:bookmarkStart w:id="126" w:name="refs"/>
-    <w:bookmarkStart w:id="77" w:name="ref-aleksandrova2013"/>
+        <w:t xml:space="preserve">[Pending.]</w:t>
+      </w:r>
+    </w:p>
+    <w:bookmarkStart w:id="128" w:name="refs"/>
+    <w:bookmarkStart w:id="69" w:name="ref-aleksandrova2013"/>
     <w:p>
       <w:pPr>
         <w:pStyle w:val="Bibliography"/>
@@ -6846,7 +5756,7 @@
       <w:r>
         <w:t xml:space="preserve"> </w:t>
       </w:r>
-      <w:hyperlink r:id="rId76">
+      <w:hyperlink r:id="rId68">
         <w:r>
           <w:rPr>
             <w:rStyle w:val="Hyperlink"/>
@@ -6855,8 +5765,8 @@
         </w:r>
       </w:hyperlink>
     </w:p>
-    <w:bookmarkEnd w:id="77"/>
-    <w:bookmarkStart w:id="79" w:name="ref-alpaugh2019"/>
+    <w:bookmarkEnd w:id="69"/>
+    <w:bookmarkStart w:id="71" w:name="ref-alpaugh2019"/>
     <w:p>
       <w:pPr>
         <w:pStyle w:val="Bibliography"/>
@@ -6867,7 +5777,7 @@
       <w:r>
         <w:t xml:space="preserve"> </w:t>
       </w:r>
-      <w:hyperlink r:id="rId78">
+      <w:hyperlink r:id="rId70">
         <w:r>
           <w:rPr>
             <w:rStyle w:val="Hyperlink"/>
@@ -6876,19 +5786,40 @@
         </w:r>
       </w:hyperlink>
     </w:p>
-    <w:bookmarkEnd w:id="79"/>
-    <w:bookmarkStart w:id="81" w:name="ref-burton2021"/>
+    <w:bookmarkEnd w:id="71"/>
+    <w:bookmarkStart w:id="73" w:name="ref-aulehner2022"/>
     <w:p>
       <w:pPr>
         <w:pStyle w:val="Bibliography"/>
       </w:pPr>
       <w:r>
+        <w:t xml:space="preserve">Aulehner, K., Bray, J., Koska, I., Pace, C., Palme, R., Kreuzer, M., Platt, B., Fenzl, T., Potschka, H., 2022. The impact of tethered recording techniques on activity and sleep patterns in rats. Scientific Reports 12, 3179.</w:t>
+      </w:r>
+      <w:r>
+        <w:t xml:space="preserve"> </w:t>
+      </w:r>
+      <w:hyperlink r:id="rId72">
+        <w:r>
+          <w:rPr>
+            <w:rStyle w:val="Hyperlink"/>
+          </w:rPr>
+          <w:t xml:space="preserve">https://doi.org/10.1038/s41598-022-06307-3</w:t>
+        </w:r>
+      </w:hyperlink>
+    </w:p>
+    <w:bookmarkEnd w:id="73"/>
+    <w:bookmarkStart w:id="75" w:name="ref-burton2021"/>
+    <w:p>
+      <w:pPr>
+        <w:pStyle w:val="Bibliography"/>
+      </w:pPr>
+      <w:r>
         <w:t xml:space="preserve">Burton, A., Won, S.M., Sohrabi, A.K., Stuart, T., Amirhossein, A., Kim, J.U., Park, Y., Gabros, A., Rogers, J.A., Vitale, F., Richardson, A.G., Gutruf, P., 2021. Wireless, battery-free, and fully implantable electrical neurostimulation in freely moving rodents. Microsystems &amp; Nanoengineering 7, 62.</w:t>
       </w:r>
       <w:r>
         <w:t xml:space="preserve"> </w:t>
       </w:r>
-      <w:hyperlink r:id="rId80">
+      <w:hyperlink r:id="rId74">
         <w:r>
           <w:rPr>
             <w:rStyle w:val="Hyperlink"/>
@@ -6897,8 +5828,8 @@
         </w:r>
       </w:hyperlink>
     </w:p>
-    <w:bookmarkEnd w:id="81"/>
-    <w:bookmarkStart w:id="83" w:name="ref-cermak2019"/>
+    <w:bookmarkEnd w:id="75"/>
+    <w:bookmarkStart w:id="77" w:name="ref-cermak2019"/>
     <w:p>
       <w:pPr>
         <w:pStyle w:val="Bibliography"/>
@@ -6909,7 +5840,7 @@
       <w:r>
         <w:t xml:space="preserve"> </w:t>
       </w:r>
-      <w:hyperlink r:id="rId82">
+      <w:hyperlink r:id="rId76">
         <w:r>
           <w:rPr>
             <w:rStyle w:val="Hyperlink"/>
@@ -6918,8 +5849,8 @@
         </w:r>
       </w:hyperlink>
     </w:p>
-    <w:bookmarkEnd w:id="83"/>
-    <w:bookmarkStart w:id="85" w:name="ref-creed2018"/>
+    <w:bookmarkEnd w:id="77"/>
+    <w:bookmarkStart w:id="79" w:name="ref-creed2018"/>
     <w:p>
       <w:pPr>
         <w:pStyle w:val="Bibliography"/>
@@ -6930,7 +5861,7 @@
       <w:r>
         <w:t xml:space="preserve"> </w:t>
       </w:r>
-      <w:hyperlink r:id="rId84">
+      <w:hyperlink r:id="rId78">
         <w:r>
           <w:rPr>
             <w:rStyle w:val="Hyperlink"/>
@@ -6939,8 +5870,8 @@
         </w:r>
       </w:hyperlink>
     </w:p>
-    <w:bookmarkEnd w:id="85"/>
-    <w:bookmarkStart w:id="87" w:name="ref-creed2013"/>
+    <w:bookmarkEnd w:id="79"/>
+    <w:bookmarkStart w:id="81" w:name="ref-creed2013"/>
     <w:p>
       <w:pPr>
         <w:pStyle w:val="Bibliography"/>
@@ -6951,7 +5882,7 @@
       <w:r>
         <w:t xml:space="preserve"> </w:t>
       </w:r>
-      <w:hyperlink r:id="rId86">
+      <w:hyperlink r:id="rId80">
         <w:r>
           <w:rPr>
             <w:rStyle w:val="Hyperlink"/>
@@ -6960,8 +5891,8 @@
         </w:r>
       </w:hyperlink>
     </w:p>
-    <w:bookmarkEnd w:id="87"/>
-    <w:bookmarkStart w:id="89" w:name="ref-creed2012egr"/>
+    <w:bookmarkEnd w:id="81"/>
+    <w:bookmarkStart w:id="83" w:name="ref-creed2012egr"/>
     <w:p>
       <w:pPr>
         <w:pStyle w:val="Bibliography"/>
@@ -6972,7 +5903,7 @@
       <w:r>
         <w:t xml:space="preserve"> </w:t>
       </w:r>
-      <w:hyperlink r:id="rId88">
+      <w:hyperlink r:id="rId82">
         <w:r>
           <w:rPr>
             <w:rStyle w:val="Hyperlink"/>
@@ -6981,8 +5912,8 @@
         </w:r>
       </w:hyperlink>
     </w:p>
-    <w:bookmarkEnd w:id="89"/>
-    <w:bookmarkStart w:id="91" w:name="ref-creed2011"/>
+    <w:bookmarkEnd w:id="83"/>
+    <w:bookmarkStart w:id="85" w:name="ref-creed2011"/>
     <w:p>
       <w:pPr>
         <w:pStyle w:val="Bibliography"/>
@@ -6993,7 +5924,7 @@
       <w:r>
         <w:t xml:space="preserve"> </w:t>
       </w:r>
-      <w:hyperlink r:id="rId90">
+      <w:hyperlink r:id="rId84">
         <w:r>
           <w:rPr>
             <w:rStyle w:val="Hyperlink"/>
@@ -7002,8 +5933,8 @@
         </w:r>
       </w:hyperlink>
     </w:p>
-    <w:bookmarkEnd w:id="91"/>
-    <w:bookmarkStart w:id="93" w:name="ref-creed2015"/>
+    <w:bookmarkEnd w:id="85"/>
+    <w:bookmarkStart w:id="87" w:name="ref-creed2015"/>
     <w:p>
       <w:pPr>
         <w:pStyle w:val="Bibliography"/>
@@ -7014,7 +5945,7 @@
       <w:r>
         <w:t xml:space="preserve"> </w:t>
       </w:r>
-      <w:hyperlink r:id="rId92">
+      <w:hyperlink r:id="rId86">
         <w:r>
           <w:rPr>
             <w:rStyle w:val="Hyperlink"/>
@@ -7023,8 +5954,8 @@
         </w:r>
       </w:hyperlink>
     </w:p>
-    <w:bookmarkEnd w:id="93"/>
-    <w:bookmarkStart w:id="95" w:name="ref-fasano2019"/>
+    <w:bookmarkEnd w:id="87"/>
+    <w:bookmarkStart w:id="89" w:name="ref-fasano2019"/>
     <w:p>
       <w:pPr>
         <w:pStyle w:val="Bibliography"/>
@@ -7035,7 +5966,7 @@
       <w:r>
         <w:t xml:space="preserve"> </w:t>
       </w:r>
-      <w:hyperlink r:id="rId94">
+      <w:hyperlink r:id="rId88">
         <w:r>
           <w:rPr>
             <w:rStyle w:val="Hyperlink"/>
@@ -7044,8 +5975,8 @@
         </w:r>
       </w:hyperlink>
     </w:p>
-    <w:bookmarkEnd w:id="95"/>
-    <w:bookmarkStart w:id="97" w:name="ref-fleischer2020"/>
+    <w:bookmarkEnd w:id="89"/>
+    <w:bookmarkStart w:id="91" w:name="ref-fleischer2020"/>
     <w:p>
       <w:pPr>
         <w:pStyle w:val="Bibliography"/>
@@ -7056,7 +5987,7 @@
       <w:r>
         <w:t xml:space="preserve"> </w:t>
       </w:r>
-      <w:hyperlink r:id="rId96">
+      <w:hyperlink r:id="rId90">
         <w:r>
           <w:rPr>
             <w:rStyle w:val="Hyperlink"/>
@@ -7065,8 +5996,8 @@
         </w:r>
       </w:hyperlink>
     </w:p>
-    <w:bookmarkEnd w:id="97"/>
-    <w:bookmarkStart w:id="99" w:name="ref-grotemeyer2024"/>
+    <w:bookmarkEnd w:id="91"/>
+    <w:bookmarkStart w:id="93" w:name="ref-grotemeyer2024"/>
     <w:p>
       <w:pPr>
         <w:pStyle w:val="Bibliography"/>
@@ -7077,7 +6008,7 @@
       <w:r>
         <w:t xml:space="preserve"> </w:t>
       </w:r>
-      <w:hyperlink r:id="rId98">
+      <w:hyperlink r:id="rId92">
         <w:r>
           <w:rPr>
             <w:rStyle w:val="Hyperlink"/>
@@ -7086,8 +6017,8 @@
         </w:r>
       </w:hyperlink>
     </w:p>
-    <w:bookmarkEnd w:id="99"/>
-    <w:bookmarkStart w:id="101" w:name="ref-dehaas2012"/>
+    <w:bookmarkEnd w:id="93"/>
+    <w:bookmarkStart w:id="95" w:name="ref-dehaas2012"/>
     <w:p>
       <w:pPr>
         <w:pStyle w:val="Bibliography"/>
@@ -7098,7 +6029,7 @@
       <w:r>
         <w:t xml:space="preserve"> </w:t>
       </w:r>
-      <w:hyperlink r:id="rId100">
+      <w:hyperlink r:id="rId94">
         <w:r>
           <w:rPr>
             <w:rStyle w:val="Hyperlink"/>
@@ -7107,19 +6038,49 @@
         </w:r>
       </w:hyperlink>
     </w:p>
-    <w:bookmarkEnd w:id="101"/>
-    <w:bookmarkStart w:id="103" w:name="ref-knotkova2021"/>
+    <w:bookmarkEnd w:id="95"/>
+    <w:bookmarkStart w:id="97" w:name="ref-jiang2017"/>
     <w:p>
       <w:pPr>
         <w:pStyle w:val="Bibliography"/>
       </w:pPr>
       <w:r>
+        <w:t xml:space="preserve">Jiang, Z., Huxter, J.R., Bowyer, S.A., Blockeel, A.J., Butler, J., Imtiaz, S.A., Wafford, K.A., Phillips, K.G., Tricklebank, M.D., Marston, H.M., Rodriguez-Villegas, E., 2017.</w:t>
+      </w:r>
+      <w:r>
+        <w:t xml:space="preserve"> </w:t>
+      </w:r>
+      <w:r>
+        <w:t xml:space="preserve">TaiNi</w:t>
+      </w:r>
+      <w:r>
+        <w:t xml:space="preserve">: Maximizing research output whilst improving animals’ welfare in neurophysiology experiments. Scientific Reports 7, 8086.</w:t>
+      </w:r>
+      <w:r>
+        <w:t xml:space="preserve"> </w:t>
+      </w:r>
+      <w:hyperlink r:id="rId96">
+        <w:r>
+          <w:rPr>
+            <w:rStyle w:val="Hyperlink"/>
+          </w:rPr>
+          <w:t xml:space="preserve">https://doi.org/10.1038/s41598-017-08078-8</w:t>
+        </w:r>
+      </w:hyperlink>
+    </w:p>
+    <w:bookmarkEnd w:id="97"/>
+    <w:bookmarkStart w:id="99" w:name="ref-knotkova2021"/>
+    <w:p>
+      <w:pPr>
+        <w:pStyle w:val="Bibliography"/>
+      </w:pPr>
+      <w:r>
         <w:t xml:space="preserve">Knotkova, H., Hamani, C., Sivanesan, E., Le Beuffe, M.F.E., Moon, J.Y., Cohen, S.P., Huntoon, M.A., 2021. Neuromodulation for chronic pain. The Lancet 397, 2111–2124.</w:t>
       </w:r>
       <w:r>
         <w:t xml:space="preserve"> </w:t>
       </w:r>
-      <w:hyperlink r:id="rId102">
+      <w:hyperlink r:id="rId98">
         <w:r>
           <w:rPr>
             <w:rStyle w:val="Hyperlink"/>
@@ -7128,8 +6089,8 @@
         </w:r>
       </w:hyperlink>
     </w:p>
-    <w:bookmarkEnd w:id="103"/>
-    <w:bookmarkStart w:id="105" w:name="ref-koo2018"/>
+    <w:bookmarkEnd w:id="99"/>
+    <w:bookmarkStart w:id="101" w:name="ref-koo2018"/>
     <w:p>
       <w:pPr>
         <w:pStyle w:val="Bibliography"/>
@@ -7140,7 +6101,7 @@
       <w:r>
         <w:t xml:space="preserve"> </w:t>
       </w:r>
-      <w:hyperlink r:id="rId104">
+      <w:hyperlink r:id="rId100">
         <w:r>
           <w:rPr>
             <w:rStyle w:val="Hyperlink"/>
@@ -7149,8 +6110,8 @@
         </w:r>
       </w:hyperlink>
     </w:p>
-    <w:bookmarkEnd w:id="105"/>
-    <w:bookmarkStart w:id="107" w:name="ref-kouzani2013"/>
+    <w:bookmarkEnd w:id="101"/>
+    <w:bookmarkStart w:id="103" w:name="ref-kouzani2013"/>
     <w:p>
       <w:pPr>
         <w:pStyle w:val="Bibliography"/>
@@ -7161,7 +6122,7 @@
       <w:r>
         <w:t xml:space="preserve"> </w:t>
       </w:r>
-      <w:hyperlink r:id="rId106">
+      <w:hyperlink r:id="rId102">
         <w:r>
           <w:rPr>
             <w:rStyle w:val="Hyperlink"/>
@@ -7170,8 +6131,8 @@
         </w:r>
       </w:hyperlink>
     </w:p>
-    <w:bookmarkEnd w:id="107"/>
-    <w:bookmarkStart w:id="109" w:name="ref-krauss2021"/>
+    <w:bookmarkEnd w:id="103"/>
+    <w:bookmarkStart w:id="105" w:name="ref-krauss2021"/>
     <w:p>
       <w:pPr>
         <w:pStyle w:val="Bibliography"/>
@@ -7182,7 +6143,7 @@
       <w:r>
         <w:t xml:space="preserve"> </w:t>
       </w:r>
-      <w:hyperlink r:id="rId108">
+      <w:hyperlink r:id="rId104">
         <w:r>
           <w:rPr>
             <w:rStyle w:val="Hyperlink"/>
@@ -7191,19 +6152,40 @@
         </w:r>
       </w:hyperlink>
     </w:p>
-    <w:bookmarkEnd w:id="109"/>
-    <w:bookmarkStart w:id="111" w:name="ref-lozano2019"/>
+    <w:bookmarkEnd w:id="105"/>
+    <w:bookmarkStart w:id="107" w:name="ref-kupsch2006"/>
     <w:p>
       <w:pPr>
         <w:pStyle w:val="Bibliography"/>
       </w:pPr>
       <w:r>
+        <w:t xml:space="preserve">Kupsch, A., Benecke, R., Müller, J., Trottenberg, T., Schneider, G.-H., Poewe, W., Eisner, W., Wolters, A., Müller, J.-U., Deuschl, G., Pinsker, M.O., Skogseid, I.M., Roeste, G.K., Vollmer-Haase, J., Brentrup, A., Krause, M., Tronnier, V., Schnitzler, A., Voges, J., Nikkhah, G., Vesper, J., Naumann, M., Volkmann, J., 2006. Pallidal deep-brain stimulation in primary generalized or segmental dystonia. New England Journal of Medicine 355, 1978–1990.</w:t>
+      </w:r>
+      <w:r>
+        <w:t xml:space="preserve"> </w:t>
+      </w:r>
+      <w:hyperlink r:id="rId106">
+        <w:r>
+          <w:rPr>
+            <w:rStyle w:val="Hyperlink"/>
+          </w:rPr>
+          <w:t xml:space="preserve">https://doi.org/10.1056/NEJMoa063618</w:t>
+        </w:r>
+      </w:hyperlink>
+    </w:p>
+    <w:bookmarkEnd w:id="107"/>
+    <w:bookmarkStart w:id="109" w:name="ref-lozano2019"/>
+    <w:p>
+      <w:pPr>
+        <w:pStyle w:val="Bibliography"/>
+      </w:pPr>
+      <w:r>
         <w:t xml:space="preserve">Lozano, A.M., Lipsman, N., Bergman, H., Brown, P., Chabardes, S., Chang, J.W., Matthews, K., McIntyre, C.C., Schlaepfer, T.E., Schulder, M., Temel, Y., Volkmann, J., Krauss, J.K., 2019. Deep brain stimulation: Current challenges and future directions. Nature Reviews Neurology 15, 148–160.</w:t>
       </w:r>
       <w:r>
         <w:t xml:space="preserve"> </w:t>
       </w:r>
-      <w:hyperlink r:id="rId110">
+      <w:hyperlink r:id="rId108">
         <w:r>
           <w:rPr>
             <w:rStyle w:val="Hyperlink"/>
@@ -7212,8 +6194,8 @@
         </w:r>
       </w:hyperlink>
     </w:p>
-    <w:bookmarkEnd w:id="111"/>
-    <w:bookmarkStart w:id="113" w:name="ref-merrill2005"/>
+    <w:bookmarkEnd w:id="109"/>
+    <w:bookmarkStart w:id="111" w:name="ref-merrill2005"/>
     <w:p>
       <w:pPr>
         <w:pStyle w:val="Bibliography"/>
@@ -7224,7 +6206,7 @@
       <w:r>
         <w:t xml:space="preserve"> </w:t>
       </w:r>
-      <w:hyperlink r:id="rId112">
+      <w:hyperlink r:id="rId110">
         <w:r>
           <w:rPr>
             <w:rStyle w:val="Hyperlink"/>
@@ -7233,8 +6215,8 @@
         </w:r>
       </w:hyperlink>
     </w:p>
-    <w:bookmarkEnd w:id="113"/>
-    <w:bookmarkStart w:id="115" w:name="ref-murphy2021"/>
+    <w:bookmarkEnd w:id="111"/>
+    <w:bookmarkStart w:id="113" w:name="ref-murphy2021"/>
     <w:p>
       <w:pPr>
         <w:pStyle w:val="Bibliography"/>
@@ -7245,7 +6227,7 @@
       <w:r>
         <w:t xml:space="preserve"> </w:t>
       </w:r>
-      <w:hyperlink r:id="rId114">
+      <w:hyperlink r:id="rId112">
         <w:r>
           <w:rPr>
             <w:rStyle w:val="Hyperlink"/>
@@ -7254,8 +6236,8 @@
         </w:r>
       </w:hyperlink>
     </w:p>
-    <w:bookmarkEnd w:id="115"/>
-    <w:bookmarkStart w:id="117" w:name="ref-paulat2026"/>
+    <w:bookmarkEnd w:id="113"/>
+    <w:bookmarkStart w:id="115" w:name="ref-paulat2026"/>
     <w:p>
       <w:pPr>
         <w:pStyle w:val="Bibliography"/>
@@ -7266,7 +6248,7 @@
       <w:r>
         <w:t xml:space="preserve"> </w:t>
       </w:r>
-      <w:hyperlink r:id="rId116">
+      <w:hyperlink r:id="rId114">
         <w:r>
           <w:rPr>
             <w:rStyle w:val="Hyperlink"/>
@@ -7275,8 +6257,8 @@
         </w:r>
       </w:hyperlink>
     </w:p>
-    <w:bookmarkEnd w:id="117"/>
-    <w:bookmarkStart w:id="119" w:name="ref-pinnell2018"/>
+    <w:bookmarkEnd w:id="115"/>
+    <w:bookmarkStart w:id="117" w:name="ref-pinnell2018"/>
     <w:p>
       <w:pPr>
         <w:pStyle w:val="Bibliography"/>
@@ -7287,7 +6269,7 @@
       <w:r>
         <w:t xml:space="preserve"> </w:t>
       </w:r>
-      <w:hyperlink r:id="rId118">
+      <w:hyperlink r:id="rId116">
         <w:r>
           <w:rPr>
             <w:rStyle w:val="Hyperlink"/>
@@ -7296,8 +6278,8 @@
         </w:r>
       </w:hyperlink>
     </w:p>
-    <w:bookmarkEnd w:id="119"/>
-    <w:bookmarkStart w:id="121" w:name="ref-plocksties2021"/>
+    <w:bookmarkEnd w:id="117"/>
+    <w:bookmarkStart w:id="119" w:name="ref-plocksties2021"/>
     <w:p>
       <w:pPr>
         <w:pStyle w:val="Bibliography"/>
@@ -7314,7 +6296,7 @@
       <w:r>
         <w:t xml:space="preserve"> </w:t>
       </w:r>
-      <w:hyperlink r:id="rId120">
+      <w:hyperlink r:id="rId118">
         <w:r>
           <w:rPr>
             <w:rStyle w:val="Hyperlink"/>
@@ -7323,8 +6305,8 @@
         </w:r>
       </w:hyperlink>
     </w:p>
-    <w:bookmarkEnd w:id="121"/>
-    <w:bookmarkStart w:id="123" w:name="ref-shen2026"/>
+    <w:bookmarkEnd w:id="119"/>
+    <w:bookmarkStart w:id="121" w:name="ref-shen2026"/>
     <w:p>
       <w:pPr>
         <w:pStyle w:val="Bibliography"/>
@@ -7335,7 +6317,7 @@
       <w:r>
         <w:t xml:space="preserve"> </w:t>
       </w:r>
-      <w:hyperlink r:id="rId122">
+      <w:hyperlink r:id="rId120">
         <w:r>
           <w:rPr>
             <w:rStyle w:val="Hyperlink"/>
@@ -7344,8 +6326,8 @@
         </w:r>
       </w:hyperlink>
     </w:p>
-    <w:bookmarkEnd w:id="123"/>
-    <w:bookmarkStart w:id="125" w:name="ref-ti2008howland"/>
+    <w:bookmarkEnd w:id="121"/>
+    <w:bookmarkStart w:id="123" w:name="ref-ti2008howland"/>
     <w:p>
       <w:pPr>
         <w:pStyle w:val="Bibliography"/>
@@ -7356,7 +6338,7 @@
       <w:r>
         <w:t xml:space="preserve"> </w:t>
       </w:r>
-      <w:hyperlink r:id="rId124">
+      <w:hyperlink r:id="rId122">
         <w:r>
           <w:rPr>
             <w:rStyle w:val="Hyperlink"/>
@@ -7407,10 +6389,63 @@
         <w:t xml:space="preserve">(Application Report No. SNOA474A). Texas Instruments.</w:t>
       </w:r>
     </w:p>
+    <w:bookmarkEnd w:id="123"/>
+    <w:bookmarkStart w:id="125" w:name="ref-tucker2013"/>
+    <w:p>
+      <w:pPr>
+        <w:pStyle w:val="Bibliography"/>
+      </w:pPr>
+      <w:r>
+        <w:t xml:space="preserve">Tucker, A.S., Fox, R.M., Sadleir, R.J., 2013. Biocompatible, high precision, wideband, improved</w:t>
+      </w:r>
+      <w:r>
+        <w:t xml:space="preserve"> </w:t>
+      </w:r>
+      <w:r>
+        <w:t xml:space="preserve">Howland</w:t>
+      </w:r>
+      <w:r>
+        <w:t xml:space="preserve"> </w:t>
+      </w:r>
+      <w:r>
+        <w:t xml:space="preserve">current source with lead-lag compensation. IEEE Transactions on Biomedical Circuits and Systems 7, 63–70.</w:t>
+      </w:r>
+      <w:r>
+        <w:t xml:space="preserve"> </w:t>
+      </w:r>
+      <w:hyperlink r:id="rId124">
+        <w:r>
+          <w:rPr>
+            <w:rStyle w:val="Hyperlink"/>
+          </w:rPr>
+          <w:t xml:space="preserve">https://doi.org/10.1109/TBCAS.2012.2199114</w:t>
+        </w:r>
+      </w:hyperlink>
+    </w:p>
     <w:bookmarkEnd w:id="125"/>
-    <w:bookmarkEnd w:id="126"/>
+    <w:bookmarkStart w:id="127" w:name="ref-vachez2020"/>
+    <w:p>
+      <w:pPr>
+        <w:pStyle w:val="Bibliography"/>
+      </w:pPr>
+      <w:r>
+        <w:t xml:space="preserve">Vachez, Y.M., Creed, M.C., 2020. Deep brain stimulation of the subthalamic nucleus modulates reward-related behavior: A systematic review. Frontiers in Human Neuroscience 14, 578564.</w:t>
+      </w:r>
+      <w:r>
+        <w:t xml:space="preserve"> </w:t>
+      </w:r>
+      <w:hyperlink r:id="rId126">
+        <w:r>
+          <w:rPr>
+            <w:rStyle w:val="Hyperlink"/>
+          </w:rPr>
+          <w:t xml:space="preserve">https://doi.org/10.3389/fnhum.2020.578564</w:t>
+        </w:r>
+      </w:hyperlink>
+    </w:p>
     <w:bookmarkEnd w:id="127"/>
     <w:bookmarkEnd w:id="128"/>
+    <w:bookmarkEnd w:id="129"/>
     <w:sectPr>
       <w:footnotePr>
         <w:numRestart w:val="eachSect"/>
@@ -8315,27 +7350,6 @@
     </w:lvlOverride>
   </w:num>
   <w:num w:numId="1002">
-    <w:abstractNumId w:val="991"/>
-  </w:num>
-  <w:num w:numId="1003">
-    <w:abstractNumId w:val="991"/>
-  </w:num>
-  <w:num w:numId="1004">
-    <w:abstractNumId w:val="991"/>
-  </w:num>
-  <w:num w:numId="1005">
-    <w:abstractNumId w:val="991"/>
-  </w:num>
-  <w:num w:numId="1006">
-    <w:abstractNumId w:val="991"/>
-  </w:num>
-  <w:num w:numId="1007">
-    <w:abstractNumId w:val="991"/>
-  </w:num>
-  <w:num w:numId="1008">
-    <w:abstractNumId w:val="991"/>
-  </w:num>
-  <w:num w:numId="1009">
     <w:abstractNumId w:val="991"/>
   </w:num>
 </w:numbering>

</xml_diff>

<commit_message>
Figure 6 open-field results; in vivo methods and framing; electrode, ethics and availability statements; Howland error derivation; build instructions
Co-authored-by: Cursor <cursoragent@cursor.com>
</commit_message>
<xml_diff>
--- a/manuscript/build/flex_dbs.docx
+++ b/manuscript/build/flex_dbs.docx
@@ -21,7 +21,7 @@
         <w:rPr>
           <w:vertAlign w:val="superscript"/>
         </w:rPr>
-        <w:t xml:space="preserve">1,*</w:t>
+        <w:t xml:space="preserve">1</w:t>
       </w:r>
       <w:r>
         <w:t xml:space="preserve">, Meaghan C. Creed</w:t>
@@ -39,7 +39,7 @@
         <w:rPr>
           <w:vertAlign w:val="superscript"/>
         </w:rPr>
-        <w:t xml:space="preserve">2</w:t>
+        <w:t xml:space="preserve">2,*</w:t>
       </w:r>
     </w:p>
     <w:p>
@@ -81,7 +81,7 @@
         <w:t xml:space="preserve">*</w:t>
       </w:r>
       <w:r>
-        <w:t xml:space="preserve">Corresponding author: Robert D. Graham, robertg@wustl.edu</w:t>
+        <w:t xml:space="preserve">Corresponding author: Matt Gaidica, gaidica@wustl.edu</w:t>
       </w:r>
     </w:p>
     <w:p>
@@ -162,7 +162,7 @@
         <w:t xml:space="preserve"> </w:t>
       </w:r>
       <w:r>
-        <w:t xml:space="preserve">Into a 1 kΩ bench load, delivered current increased approximately linearly with the amplitude setting and was repeatable from pulse to pulse, with an asymmetric biphasic waveform whose recovery phase ran at about one fifth of the stimulating amplitude. Battery current was 1.47–1.89 mA in standby and 3.15–3.42 mA during stimulation at amplitude settings of 60–400 µA, giving a projected three days of continuous stimulation per pair of cells. Firmware v0.5 left a net charge of 26–35 % of the stimulating-phase charge per pulse into 1 kΩ. Into 47 kΩ, within the in-vivo load range, stimulating current was compliance-limited at 93 µA. Pulse-derived estimates of the effective load presented by five implanted platinum electrodes in three mice had weekly means of 43–54 kΩ over eight weeks (32–80 kΩ across individual sessions), placing the maximum regulated current near 90 µA (81–101 µA at the weekly means). Analysis of the current-pump network bounds load-dependent current error at 3–8 % for these loads.</w:t>
+        <w:t xml:space="preserve">Into a 1 kΩ bench load, delivered current increased approximately linearly with the amplitude setting and was repeatable from pulse to pulse, with an asymmetric biphasic waveform whose recovery phase ran at about one fifth of the stimulating amplitude. Battery current was 1.47–1.89 mA in standby and 3.15–3.42 mA during stimulation at amplitude settings of 60–400 µA, giving a projected three days of continuous stimulation per pair of cells. Firmware v0.5 left a net charge of 26–35 % of the stimulating-phase charge per pulse into 1 kΩ. Into 47 kΩ, within the in vivo load range, stimulating current was compliance-limited at 93 µA. Pulse-derived estimates of the effective load presented by five implanted platinum electrodes in three mice had weekly means of 43–54 kΩ over eight weeks (32–80 kΩ across individual sessions), placing the maximum regulated current near 90 µA (81–101 µA at the weekly means). Analysis of the current-pump network bounds load-dependent current error at 3–8 % for these loads. In vivo, we used FLEX-DBS at high amplitude settings, intended to evoke a robust stimulation-associated behavioral phenotype, through electrodes implanted in the cingulate cortex of 6 mice. Time spent immobile in an open field rose from 46.5 % at baseline to 75.7 % during stimulation (a 62.7 % increase in the group mean) and remained elevated after stimulation ended; without a sham control, this increase cannot be separated from within-session habituation.</w:t>
       </w:r>
     </w:p>
     <w:p>
@@ -198,7 +198,7 @@
         <w:t xml:space="preserve"> </w:t>
       </w:r>
       <w:r>
-        <w:t xml:space="preserve">FLEX-DBS is designed for untethered DBS experiments in which parameters must be set, changed and verified at the cage. Its measured power consumption permits a projected three days of continuous operation per cell pair; firmware v0.5 requires improved charge balancing before prolonged in-vivo stimulation. The electrode load, rather than the programmable range, sets the usable stimulation amplitude in vivo.</w:t>
+        <w:t xml:space="preserve">FLEX-DBS is designed for untethered DBS experiments in which parameters must be set, changed and verified at the cage. Its measured power consumption permits a projected three days of continuous operation per cell pair; firmware v0.5 requires improved charge balancing before prolonged in vivo stimulation. The electrode load, rather than the programmable range, sets the usable stimulation amplitude in vivo. In vivo, stimulation at high amplitude settings was associated with increased immobility, consistent with effective stimulation through implanted electrodes; electrode impedance and delivered current were not measured in these mice.</w:t>
       </w:r>
     </w:p>
     <w:p>
@@ -349,7 +349,7 @@
         <w:t xml:space="preserve">(Aleksandrova et al., 2013)</w:t>
       </w:r>
       <w:r>
-        <w:t xml:space="preserve">. A wireless, battery-powered system for delivering sustained DBS in rodents would support mechanistic studies of why efficacy is lost with long-term stimulation and of indications in which therapeutic effects emerge slowly.</w:t>
+        <w:t xml:space="preserve">. A wireless, battery-powered system for delivering sustained DBS in rodents would support mechanistic studies of both long-term loss of efficacy and indications in which therapeutic effects emerge slowly.</w:t>
       </w:r>
     </w:p>
     <w:p>
@@ -384,7 +384,25 @@
         <w:t xml:space="preserve">(Vachez and Creed, 2020)</w:t>
       </w:r>
       <w:r>
-        <w:t xml:space="preserve">. Most published long-runtime mouse-scale systems also run from supplies of about 3 V, and several are single-channel.</w:t>
+        <w:t xml:space="preserve">. Most published long-runtime mouse-scale systems also run from supplies of about 3 V</w:t>
+      </w:r>
+      <w:r>
+        <w:t xml:space="preserve"> </w:t>
+      </w:r>
+      <w:r>
+        <w:t xml:space="preserve">(Alpaugh et al., 2019; Fleischer et al., 2020; Grotemeyer et al., 2024; Kouzani et al., 2013; Paulat et al., 2026)</w:t>
+      </w:r>
+      <w:r>
+        <w:t xml:space="preserve">, and several are single-channel</w:t>
+      </w:r>
+      <w:r>
+        <w:t xml:space="preserve"> </w:t>
+      </w:r>
+      <w:r>
+        <w:t xml:space="preserve">(Alpaugh et al., 2019; Fleischer et al., 2020; Grotemeyer et al., 2024; Kouzani et al., 2013)</w:t>
+      </w:r>
+      <w:r>
+        <w:t xml:space="preserve">.</w:t>
       </w:r>
     </w:p>
     <w:p>
@@ -451,7 +469,7 @@
         <w:pStyle w:val="FirstParagraph"/>
       </w:pPr>
       <w:r>
-        <w:t xml:space="preserve">FLEX-DBS implements the general architecture with the choices listed in Table 1. The circuit schematic is provided as Supplementary material S1, and the firmware, application and communication protocol are released as open source (S2–S4); the main text describes function.</w:t>
+        <w:t xml:space="preserve">FLEX-DBS implements the general architecture with the choices listed in Table 1. The circuit schematic (Supplementary material S1) is available on request, and the firmware, application and communication protocol are released as open source (S2–S4); the main text describes function.</w:t>
       </w:r>
     </w:p>
     <w:p>
@@ -809,7 +827,7 @@
         <w:t xml:space="preserve"> </w:t>
       </w:r>
       <w:r>
-        <w:t xml:space="preserve">The device has two output channels, one per hemisphere, each with its own Howland pump, switch and two-stage output filter (two 330 Ω series resistors, each followed by 470 pF to ground; 660 Ω in total per channel). The two channels share the DAC command, so they deliver the same amplitude and, in the current firmware, the same timing: both switches close and open together and both pumps see the same DAC steps. Independent timing per channel is possible with the existing hardware because each switch has its own control line; independent amplitude is not, because the DAC is shared. The four-pin electrode connector carries the two channel outputs and the ground return.</w:t>
+        <w:t xml:space="preserve">The device has two output channels, one per hemisphere, each with its own Howland pump, switch and two-stage output filter (two 330 Ω series resistors, each followed by 470 pF to ground; 660 Ω in total per channel). The two channels share the DAC command, so they deliver the same amplitude and, in the current firmware, the same timing: both switches close and open together and both pumps see the same DAC steps. Independent timing per channel is possible with the existing hardware because each switch has its own control line; independent amplitude is not, because the DAC is shared. The four-pin electrode connector carries the two channel outputs and the ground return. One electrode is implanted per hemisphere, and each electrode is a twisted pair of one stimulating wire, connected to the channel output, and one ground wire, connected to the device ground; no separate return electrode is used.</w:t>
       </w:r>
     </w:p>
     <w:p>
@@ -1609,7 +1627,7 @@
         <w:t xml:space="preserve"> </w:t>
       </w:r>
       <w:r>
-        <w:t xml:space="preserve">is the reference protocol around which the application’s defaults are written. The frequency range covers the 130 Hz clinical standard and the 80–160 Hz window in which most rodent high-frequency protocols fall; it does not extend to the 30 and 60 Hz conditions used in earlier comparative work</w:t>
+        <w:t xml:space="preserve">is the reference protocol around which the application’s defaults are written. The frequency range covers the 130 Hz clinical standard and the 80–160 Hz range selected for this device; it does not extend to the 30 and 60 Hz conditions used in earlier comparative work</w:t>
       </w:r>
       <w:r>
         <w:t xml:space="preserve"> </w:t>
@@ -1732,6 +1750,250 @@
           <w:b/>
           <w:bCs/>
         </w:rPr>
+        <w:t xml:space="preserve">Load dependence below compliance.</w:t>
+      </w:r>
+      <w:r>
+        <w:t xml:space="preserve"> </w:t>
+      </w:r>
+      <w:r>
+        <w:t xml:space="preserve">An improved Howland pump has infinite output impedance only when its resistor ratios are exactly balanced; any mismatch leaves a finite output impedance</w:t>
+      </w:r>
+      <w:r>
+        <w:t xml:space="preserve"> </w:t>
+      </w:r>
+      <m:oMath>
+        <m:sSub>
+          <m:e>
+            <m:r>
+              <m:t>R</m:t>
+            </m:r>
+          </m:e>
+          <m:sub>
+            <m:r>
+              <m:rPr>
+                <m:sty m:val="p"/>
+              </m:rPr>
+              <m:t>o</m:t>
+            </m:r>
+            <m:r>
+              <m:rPr>
+                <m:sty m:val="p"/>
+              </m:rPr>
+              <m:t>u</m:t>
+            </m:r>
+            <m:r>
+              <m:rPr>
+                <m:sty m:val="p"/>
+              </m:rPr>
+              <m:t>t</m:t>
+            </m:r>
+          </m:sub>
+        </m:sSub>
+      </m:oMath>
+      <w:r>
+        <w:t xml:space="preserve"> </w:t>
+      </w:r>
+      <w:r>
+        <w:t xml:space="preserve">in parallel with the load, so the current delivered into a load</w:t>
+      </w:r>
+      <w:r>
+        <w:t xml:space="preserve"> </w:t>
+      </w:r>
+      <m:oMath>
+        <m:sSub>
+          <m:e>
+            <m:r>
+              <m:t>R</m:t>
+            </m:r>
+          </m:e>
+          <m:sub>
+            <m:r>
+              <m:t>L</m:t>
+            </m:r>
+          </m:sub>
+        </m:sSub>
+      </m:oMath>
+      <w:r>
+        <w:t xml:space="preserve"> </w:t>
+      </w:r>
+      <w:r>
+        <w:t xml:space="preserve">falls short of the commanded current by the fraction</w:t>
+      </w:r>
+      <w:r>
+        <w:t xml:space="preserve"> </w:t>
+      </w:r>
+      <m:oMath>
+        <m:sSub>
+          <m:e>
+            <m:r>
+              <m:t>R</m:t>
+            </m:r>
+          </m:e>
+          <m:sub>
+            <m:r>
+              <m:t>L</m:t>
+            </m:r>
+          </m:sub>
+        </m:sSub>
+        <m:r>
+          <m:rPr>
+            <m:sty m:val="p"/>
+          </m:rPr>
+          <m:t>/</m:t>
+        </m:r>
+        <m:r>
+          <m:rPr>
+            <m:sty m:val="p"/>
+          </m:rPr>
+          <m:t>(</m:t>
+        </m:r>
+        <m:sSub>
+          <m:e>
+            <m:r>
+              <m:t>R</m:t>
+            </m:r>
+          </m:e>
+          <m:sub>
+            <m:r>
+              <m:t>L</m:t>
+            </m:r>
+          </m:sub>
+        </m:sSub>
+        <m:r>
+          <m:rPr>
+            <m:sty m:val="p"/>
+          </m:rPr>
+          <m:t>+</m:t>
+        </m:r>
+        <m:sSub>
+          <m:e>
+            <m:r>
+              <m:t>R</m:t>
+            </m:r>
+          </m:e>
+          <m:sub>
+            <m:r>
+              <m:rPr>
+                <m:sty m:val="p"/>
+              </m:rPr>
+              <m:t>o</m:t>
+            </m:r>
+            <m:r>
+              <m:rPr>
+                <m:sty m:val="p"/>
+              </m:rPr>
+              <m:t>u</m:t>
+            </m:r>
+            <m:r>
+              <m:rPr>
+                <m:sty m:val="p"/>
+              </m:rPr>
+              <m:t>t</m:t>
+            </m:r>
+          </m:sub>
+        </m:sSub>
+        <m:r>
+          <m:rPr>
+            <m:sty m:val="p"/>
+          </m:rPr>
+          <m:t>)</m:t>
+        </m:r>
+      </m:oMath>
+      <w:r>
+        <w:t xml:space="preserve"> </w:t>
+      </w:r>
+      <w:r>
+        <w:t xml:space="preserve">(Tucker et al., 2013)</w:t>
+      </w:r>
+      <w:r>
+        <w:t xml:space="preserve">. We computed</w:t>
+      </w:r>
+      <w:r>
+        <w:t xml:space="preserve"> </w:t>
+      </w:r>
+      <m:oMath>
+        <m:sSub>
+          <m:e>
+            <m:r>
+              <m:t>R</m:t>
+            </m:r>
+          </m:e>
+          <m:sub>
+            <m:r>
+              <m:rPr>
+                <m:sty m:val="p"/>
+              </m:rPr>
+              <m:t>o</m:t>
+            </m:r>
+            <m:r>
+              <m:rPr>
+                <m:sty m:val="p"/>
+              </m:rPr>
+              <m:t>u</m:t>
+            </m:r>
+            <m:r>
+              <m:rPr>
+                <m:sty m:val="p"/>
+              </m:rPr>
+              <m:t>t</m:t>
+            </m:r>
+          </m:sub>
+        </m:sSub>
+      </m:oMath>
+      <w:r>
+        <w:t xml:space="preserve"> </w:t>
+      </w:r>
+      <w:r>
+        <w:t xml:space="preserve">for the FLEX-DBS network (10 kΩ input and feedback resistors, 12 kΩ reference resistor, 10 kΩ feedback resistor and 2 kΩ sense resistor; Section 2.2) at every combination of ±0.1 % resistor tolerance, assuming an ideal op amp. The worst case is about 0.9 MΩ. Into the 32–80 kΩ electrode loads measured in Section 3, plus 660 Ω of output filter resistance, this corresponds to a current shortfall of at most 3–8 %; with nominal resistor values the shortfall is zero. Finite op-amp gain would lower</w:t>
+      </w:r>
+      <w:r>
+        <w:t xml:space="preserve"> </w:t>
+      </w:r>
+      <m:oMath>
+        <m:sSub>
+          <m:e>
+            <m:r>
+              <m:t>R</m:t>
+            </m:r>
+          </m:e>
+          <m:sub>
+            <m:r>
+              <m:rPr>
+                <m:sty m:val="p"/>
+              </m:rPr>
+              <m:t>o</m:t>
+            </m:r>
+            <m:r>
+              <m:rPr>
+                <m:sty m:val="p"/>
+              </m:rPr>
+              <m:t>u</m:t>
+            </m:r>
+            <m:r>
+              <m:rPr>
+                <m:sty m:val="p"/>
+              </m:rPr>
+              <m:t>t</m:t>
+            </m:r>
+          </m:sub>
+        </m:sSub>
+      </m:oMath>
+      <w:r>
+        <w:t xml:space="preserve"> </w:t>
+      </w:r>
+      <w:r>
+        <w:t xml:space="preserve">further, so these values are a bound for the resistor network alone, not a measurement.</w:t>
+      </w:r>
+    </w:p>
+    <w:p>
+      <w:pPr>
+        <w:pStyle w:val="BodyText"/>
+      </w:pPr>
+      <w:r>
+        <w:rPr>
+          <w:b/>
+          <w:bCs/>
+        </w:rPr>
         <w:t xml:space="preserve">Waveform and charge balance.</w:t>
       </w:r>
       <w:r>
@@ -1835,13 +2097,13 @@
         <w:t xml:space="preserve">A constant-current stimulator regulates current only while the voltage the electrode requires stays within its compliance, so the electrode load determines how much of the programmable range is usable.</w:t>
       </w:r>
     </w:p>
-    <w:bookmarkStart w:id="28" w:name="electrode-construction"/>
+    <w:bookmarkStart w:id="28" w:name="animals-and-electrode-implantation"/>
     <w:p>
       <w:pPr>
         <w:pStyle w:val="Heading3"/>
       </w:pPr>
       <w:r>
-        <w:t xml:space="preserve">3.1 Electrode construction</w:t>
+        <w:t xml:space="preserve">3.1 Animals and electrode implantation</w:t>
       </w:r>
     </w:p>
     <w:p>
@@ -1849,7 +2111,15 @@
         <w:pStyle w:val="FirstParagraph"/>
       </w:pPr>
       <w:r>
-        <w:t xml:space="preserve">Electrodes were implanted using a custom 3D-printed electrode holder designed in Fusion 360 (Autodesk; design available at</w:t>
+        <w:t xml:space="preserve">Adult (≥6 weeks) male and female C57BL/6J mice were sourced or bred from Jackson Laboratory lines and used for all experiments. Mice were group housed (2–5 per cage, single sex) under controlled humidity, temperature and photoperiod (12:12; light onset/offset at 07:00 and 19:00) conditions with ad libitum access to food and water. Anesthesia was induced and maintained with isoflurane (5 % and 1.5 %, respectively). Following craniotomy, DBS electrodes were implanted into the cingulate cortex (coordinates relative to bregma: anteroposterior (AP), −0.6 mm; mediolateral (ML), ±0.3 mm; dorsoventral (DV), −1.25 mm). Animals recovered for 7–10 days before behavioral testing. All procedures were approved by the Institutional Animal Care and Use Committee at Washington University in St. Louis and conducted in accordance with the Guide for the Care and Use of Laboratory Animals (NIH).</w:t>
+      </w:r>
+    </w:p>
+    <w:p>
+      <w:pPr>
+        <w:pStyle w:val="BodyText"/>
+      </w:pPr>
+      <w:r>
+        <w:t xml:space="preserve">Electrodes were Teflon-insulated platinum twisted-wire pairs (Protech International Inc.; length 10 mm; wire diameter 0.25 mm; diameter with insulation 0.33 mm). The mating end of each wire pair was inserted into a custom 3D-printed electrode holder, designed in Fusion 360 (Autodesk; design available at</w:t>
       </w:r>
       <w:r>
         <w:t xml:space="preserve"> </w:t>
@@ -1863,15 +2133,7 @@
         </w:r>
       </w:hyperlink>
       <w:r>
-        <w:t xml:space="preserve">) and printed in clear biocompatible resin.</w:t>
-      </w:r>
-    </w:p>
-    <w:p>
-      <w:pPr>
-        <w:pStyle w:val="BodyText"/>
-      </w:pPr>
-      <w:r>
-        <w:t xml:space="preserve">[Remaining construction details pending.]</w:t>
+        <w:t xml:space="preserve">) and printed in clear biocompatible resin, and superglue was applied to the base of each wire to hold the pairs in place. After the glue dried, each wire was cut to the length needed to reach the implantation target, and the ends of each electrode were wet-sanded (3000 grit) to maximize contact surface area. One electrode was implanted per hemisphere. Each electrode was a twisted pair in which one wire was the stimulating contact and the other was connected to ground; no separate return electrode was implanted.</w:t>
       </w:r>
     </w:p>
     <w:bookmarkEnd w:id="28"/>
@@ -1881,7 +2143,7 @@
         <w:pStyle w:val="Heading3"/>
       </w:pPr>
       <w:r>
-        <w:t xml:space="preserve">3.2 In-vivo impedance measurement</w:t>
+        <w:t xml:space="preserve">3.2 In vivo impedance measurement</w:t>
       </w:r>
     </w:p>
     <w:p>
@@ -1889,7 +2151,7 @@
         <w:pStyle w:val="FirstParagraph"/>
       </w:pPr>
       <w:r>
-        <w:t xml:space="preserve">Platinum electrodes were implanted bilaterally in four mice across two surgical cohorts (eight electrodes), and impedance was measured weekly from 1 to 8 weeks after implantation. At each session a StimJim stimulator</w:t>
+        <w:t xml:space="preserve">Platinum electrodes were implanted bilaterally, one per hemisphere, in four mice across two surgical cohorts (eight electrodes); these mice were separate from those used in Section 6. Impedance was measured weekly from 1 to 8 weeks after implantation. At each session a StimJim stimulator</w:t>
       </w:r>
       <w:r>
         <w:t xml:space="preserve"> </w:t>
@@ -1901,7 +2163,7 @@
         <w:t xml:space="preserve"> </w:t>
       </w:r>
       <w:r>
-        <w:t xml:space="preserve">delivered 10 µA, 450 µs pulses at 130 Hz for 10 s through each electrode against the common return, and the pulse voltage and delivered current reported by the StimJim were recorded five times. Impedance was computed as voltage divided by delivered current and averaged over the five readings; this quantity is an effective, pulse-derived estimate of the load, referred to as impedance in this section. This two-electrode configuration is the one the stimulator itself drives. Two- and three-electrode impedance spectroscopy measurements are highly correlated</w:t>
+        <w:t xml:space="preserve">delivered 10 µA, 450 µs pulses at 130 Hz for 10 s through the stimulating wire of each electrode, with the other wire of the pair as ground, and the pulse voltage and delivered current reported by the StimJim were recorded five times. Impedance was computed as voltage divided by delivered current and averaged over the five readings; this quantity is an effective, pulse-derived estimate of the load, referred to as impedance in this section. This two-electrode configuration is the one the stimulator itself drives. Two- and three-electrode impedance spectroscopy measurements are highly correlated</w:t>
       </w:r>
       <w:r>
         <w:t xml:space="preserve"> </w:t>
@@ -1918,7 +2180,7 @@
         <w:pStyle w:val="BodyText"/>
       </w:pPr>
       <w:r>
-        <w:t xml:space="preserve">Three electrodes were excluded. One read near 0 V at every session, consistent with a short to the return. Both electrodes of one mouse gave unstable readings, varying by up to 4.7-fold between sessions and drifting within a session; whether this reflected the electrodes, the implant strategy or the recording setup could not be determined. The analyzed data set therefore comprises five electrodes from three mice, measured at eight weekly sessions (40 electrode-sessions).</w:t>
+        <w:t xml:space="preserve">Three electrodes were excluded. One read near 0 V at every session, consistent with a short between the stimulating and ground wires of the pair. Both electrodes of one mouse gave unstable readings, varying by up to 4.7-fold between sessions and drifting within a session; whether this reflected the electrodes, the implant strategy or the recording setup could not be determined. The analyzed data set therefore comprises five electrodes from three mice, measured at eight weekly sessions (40 electrode-sessions).</w:t>
       </w:r>
     </w:p>
     <w:p>
@@ -1926,7 +2188,7 @@
         <w:pStyle w:val="BodyText"/>
       </w:pPr>
       <w:r>
-        <w:t xml:space="preserve">Two properties of the measurement bound its interpretation. First, in a bench check against resistive loads, the voltage reported by the StimJim fell 6–73 % below the oscilloscope-measured voltage for loads of 2–68 kΩ, with the largest errors above 10 kΩ, which would bias the in-vivo values low. Second, the 450 µs measurement pulse is longer than typical DBS pulses, so the polarization it includes would bias the values high relative to the load seen by shorter pulses. Because these biases act in opposite directions, the direction of the net error is unknown, and the values below are best treated as an estimate of the load range rather than a calibrated impedance.</w:t>
+        <w:t xml:space="preserve">Two properties of the measurement bound its interpretation. First, in a bench check against resistive loads, the voltage reported by the StimJim fell 6–73 % below the oscilloscope-measured voltage for loads of 2–68 kΩ, with the largest errors above 10 kΩ, which would bias the in vivo values low. Second, the 450 µs measurement pulse is longer than typical DBS pulses, so the polarization it includes would bias the values high relative to the load seen by shorter pulses. Because these biases act in opposite directions, the direction of the net error is unknown, and the values below are best treated as an estimate of the load range rather than a calibrated impedance.</w:t>
       </w:r>
     </w:p>
     <w:bookmarkEnd w:id="29"/>
@@ -1936,7 +2198,7 @@
         <w:pStyle w:val="Heading3"/>
       </w:pPr>
       <w:r>
-        <w:t xml:space="preserve">3.3 In-vivo impedance and the compliance envelope</w:t>
+        <w:t xml:space="preserve">3.3 In vivo impedance and the compliance envelope</w:t>
       </w:r>
     </w:p>
     <w:p>
@@ -4355,7 +4617,7 @@
         <w:pStyle w:val="Heading2"/>
       </w:pPr>
       <w:r>
-        <w:t xml:space="preserve">6. In-vivo functional validation</w:t>
+        <w:t xml:space="preserve">6. In vivo functional validation</w:t>
       </w:r>
     </w:p>
     <w:bookmarkStart w:id="36" w:name="experimental-paradigm"/>
@@ -4372,7 +4634,45 @@
         <w:pStyle w:val="FirstParagraph"/>
       </w:pPr>
       <w:r>
-        <w:t xml:space="preserve">[Pending.]</w:t>
+        <w:t xml:space="preserve">In our rodent DBS protocols, stimulation amplitude is titrated in each animal against an observable effect, and the amplitude at which side effects such as muscle twitches appear is a natural upper reference. A preclinical DBS system should therefore be able to deliver amplitudes in the therapeutic range and the larger amplitudes at which side effects appear. DBS of the cingulate cortex is under active investigation for chronic pain that is refractory to conventional medical management</w:t>
+      </w:r>
+      <w:r>
+        <w:t xml:space="preserve"> </w:t>
+      </w:r>
+      <w:r>
+        <w:t xml:space="preserve">(Boccard et al., 2017;</w:t>
+      </w:r>
+      <w:r>
+        <w:t xml:space="preserve"> </w:t>
+      </w:r>
+      <w:r>
+        <w:t xml:space="preserve">Shirvalkar et al.</w:t>
+      </w:r>
+      <w:r>
+        <w:t xml:space="preserve">, 2025)</w:t>
+      </w:r>
+      <w:r>
+        <w:t xml:space="preserve">. We hypothesized that high-amplitude cingulate stimulation would produce freezing or prolonged immobility. We therefore delivered high amplitude settings intended to evoke a robust stimulation-associated behavioral phenotype in vivo.</w:t>
+      </w:r>
+    </w:p>
+    <w:p>
+      <w:pPr>
+        <w:pStyle w:val="BodyText"/>
+      </w:pPr>
+      <w:r>
+        <w:t xml:space="preserve">Six mice implanted with cingulate DBS electrodes (Section 3.1), which had also received a unilateral chronic constriction injury (CCI) of the sciatic nerve, were placed in an open-field chamber (30 cm × 30 cm inner dimensions) and allowed to acclimate for 5 minutes before behavioral recording. Position was tracked with Bonsai</w:t>
+      </w:r>
+      <w:r>
+        <w:t xml:space="preserve"> </w:t>
+      </w:r>
+      <w:r>
+        <w:t xml:space="preserve">(Lopes et al., 2015)</w:t>
+      </w:r>
+      <w:r>
+        <w:t xml:space="preserve"> </w:t>
+      </w:r>
+      <w:r>
+        <w:t xml:space="preserve">using a webcam mounted above the chamber (Figure 6A). Each mouse was recorded once, in a single session of 17.5–20.7 minutes comprising a baseline period, a period of bilateral high-amplitude DBS and a post-stimulation period. DBS was switched on 5.5–6.9 minutes and off 11.7–14.4 minutes after the start of recording. These mice were separate from those used for the impedance measurements in Section 3.2. Stimulation was delivered by FLEX-DBS with firmware v0.5, as in the rest of this paper, at an amplitude setting above 100 µA, 450 µs pulse duration and 130 Hz pulse frequency (the 130 Hz setting is delivered as 142.5 Hz, Table 2). Electrode impedance and delivered current were not measured in these mice; at the electrode loads measured in Section 3.2, the delivered current would be limited by compliance to approximately 81–101 µA (Figure 4B).</w:t>
       </w:r>
     </w:p>
     <w:bookmarkEnd w:id="36"/>
@@ -4390,17 +4690,50 @@
         <w:pStyle w:val="FirstParagraph"/>
       </w:pPr>
       <w:r>
-        <w:t xml:space="preserve">[Pending.]</w:t>
+        <w:t xml:space="preserve">The position of each mouse in the open-field chamber was tracked throughout the baseline, DBS and post-stimulation periods (Figure 6C). Video was saved at 320 × 240 px (MPEG-4), and the centroid of the animal was tracked online in an 894 × 877 px tracking frame, with each position exported with its acquisition timestamp. Frame timing was irregular (median approximately 31 frames/s; inter-frame intervals 13–58 ms), so speed was computed as displacement divided by the measured interval between frames, and all averages were weighted by time. Pixel-to-centimeter calibration was measured separately for each recording from its own video, as the wall-to-wall span of the arena floor detected in a median background image (27.30–27.73 px/cm across recordings), because the camera position shifted slightly between sessions. Trajectories were preprocessed in the following order: (1) tracking gaps of up to 0.25 s were linearly interpolated, and longer gaps were left missing; (2) frames implying a speed above 100 cm/s, which corresponded to the tracker jumping to the experimenter’s hand, were rejected iteratively and replaced by linear interpolation; (3) a 5-frame median filter was applied; and (4) position was smoothed with a Gaussian filter (standard deviation 0.12 s, applied on the frame index at the median frame rate).</w:t>
+      </w:r>
+    </w:p>
+    <w:p>
+      <w:pPr>
+        <w:pStyle w:val="BodyText"/>
+      </w:pPr>
+      <w:r>
+        <w:t xml:space="preserve">The baseline, DBS and post-stimulation periods were separated by brief handling events in which the experimenter’s hand entered the chamber to switch stimulation on and off. Handling events were detected automatically in the video, and detections less than 60 s apart were merged into a single event. Because handling transiently increased locomotion, every analysis window began 90 s after the preceding handling event. This applied to all three periods: the baseline window began 90 s after the start of recording, the DBS window 90 s after the stimulation-on event, and the post-stimulation window 90 s after the stimulation-off event. The 90 s buffer was fixed before the second group of animals was recorded and was not adjusted afterward. Baseline windows ended at the stimulation-on event, DBS windows at the stimulation-off event, and post-stimulation windows at the end of recording. Analyzed durations were 241–324 s (baseline), 263–339 s (DBS) and 225–288 s (post-stimulation).</w:t>
+      </w:r>
+    </w:p>
+    <w:p>
+      <w:pPr>
+        <w:pStyle w:val="BodyText"/>
+      </w:pPr>
+      <w:r>
+        <w:t xml:space="preserve">Immobility was defined by classifying each inter-frame interval as mobile or immobile using speed thresholds with hysteresis. A mobile bout began when speed exceeded 2 cm/s and ended when speed fell below 1 cm/s, with minimum bout durations of 0.5 s (mobile) and 1.0 s (immobile). Percent time immobile was the time-weighted fraction of the analysis window not classified as mobile. The thresholds, the 100 cm/s speed ceiling and the smoothing parameters were chosen values rather than values taken from the literature. Turning was quantified after rediscretizing each trajectory into steps of constant 1 cm length, independent of speed or elapsed time</w:t>
+      </w:r>
+      <w:r>
+        <w:t xml:space="preserve"> </w:t>
+      </w:r>
+      <w:r>
+        <w:t xml:space="preserve">(Bovet and Benhamou, 1988)</w:t>
+      </w:r>
+      <w:r>
+        <w:t xml:space="preserve">. A new point was recorded each time the animal had moved 1 cm in a straight line from the previous point, and paths were split at untracked gaps so that no step spanned missing data. The turning angle was the change in heading between consecutive steps, wrapped to ±180 degrees. Turning for each period was the mean absolute turning angle, which counts turns in either direction, and required at least 20 steps (20 cm of path); otherwise it was left undefined. Locality was quantified as the radius of gyration, the time-weighted root-mean-square distance of the animal’s position from its mean position. It was computed in consecutive 60 s bins from the start of each analysis window, with bins containing less than 30 s of valid tracking discarded, and averaged across bins weighted by tracked time.</w:t>
+      </w:r>
+    </w:p>
+    <w:p>
+      <w:pPr>
+        <w:pStyle w:val="BodyText"/>
+      </w:pPr>
+      <w:r>
+        <w:t xml:space="preserve">Periods were compared with two-tailed paired t-tests using the animal as the unit of analysis (n = 6). Animals without a defined value in a period were excluded only from comparisons involving that period. For immobility, a Wilcoxon signed-rank test was also computed for baseline versus DBS. To estimate the contribution of within-session habituation, immobility during DBS was additionally compared with the final 2 min of the baseline window. Turning and locality were exploratory analyses developed after the immobility result, and their p-values are reported without correction for multiple comparisons. Analyses were performed in Python; turning, locality, statistics and figures were computed with Python 3.13.5, NumPy 2.5.3, pandas 3.0.6, SciPy 1.18.1 and Matplotlib 3.11.2.</w:t>
       </w:r>
     </w:p>
     <w:bookmarkEnd w:id="37"/>
-    <w:bookmarkStart w:id="38" w:name="functional-equivalence"/>
+    <w:bookmarkStart w:id="38" w:name="Xd87205b9cf9fef538e82336079cacef2395694a"/>
     <w:p>
       <w:pPr>
         <w:pStyle w:val="Heading3"/>
       </w:pPr>
       <w:r>
-        <w:t xml:space="preserve">6.3 Functional equivalence</w:t>
+        <w:t xml:space="preserve">6.3 Immobility increased during high-amplitude stimulation</w:t>
       </w:r>
     </w:p>
     <w:p>
@@ -4408,7 +4741,15 @@
         <w:pStyle w:val="FirstParagraph"/>
       </w:pPr>
       <w:r>
-        <w:t xml:space="preserve">[Pending.]</w:t>
+        <w:t xml:space="preserve">To confirm that the device delivered stimulation sufficient to produce observable motor effects, mice were recorded in an open field before, during and after FLEX-DBS at high amplitude settings in a single session (Figure 6A). Across the six animals, the percentage of time spent immobile was 46.5 ± 4.1 % during baseline, 75.7 ± 11.6 % during DBS and 79.7 ± 8.9 % after stimulation (mean ± SEM; Figure 6B), a 62.7 % increase in the group mean from baseline to DBS. Immobility was higher during DBS than at baseline (paired t-test, t(5) = −3.26, p = 0.022) and remained higher after stimulation ended (t(5) = −4.95, p = 0.004). Five of six animals showed the increase; the exception, F1R, became less immobile during DBS (29.4 % to 19.2 %), and a Wilcoxon signed-rank test of baseline versus DBS gave p = 0.0625. Because all periods were recorded in one session without a sham control, this increase is associated with stimulation but cannot be separated from within-session habituation. When DBS was compared only with the final 2 min of baseline (50.4 ± 7.3 % immobile), the difference was smaller and not significant (t(5) = −2.34, p = 0.066), and immobility did not return toward baseline levels after stimulation ended.</w:t>
+      </w:r>
+    </w:p>
+    <w:p>
+      <w:pPr>
+        <w:pStyle w:val="BodyText"/>
+      </w:pPr>
+      <w:r>
+        <w:t xml:space="preserve">In exploratory analyses that were not corrected for multiple comparisons, movement during DBS was more tortuous and more spatially confined than at baseline (Figure 6C–E). Turning per 1 cm step rose from 21.4 ± 1.6 to 32.9 ± 5.9 degrees (t(5) = −2.40, p = 0.062), increasing in five of six animals, again with the exception of F1R. The within-minute radius of gyration fell from 11.0 ± 0.7 to 5.4 ± 1.6 cm (t(5) = 4.13, p = 0.009). Neither measure differed significantly between DBS and post-stimulation or between baseline and post-stimulation: for turning, n = 4 because two animals did not move after stimulation, with p = 0.246 and p = 0.406; for locality, n = 6, with p = 0.405 and p = 0.199. Locality partly reflects immobility, because a stationary animal scores near zero. Together, these data show motor changes during FLEX-DBS at high amplitude settings, consistent with effective stimulation through implanted electrodes. They do not establish that stimulation caused the changes or that the changes reversed when stimulation ended.</w:t>
       </w:r>
     </w:p>
     <w:bookmarkEnd w:id="38"/>
@@ -4447,7 +4788,7 @@
         <w:pStyle w:val="BodyText"/>
       </w:pPr>
       <w:r>
-        <w:t xml:space="preserve">The in-vivo load measurements reinforce that DBS delivery is a systems problem. Electrode impedance and stimulator compliance jointly determine whether the commanded constant current is actually delivered, and impedance differs between electrodes and varies over the weeks after implantation. A stimulator specified only by its programmable current range has not been fully specified. For the implanted platinum electrodes used here, with pulse-derived effective loads of 32–80 kΩ and weekly means of 43–54 kΩ, the ±5 V rails of FLEX-DBS support roughly 56–131 µA, well below the 600 µA programmable range and centered on the 100 µA protocols used in prior work. We therefore recommend reporting the compliance limit alongside the measured load distribution (Figure 4B) for any rodent stimulator.</w:t>
+        <w:t xml:space="preserve">The in vivo load measurements reinforce that DBS delivery is a systems problem. Electrode impedance and stimulator compliance jointly determine whether the commanded constant current is actually delivered, and impedance differs between electrodes and varies over the weeks after implantation. A programmable current range alone therefore does not fully characterize a stimulator. For the implanted platinum electrodes used here, with pulse-derived effective loads of 32–80 kΩ and weekly means of 43–54 kΩ, the ±5 V rails of FLEX-DBS support roughly 56–131 µA, well below the 600 µA programmable range and centered on the 100 µA protocols used in prior work. We therefore recommend reporting the compliance limit alongside the measured load distribution (Figure 4B) for any rodent stimulator.</w:t>
       </w:r>
     </w:p>
     <w:p>
@@ -4512,16 +4853,7 @@
         <w:t xml:space="preserve"> </w:t>
       </w:r>
       <w:r>
-        <w:t xml:space="preserve">Firmware v0.5 delivers the 130 Hz setting as 142.5 Hz and leaves a net charge of 26–35 % of the stimulating-phase charge per pulse into 1 kΩ; this must be corrected before prolonged in-vivo stimulation. Below compliance, the finite output impedance of the Howland pumps (about 0.9 MΩ worst case with 0.1 % resistors) lets delivered current fall by up to 3–8 % into the loads measured here</w:t>
-      </w:r>
-      <w:r>
-        <w:t xml:space="preserve"> </w:t>
-      </w:r>
-      <w:r>
-        <w:t xml:space="preserve">(Tucker et al., 2013)</w:t>
-      </w:r>
-      <w:r>
-        <w:t xml:space="preserve">, so amplitude settings should be read against the measured load and the bench measurements rather than as absolute currents. The two channels share amplitude and timing, and the 80 Hz frequency floor excludes the low-frequency protocols of comparative and therapeutic interest</w:t>
+        <w:t xml:space="preserve">Firmware v0.5 delivers the 130 Hz setting as 142.5 Hz and leaves a net charge of 26–35 % of the stimulating-phase charge per pulse into 1 kΩ; this must be corrected before prolonged in vivo stimulation, and it applies to the stimulation delivered in Section 6. Below compliance, the finite output impedance of the Howland pumps (about 0.9 MΩ worst case with 0.1 % resistors; Section 2.3) lets delivered current fall by up to 3–8 % into the loads measured here, so amplitude settings should be read against the measured load and the bench measurements rather than as absolute currents. The two channels share amplitude and timing, and the 80 Hz frequency floor excludes the low-frequency protocols of comparative and therapeutic interest</w:t>
       </w:r>
       <w:r>
         <w:t xml:space="preserve"> </w:t>
@@ -4530,7 +4862,7 @@
         <w:t xml:space="preserve">(Creed et al., 2015, 2011)</w:t>
       </w:r>
       <w:r>
-        <w:t xml:space="preserve">. Finally, the bench measurements cover one pulse width into two loads, and the impedance data come from five electrodes in three mice.</w:t>
+        <w:t xml:space="preserve">. Finally, the bench measurements cover one pulse width into two loads, the impedance data come from five electrodes in three mice, and the in vivo test was a single session in six mice without a sham control, so the immobility increase cannot be separated from within-session habituation.</w:t>
       </w:r>
     </w:p>
     <w:p>
@@ -4548,7 +4880,7 @@
         <w:t xml:space="preserve"> </w:t>
       </w:r>
       <w:r>
-        <w:t xml:space="preserve">The schematic, firmware, application and protocol are released so that others can reproduce or adapt the platform (Supplementary material). Several extensions are firmware-level within the present hardware: computing the stimulation period in timer ticks rather than whole milliseconds, which would deliver 130 Hz and other frequencies exactly; calibrating the phase-timing compensation and recovery amplitude against bench measurements so that the two phases carry equal charge; independent per-channel timing; a wider frequency range; a selectable recovery ratio; and over-the-air firmware update. At the hardware level, on-board sensing of delivered current or electrode voltage would report the stimulation actually delivered and track electrode impedance over the course of an experiment, supporting amplitude titration in each animal.</w:t>
+        <w:t xml:space="preserve">The firmware, application and protocol are released, and the schematic is available on request, so that others can reproduce or adapt the platform (Supplementary material). Several extensions are firmware-level within the present hardware: computing the stimulation period in timer ticks rather than whole milliseconds, which would deliver 130 Hz and other frequencies exactly; calibrating the phase-timing compensation and recovery amplitude against bench measurements so that the two phases carry equal charge; independent per-channel timing; a wider frequency range; a selectable recovery ratio; and over-the-air firmware update. At the hardware level, on-board sensing of delivered current or electrode voltage would report the stimulation actually delivered and track electrode impedance over the course of an experiment, supporting amplitude titration in each animal.</w:t>
       </w:r>
     </w:p>
     <w:bookmarkEnd w:id="40"/>
@@ -4566,11 +4898,11 @@
         <w:pStyle w:val="FirstParagraph"/>
       </w:pPr>
       <w:r>
-        <w:t xml:space="preserve">FLEX-DBS is a head-mounted, bilateral, constant-current stimulator with real-time smartphone control, intended for experiments in which parameters must be set, changed and verified at the cage. Its measured power consumption permits a projected three days of continuous operation per cell pair; firmware v0.5 requires improved charge balancing before prolonged in-vivo stimulation. Its ±5 V compliance rails deliver roughly 56–131 µA into implanted platinum electrodes with pulse-derived effective loads of 32–80 kΩ, so the electrode load, not the programmable range, sets usable amplitude in vivo.</w:t>
+        <w:t xml:space="preserve">FLEX-DBS is a head-mounted, bilateral, constant-current stimulator with real-time smartphone control, intended for experiments in which parameters must be set, changed and verified at the cage. Its measured power consumption permits a projected three days of continuous operation per cell pair; firmware v0.5 requires improved charge balancing before prolonged in vivo stimulation. Its ±5 V compliance rails deliver roughly 56–131 µA into implanted platinum electrodes with pulse-derived effective loads of 32–80 kΩ, so the electrode load, not the programmable range, sets usable amplitude in vivo. In vivo, stimulation at high amplitude settings was associated with increased immobility in an open field, consistent with effective stimulation through implanted electrodes; because electrode impedance and delivered current were not measured in these mice, and delivered current would be compliance-limited to about 81–101 µA at the loads measured in Section 3, this does not establish the delivered amplitude.</w:t>
       </w:r>
     </w:p>
     <w:bookmarkEnd w:id="41"/>
-    <w:bookmarkStart w:id="60" w:name="figures"/>
+    <w:bookmarkStart w:id="63" w:name="figures"/>
     <w:p>
       <w:pPr>
         <w:pStyle w:val="Heading2"/>
@@ -4594,7 +4926,7 @@
         <w:t xml:space="preserve"> </w:t>
       </w:r>
       <w:r>
-        <w:t xml:space="preserve">Functional blocks used to describe rodent stimulators, as implemented in FLEX-DBS. Zinc-air cells feed a boost converter that generates the +5 V rail; an inverter derives −5 V, and a regulator derives 3.3 V for the BLE microcontroller. The microcontroller sets pulse timing, commands amplitude through a reference and DAC, and controls the output switches. The DAC drives two Howland current pumps on ±5 V, one per hemisphere, whose outputs pass through the switches and output filters to bilateral electrodes with a common return. A Hall-effect sensor wakes the device when a magnet is passed over it, and parameters are set from an iOS application over BLE. Components are listed in Table 1.</w:t>
+        <w:t xml:space="preserve">Functional blocks used to describe rodent stimulators, as implemented in FLEX-DBS. Zinc-air cells feed a boost converter that generates the +5 V rail; an inverter derives −5 V, and a regulator derives 3.3 V for the BLE microcontroller. The microcontroller sets pulse timing, commands amplitude through a reference and DAC, and controls the output switches. The DAC drives two Howland current pumps on ±5 V, one per hemisphere, whose outputs pass through the switches and output filters to bilateral electrodes, one per hemisphere, each a twisted pair of a stimulating wire and a ground wire. A Hall-effect sensor wakes the device when a magnet is passed over it, and parameters are set from an iOS application over BLE. Components are listed in Table 1.</w:t>
       </w:r>
     </w:p>
     <w:p>
@@ -4880,7 +5212,7 @@
           <w:b/>
           <w:bCs/>
         </w:rPr>
-        <w:t xml:space="preserve">Figure 4. In-vivo electrode impedance and the compliance envelope.</w:t>
+        <w:t xml:space="preserve">Figure 4. In vivo electrode impedance and the compliance envelope.</w:t>
       </w:r>
       <w:r>
         <w:t xml:space="preserve"> </w:t>
@@ -5087,7 +5419,7 @@
         <w:t xml:space="preserve"> </w:t>
       </w:r>
       <w:r>
-        <w:t xml:space="preserve">Both outputs of a FLEX-DBS device (firmware v0.5) were loaded with 1 kΩ, or with a nominal 47 kΩ within the in-vivo load range, and one output was recorded at 500 kHz for</w:t>
+        <w:t xml:space="preserve">Both outputs of a FLEX-DBS device (firmware v0.5) were loaded with 1 kΩ, or with a nominal 47 kΩ within the in vivo load range, and one output was recorded at 500 kHz for</w:t>
       </w:r>
       <w:r>
         <w:t xml:space="preserve"> </w:t>
@@ -5199,8 +5531,147 @@
         </w:drawing>
       </w:r>
     </w:p>
-    <w:bookmarkEnd w:id="60"/>
-    <w:bookmarkStart w:id="63" w:name="supplementary-material"/>
+    <w:p>
+      <w:pPr>
+        <w:pStyle w:val="BodyText"/>
+      </w:pPr>
+      <w:r>
+        <w:rPr>
+          <w:b/>
+          <w:bCs/>
+        </w:rPr>
+        <w:t xml:space="preserve">Figure 6. Open-field behavior before, during and after FLEX-DBS at high amplitude settings.</w:t>
+      </w:r>
+      <w:r>
+        <w:t xml:space="preserve"> </w:t>
+      </w:r>
+      <w:r>
+        <w:rPr>
+          <w:i/>
+          <w:iCs/>
+        </w:rPr>
+        <w:t xml:space="preserve">(A)</w:t>
+      </w:r>
+      <w:r>
+        <w:t xml:space="preserve"> </w:t>
+      </w:r>
+      <w:r>
+        <w:t xml:space="preserve">Recording setup and approximate session timeline (actual timing in Section 6.1). Period colors are used throughout.</w:t>
+      </w:r>
+      <w:r>
+        <w:t xml:space="preserve"> </w:t>
+      </w:r>
+      <w:r>
+        <w:rPr>
+          <w:i/>
+          <w:iCs/>
+        </w:rPr>
+        <w:t xml:space="preserve">(B)</w:t>
+      </w:r>
+      <w:r>
+        <w:t xml:space="preserve"> </w:t>
+      </w:r>
+      <w:r>
+        <w:t xml:space="preserve">Percent of each analyzed period spent immobile. Gray lines and open markers show individual animals (n = 6), with marker shape identifying each animal in B, D and E; black squares show mean ± SEM.</w:t>
+      </w:r>
+      <w:r>
+        <w:t xml:space="preserve"> </w:t>
+      </w:r>
+      <w:r>
+        <w:rPr>
+          <w:i/>
+          <w:iCs/>
+        </w:rPr>
+        <w:t xml:space="preserve">(C)</w:t>
+      </w:r>
+      <w:r>
+        <w:t xml:space="preserve"> </w:t>
+      </w:r>
+      <w:r>
+        <w:t xml:space="preserve">Trajectories of one example animal (MLR) in each period. The outer square marks the extent of tracked positions, and the inner square the equal-area center zone.</w:t>
+      </w:r>
+      <w:r>
+        <w:t xml:space="preserve"> </w:t>
+      </w:r>
+      <w:r>
+        <w:rPr>
+          <w:i/>
+          <w:iCs/>
+        </w:rPr>
+        <w:t xml:space="preserve">(D)</w:t>
+      </w:r>
+      <w:r>
+        <w:t xml:space="preserve"> </w:t>
+      </w:r>
+      <w:r>
+        <w:t xml:space="preserve">Mean absolute change in heading between consecutive 1 cm steps of path; undefined for animals that did not move.</w:t>
+      </w:r>
+      <w:r>
+        <w:t xml:space="preserve"> </w:t>
+      </w:r>
+      <w:r>
+        <w:rPr>
+          <w:i/>
+          <w:iCs/>
+        </w:rPr>
+        <w:t xml:space="preserve">(E)</w:t>
+      </w:r>
+      <w:r>
+        <w:t xml:space="preserve"> </w:t>
+      </w:r>
+      <w:r>
+        <w:t xml:space="preserve">Locality, the radius of gyration of position within 1 min bins, averaged over the period. In D and E, boxes show median and interquartile range, and whiskers extend to the most extreme values within 1.5 × the interquartile range. Brackets give two-tailed paired t-tests with the number of animals in each comparison; *p &lt; 0.05, **p &lt; 0.01.</w:t>
+      </w:r>
+    </w:p>
+    <w:p>
+      <w:pPr>
+        <w:pStyle w:val="BodyText"/>
+      </w:pPr>
+      <w:r>
+        <w:drawing>
+          <wp:inline>
+            <wp:extent cx="5943600" cy="6955535"/>
+            <wp:effectExtent b="0" l="0" r="0" t="0"/>
+            <wp:docPr descr="image" title="" id="61" name="Picture"/>
+            <a:graphic>
+              <a:graphicData uri="http://schemas.openxmlformats.org/drawingml/2006/picture">
+                <pic:pic>
+                  <pic:nvPicPr>
+                    <pic:cNvPr descr="figures/fig6_open_field.png" id="62" name="Picture"/>
+                    <pic:cNvPicPr>
+                      <a:picLocks noChangeArrowheads="1" noChangeAspect="1"/>
+                    </pic:cNvPicPr>
+                  </pic:nvPicPr>
+                  <pic:blipFill>
+                    <a:blip r:embed="rId60"/>
+                    <a:stretch>
+                      <a:fillRect/>
+                    </a:stretch>
+                  </pic:blipFill>
+                  <pic:spPr bwMode="auto">
+                    <a:xfrm>
+                      <a:off x="0" y="0"/>
+                      <a:ext cx="5943600" cy="6955535"/>
+                    </a:xfrm>
+                    <a:prstGeom prst="rect">
+                      <a:avLst/>
+                    </a:prstGeom>
+                    <a:noFill/>
+                    <a:ln w="9525">
+                      <a:noFill/>
+                      <a:headEnd/>
+                      <a:tailEnd/>
+                    </a:ln>
+                  </pic:spPr>
+                </pic:pic>
+              </a:graphicData>
+            </a:graphic>
+          </wp:inline>
+        </w:drawing>
+      </w:r>
+    </w:p>
+    <w:bookmarkEnd w:id="63"/>
+    <w:bookmarkStart w:id="66" w:name="supplementary-material"/>
     <w:p>
       <w:pPr>
         <w:pStyle w:val="Heading2"/>
@@ -5227,7 +5698,7 @@
         <w:t xml:space="preserve"> </w:t>
       </w:r>
       <w:r>
-        <w:t xml:space="preserve">Circuit schematic of the FLEX-DBS board (PDF).</w:t>
+        <w:t xml:space="preserve">Circuit schematic of the FLEX-DBS board (PDF); available from the corresponding author on request.</w:t>
       </w:r>
     </w:p>
     <w:p>
@@ -5253,7 +5724,7 @@
       <w:r>
         <w:t xml:space="preserve"> </w:t>
       </w:r>
-      <w:hyperlink r:id="rId61">
+      <w:hyperlink r:id="rId64">
         <w:r>
           <w:rPr>
             <w:rStyle w:val="Hyperlink"/>
@@ -5285,7 +5756,7 @@
       <w:r>
         <w:t xml:space="preserve"> </w:t>
       </w:r>
-      <w:hyperlink r:id="rId62">
+      <w:hyperlink r:id="rId65">
         <w:r>
           <w:rPr>
             <w:rStyle w:val="Hyperlink"/>
@@ -5806,7 +6277,7 @@
               <w:jc w:val="left"/>
             </w:pPr>
             <w:r>
-              <w:t xml:space="preserve">Schematic, firmware, app, protocol (S1–S4)</w:t>
+              <w:t xml:space="preserve">Firmware, app, protocol (S2–S4); schematic on request (S1)</w:t>
             </w:r>
           </w:p>
         </w:tc>
@@ -7219,8 +7690,8 @@
         <w:t xml:space="preserve">New paradigm enabling.</w:t>
       </w:r>
     </w:p>
-    <w:bookmarkEnd w:id="63"/>
-    <w:bookmarkStart w:id="64" w:name="author-contributions"/>
+    <w:bookmarkEnd w:id="66"/>
+    <w:bookmarkStart w:id="67" w:name="author-contributions"/>
     <w:p>
       <w:pPr>
         <w:pStyle w:val="Heading2"/>
@@ -7237,8 +7708,8 @@
         <w:t xml:space="preserve">RDG implemented the experiments, performed the impedance bench testing and carried out animal handling and testing. MCC conceived and designed the experimental approach. MG designed the hardware, carried out the technical implementation, and performed the electrical bench testing and analysis. All authors contributed to writing the manuscript.</w:t>
       </w:r>
     </w:p>
-    <w:bookmarkEnd w:id="64"/>
-    <w:bookmarkStart w:id="65" w:name="competing-interests"/>
+    <w:bookmarkEnd w:id="67"/>
+    <w:bookmarkStart w:id="68" w:name="competing-interests"/>
     <w:p>
       <w:pPr>
         <w:pStyle w:val="Heading2"/>
@@ -7255,8 +7726,8 @@
         <w:t xml:space="preserve">The authors declare no competing interests.</w:t>
       </w:r>
     </w:p>
-    <w:bookmarkEnd w:id="65"/>
-    <w:bookmarkStart w:id="66" w:name="funding"/>
+    <w:bookmarkEnd w:id="68"/>
+    <w:bookmarkStart w:id="69" w:name="funding"/>
     <w:p>
       <w:pPr>
         <w:pStyle w:val="Heading2"/>
@@ -7270,16 +7741,34 @@
         <w:pStyle w:val="FirstParagraph"/>
       </w:pPr>
       <w:r>
-        <w:t xml:space="preserve">[Pending.]</w:t>
-      </w:r>
-    </w:p>
-    <w:bookmarkEnd w:id="66"/>
-    <w:bookmarkStart w:id="67" w:name="data-and-code-availability"/>
+        <w:t xml:space="preserve">This work was supported by the National Institute on Drug Abuse (R01DA049924, R01DA058755, R01DA056829 and R01DA0625509 to M.C.C.; T32DA007261 and L70NS134089 to R.D.G.), the National Institute of Neurological Disorders and Stroke (RM1NS135283 to M.C.C.) and the McDonnell Center for Systems Neuroscience (pilot grant to R.D.G. and M.G.).</w:t>
+      </w:r>
+    </w:p>
+    <w:bookmarkEnd w:id="69"/>
+    <w:bookmarkStart w:id="70" w:name="ethics-statement"/>
     <w:p>
       <w:pPr>
         <w:pStyle w:val="Heading2"/>
       </w:pPr>
       <w:r>
+        <w:t xml:space="preserve">Ethics statement</w:t>
+      </w:r>
+    </w:p>
+    <w:p>
+      <w:pPr>
+        <w:pStyle w:val="FirstParagraph"/>
+      </w:pPr>
+      <w:r>
+        <w:t xml:space="preserve">All animal procedures were approved by the Institutional Animal Care and Use Committee at Washington University in St. Louis and conducted in accordance with the Guide for the Care and Use of Laboratory Animals (NIH).</w:t>
+      </w:r>
+    </w:p>
+    <w:bookmarkEnd w:id="70"/>
+    <w:bookmarkStart w:id="71" w:name="data-and-code-availability"/>
+    <w:p>
+      <w:pPr>
+        <w:pStyle w:val="Heading2"/>
+      </w:pPr>
+      <w:r>
         <w:t xml:space="preserve">Data and code availability</w:t>
       </w:r>
     </w:p>
@@ -7288,7 +7777,41 @@
         <w:pStyle w:val="FirstParagraph"/>
       </w:pPr>
       <w:r>
-        <w:t xml:space="preserve">The circuit schematic is provided as Supplementary material S1. Firmware, iOS application source and the BLE protocol specification are available in the repositories listed as S2–S4, and the shroud design is available at</w:t>
+        <w:t xml:space="preserve">The firmware is publicly available at</w:t>
+      </w:r>
+      <w:r>
+        <w:t xml:space="preserve"> </w:t>
+      </w:r>
+      <w:hyperlink r:id="rId64">
+        <w:r>
+          <w:rPr>
+            <w:rStyle w:val="Hyperlink"/>
+          </w:rPr>
+          <w:t xml:space="preserve">https://github.com/Neurotech-Hub/Creed-DBS-SiLabs</w:t>
+        </w:r>
+      </w:hyperlink>
+      <w:r>
+        <w:t xml:space="preserve"> </w:t>
+      </w:r>
+      <w:r>
+        <w:t xml:space="preserve">(S2), and the iOS application source and BLE protocol specification at</w:t>
+      </w:r>
+      <w:r>
+        <w:t xml:space="preserve"> </w:t>
+      </w:r>
+      <w:hyperlink r:id="rId65">
+        <w:r>
+          <w:rPr>
+            <w:rStyle w:val="Hyperlink"/>
+          </w:rPr>
+          <w:t xml:space="preserve">https://github.com/Neurotech-Hub/MouseCap-iOS</w:t>
+        </w:r>
+      </w:hyperlink>
+      <w:r>
+        <w:t xml:space="preserve"> </w:t>
+      </w:r>
+      <w:r>
+        <w:t xml:space="preserve">(S3, S4). The shroud and electrode holder designs are available at</w:t>
       </w:r>
       <w:r>
         <w:t xml:space="preserve"> </w:t>
@@ -7302,11 +7825,28 @@
         </w:r>
       </w:hyperlink>
       <w:r>
-        <w:t xml:space="preserve">. The impedance data underlying Figure 4 are available from the corresponding author on request.</w:t>
-      </w:r>
-    </w:p>
-    <w:bookmarkEnd w:id="67"/>
-    <w:bookmarkStart w:id="131" w:name="acknowledgments"/>
+        <w:t xml:space="preserve"> </w:t>
+      </w:r>
+      <w:r>
+        <w:t xml:space="preserve">and</w:t>
+      </w:r>
+      <w:r>
+        <w:t xml:space="preserve"> </w:t>
+      </w:r>
+      <w:hyperlink r:id="rId27">
+        <w:r>
+          <w:rPr>
+            <w:rStyle w:val="Hyperlink"/>
+          </w:rPr>
+          <w:t xml:space="preserve">https://a360.co/4rEBmq2</w:t>
+        </w:r>
+      </w:hyperlink>
+      <w:r>
+        <w:t xml:space="preserve">. The circuit schematic (S1), the impedance data underlying Figure 4, the bench recordings and analysis scripts underlying Figures 4 and 5, the behavioral tracking data and analysis code underlying Figure 6, and other design files are available from the corresponding author on request.</w:t>
+      </w:r>
+    </w:p>
+    <w:bookmarkEnd w:id="71"/>
+    <w:bookmarkStart w:id="143" w:name="acknowledgments"/>
     <w:p>
       <w:pPr>
         <w:pStyle w:val="Heading2"/>
@@ -7323,8 +7863,8 @@
         <w:t xml:space="preserve">We thank the Washington University Neurotech Hub for technical assistance with 3D design and hardware fabrication.</w:t>
       </w:r>
     </w:p>
-    <w:bookmarkStart w:id="130" w:name="refs"/>
-    <w:bookmarkStart w:id="69" w:name="ref-aleksandrova2013"/>
+    <w:bookmarkStart w:id="142" w:name="refs"/>
+    <w:bookmarkStart w:id="73" w:name="ref-aleksandrova2013"/>
     <w:p>
       <w:pPr>
         <w:pStyle w:val="Bibliography"/>
@@ -7335,7 +7875,7 @@
       <w:r>
         <w:t xml:space="preserve"> </w:t>
       </w:r>
-      <w:hyperlink r:id="rId68">
+      <w:hyperlink r:id="rId72">
         <w:r>
           <w:rPr>
             <w:rStyle w:val="Hyperlink"/>
@@ -7344,8 +7884,8 @@
         </w:r>
       </w:hyperlink>
     </w:p>
-    <w:bookmarkEnd w:id="69"/>
-    <w:bookmarkStart w:id="71" w:name="ref-alpaugh2019"/>
+    <w:bookmarkEnd w:id="73"/>
+    <w:bookmarkStart w:id="75" w:name="ref-alpaugh2019"/>
     <w:p>
       <w:pPr>
         <w:pStyle w:val="Bibliography"/>
@@ -7356,7 +7896,7 @@
       <w:r>
         <w:t xml:space="preserve"> </w:t>
       </w:r>
-      <w:hyperlink r:id="rId70">
+      <w:hyperlink r:id="rId74">
         <w:r>
           <w:rPr>
             <w:rStyle w:val="Hyperlink"/>
@@ -7365,8 +7905,8 @@
         </w:r>
       </w:hyperlink>
     </w:p>
-    <w:bookmarkEnd w:id="71"/>
-    <w:bookmarkStart w:id="73" w:name="ref-aulehner2022"/>
+    <w:bookmarkEnd w:id="75"/>
+    <w:bookmarkStart w:id="77" w:name="ref-aulehner2022"/>
     <w:p>
       <w:pPr>
         <w:pStyle w:val="Bibliography"/>
@@ -7377,7 +7917,7 @@
       <w:r>
         <w:t xml:space="preserve"> </w:t>
       </w:r>
-      <w:hyperlink r:id="rId72">
+      <w:hyperlink r:id="rId76">
         <w:r>
           <w:rPr>
             <w:rStyle w:val="Hyperlink"/>
@@ -7386,19 +7926,61 @@
         </w:r>
       </w:hyperlink>
     </w:p>
-    <w:bookmarkEnd w:id="73"/>
-    <w:bookmarkStart w:id="75" w:name="ref-burton2021"/>
+    <w:bookmarkEnd w:id="77"/>
+    <w:bookmarkStart w:id="79" w:name="ref-boccard2017"/>
     <w:p>
       <w:pPr>
         <w:pStyle w:val="Bibliography"/>
       </w:pPr>
       <w:r>
+        <w:t xml:space="preserve">Boccard, S.G.J., Prangnell, S.J., Pycroft, L., Cheeran, B., Moir, L., Pereira, E.A.C., Fitzgerald, J.J., Green, A.L., Aziz, T.Z., 2017. Long-term results of deep brain stimulation of the anterior cingulate cortex for neuropathic pain. World Neurosurgery 106, 625–637.</w:t>
+      </w:r>
+      <w:r>
+        <w:t xml:space="preserve"> </w:t>
+      </w:r>
+      <w:hyperlink r:id="rId78">
+        <w:r>
+          <w:rPr>
+            <w:rStyle w:val="Hyperlink"/>
+          </w:rPr>
+          <w:t xml:space="preserve">https://doi.org/10.1016/j.wneu.2017.06.173</w:t>
+        </w:r>
+      </w:hyperlink>
+    </w:p>
+    <w:bookmarkEnd w:id="79"/>
+    <w:bookmarkStart w:id="81" w:name="ref-bovet1988"/>
+    <w:p>
+      <w:pPr>
+        <w:pStyle w:val="Bibliography"/>
+      </w:pPr>
+      <w:r>
+        <w:t xml:space="preserve">Bovet, P., Benhamou, S., 1988. Spatial analysis of animals’ movements using a correlated random walk model. Journal of Theoretical Biology 131, 419–433.</w:t>
+      </w:r>
+      <w:r>
+        <w:t xml:space="preserve"> </w:t>
+      </w:r>
+      <w:hyperlink r:id="rId80">
+        <w:r>
+          <w:rPr>
+            <w:rStyle w:val="Hyperlink"/>
+          </w:rPr>
+          <w:t xml:space="preserve">https://doi.org/10.1016/S0022-5193(88)80038-9</w:t>
+        </w:r>
+      </w:hyperlink>
+    </w:p>
+    <w:bookmarkEnd w:id="81"/>
+    <w:bookmarkStart w:id="83" w:name="ref-burton2021"/>
+    <w:p>
+      <w:pPr>
+        <w:pStyle w:val="Bibliography"/>
+      </w:pPr>
+      <w:r>
         <w:t xml:space="preserve">Burton, A., Won, S.M., Sohrabi, A.K., Stuart, T., Amirhossein, A., Kim, J.U., Park, Y., Gabros, A., Rogers, J.A., Vitale, F., Richardson, A.G., Gutruf, P., 2021. Wireless, battery-free, and fully implantable electrical neurostimulation in freely moving rodents. Microsystems &amp; Nanoengineering 7, 62.</w:t>
       </w:r>
       <w:r>
         <w:t xml:space="preserve"> </w:t>
       </w:r>
-      <w:hyperlink r:id="rId74">
+      <w:hyperlink r:id="rId82">
         <w:r>
           <w:rPr>
             <w:rStyle w:val="Hyperlink"/>
@@ -7407,8 +7989,8 @@
         </w:r>
       </w:hyperlink>
     </w:p>
-    <w:bookmarkEnd w:id="75"/>
-    <w:bookmarkStart w:id="77" w:name="ref-cermak2019"/>
+    <w:bookmarkEnd w:id="83"/>
+    <w:bookmarkStart w:id="85" w:name="ref-cermak2019"/>
     <w:p>
       <w:pPr>
         <w:pStyle w:val="Bibliography"/>
@@ -7419,7 +8001,7 @@
       <w:r>
         <w:t xml:space="preserve"> </w:t>
       </w:r>
-      <w:hyperlink r:id="rId76">
+      <w:hyperlink r:id="rId84">
         <w:r>
           <w:rPr>
             <w:rStyle w:val="Hyperlink"/>
@@ -7428,8 +8010,8 @@
         </w:r>
       </w:hyperlink>
     </w:p>
-    <w:bookmarkEnd w:id="77"/>
-    <w:bookmarkStart w:id="79" w:name="ref-creed2018"/>
+    <w:bookmarkEnd w:id="85"/>
+    <w:bookmarkStart w:id="87" w:name="ref-creed2018"/>
     <w:p>
       <w:pPr>
         <w:pStyle w:val="Bibliography"/>
@@ -7440,7 +8022,7 @@
       <w:r>
         <w:t xml:space="preserve"> </w:t>
       </w:r>
-      <w:hyperlink r:id="rId78">
+      <w:hyperlink r:id="rId86">
         <w:r>
           <w:rPr>
             <w:rStyle w:val="Hyperlink"/>
@@ -7449,8 +8031,8 @@
         </w:r>
       </w:hyperlink>
     </w:p>
-    <w:bookmarkEnd w:id="79"/>
-    <w:bookmarkStart w:id="81" w:name="ref-creed2013"/>
+    <w:bookmarkEnd w:id="87"/>
+    <w:bookmarkStart w:id="89" w:name="ref-creed2013"/>
     <w:p>
       <w:pPr>
         <w:pStyle w:val="Bibliography"/>
@@ -7461,7 +8043,7 @@
       <w:r>
         <w:t xml:space="preserve"> </w:t>
       </w:r>
-      <w:hyperlink r:id="rId80">
+      <w:hyperlink r:id="rId88">
         <w:r>
           <w:rPr>
             <w:rStyle w:val="Hyperlink"/>
@@ -7470,8 +8052,8 @@
         </w:r>
       </w:hyperlink>
     </w:p>
-    <w:bookmarkEnd w:id="81"/>
-    <w:bookmarkStart w:id="83" w:name="ref-creed2012egr"/>
+    <w:bookmarkEnd w:id="89"/>
+    <w:bookmarkStart w:id="91" w:name="ref-creed2012egr"/>
     <w:p>
       <w:pPr>
         <w:pStyle w:val="Bibliography"/>
@@ -7482,7 +8064,7 @@
       <w:r>
         <w:t xml:space="preserve"> </w:t>
       </w:r>
-      <w:hyperlink r:id="rId82">
+      <w:hyperlink r:id="rId90">
         <w:r>
           <w:rPr>
             <w:rStyle w:val="Hyperlink"/>
@@ -7491,8 +8073,8 @@
         </w:r>
       </w:hyperlink>
     </w:p>
-    <w:bookmarkEnd w:id="83"/>
-    <w:bookmarkStart w:id="85" w:name="ref-creed2011"/>
+    <w:bookmarkEnd w:id="91"/>
+    <w:bookmarkStart w:id="93" w:name="ref-creed2011"/>
     <w:p>
       <w:pPr>
         <w:pStyle w:val="Bibliography"/>
@@ -7503,7 +8085,7 @@
       <w:r>
         <w:t xml:space="preserve"> </w:t>
       </w:r>
-      <w:hyperlink r:id="rId84">
+      <w:hyperlink r:id="rId92">
         <w:r>
           <w:rPr>
             <w:rStyle w:val="Hyperlink"/>
@@ -7512,8 +8094,8 @@
         </w:r>
       </w:hyperlink>
     </w:p>
-    <w:bookmarkEnd w:id="85"/>
-    <w:bookmarkStart w:id="87" w:name="ref-creed2015"/>
+    <w:bookmarkEnd w:id="93"/>
+    <w:bookmarkStart w:id="95" w:name="ref-creed2015"/>
     <w:p>
       <w:pPr>
         <w:pStyle w:val="Bibliography"/>
@@ -7524,7 +8106,7 @@
       <w:r>
         <w:t xml:space="preserve"> </w:t>
       </w:r>
-      <w:hyperlink r:id="rId86">
+      <w:hyperlink r:id="rId94">
         <w:r>
           <w:rPr>
             <w:rStyle w:val="Hyperlink"/>
@@ -7533,8 +8115,8 @@
         </w:r>
       </w:hyperlink>
     </w:p>
-    <w:bookmarkEnd w:id="87"/>
-    <w:bookmarkStart w:id="89" w:name="ref-ewing2013"/>
+    <w:bookmarkEnd w:id="95"/>
+    <w:bookmarkStart w:id="97" w:name="ref-ewing2013"/>
     <w:p>
       <w:pPr>
         <w:pStyle w:val="Bibliography"/>
@@ -7554,7 +8136,7 @@
       <w:r>
         <w:t xml:space="preserve"> </w:t>
       </w:r>
-      <w:hyperlink r:id="rId88">
+      <w:hyperlink r:id="rId96">
         <w:r>
           <w:rPr>
             <w:rStyle w:val="Hyperlink"/>
@@ -7563,8 +8145,8 @@
         </w:r>
       </w:hyperlink>
     </w:p>
-    <w:bookmarkEnd w:id="89"/>
-    <w:bookmarkStart w:id="91" w:name="ref-fasano2019"/>
+    <w:bookmarkEnd w:id="97"/>
+    <w:bookmarkStart w:id="99" w:name="ref-fasano2019"/>
     <w:p>
       <w:pPr>
         <w:pStyle w:val="Bibliography"/>
@@ -7575,7 +8157,7 @@
       <w:r>
         <w:t xml:space="preserve"> </w:t>
       </w:r>
-      <w:hyperlink r:id="rId90">
+      <w:hyperlink r:id="rId98">
         <w:r>
           <w:rPr>
             <w:rStyle w:val="Hyperlink"/>
@@ -7584,8 +8166,8 @@
         </w:r>
       </w:hyperlink>
     </w:p>
-    <w:bookmarkEnd w:id="91"/>
-    <w:bookmarkStart w:id="93" w:name="ref-fleischer2020"/>
+    <w:bookmarkEnd w:id="99"/>
+    <w:bookmarkStart w:id="101" w:name="ref-fleischer2020"/>
     <w:p>
       <w:pPr>
         <w:pStyle w:val="Bibliography"/>
@@ -7596,7 +8178,7 @@
       <w:r>
         <w:t xml:space="preserve"> </w:t>
       </w:r>
-      <w:hyperlink r:id="rId92">
+      <w:hyperlink r:id="rId100">
         <w:r>
           <w:rPr>
             <w:rStyle w:val="Hyperlink"/>
@@ -7605,8 +8187,8 @@
         </w:r>
       </w:hyperlink>
     </w:p>
-    <w:bookmarkEnd w:id="93"/>
-    <w:bookmarkStart w:id="95" w:name="ref-grotemeyer2024"/>
+    <w:bookmarkEnd w:id="101"/>
+    <w:bookmarkStart w:id="103" w:name="ref-grotemeyer2024"/>
     <w:p>
       <w:pPr>
         <w:pStyle w:val="Bibliography"/>
@@ -7617,7 +8199,7 @@
       <w:r>
         <w:t xml:space="preserve"> </w:t>
       </w:r>
-      <w:hyperlink r:id="rId94">
+      <w:hyperlink r:id="rId102">
         <w:r>
           <w:rPr>
             <w:rStyle w:val="Hyperlink"/>
@@ -7626,8 +8208,8 @@
         </w:r>
       </w:hyperlink>
     </w:p>
-    <w:bookmarkEnd w:id="95"/>
-    <w:bookmarkStart w:id="97" w:name="ref-dehaas2012"/>
+    <w:bookmarkEnd w:id="103"/>
+    <w:bookmarkStart w:id="105" w:name="ref-dehaas2012"/>
     <w:p>
       <w:pPr>
         <w:pStyle w:val="Bibliography"/>
@@ -7638,7 +8220,7 @@
       <w:r>
         <w:t xml:space="preserve"> </w:t>
       </w:r>
-      <w:hyperlink r:id="rId96">
+      <w:hyperlink r:id="rId104">
         <w:r>
           <w:rPr>
             <w:rStyle w:val="Hyperlink"/>
@@ -7647,8 +8229,8 @@
         </w:r>
       </w:hyperlink>
     </w:p>
-    <w:bookmarkEnd w:id="97"/>
-    <w:bookmarkStart w:id="99" w:name="ref-jiang2017"/>
+    <w:bookmarkEnd w:id="105"/>
+    <w:bookmarkStart w:id="107" w:name="ref-jiang2017"/>
     <w:p>
       <w:pPr>
         <w:pStyle w:val="Bibliography"/>
@@ -7668,7 +8250,7 @@
       <w:r>
         <w:t xml:space="preserve"> </w:t>
       </w:r>
-      <w:hyperlink r:id="rId98">
+      <w:hyperlink r:id="rId106">
         <w:r>
           <w:rPr>
             <w:rStyle w:val="Hyperlink"/>
@@ -7677,8 +8259,8 @@
         </w:r>
       </w:hyperlink>
     </w:p>
-    <w:bookmarkEnd w:id="99"/>
-    <w:bookmarkStart w:id="101" w:name="ref-knotkova2021"/>
+    <w:bookmarkEnd w:id="107"/>
+    <w:bookmarkStart w:id="109" w:name="ref-knotkova2021"/>
     <w:p>
       <w:pPr>
         <w:pStyle w:val="Bibliography"/>
@@ -7689,7 +8271,7 @@
       <w:r>
         <w:t xml:space="preserve"> </w:t>
       </w:r>
-      <w:hyperlink r:id="rId100">
+      <w:hyperlink r:id="rId108">
         <w:r>
           <w:rPr>
             <w:rStyle w:val="Hyperlink"/>
@@ -7698,8 +8280,8 @@
         </w:r>
       </w:hyperlink>
     </w:p>
-    <w:bookmarkEnd w:id="101"/>
-    <w:bookmarkStart w:id="103" w:name="ref-koo2018"/>
+    <w:bookmarkEnd w:id="109"/>
+    <w:bookmarkStart w:id="111" w:name="ref-koo2018"/>
     <w:p>
       <w:pPr>
         <w:pStyle w:val="Bibliography"/>
@@ -7710,7 +8292,7 @@
       <w:r>
         <w:t xml:space="preserve"> </w:t>
       </w:r>
-      <w:hyperlink r:id="rId102">
+      <w:hyperlink r:id="rId110">
         <w:r>
           <w:rPr>
             <w:rStyle w:val="Hyperlink"/>
@@ -7719,8 +8301,8 @@
         </w:r>
       </w:hyperlink>
     </w:p>
-    <w:bookmarkEnd w:id="103"/>
-    <w:bookmarkStart w:id="105" w:name="ref-kouzani2013"/>
+    <w:bookmarkEnd w:id="111"/>
+    <w:bookmarkStart w:id="113" w:name="ref-kouzani2013"/>
     <w:p>
       <w:pPr>
         <w:pStyle w:val="Bibliography"/>
@@ -7731,7 +8313,7 @@
       <w:r>
         <w:t xml:space="preserve"> </w:t>
       </w:r>
-      <w:hyperlink r:id="rId104">
+      <w:hyperlink r:id="rId112">
         <w:r>
           <w:rPr>
             <w:rStyle w:val="Hyperlink"/>
@@ -7740,8 +8322,8 @@
         </w:r>
       </w:hyperlink>
     </w:p>
-    <w:bookmarkEnd w:id="105"/>
-    <w:bookmarkStart w:id="107" w:name="ref-krauss2021"/>
+    <w:bookmarkEnd w:id="113"/>
+    <w:bookmarkStart w:id="115" w:name="ref-krauss2021"/>
     <w:p>
       <w:pPr>
         <w:pStyle w:val="Bibliography"/>
@@ -7752,7 +8334,7 @@
       <w:r>
         <w:t xml:space="preserve"> </w:t>
       </w:r>
-      <w:hyperlink r:id="rId106">
+      <w:hyperlink r:id="rId114">
         <w:r>
           <w:rPr>
             <w:rStyle w:val="Hyperlink"/>
@@ -7761,8 +8343,8 @@
         </w:r>
       </w:hyperlink>
     </w:p>
-    <w:bookmarkEnd w:id="107"/>
-    <w:bookmarkStart w:id="109" w:name="ref-kupsch2006"/>
+    <w:bookmarkEnd w:id="115"/>
+    <w:bookmarkStart w:id="117" w:name="ref-kupsch2006"/>
     <w:p>
       <w:pPr>
         <w:pStyle w:val="Bibliography"/>
@@ -7773,7 +8355,7 @@
       <w:r>
         <w:t xml:space="preserve"> </w:t>
       </w:r>
-      <w:hyperlink r:id="rId108">
+      <w:hyperlink r:id="rId116">
         <w:r>
           <w:rPr>
             <w:rStyle w:val="Hyperlink"/>
@@ -7782,19 +8364,40 @@
         </w:r>
       </w:hyperlink>
     </w:p>
-    <w:bookmarkEnd w:id="109"/>
-    <w:bookmarkStart w:id="111" w:name="ref-lozano2019"/>
+    <w:bookmarkEnd w:id="117"/>
+    <w:bookmarkStart w:id="119" w:name="ref-lopes2015"/>
     <w:p>
       <w:pPr>
         <w:pStyle w:val="Bibliography"/>
       </w:pPr>
       <w:r>
+        <w:t xml:space="preserve">Lopes, G., Bonacchi, N., Frazão, J., Neto, J.P., Atallah, B.V., Soares, S., Moreira, L., Matias, S., Itskov, P.M., Correia, P.A., Medina, R.E., Calcaterra, L., Dreosti, E., Paton, J.J., Kampff, A.R., 2015. Bonsai: An event-based framework for processing and controlling data streams. Frontiers in Neuroinformatics 9.</w:t>
+      </w:r>
+      <w:r>
+        <w:t xml:space="preserve"> </w:t>
+      </w:r>
+      <w:hyperlink r:id="rId118">
+        <w:r>
+          <w:rPr>
+            <w:rStyle w:val="Hyperlink"/>
+          </w:rPr>
+          <w:t xml:space="preserve">https://doi.org/10.3389/fninf.2015.00007</w:t>
+        </w:r>
+      </w:hyperlink>
+    </w:p>
+    <w:bookmarkEnd w:id="119"/>
+    <w:bookmarkStart w:id="121" w:name="ref-lozano2019"/>
+    <w:p>
+      <w:pPr>
+        <w:pStyle w:val="Bibliography"/>
+      </w:pPr>
+      <w:r>
         <w:t xml:space="preserve">Lozano, A.M., Lipsman, N., Bergman, H., Brown, P., Chabardes, S., Chang, J.W., Matthews, K., McIntyre, C.C., Schlaepfer, T.E., Schulder, M., Temel, Y., Volkmann, J., Krauss, J.K., 2019. Deep brain stimulation: Current challenges and future directions. Nature Reviews Neurology 15, 148–160.</w:t>
       </w:r>
       <w:r>
         <w:t xml:space="preserve"> </w:t>
       </w:r>
-      <w:hyperlink r:id="rId110">
+      <w:hyperlink r:id="rId120">
         <w:r>
           <w:rPr>
             <w:rStyle w:val="Hyperlink"/>
@@ -7803,8 +8406,8 @@
         </w:r>
       </w:hyperlink>
     </w:p>
-    <w:bookmarkEnd w:id="111"/>
-    <w:bookmarkStart w:id="113" w:name="ref-merrill2005"/>
+    <w:bookmarkEnd w:id="121"/>
+    <w:bookmarkStart w:id="123" w:name="ref-merrill2005"/>
     <w:p>
       <w:pPr>
         <w:pStyle w:val="Bibliography"/>
@@ -7815,7 +8418,7 @@
       <w:r>
         <w:t xml:space="preserve"> </w:t>
       </w:r>
-      <w:hyperlink r:id="rId112">
+      <w:hyperlink r:id="rId122">
         <w:r>
           <w:rPr>
             <w:rStyle w:val="Hyperlink"/>
@@ -7824,8 +8427,8 @@
         </w:r>
       </w:hyperlink>
     </w:p>
-    <w:bookmarkEnd w:id="113"/>
-    <w:bookmarkStart w:id="115" w:name="ref-murphy2021"/>
+    <w:bookmarkEnd w:id="123"/>
+    <w:bookmarkStart w:id="125" w:name="ref-murphy2021"/>
     <w:p>
       <w:pPr>
         <w:pStyle w:val="Bibliography"/>
@@ -7836,7 +8439,7 @@
       <w:r>
         <w:t xml:space="preserve"> </w:t>
       </w:r>
-      <w:hyperlink r:id="rId114">
+      <w:hyperlink r:id="rId124">
         <w:r>
           <w:rPr>
             <w:rStyle w:val="Hyperlink"/>
@@ -7845,8 +8448,8 @@
         </w:r>
       </w:hyperlink>
     </w:p>
-    <w:bookmarkEnd w:id="115"/>
-    <w:bookmarkStart w:id="117" w:name="ref-paulat2026"/>
+    <w:bookmarkEnd w:id="125"/>
+    <w:bookmarkStart w:id="127" w:name="ref-paulat2026"/>
     <w:p>
       <w:pPr>
         <w:pStyle w:val="Bibliography"/>
@@ -7857,7 +8460,7 @@
       <w:r>
         <w:t xml:space="preserve"> </w:t>
       </w:r>
-      <w:hyperlink r:id="rId116">
+      <w:hyperlink r:id="rId126">
         <w:r>
           <w:rPr>
             <w:rStyle w:val="Hyperlink"/>
@@ -7866,8 +8469,8 @@
         </w:r>
       </w:hyperlink>
     </w:p>
-    <w:bookmarkEnd w:id="117"/>
-    <w:bookmarkStart w:id="119" w:name="ref-pinnell2018"/>
+    <w:bookmarkEnd w:id="127"/>
+    <w:bookmarkStart w:id="129" w:name="ref-pinnell2018"/>
     <w:p>
       <w:pPr>
         <w:pStyle w:val="Bibliography"/>
@@ -7878,7 +8481,7 @@
       <w:r>
         <w:t xml:space="preserve"> </w:t>
       </w:r>
-      <w:hyperlink r:id="rId118">
+      <w:hyperlink r:id="rId128">
         <w:r>
           <w:rPr>
             <w:rStyle w:val="Hyperlink"/>
@@ -7887,8 +8490,8 @@
         </w:r>
       </w:hyperlink>
     </w:p>
-    <w:bookmarkEnd w:id="119"/>
-    <w:bookmarkStart w:id="121" w:name="ref-plocksties2021"/>
+    <w:bookmarkEnd w:id="129"/>
+    <w:bookmarkStart w:id="131" w:name="ref-plocksties2021"/>
     <w:p>
       <w:pPr>
         <w:pStyle w:val="Bibliography"/>
@@ -7905,7 +8508,7 @@
       <w:r>
         <w:t xml:space="preserve"> </w:t>
       </w:r>
-      <w:hyperlink r:id="rId120">
+      <w:hyperlink r:id="rId130">
         <w:r>
           <w:rPr>
             <w:rStyle w:val="Hyperlink"/>
@@ -7914,8 +8517,8 @@
         </w:r>
       </w:hyperlink>
     </w:p>
-    <w:bookmarkEnd w:id="121"/>
-    <w:bookmarkStart w:id="123" w:name="ref-shen2026"/>
+    <w:bookmarkEnd w:id="131"/>
+    <w:bookmarkStart w:id="133" w:name="ref-shen2026"/>
     <w:p>
       <w:pPr>
         <w:pStyle w:val="Bibliography"/>
@@ -7926,7 +8529,7 @@
       <w:r>
         <w:t xml:space="preserve"> </w:t>
       </w:r>
-      <w:hyperlink r:id="rId122">
+      <w:hyperlink r:id="rId132">
         <w:r>
           <w:rPr>
             <w:rStyle w:val="Hyperlink"/>
@@ -7935,19 +8538,43 @@
         </w:r>
       </w:hyperlink>
     </w:p>
-    <w:bookmarkEnd w:id="123"/>
-    <w:bookmarkStart w:id="125" w:name="ref-ti2008howland"/>
+    <w:bookmarkEnd w:id="133"/>
+    <w:bookmarkStart w:id="135" w:name="ref-shirvalkar2025"/>
     <w:p>
       <w:pPr>
         <w:pStyle w:val="Bibliography"/>
       </w:pPr>
       <w:r>
+        <w:t xml:space="preserve">Shirvalkar, P., Leriche, R., Saal, J., Cagle, J., Prosky, J., Joseph, I., Shaughnessy, A., Schmitgen, A., Lin, J., Motzkin, J., Dawes, H., Racine, C., Seritan, A., Sellers, K.K., deHemptinne, C., Starr, P.A., Chang, E.F.</w:t>
+      </w:r>
+      <w:r>
+        <w:t xml:space="preserve">, 2025. Personalized, closed-loop deep brain stimulation for chronic pain.</w:t>
+      </w:r>
+      <w:r>
+        <w:t xml:space="preserve"> </w:t>
+      </w:r>
+      <w:hyperlink r:id="rId134">
+        <w:r>
+          <w:rPr>
+            <w:rStyle w:val="Hyperlink"/>
+          </w:rPr>
+          <w:t xml:space="preserve">https://doi.org/10.1101/2025.08.11.25333010</w:t>
+        </w:r>
+      </w:hyperlink>
+    </w:p>
+    <w:bookmarkEnd w:id="135"/>
+    <w:bookmarkStart w:id="137" w:name="ref-ti2008howland"/>
+    <w:p>
+      <w:pPr>
+        <w:pStyle w:val="Bibliography"/>
+      </w:pPr>
+      <w:r>
         <w:t xml:space="preserve">Texas Instruments, 2008.</w:t>
       </w:r>
       <w:r>
         <w:t xml:space="preserve"> </w:t>
       </w:r>
-      <w:hyperlink r:id="rId124">
+      <w:hyperlink r:id="rId136">
         <w:r>
           <w:rPr>
             <w:rStyle w:val="Hyperlink"/>
@@ -7998,8 +8625,8 @@
         <w:t xml:space="preserve">(Application Report No. SNOA474A). Texas Instruments.</w:t>
       </w:r>
     </w:p>
-    <w:bookmarkEnd w:id="125"/>
-    <w:bookmarkStart w:id="127" w:name="ref-tucker2013"/>
+    <w:bookmarkEnd w:id="137"/>
+    <w:bookmarkStart w:id="139" w:name="ref-tucker2013"/>
     <w:p>
       <w:pPr>
         <w:pStyle w:val="Bibliography"/>
@@ -8022,7 +8649,7 @@
       <w:r>
         <w:t xml:space="preserve"> </w:t>
       </w:r>
-      <w:hyperlink r:id="rId126">
+      <w:hyperlink r:id="rId138">
         <w:r>
           <w:rPr>
             <w:rStyle w:val="Hyperlink"/>
@@ -8031,8 +8658,8 @@
         </w:r>
       </w:hyperlink>
     </w:p>
-    <w:bookmarkEnd w:id="127"/>
-    <w:bookmarkStart w:id="129" w:name="ref-vachez2020"/>
+    <w:bookmarkEnd w:id="139"/>
+    <w:bookmarkStart w:id="141" w:name="ref-vachez2020"/>
     <w:p>
       <w:pPr>
         <w:pStyle w:val="Bibliography"/>
@@ -8043,7 +8670,7 @@
       <w:r>
         <w:t xml:space="preserve"> </w:t>
       </w:r>
-      <w:hyperlink r:id="rId128">
+      <w:hyperlink r:id="rId140">
         <w:r>
           <w:rPr>
             <w:rStyle w:val="Hyperlink"/>
@@ -8052,9 +8679,9 @@
         </w:r>
       </w:hyperlink>
     </w:p>
-    <w:bookmarkEnd w:id="129"/>
-    <w:bookmarkEnd w:id="130"/>
-    <w:bookmarkEnd w:id="131"/>
+    <w:bookmarkEnd w:id="141"/>
+    <w:bookmarkEnd w:id="142"/>
+    <w:bookmarkEnd w:id="143"/>
     <w:sectPr>
       <w:footnotePr>
         <w:numRestart w:val="eachSect"/>

</xml_diff>

<commit_message>
CCI method, IACUC protocol number, corrected grant R01DA062509
Co-authored-by: Cursor <cursoragent@cursor.com>
</commit_message>
<xml_diff>
--- a/manuscript/build/flex_dbs.docx
+++ b/manuscript/build/flex_dbs.docx
@@ -2111,7 +2111,7 @@
         <w:pStyle w:val="FirstParagraph"/>
       </w:pPr>
       <w:r>
-        <w:t xml:space="preserve">Adult (≥6 weeks) male and female C57BL/6J mice were sourced or bred from Jackson Laboratory lines and used for all experiments. Mice were group housed (2–5 per cage, single sex) under controlled humidity, temperature and photoperiod (12:12; light onset/offset at 07:00 and 19:00) conditions with ad libitum access to food and water. Anesthesia was induced and maintained with isoflurane (5 % and 1.5 %, respectively). Following craniotomy, DBS electrodes were implanted into the cingulate cortex (coordinates relative to bregma: anteroposterior (AP), −0.6 mm; mediolateral (ML), ±0.3 mm; dorsoventral (DV), −1.25 mm). Animals recovered for 7–10 days before behavioral testing. All procedures were approved by the Institutional Animal Care and Use Committee at Washington University in St. Louis and conducted in accordance with the Guide for the Care and Use of Laboratory Animals (NIH).</w:t>
+        <w:t xml:space="preserve">Adult (≥6 weeks) male and female C57BL/6J mice were sourced or bred from Jackson Laboratory lines and used for all experiments. Mice were group housed (2–5 per cage, single sex) under controlled humidity, temperature and photoperiod (12:12; light onset/offset at 07:00 and 19:00) conditions with ad libitum access to food and water. Anesthesia was induced and maintained with isoflurane (5 % and 1.5 %, respectively). Following craniotomy, DBS electrodes were implanted into the cingulate cortex (coordinates relative to bregma: anteroposterior (AP), −0.6 mm; mediolateral (ML), ±0.3 mm; dorsoventral (DV), −1.25 mm). Animals recovered for 7–10 days before behavioral testing. All procedures were approved by the Institutional Animal Care and Use Committee at Washington University in St. Louis (protocol 24-0211) and conducted in accordance with the Guide for the Care and Use of Laboratory Animals (NIH).</w:t>
       </w:r>
     </w:p>
     <w:p>
@@ -4660,7 +4660,7 @@
         <w:pStyle w:val="BodyText"/>
       </w:pPr>
       <w:r>
-        <w:t xml:space="preserve">Six mice implanted with cingulate DBS electrodes (Section 3.1), which had also received a unilateral chronic constriction injury (CCI) of the sciatic nerve, were placed in an open-field chamber (30 cm × 30 cm inner dimensions) and allowed to acclimate for 5 minutes before behavioral recording. Position was tracked with Bonsai</w:t>
+        <w:t xml:space="preserve">Six mice implanted with cingulate DBS electrodes (Section 3.1) had also received a unilateral chronic constriction injury (CCI) of the sciatic nerve. Briefly, the CCI was performed by making a small incision on the thigh, exposing the sciatic nerve by blunt dissection between the gluteus maximus and biceps femoris, and tightly ligating the sciatic trunk with two chromic gut sutures. Mice were placed in an open-field chamber (30 cm × 30 cm inner dimensions) and allowed to acclimate for 5 minutes before behavioral recording. Position was tracked with Bonsai</w:t>
       </w:r>
       <w:r>
         <w:t xml:space="preserve"> </w:t>
@@ -7741,7 +7741,7 @@
         <w:pStyle w:val="FirstParagraph"/>
       </w:pPr>
       <w:r>
-        <w:t xml:space="preserve">This work was supported by the National Institute on Drug Abuse (R01DA049924, R01DA058755, R01DA056829 and R01DA0625509 to M.C.C.; T32DA007261 and L70NS134089 to R.D.G.), the National Institute of Neurological Disorders and Stroke (RM1NS135283 to M.C.C.) and the McDonnell Center for Systems Neuroscience (pilot grant to R.D.G. and M.G.).</w:t>
+        <w:t xml:space="preserve">This work was supported by the National Institute on Drug Abuse (R01DA049924, R01DA058755, R01DA056829 and R01DA062509 to M.C.C.; T32DA007261 and L70NS134089 to R.D.G.), the National Institute of Neurological Disorders and Stroke (RM1NS135283 to M.C.C.) and the McDonnell Center for Systems Neuroscience (pilot grant to R.D.G. and M.G.).</w:t>
       </w:r>
     </w:p>
     <w:bookmarkEnd w:id="69"/>
@@ -7759,7 +7759,7 @@
         <w:pStyle w:val="FirstParagraph"/>
       </w:pPr>
       <w:r>
-        <w:t xml:space="preserve">All animal procedures were approved by the Institutional Animal Care and Use Committee at Washington University in St. Louis and conducted in accordance with the Guide for the Care and Use of Laboratory Animals (NIH).</w:t>
+        <w:t xml:space="preserve">All animal procedures were approved by the Institutional Animal Care and Use Committee at Washington University in St. Louis (protocol 24-0211) and conducted in accordance with the Guide for the Care and Use of Laboratory Animals (NIH).</w:t>
       </w:r>
     </w:p>
     <w:bookmarkEnd w:id="70"/>

</xml_diff>

<commit_message>
Review fixes: 6.3 heading, abstract in vivo sentence, CCI citation (Bennett and Xie 1988), Discussion wording, shorter Conclusion
Co-authored-by: Cursor <cursoragent@cursor.com>
</commit_message>
<xml_diff>
--- a/manuscript/build/flex_dbs.docx
+++ b/manuscript/build/flex_dbs.docx
@@ -162,7 +162,7 @@
         <w:t xml:space="preserve"> </w:t>
       </w:r>
       <w:r>
-        <w:t xml:space="preserve">Into a 1 kΩ bench load, delivered current increased approximately linearly with the amplitude setting and was repeatable from pulse to pulse, with an asymmetric biphasic waveform whose recovery phase ran at about one fifth of the stimulating amplitude. Battery current was 1.47–1.89 mA in standby and 3.15–3.42 mA during stimulation at amplitude settings of 60–400 µA, giving a projected three days of continuous stimulation per pair of cells. Firmware v0.5 left a net charge of 26–35 % of the stimulating-phase charge per pulse into 1 kΩ. Into 47 kΩ, within the in vivo load range, stimulating current was compliance-limited at 93 µA. Pulse-derived estimates of the effective load presented by five implanted platinum electrodes in three mice had weekly means of 43–54 kΩ over eight weeks (32–80 kΩ across individual sessions), placing the maximum regulated current near 90 µA (81–101 µA at the weekly means). Analysis of the current-pump network bounds load-dependent current error at 3–8 % for these loads. In vivo, we used FLEX-DBS at high amplitude settings, intended to evoke a robust stimulation-associated behavioral phenotype, through electrodes implanted in the cingulate cortex of 6 mice. Time spent immobile in an open field rose from 46.5 % at baseline to 75.7 % during stimulation (a 62.7 % increase in the group mean) and remained elevated after stimulation ended; without a sham control, this increase cannot be separated from within-session habituation.</w:t>
+        <w:t xml:space="preserve">Into a 1 kΩ bench load, delivered current increased approximately linearly with the amplitude setting and was repeatable from pulse to pulse, with an asymmetric biphasic waveform whose recovery phase ran at about one fifth of the stimulating amplitude. Battery current was 1.47–1.89 mA in standby and 3.15–3.42 mA during stimulation at amplitude settings of 60–400 µA, giving a projected three days of continuous stimulation per pair of cells. Firmware v0.5 left a net charge of 26–35 % of the stimulating-phase charge per pulse into 1 kΩ. Into 47 kΩ, within the in vivo load range, stimulating current was compliance-limited at 93 µA. Pulse-derived estimates of the effective load presented by five implanted platinum electrodes in three mice had weekly means of 43–54 kΩ over eight weeks (32–80 kΩ across individual sessions), placing the maximum regulated current near 90 µA (81–101 µA at the weekly means). Analysis of the current-pump network bounds load-dependent current error at 3–8 % for these loads. In vivo, we delivered cingulate FLEX-DBS at high amplitude settings intended to evoke a robust stimulation-associated behavioral phenotype in six mice. Time spent immobile in an open field rose from 46.5 % at baseline to 75.7 % during stimulation (a 62.7 % increase in the group mean) and remained elevated after stimulation ended; without a sham control, this increase cannot be separated from within-session habituation.</w:t>
       </w:r>
     </w:p>
     <w:p>
@@ -4660,7 +4660,16 @@
         <w:pStyle w:val="BodyText"/>
       </w:pPr>
       <w:r>
-        <w:t xml:space="preserve">Six mice implanted with cingulate DBS electrodes (Section 3.1) had also received a unilateral chronic constriction injury (CCI) of the sciatic nerve. Briefly, the CCI was performed by making a small incision on the thigh, exposing the sciatic nerve by blunt dissection between the gluteus maximus and biceps femoris, and tightly ligating the sciatic trunk with two chromic gut sutures. Mice were placed in an open-field chamber (30 cm × 30 cm inner dimensions) and allowed to acclimate for 5 minutes before behavioral recording. Position was tracked with Bonsai</w:t>
+        <w:t xml:space="preserve">Six mice implanted with cingulate DBS electrodes (Section 3.1), which were being studied in a separate chronic-pain paradigm, had also received a unilateral chronic constriction injury (CCI) of the sciatic nerve, adapted from</w:t>
+      </w:r>
+      <w:r>
+        <w:t xml:space="preserve"> </w:t>
+      </w:r>
+      <w:r>
+        <w:t xml:space="preserve">Bennett and Xie (1988)</w:t>
+      </w:r>
+      <w:r>
+        <w:t xml:space="preserve">. Briefly, the CCI was performed by making a small incision on the thigh, exposing the sciatic nerve by blunt dissection between the gluteus maximus and biceps femoris, and tightly ligating the sciatic trunk with two chromic gut sutures. Mice were placed in an open-field chamber (30 cm × 30 cm inner dimensions) and allowed to acclimate for 5 minutes before behavioral recording. Position was tracked with Bonsai</w:t>
       </w:r>
       <w:r>
         <w:t xml:space="preserve"> </w:t>
@@ -4672,7 +4681,7 @@
         <w:t xml:space="preserve"> </w:t>
       </w:r>
       <w:r>
-        <w:t xml:space="preserve">using a webcam mounted above the chamber (Figure 6A). Each mouse was recorded once, in a single session of 17.5–20.7 minutes comprising a baseline period, a period of bilateral high-amplitude DBS and a post-stimulation period. DBS was switched on 5.5–6.9 minutes and off 11.7–14.4 minutes after the start of recording. These mice were separate from those used for the impedance measurements in Section 3.2. Stimulation was delivered by FLEX-DBS with firmware v0.5, as in the rest of this paper, at an amplitude setting above 100 µA, 450 µs pulse duration and 130 Hz pulse frequency (the 130 Hz setting is delivered as 142.5 Hz, Table 2). Electrode impedance and delivered current were not measured in these mice; at the electrode loads measured in Section 3.2, the delivered current would be limited by compliance to approximately 81–101 µA (Figure 4B).</w:t>
+        <w:t xml:space="preserve">using a webcam mounted above the chamber (Figure 6A). Each mouse was recorded once, in a single session of 17.5–20.7 minutes comprising a baseline period, a period of bilateral DBS at high amplitude settings and a post-stimulation period. DBS was switched on 5.5–6.9 minutes and off 11.7–14.4 minutes after the start of recording. These mice were separate from those used for the impedance measurements in Section 3.2. Stimulation was delivered by FLEX-DBS with firmware v0.5, as in the rest of this paper, at an amplitude setting above 100 µA, 450 µs pulse duration and 130 Hz pulse frequency (the 130 Hz setting is delivered as 142.5 Hz, Table 2). Electrode impedance and delivered current were not measured in these mice; at the electrode loads measured in Section 3.2, the delivered current would be limited by compliance to approximately 81–101 µA (Figure 4B).</w:t>
       </w:r>
     </w:p>
     <w:bookmarkEnd w:id="36"/>
@@ -4733,7 +4742,7 @@
         <w:pStyle w:val="Heading3"/>
       </w:pPr>
       <w:r>
-        <w:t xml:space="preserve">6.3 Immobility increased during high-amplitude stimulation</w:t>
+        <w:t xml:space="preserve">6.3 Immobility increased during stimulation at high amplitude settings</w:t>
       </w:r>
     </w:p>
     <w:p>
@@ -4796,7 +4805,7 @@
         <w:pStyle w:val="BodyText"/>
       </w:pPr>
       <w:r>
-        <w:t xml:space="preserve">Two practical consequences follow. First, electrode impedance is the most direct lever on usable amplitude, and future protocols will establish a method for fabricating lower-impedance electrodes. Second, amplitude should be titrated in each animal against its behavioral effect, as in our protocols, rather than taken from the application’s nominal value. A configurable stimulator lets the experimenter confirm that a chosen amplitude is both deliverable into the implanted load and behaviorally effective, and adjust it if either condition fails.</w:t>
+        <w:t xml:space="preserve">Two practical consequences follow. First, electrode impedance is the most direct lever on usable amplitude, and future protocols will establish a method for fabricating lower-impedance electrodes. Second, amplitude should be titrated in each animal against its behavioral effect, as in our protocols, rather than taken from the application’s nominal value. A configurable stimulator lets the experimenter select an amplitude that is deliverable into the implanted load and behaviorally effective, and adjust it if either condition fails.</w:t>
       </w:r>
     </w:p>
     <w:p>
@@ -4898,7 +4907,7 @@
         <w:pStyle w:val="FirstParagraph"/>
       </w:pPr>
       <w:r>
-        <w:t xml:space="preserve">FLEX-DBS is a head-mounted, bilateral, constant-current stimulator with real-time smartphone control, intended for experiments in which parameters must be set, changed and verified at the cage. Its measured power consumption permits a projected three days of continuous operation per cell pair; firmware v0.5 requires improved charge balancing before prolonged in vivo stimulation. Its ±5 V compliance rails deliver roughly 56–131 µA into implanted platinum electrodes with pulse-derived effective loads of 32–80 kΩ, so the electrode load, not the programmable range, sets usable amplitude in vivo. In vivo, stimulation at high amplitude settings was associated with increased immobility in an open field, consistent with effective stimulation through implanted electrodes; because electrode impedance and delivered current were not measured in these mice, and delivered current would be compliance-limited to about 81–101 µA at the loads measured in Section 3, this does not establish the delivered amplitude.</w:t>
+        <w:t xml:space="preserve">FLEX-DBS is a head-mounted, bilateral, constant-current stimulator with real-time smartphone control, intended for experiments in which parameters must be set, changed and verified at the cage. Its measured power consumption permits a projected three days of continuous operation per cell pair; firmware v0.5 requires improved charge balancing before prolonged in vivo stimulation. Its ±5 V compliance rails deliver roughly 56–131 µA into implanted platinum electrodes with pulse-derived effective loads of 32–80 kΩ, so the electrode load, not the programmable range, sets usable amplitude in vivo. In vivo, stimulation at high amplitude settings was associated with increased immobility in an open field, consistent with effective stimulation through implanted electrodes.</w:t>
       </w:r>
     </w:p>
     <w:bookmarkEnd w:id="41"/>
@@ -7846,7 +7855,7 @@
       </w:r>
     </w:p>
     <w:bookmarkEnd w:id="71"/>
-    <w:bookmarkStart w:id="143" w:name="acknowledgments"/>
+    <w:bookmarkStart w:id="145" w:name="acknowledgments"/>
     <w:p>
       <w:pPr>
         <w:pStyle w:val="Heading2"/>
@@ -7863,7 +7872,7 @@
         <w:t xml:space="preserve">We thank the Washington University Neurotech Hub for technical assistance with 3D design and hardware fabrication.</w:t>
       </w:r>
     </w:p>
-    <w:bookmarkStart w:id="142" w:name="refs"/>
+    <w:bookmarkStart w:id="144" w:name="refs"/>
     <w:bookmarkStart w:id="73" w:name="ref-aleksandrova2013"/>
     <w:p>
       <w:pPr>
@@ -7927,18 +7936,39 @@
       </w:hyperlink>
     </w:p>
     <w:bookmarkEnd w:id="77"/>
-    <w:bookmarkStart w:id="79" w:name="ref-boccard2017"/>
+    <w:bookmarkStart w:id="79" w:name="ref-bennett1988"/>
     <w:p>
       <w:pPr>
         <w:pStyle w:val="Bibliography"/>
       </w:pPr>
       <w:r>
+        <w:t xml:space="preserve">Bennett, G.J., Xie, Y.-K., 1988. A peripheral mononeuropathy in rat that produces disorders of pain sensation like those seen in man. Pain 33, 87–107.</w:t>
+      </w:r>
+      <w:r>
+        <w:t xml:space="preserve"> </w:t>
+      </w:r>
+      <w:hyperlink r:id="rId78">
+        <w:r>
+          <w:rPr>
+            <w:rStyle w:val="Hyperlink"/>
+          </w:rPr>
+          <w:t xml:space="preserve">https://doi.org/10.1016/0304-3959(88)90209-6</w:t>
+        </w:r>
+      </w:hyperlink>
+    </w:p>
+    <w:bookmarkEnd w:id="79"/>
+    <w:bookmarkStart w:id="81" w:name="ref-boccard2017"/>
+    <w:p>
+      <w:pPr>
+        <w:pStyle w:val="Bibliography"/>
+      </w:pPr>
+      <w:r>
         <w:t xml:space="preserve">Boccard, S.G.J., Prangnell, S.J., Pycroft, L., Cheeran, B., Moir, L., Pereira, E.A.C., Fitzgerald, J.J., Green, A.L., Aziz, T.Z., 2017. Long-term results of deep brain stimulation of the anterior cingulate cortex for neuropathic pain. World Neurosurgery 106, 625–637.</w:t>
       </w:r>
       <w:r>
         <w:t xml:space="preserve"> </w:t>
       </w:r>
-      <w:hyperlink r:id="rId78">
+      <w:hyperlink r:id="rId80">
         <w:r>
           <w:rPr>
             <w:rStyle w:val="Hyperlink"/>
@@ -7947,8 +7977,8 @@
         </w:r>
       </w:hyperlink>
     </w:p>
-    <w:bookmarkEnd w:id="79"/>
-    <w:bookmarkStart w:id="81" w:name="ref-bovet1988"/>
+    <w:bookmarkEnd w:id="81"/>
+    <w:bookmarkStart w:id="83" w:name="ref-bovet1988"/>
     <w:p>
       <w:pPr>
         <w:pStyle w:val="Bibliography"/>
@@ -7959,7 +7989,7 @@
       <w:r>
         <w:t xml:space="preserve"> </w:t>
       </w:r>
-      <w:hyperlink r:id="rId80">
+      <w:hyperlink r:id="rId82">
         <w:r>
           <w:rPr>
             <w:rStyle w:val="Hyperlink"/>
@@ -7968,8 +7998,8 @@
         </w:r>
       </w:hyperlink>
     </w:p>
-    <w:bookmarkEnd w:id="81"/>
-    <w:bookmarkStart w:id="83" w:name="ref-burton2021"/>
+    <w:bookmarkEnd w:id="83"/>
+    <w:bookmarkStart w:id="85" w:name="ref-burton2021"/>
     <w:p>
       <w:pPr>
         <w:pStyle w:val="Bibliography"/>
@@ -7980,7 +8010,7 @@
       <w:r>
         <w:t xml:space="preserve"> </w:t>
       </w:r>
-      <w:hyperlink r:id="rId82">
+      <w:hyperlink r:id="rId84">
         <w:r>
           <w:rPr>
             <w:rStyle w:val="Hyperlink"/>
@@ -7989,8 +8019,8 @@
         </w:r>
       </w:hyperlink>
     </w:p>
-    <w:bookmarkEnd w:id="83"/>
-    <w:bookmarkStart w:id="85" w:name="ref-cermak2019"/>
+    <w:bookmarkEnd w:id="85"/>
+    <w:bookmarkStart w:id="87" w:name="ref-cermak2019"/>
     <w:p>
       <w:pPr>
         <w:pStyle w:val="Bibliography"/>
@@ -8001,7 +8031,7 @@
       <w:r>
         <w:t xml:space="preserve"> </w:t>
       </w:r>
-      <w:hyperlink r:id="rId84">
+      <w:hyperlink r:id="rId86">
         <w:r>
           <w:rPr>
             <w:rStyle w:val="Hyperlink"/>
@@ -8010,8 +8040,8 @@
         </w:r>
       </w:hyperlink>
     </w:p>
-    <w:bookmarkEnd w:id="85"/>
-    <w:bookmarkStart w:id="87" w:name="ref-creed2018"/>
+    <w:bookmarkEnd w:id="87"/>
+    <w:bookmarkStart w:id="89" w:name="ref-creed2018"/>
     <w:p>
       <w:pPr>
         <w:pStyle w:val="Bibliography"/>
@@ -8022,7 +8052,7 @@
       <w:r>
         <w:t xml:space="preserve"> </w:t>
       </w:r>
-      <w:hyperlink r:id="rId86">
+      <w:hyperlink r:id="rId88">
         <w:r>
           <w:rPr>
             <w:rStyle w:val="Hyperlink"/>
@@ -8031,8 +8061,8 @@
         </w:r>
       </w:hyperlink>
     </w:p>
-    <w:bookmarkEnd w:id="87"/>
-    <w:bookmarkStart w:id="89" w:name="ref-creed2013"/>
+    <w:bookmarkEnd w:id="89"/>
+    <w:bookmarkStart w:id="91" w:name="ref-creed2013"/>
     <w:p>
       <w:pPr>
         <w:pStyle w:val="Bibliography"/>
@@ -8043,7 +8073,7 @@
       <w:r>
         <w:t xml:space="preserve"> </w:t>
       </w:r>
-      <w:hyperlink r:id="rId88">
+      <w:hyperlink r:id="rId90">
         <w:r>
           <w:rPr>
             <w:rStyle w:val="Hyperlink"/>
@@ -8052,8 +8082,8 @@
         </w:r>
       </w:hyperlink>
     </w:p>
-    <w:bookmarkEnd w:id="89"/>
-    <w:bookmarkStart w:id="91" w:name="ref-creed2012egr"/>
+    <w:bookmarkEnd w:id="91"/>
+    <w:bookmarkStart w:id="93" w:name="ref-creed2012egr"/>
     <w:p>
       <w:pPr>
         <w:pStyle w:val="Bibliography"/>
@@ -8064,7 +8094,7 @@
       <w:r>
         <w:t xml:space="preserve"> </w:t>
       </w:r>
-      <w:hyperlink r:id="rId90">
+      <w:hyperlink r:id="rId92">
         <w:r>
           <w:rPr>
             <w:rStyle w:val="Hyperlink"/>
@@ -8073,8 +8103,8 @@
         </w:r>
       </w:hyperlink>
     </w:p>
-    <w:bookmarkEnd w:id="91"/>
-    <w:bookmarkStart w:id="93" w:name="ref-creed2011"/>
+    <w:bookmarkEnd w:id="93"/>
+    <w:bookmarkStart w:id="95" w:name="ref-creed2011"/>
     <w:p>
       <w:pPr>
         <w:pStyle w:val="Bibliography"/>
@@ -8085,7 +8115,7 @@
       <w:r>
         <w:t xml:space="preserve"> </w:t>
       </w:r>
-      <w:hyperlink r:id="rId92">
+      <w:hyperlink r:id="rId94">
         <w:r>
           <w:rPr>
             <w:rStyle w:val="Hyperlink"/>
@@ -8094,8 +8124,8 @@
         </w:r>
       </w:hyperlink>
     </w:p>
-    <w:bookmarkEnd w:id="93"/>
-    <w:bookmarkStart w:id="95" w:name="ref-creed2015"/>
+    <w:bookmarkEnd w:id="95"/>
+    <w:bookmarkStart w:id="97" w:name="ref-creed2015"/>
     <w:p>
       <w:pPr>
         <w:pStyle w:val="Bibliography"/>
@@ -8106,7 +8136,7 @@
       <w:r>
         <w:t xml:space="preserve"> </w:t>
       </w:r>
-      <w:hyperlink r:id="rId94">
+      <w:hyperlink r:id="rId96">
         <w:r>
           <w:rPr>
             <w:rStyle w:val="Hyperlink"/>
@@ -8115,8 +8145,8 @@
         </w:r>
       </w:hyperlink>
     </w:p>
-    <w:bookmarkEnd w:id="95"/>
-    <w:bookmarkStart w:id="97" w:name="ref-ewing2013"/>
+    <w:bookmarkEnd w:id="97"/>
+    <w:bookmarkStart w:id="99" w:name="ref-ewing2013"/>
     <w:p>
       <w:pPr>
         <w:pStyle w:val="Bibliography"/>
@@ -8136,7 +8166,7 @@
       <w:r>
         <w:t xml:space="preserve"> </w:t>
       </w:r>
-      <w:hyperlink r:id="rId96">
+      <w:hyperlink r:id="rId98">
         <w:r>
           <w:rPr>
             <w:rStyle w:val="Hyperlink"/>
@@ -8145,8 +8175,8 @@
         </w:r>
       </w:hyperlink>
     </w:p>
-    <w:bookmarkEnd w:id="97"/>
-    <w:bookmarkStart w:id="99" w:name="ref-fasano2019"/>
+    <w:bookmarkEnd w:id="99"/>
+    <w:bookmarkStart w:id="101" w:name="ref-fasano2019"/>
     <w:p>
       <w:pPr>
         <w:pStyle w:val="Bibliography"/>
@@ -8157,7 +8187,7 @@
       <w:r>
         <w:t xml:space="preserve"> </w:t>
       </w:r>
-      <w:hyperlink r:id="rId98">
+      <w:hyperlink r:id="rId100">
         <w:r>
           <w:rPr>
             <w:rStyle w:val="Hyperlink"/>
@@ -8166,8 +8196,8 @@
         </w:r>
       </w:hyperlink>
     </w:p>
-    <w:bookmarkEnd w:id="99"/>
-    <w:bookmarkStart w:id="101" w:name="ref-fleischer2020"/>
+    <w:bookmarkEnd w:id="101"/>
+    <w:bookmarkStart w:id="103" w:name="ref-fleischer2020"/>
     <w:p>
       <w:pPr>
         <w:pStyle w:val="Bibliography"/>
@@ -8178,7 +8208,7 @@
       <w:r>
         <w:t xml:space="preserve"> </w:t>
       </w:r>
-      <w:hyperlink r:id="rId100">
+      <w:hyperlink r:id="rId102">
         <w:r>
           <w:rPr>
             <w:rStyle w:val="Hyperlink"/>
@@ -8187,8 +8217,8 @@
         </w:r>
       </w:hyperlink>
     </w:p>
-    <w:bookmarkEnd w:id="101"/>
-    <w:bookmarkStart w:id="103" w:name="ref-grotemeyer2024"/>
+    <w:bookmarkEnd w:id="103"/>
+    <w:bookmarkStart w:id="105" w:name="ref-grotemeyer2024"/>
     <w:p>
       <w:pPr>
         <w:pStyle w:val="Bibliography"/>
@@ -8199,7 +8229,7 @@
       <w:r>
         <w:t xml:space="preserve"> </w:t>
       </w:r>
-      <w:hyperlink r:id="rId102">
+      <w:hyperlink r:id="rId104">
         <w:r>
           <w:rPr>
             <w:rStyle w:val="Hyperlink"/>
@@ -8208,8 +8238,8 @@
         </w:r>
       </w:hyperlink>
     </w:p>
-    <w:bookmarkEnd w:id="103"/>
-    <w:bookmarkStart w:id="105" w:name="ref-dehaas2012"/>
+    <w:bookmarkEnd w:id="105"/>
+    <w:bookmarkStart w:id="107" w:name="ref-dehaas2012"/>
     <w:p>
       <w:pPr>
         <w:pStyle w:val="Bibliography"/>
@@ -8220,7 +8250,7 @@
       <w:r>
         <w:t xml:space="preserve"> </w:t>
       </w:r>
-      <w:hyperlink r:id="rId104">
+      <w:hyperlink r:id="rId106">
         <w:r>
           <w:rPr>
             <w:rStyle w:val="Hyperlink"/>
@@ -8229,8 +8259,8 @@
         </w:r>
       </w:hyperlink>
     </w:p>
-    <w:bookmarkEnd w:id="105"/>
-    <w:bookmarkStart w:id="107" w:name="ref-jiang2017"/>
+    <w:bookmarkEnd w:id="107"/>
+    <w:bookmarkStart w:id="109" w:name="ref-jiang2017"/>
     <w:p>
       <w:pPr>
         <w:pStyle w:val="Bibliography"/>
@@ -8250,7 +8280,7 @@
       <w:r>
         <w:t xml:space="preserve"> </w:t>
       </w:r>
-      <w:hyperlink r:id="rId106">
+      <w:hyperlink r:id="rId108">
         <w:r>
           <w:rPr>
             <w:rStyle w:val="Hyperlink"/>
@@ -8259,8 +8289,8 @@
         </w:r>
       </w:hyperlink>
     </w:p>
-    <w:bookmarkEnd w:id="107"/>
-    <w:bookmarkStart w:id="109" w:name="ref-knotkova2021"/>
+    <w:bookmarkEnd w:id="109"/>
+    <w:bookmarkStart w:id="111" w:name="ref-knotkova2021"/>
     <w:p>
       <w:pPr>
         <w:pStyle w:val="Bibliography"/>
@@ -8271,7 +8301,7 @@
       <w:r>
         <w:t xml:space="preserve"> </w:t>
       </w:r>
-      <w:hyperlink r:id="rId108">
+      <w:hyperlink r:id="rId110">
         <w:r>
           <w:rPr>
             <w:rStyle w:val="Hyperlink"/>
@@ -8280,8 +8310,8 @@
         </w:r>
       </w:hyperlink>
     </w:p>
-    <w:bookmarkEnd w:id="109"/>
-    <w:bookmarkStart w:id="111" w:name="ref-koo2018"/>
+    <w:bookmarkEnd w:id="111"/>
+    <w:bookmarkStart w:id="113" w:name="ref-koo2018"/>
     <w:p>
       <w:pPr>
         <w:pStyle w:val="Bibliography"/>
@@ -8292,7 +8322,7 @@
       <w:r>
         <w:t xml:space="preserve"> </w:t>
       </w:r>
-      <w:hyperlink r:id="rId110">
+      <w:hyperlink r:id="rId112">
         <w:r>
           <w:rPr>
             <w:rStyle w:val="Hyperlink"/>
@@ -8301,8 +8331,8 @@
         </w:r>
       </w:hyperlink>
     </w:p>
-    <w:bookmarkEnd w:id="111"/>
-    <w:bookmarkStart w:id="113" w:name="ref-kouzani2013"/>
+    <w:bookmarkEnd w:id="113"/>
+    <w:bookmarkStart w:id="115" w:name="ref-kouzani2013"/>
     <w:p>
       <w:pPr>
         <w:pStyle w:val="Bibliography"/>
@@ -8313,7 +8343,7 @@
       <w:r>
         <w:t xml:space="preserve"> </w:t>
       </w:r>
-      <w:hyperlink r:id="rId112">
+      <w:hyperlink r:id="rId114">
         <w:r>
           <w:rPr>
             <w:rStyle w:val="Hyperlink"/>
@@ -8322,8 +8352,8 @@
         </w:r>
       </w:hyperlink>
     </w:p>
-    <w:bookmarkEnd w:id="113"/>
-    <w:bookmarkStart w:id="115" w:name="ref-krauss2021"/>
+    <w:bookmarkEnd w:id="115"/>
+    <w:bookmarkStart w:id="117" w:name="ref-krauss2021"/>
     <w:p>
       <w:pPr>
         <w:pStyle w:val="Bibliography"/>
@@ -8334,7 +8364,7 @@
       <w:r>
         <w:t xml:space="preserve"> </w:t>
       </w:r>
-      <w:hyperlink r:id="rId114">
+      <w:hyperlink r:id="rId116">
         <w:r>
           <w:rPr>
             <w:rStyle w:val="Hyperlink"/>
@@ -8343,8 +8373,8 @@
         </w:r>
       </w:hyperlink>
     </w:p>
-    <w:bookmarkEnd w:id="115"/>
-    <w:bookmarkStart w:id="117" w:name="ref-kupsch2006"/>
+    <w:bookmarkEnd w:id="117"/>
+    <w:bookmarkStart w:id="119" w:name="ref-kupsch2006"/>
     <w:p>
       <w:pPr>
         <w:pStyle w:val="Bibliography"/>
@@ -8355,7 +8385,7 @@
       <w:r>
         <w:t xml:space="preserve"> </w:t>
       </w:r>
-      <w:hyperlink r:id="rId116">
+      <w:hyperlink r:id="rId118">
         <w:r>
           <w:rPr>
             <w:rStyle w:val="Hyperlink"/>
@@ -8364,8 +8394,8 @@
         </w:r>
       </w:hyperlink>
     </w:p>
-    <w:bookmarkEnd w:id="117"/>
-    <w:bookmarkStart w:id="119" w:name="ref-lopes2015"/>
+    <w:bookmarkEnd w:id="119"/>
+    <w:bookmarkStart w:id="121" w:name="ref-lopes2015"/>
     <w:p>
       <w:pPr>
         <w:pStyle w:val="Bibliography"/>
@@ -8376,7 +8406,7 @@
       <w:r>
         <w:t xml:space="preserve"> </w:t>
       </w:r>
-      <w:hyperlink r:id="rId118">
+      <w:hyperlink r:id="rId120">
         <w:r>
           <w:rPr>
             <w:rStyle w:val="Hyperlink"/>
@@ -8385,8 +8415,8 @@
         </w:r>
       </w:hyperlink>
     </w:p>
-    <w:bookmarkEnd w:id="119"/>
-    <w:bookmarkStart w:id="121" w:name="ref-lozano2019"/>
+    <w:bookmarkEnd w:id="121"/>
+    <w:bookmarkStart w:id="123" w:name="ref-lozano2019"/>
     <w:p>
       <w:pPr>
         <w:pStyle w:val="Bibliography"/>
@@ -8397,7 +8427,7 @@
       <w:r>
         <w:t xml:space="preserve"> </w:t>
       </w:r>
-      <w:hyperlink r:id="rId120">
+      <w:hyperlink r:id="rId122">
         <w:r>
           <w:rPr>
             <w:rStyle w:val="Hyperlink"/>
@@ -8406,8 +8436,8 @@
         </w:r>
       </w:hyperlink>
     </w:p>
-    <w:bookmarkEnd w:id="121"/>
-    <w:bookmarkStart w:id="123" w:name="ref-merrill2005"/>
+    <w:bookmarkEnd w:id="123"/>
+    <w:bookmarkStart w:id="125" w:name="ref-merrill2005"/>
     <w:p>
       <w:pPr>
         <w:pStyle w:val="Bibliography"/>
@@ -8418,7 +8448,7 @@
       <w:r>
         <w:t xml:space="preserve"> </w:t>
       </w:r>
-      <w:hyperlink r:id="rId122">
+      <w:hyperlink r:id="rId124">
         <w:r>
           <w:rPr>
             <w:rStyle w:val="Hyperlink"/>
@@ -8427,8 +8457,8 @@
         </w:r>
       </w:hyperlink>
     </w:p>
-    <w:bookmarkEnd w:id="123"/>
-    <w:bookmarkStart w:id="125" w:name="ref-murphy2021"/>
+    <w:bookmarkEnd w:id="125"/>
+    <w:bookmarkStart w:id="127" w:name="ref-murphy2021"/>
     <w:p>
       <w:pPr>
         <w:pStyle w:val="Bibliography"/>
@@ -8439,7 +8469,7 @@
       <w:r>
         <w:t xml:space="preserve"> </w:t>
       </w:r>
-      <w:hyperlink r:id="rId124">
+      <w:hyperlink r:id="rId126">
         <w:r>
           <w:rPr>
             <w:rStyle w:val="Hyperlink"/>
@@ -8448,8 +8478,8 @@
         </w:r>
       </w:hyperlink>
     </w:p>
-    <w:bookmarkEnd w:id="125"/>
-    <w:bookmarkStart w:id="127" w:name="ref-paulat2026"/>
+    <w:bookmarkEnd w:id="127"/>
+    <w:bookmarkStart w:id="129" w:name="ref-paulat2026"/>
     <w:p>
       <w:pPr>
         <w:pStyle w:val="Bibliography"/>
@@ -8460,7 +8490,7 @@
       <w:r>
         <w:t xml:space="preserve"> </w:t>
       </w:r>
-      <w:hyperlink r:id="rId126">
+      <w:hyperlink r:id="rId128">
         <w:r>
           <w:rPr>
             <w:rStyle w:val="Hyperlink"/>
@@ -8469,8 +8499,8 @@
         </w:r>
       </w:hyperlink>
     </w:p>
-    <w:bookmarkEnd w:id="127"/>
-    <w:bookmarkStart w:id="129" w:name="ref-pinnell2018"/>
+    <w:bookmarkEnd w:id="129"/>
+    <w:bookmarkStart w:id="131" w:name="ref-pinnell2018"/>
     <w:p>
       <w:pPr>
         <w:pStyle w:val="Bibliography"/>
@@ -8481,7 +8511,7 @@
       <w:r>
         <w:t xml:space="preserve"> </w:t>
       </w:r>
-      <w:hyperlink r:id="rId128">
+      <w:hyperlink r:id="rId130">
         <w:r>
           <w:rPr>
             <w:rStyle w:val="Hyperlink"/>
@@ -8490,8 +8520,8 @@
         </w:r>
       </w:hyperlink>
     </w:p>
-    <w:bookmarkEnd w:id="129"/>
-    <w:bookmarkStart w:id="131" w:name="ref-plocksties2021"/>
+    <w:bookmarkEnd w:id="131"/>
+    <w:bookmarkStart w:id="133" w:name="ref-plocksties2021"/>
     <w:p>
       <w:pPr>
         <w:pStyle w:val="Bibliography"/>
@@ -8508,7 +8538,7 @@
       <w:r>
         <w:t xml:space="preserve"> </w:t>
       </w:r>
-      <w:hyperlink r:id="rId130">
+      <w:hyperlink r:id="rId132">
         <w:r>
           <w:rPr>
             <w:rStyle w:val="Hyperlink"/>
@@ -8517,8 +8547,8 @@
         </w:r>
       </w:hyperlink>
     </w:p>
-    <w:bookmarkEnd w:id="131"/>
-    <w:bookmarkStart w:id="133" w:name="ref-shen2026"/>
+    <w:bookmarkEnd w:id="133"/>
+    <w:bookmarkStart w:id="135" w:name="ref-shen2026"/>
     <w:p>
       <w:pPr>
         <w:pStyle w:val="Bibliography"/>
@@ -8529,7 +8559,7 @@
       <w:r>
         <w:t xml:space="preserve"> </w:t>
       </w:r>
-      <w:hyperlink r:id="rId132">
+      <w:hyperlink r:id="rId134">
         <w:r>
           <w:rPr>
             <w:rStyle w:val="Hyperlink"/>
@@ -8538,8 +8568,8 @@
         </w:r>
       </w:hyperlink>
     </w:p>
-    <w:bookmarkEnd w:id="133"/>
-    <w:bookmarkStart w:id="135" w:name="ref-shirvalkar2025"/>
+    <w:bookmarkEnd w:id="135"/>
+    <w:bookmarkStart w:id="137" w:name="ref-shirvalkar2025"/>
     <w:p>
       <w:pPr>
         <w:pStyle w:val="Bibliography"/>
@@ -8553,7 +8583,7 @@
       <w:r>
         <w:t xml:space="preserve"> </w:t>
       </w:r>
-      <w:hyperlink r:id="rId134">
+      <w:hyperlink r:id="rId136">
         <w:r>
           <w:rPr>
             <w:rStyle w:val="Hyperlink"/>
@@ -8562,8 +8592,8 @@
         </w:r>
       </w:hyperlink>
     </w:p>
-    <w:bookmarkEnd w:id="135"/>
-    <w:bookmarkStart w:id="137" w:name="ref-ti2008howland"/>
+    <w:bookmarkEnd w:id="137"/>
+    <w:bookmarkStart w:id="139" w:name="ref-ti2008howland"/>
     <w:p>
       <w:pPr>
         <w:pStyle w:val="Bibliography"/>
@@ -8574,7 +8604,7 @@
       <w:r>
         <w:t xml:space="preserve"> </w:t>
       </w:r>
-      <w:hyperlink r:id="rId136">
+      <w:hyperlink r:id="rId138">
         <w:r>
           <w:rPr>
             <w:rStyle w:val="Hyperlink"/>
@@ -8625,8 +8655,8 @@
         <w:t xml:space="preserve">(Application Report No. SNOA474A). Texas Instruments.</w:t>
       </w:r>
     </w:p>
-    <w:bookmarkEnd w:id="137"/>
-    <w:bookmarkStart w:id="139" w:name="ref-tucker2013"/>
+    <w:bookmarkEnd w:id="139"/>
+    <w:bookmarkStart w:id="141" w:name="ref-tucker2013"/>
     <w:p>
       <w:pPr>
         <w:pStyle w:val="Bibliography"/>
@@ -8649,7 +8679,7 @@
       <w:r>
         <w:t xml:space="preserve"> </w:t>
       </w:r>
-      <w:hyperlink r:id="rId138">
+      <w:hyperlink r:id="rId140">
         <w:r>
           <w:rPr>
             <w:rStyle w:val="Hyperlink"/>
@@ -8658,8 +8688,8 @@
         </w:r>
       </w:hyperlink>
     </w:p>
-    <w:bookmarkEnd w:id="139"/>
-    <w:bookmarkStart w:id="141" w:name="ref-vachez2020"/>
+    <w:bookmarkEnd w:id="141"/>
+    <w:bookmarkStart w:id="143" w:name="ref-vachez2020"/>
     <w:p>
       <w:pPr>
         <w:pStyle w:val="Bibliography"/>
@@ -8670,7 +8700,7 @@
       <w:r>
         <w:t xml:space="preserve"> </w:t>
       </w:r>
-      <w:hyperlink r:id="rId140">
+      <w:hyperlink r:id="rId142">
         <w:r>
           <w:rPr>
             <w:rStyle w:val="Hyperlink"/>
@@ -8679,9 +8709,9 @@
         </w:r>
       </w:hyperlink>
     </w:p>
-    <w:bookmarkEnd w:id="141"/>
-    <w:bookmarkEnd w:id="142"/>
     <w:bookmarkEnd w:id="143"/>
+    <w:bookmarkEnd w:id="144"/>
+    <w:bookmarkEnd w:id="145"/>
     <w:sectPr>
       <w:footnotePr>
         <w:numRestart w:val="eachSect"/>

</xml_diff>